<commit_message>
updates for Leg 2.2
</commit_message>
<xml_diff>
--- a/_text/SailingOrders/input_text_Sailing_Order.docx
+++ b/_text/SailingOrders/input_text_Sailing_Order.docx
@@ -16,13 +16,20 @@
           <w:sz w:val="24"/>
           <w:szCs w:val="24"/>
         </w:rPr>
-        <w:t>6.</w:t>
+        <w:t>1</w:t>
       </w:r>
       <w:r>
         <w:rPr>
           <w:sz w:val="24"/>
           <w:szCs w:val="24"/>
         </w:rPr>
+        <w:t>.</w:t>
+      </w:r>
+      <w:r>
+        <w:rPr>
+          <w:sz w:val="24"/>
+          <w:szCs w:val="24"/>
+        </w:rPr>
         <w:t xml:space="preserve"> </w:t>
       </w:r>
       <w:r>
@@ -47,7 +54,10 @@
         <w:pStyle w:val="Heading2"/>
       </w:pPr>
       <w:r>
-        <w:t>6.</w:t>
+        <w:t>1</w:t>
+      </w:r>
+      <w:r>
+        <w:t>.</w:t>
       </w:r>
       <w:r>
         <w:t>1</w:t>
@@ -87,7 +97,14 @@
           <w:rFonts w:asciiTheme="minorHAnsi" w:hAnsiTheme="minorHAnsi" w:cstheme="minorHAnsi"/>
           <w:szCs w:val="24"/>
         </w:rPr>
-        <w:t>6.</w:t>
+        <w:t>1</w:t>
+      </w:r>
+      <w:r>
+        <w:rPr>
+          <w:rFonts w:asciiTheme="minorHAnsi" w:hAnsiTheme="minorHAnsi" w:cstheme="minorHAnsi"/>
+          <w:szCs w:val="24"/>
+        </w:rPr>
+        <w:t>.</w:t>
       </w:r>
       <w:r>
         <w:rPr>
@@ -292,7 +309,7 @@
           <w:rFonts w:asciiTheme="minorHAnsi" w:eastAsiaTheme="minorEastAsia" w:hAnsiTheme="minorHAnsi" w:cstheme="minorHAnsi"/>
           <w:szCs w:val="24"/>
         </w:rPr>
-        <w:t>Sampling of phytoplankton, zooplankton and ichthyoplankton.</w:t>
+        <w:t>Sampling of zooplankton and ichthyoplankton.</w:t>
       </w:r>
     </w:p>
     <w:p>
@@ -430,13 +447,6 @@
           <w:szCs w:val="24"/>
         </w:rPr>
         <w:lastRenderedPageBreak/>
-        <w:t>6.</w:t>
-      </w:r>
-      <w:r>
-        <w:rPr>
-          <w:rFonts w:asciiTheme="minorHAnsi" w:hAnsiTheme="minorHAnsi" w:cstheme="minorHAnsi"/>
-          <w:szCs w:val="24"/>
-        </w:rPr>
         <w:t>1</w:t>
       </w:r>
       <w:r>
@@ -444,6 +454,20 @@
           <w:rFonts w:asciiTheme="minorHAnsi" w:hAnsiTheme="minorHAnsi" w:cstheme="minorHAnsi"/>
           <w:szCs w:val="24"/>
         </w:rPr>
+        <w:t>.</w:t>
+      </w:r>
+      <w:r>
+        <w:rPr>
+          <w:rFonts w:asciiTheme="minorHAnsi" w:hAnsiTheme="minorHAnsi" w:cstheme="minorHAnsi"/>
+          <w:szCs w:val="24"/>
+        </w:rPr>
+        <w:t>1</w:t>
+      </w:r>
+      <w:r>
+        <w:rPr>
+          <w:rFonts w:asciiTheme="minorHAnsi" w:hAnsiTheme="minorHAnsi" w:cstheme="minorHAnsi"/>
+          <w:szCs w:val="24"/>
+        </w:rPr>
         <w:t>.2 Survey area</w:t>
       </w:r>
     </w:p>
@@ -732,7 +756,14 @@
           <w:rFonts w:asciiTheme="minorHAnsi" w:hAnsiTheme="minorHAnsi" w:cstheme="minorHAnsi"/>
           <w:szCs w:val="24"/>
         </w:rPr>
-        <w:t>6.</w:t>
+        <w:t>1</w:t>
+      </w:r>
+      <w:r>
+        <w:rPr>
+          <w:rFonts w:asciiTheme="minorHAnsi" w:hAnsiTheme="minorHAnsi" w:cstheme="minorHAnsi"/>
+          <w:szCs w:val="24"/>
+        </w:rPr>
+        <w:t>.</w:t>
       </w:r>
       <w:r>
         <w:rPr>
@@ -830,38 +861,36 @@
           <w:szCs w:val="24"/>
         </w:rPr>
         <w:lastRenderedPageBreak/>
-        <w:t xml:space="preserve">University of Vigo, will also be invited to deliver specific expertise, given their experience in the field of fisheries and marine habitats in the region. The below table provides an overview of the main types of expertise required and respective number of participants by country. It should be noted that a maximum number of 19 local participants can be allowed, in addition to the scientific crew from Norway and the FAO taxonomy expert. </w:t>
-      </w:r>
-    </w:p>
-    <w:p>
-      <w:pPr>
-        <w:spacing w:after="120"/>
+        <w:t xml:space="preserve">University of Vigo, will also be invited to deliver specific expertise, given their experience in the field of fisheries and marine habitats in the region. </w:t>
+      </w:r>
+      <w:r>
         <w:rPr>
           <w:rFonts w:asciiTheme="minorHAnsi" w:hAnsiTheme="minorHAnsi" w:cstheme="minorHAnsi"/>
           <w:color w:val="000000"/>
           <w:spacing w:val="-3"/>
           <w:szCs w:val="24"/>
         </w:rPr>
-      </w:pPr>
-    </w:p>
-    <w:p>
-      <w:pPr>
-        <w:spacing w:after="120"/>
+        <w:t xml:space="preserve">An overview of the main types of expertise and number of participants required for Leg 2 is provided in </w:t>
+      </w:r>
+      <w:r>
         <w:rPr>
           <w:rFonts w:asciiTheme="minorHAnsi" w:hAnsiTheme="minorHAnsi" w:cstheme="minorHAnsi"/>
           <w:color w:val="000000"/>
           <w:spacing w:val="-3"/>
           <w:szCs w:val="24"/>
-        </w:rPr>
-      </w:pPr>
+          <w:lang w:val="en-US"/>
+        </w:rPr>
+        <w:t>[A</w:t>
+      </w:r>
       <w:r>
         <w:rPr>
           <w:rFonts w:asciiTheme="minorHAnsi" w:hAnsiTheme="minorHAnsi" w:cstheme="minorHAnsi"/>
           <w:color w:val="000000"/>
           <w:spacing w:val="-3"/>
           <w:szCs w:val="24"/>
-        </w:rPr>
-        <w:t xml:space="preserve">An overview of the main types of expertise and number of participants required for Leg 2 is provided in </w:t>
+          <w:lang w:val="en-US"/>
+        </w:rPr>
+        <w:t>NNEX I](#</w:t>
       </w:r>
       <w:r>
         <w:rPr>
@@ -871,7 +900,7 @@
           <w:szCs w:val="24"/>
           <w:lang w:val="en-US"/>
         </w:rPr>
-        <w:t>[A</w:t>
+        <w:t>A</w:t>
       </w:r>
       <w:r>
         <w:rPr>
@@ -881,7 +910,7 @@
           <w:szCs w:val="24"/>
           <w:lang w:val="en-US"/>
         </w:rPr>
-        <w:t>NNEX</w:t>
+        <w:t xml:space="preserve">NNEX_I) </w:t>
       </w:r>
       <w:r>
         <w:rPr>
@@ -889,9 +918,8 @@
           <w:color w:val="000000"/>
           <w:spacing w:val="-3"/>
           <w:szCs w:val="24"/>
-          <w:lang w:val="en-US"/>
-        </w:rPr>
-        <w:t xml:space="preserve"> </w:t>
+        </w:rPr>
+        <w:t xml:space="preserve">and the list of the </w:t>
       </w:r>
       <w:r>
         <w:rPr>
@@ -899,9 +927,8 @@
           <w:color w:val="000000"/>
           <w:spacing w:val="-3"/>
           <w:szCs w:val="24"/>
-          <w:lang w:val="en-US"/>
-        </w:rPr>
-        <w:t>I]</w:t>
+        </w:rPr>
+        <w:t xml:space="preserve">planned </w:t>
       </w:r>
       <w:r>
         <w:rPr>
@@ -909,9 +936,8 @@
           <w:color w:val="000000"/>
           <w:spacing w:val="-3"/>
           <w:szCs w:val="24"/>
-          <w:lang w:val="en-US"/>
-        </w:rPr>
-        <w:t>(#</w:t>
+        </w:rPr>
+        <w:t xml:space="preserve">survey participants is shown in </w:t>
       </w:r>
       <w:r>
         <w:rPr>
@@ -921,7 +947,7 @@
           <w:szCs w:val="24"/>
           <w:lang w:val="en-US"/>
         </w:rPr>
-        <w:t>A</w:t>
+        <w:t>[A</w:t>
       </w:r>
       <w:r>
         <w:rPr>
@@ -931,7 +957,7 @@
           <w:szCs w:val="24"/>
           <w:lang w:val="en-US"/>
         </w:rPr>
-        <w:t>NNEX_I)</w:t>
+        <w:t>NNEX II](#</w:t>
       </w:r>
       <w:r>
         <w:rPr>
@@ -941,7 +967,7 @@
           <w:szCs w:val="24"/>
           <w:lang w:val="en-US"/>
         </w:rPr>
-        <w:t xml:space="preserve"> </w:t>
+        <w:t>A</w:t>
       </w:r>
       <w:r>
         <w:rPr>
@@ -949,8 +975,9 @@
           <w:color w:val="000000"/>
           <w:spacing w:val="-3"/>
           <w:szCs w:val="24"/>
-        </w:rPr>
-        <w:t xml:space="preserve">and the list of the </w:t>
+          <w:lang w:val="en-US"/>
+        </w:rPr>
+        <w:t>NNEX_II)</w:t>
       </w:r>
       <w:r>
         <w:rPr>
@@ -959,205 +986,199 @@
           <w:spacing w:val="-3"/>
           <w:szCs w:val="24"/>
         </w:rPr>
-        <w:t xml:space="preserve">planned </w:t>
-      </w:r>
-      <w:r>
+        <w:t>.</w:t>
+      </w:r>
+    </w:p>
+    <w:p>
+      <w:pPr>
+        <w:spacing w:after="120"/>
         <w:rPr>
           <w:rFonts w:asciiTheme="minorHAnsi" w:hAnsiTheme="minorHAnsi" w:cstheme="minorHAnsi"/>
           <w:color w:val="000000"/>
           <w:spacing w:val="-3"/>
           <w:szCs w:val="24"/>
         </w:rPr>
-        <w:t xml:space="preserve">survey participants is shown in </w:t>
-      </w:r>
-      <w:r>
+      </w:pPr>
+    </w:p>
+    <w:p>
+      <w:pPr>
+        <w:spacing w:after="120"/>
         <w:rPr>
           <w:rFonts w:asciiTheme="minorHAnsi" w:hAnsiTheme="minorHAnsi" w:cstheme="minorHAnsi"/>
           <w:color w:val="000000"/>
           <w:spacing w:val="-3"/>
           <w:szCs w:val="24"/>
-          <w:lang w:val="en-US"/>
-        </w:rPr>
-        <w:t>[A</w:t>
-      </w:r>
+        </w:rPr>
+      </w:pPr>
       <w:r>
         <w:rPr>
           <w:rFonts w:asciiTheme="minorHAnsi" w:hAnsiTheme="minorHAnsi" w:cstheme="minorHAnsi"/>
           <w:color w:val="000000"/>
           <w:spacing w:val="-3"/>
           <w:szCs w:val="24"/>
-          <w:lang w:val="en-US"/>
-        </w:rPr>
-        <w:t>NNEX II](#</w:t>
-      </w:r>
-      <w:r>
+        </w:rPr>
+        <w:t xml:space="preserve">It should be noted that a maximum number of 19 local participants can be allowed, in addition to the scientific crew from Norway and the FAO taxonomy expert. </w:t>
+      </w:r>
+    </w:p>
+    <w:p>
+      <w:pPr>
+        <w:spacing w:after="120"/>
         <w:rPr>
           <w:rFonts w:asciiTheme="minorHAnsi" w:hAnsiTheme="minorHAnsi" w:cstheme="minorHAnsi"/>
           <w:color w:val="000000"/>
           <w:spacing w:val="-3"/>
           <w:szCs w:val="24"/>
-          <w:lang w:val="en-US"/>
-        </w:rPr>
-        <w:t>A</w:t>
-      </w:r>
-      <w:r>
-        <w:rPr>
-          <w:rFonts w:asciiTheme="minorHAnsi" w:hAnsiTheme="minorHAnsi" w:cstheme="minorHAnsi"/>
-          <w:color w:val="000000"/>
+        </w:rPr>
+      </w:pPr>
+    </w:p>
+    <w:p>
+      <w:pPr>
+        <w:pStyle w:val="Heading2"/>
+      </w:pPr>
+      <w:r>
+        <w:t>1</w:t>
+      </w:r>
+      <w:r>
+        <w:t>.</w:t>
+      </w:r>
+      <w:r>
+        <w:t>2</w:t>
+      </w:r>
+      <w:r>
+        <w:t xml:space="preserve"> </w:t>
+      </w:r>
+      <w:r>
+        <w:t>SCIENTIFIC RATIONALE</w:t>
+      </w:r>
+    </w:p>
+    <w:p>
+      <w:pPr>
+        <w:rPr>
+          <w:rFonts w:asciiTheme="minorHAnsi" w:hAnsiTheme="minorHAnsi" w:cstheme="minorHAnsi"/>
+          <w:szCs w:val="24"/>
+        </w:rPr>
+      </w:pPr>
+      <w:r>
+        <w:rPr>
+          <w:rFonts w:asciiTheme="minorHAnsi" w:hAnsiTheme="minorHAnsi" w:cstheme="minorHAnsi"/>
+          <w:szCs w:val="24"/>
+        </w:rPr>
+        <w:t xml:space="preserve">The overall framework and rationale for the surveys carried out by the </w:t>
+      </w:r>
+      <w:r>
+        <w:rPr>
+          <w:rFonts w:asciiTheme="minorHAnsi" w:hAnsiTheme="minorHAnsi" w:cstheme="minorHAnsi"/>
+          <w:szCs w:val="24"/>
+        </w:rPr>
+        <w:t>R/V</w:t>
+      </w:r>
+      <w:r>
+        <w:rPr>
+          <w:rFonts w:asciiTheme="minorHAnsi" w:hAnsiTheme="minorHAnsi" w:cstheme="minorHAnsi"/>
+          <w:szCs w:val="24"/>
+        </w:rPr>
+        <w:t xml:space="preserve"> </w:t>
+      </w:r>
+      <w:r>
+        <w:rPr>
+          <w:rFonts w:asciiTheme="minorHAnsi" w:hAnsiTheme="minorHAnsi" w:cstheme="minorHAnsi"/>
+          <w:szCs w:val="24"/>
+        </w:rPr>
+        <w:t>_</w:t>
+      </w:r>
+      <w:r>
+        <w:rPr>
+          <w:rFonts w:asciiTheme="minorHAnsi" w:hAnsiTheme="minorHAnsi" w:cstheme="minorHAnsi"/>
+          <w:szCs w:val="24"/>
+        </w:rPr>
+        <w:t>Dr Fridtjof Nansen_</w:t>
+      </w:r>
+      <w:r>
+        <w:rPr>
+          <w:rFonts w:asciiTheme="minorHAnsi" w:hAnsiTheme="minorHAnsi" w:cstheme="minorHAnsi"/>
+          <w:szCs w:val="24"/>
+        </w:rPr>
+        <w:t xml:space="preserve"> are provided by the EAF-Nansen Programme Science Plan which covers three main pillars (Figure </w:t>
+      </w:r>
+      <w:r>
+        <w:rPr>
+          <w:rFonts w:asciiTheme="minorHAnsi" w:hAnsiTheme="minorHAnsi" w:cstheme="minorHAnsi"/>
           <w:spacing w:val="-3"/>
           <w:szCs w:val="24"/>
           <w:lang w:val="en-US"/>
         </w:rPr>
-        <w:t>NNEX_II)</w:t>
-      </w:r>
-      <w:r>
-        <w:rPr>
-          <w:rFonts w:asciiTheme="minorHAnsi" w:hAnsiTheme="minorHAnsi" w:cstheme="minorHAnsi"/>
-          <w:color w:val="000000"/>
+        <w:t>\@ref(fig:</w:t>
+      </w:r>
+      <w:r>
+        <w:rPr>
+          <w:rFonts w:asciiTheme="minorHAnsi" w:hAnsiTheme="minorHAnsi" w:cstheme="minorHAnsi"/>
           <w:spacing w:val="-3"/>
           <w:szCs w:val="24"/>
+          <w:lang w:val="en-US"/>
+        </w:rPr>
+        <w:t>scienceplanSOfig</w:t>
+      </w:r>
+      <w:r>
+        <w:rPr>
+          <w:rFonts w:asciiTheme="minorHAnsi" w:hAnsiTheme="minorHAnsi" w:cstheme="minorHAnsi"/>
+          <w:spacing w:val="-3"/>
+          <w:szCs w:val="24"/>
+          <w:lang w:val="en-US"/>
+        </w:rPr>
+        <w:t>)</w:t>
+      </w:r>
+      <w:r>
+        <w:rPr>
+          <w:rFonts w:asciiTheme="minorHAnsi" w:hAnsiTheme="minorHAnsi" w:cstheme="minorHAnsi"/>
+          <w:szCs w:val="24"/>
+        </w:rPr>
+        <w:t xml:space="preserve">). Within this framework, the scope and objectives of the surveys in 2021 have been identified with partners, based on national and regional priorities. In addition, data recorded, and samples collected during the survey will be analysed through collaborations initiated through the various Science Plan Themes. </w:t>
+      </w:r>
+    </w:p>
+    <w:p>
+      <w:pPr>
+        <w:rPr>
+          <w:rFonts w:asciiTheme="minorHAnsi" w:hAnsiTheme="minorHAnsi" w:cstheme="minorHAnsi"/>
+          <w:szCs w:val="24"/>
+        </w:rPr>
+      </w:pPr>
+      <w:r>
+        <w:rPr>
+          <w:rFonts w:asciiTheme="minorHAnsi" w:hAnsiTheme="minorHAnsi" w:cstheme="minorHAnsi"/>
+          <w:szCs w:val="24"/>
+        </w:rPr>
+        <w:t xml:space="preserve">An overview of the Science Plan themes for which this survey is most relevant and associated projects is provided in Table </w:t>
+      </w:r>
+      <w:r>
+        <w:rPr>
+          <w:rFonts w:asciiTheme="minorHAnsi" w:hAnsiTheme="minorHAnsi" w:cstheme="minorHAnsi"/>
+          <w:szCs w:val="24"/>
+          <w:lang w:val="en-US"/>
+        </w:rPr>
+        <w:t>\@ref(tab:SOsciencethemestab).</w:t>
+      </w:r>
+    </w:p>
+    <w:p>
+      <w:pPr>
+        <w:pStyle w:val="Heading3"/>
+        <w:rPr>
+          <w:rFonts w:asciiTheme="minorHAnsi" w:hAnsiTheme="minorHAnsi" w:cstheme="minorHAnsi"/>
+          <w:szCs w:val="24"/>
+        </w:rPr>
+      </w:pPr>
+      <w:r>
+        <w:rPr>
+          <w:rFonts w:asciiTheme="minorHAnsi" w:hAnsiTheme="minorHAnsi" w:cstheme="minorHAnsi"/>
+          <w:szCs w:val="24"/>
+        </w:rPr>
+        <w:t>1</w:t>
+      </w:r>
+      <w:r>
+        <w:rPr>
+          <w:rFonts w:asciiTheme="minorHAnsi" w:hAnsiTheme="minorHAnsi" w:cstheme="minorHAnsi"/>
+          <w:szCs w:val="24"/>
         </w:rPr>
         <w:t>.</w:t>
-      </w:r>
-    </w:p>
-    <w:p>
-      <w:pPr>
-        <w:pStyle w:val="Heading2"/>
-      </w:pPr>
-      <w:r>
-        <w:t>6.</w:t>
-      </w:r>
-      <w:r>
-        <w:t>2</w:t>
-      </w:r>
-      <w:r>
-        <w:t xml:space="preserve"> </w:t>
-      </w:r>
-      <w:r>
-        <w:t>SCIENTIFIC RATIONALE</w:t>
-      </w:r>
-    </w:p>
-    <w:p>
-      <w:pPr>
-        <w:rPr>
-          <w:rFonts w:asciiTheme="minorHAnsi" w:hAnsiTheme="minorHAnsi" w:cstheme="minorHAnsi"/>
-          <w:szCs w:val="24"/>
-        </w:rPr>
-      </w:pPr>
-      <w:r>
-        <w:rPr>
-          <w:rFonts w:asciiTheme="minorHAnsi" w:hAnsiTheme="minorHAnsi" w:cstheme="minorHAnsi"/>
-          <w:szCs w:val="24"/>
-        </w:rPr>
-        <w:t xml:space="preserve">The overall framework and rationale for the surveys carried out by the </w:t>
-      </w:r>
-      <w:r>
-        <w:rPr>
-          <w:rFonts w:asciiTheme="minorHAnsi" w:hAnsiTheme="minorHAnsi" w:cstheme="minorHAnsi"/>
-          <w:szCs w:val="24"/>
-        </w:rPr>
-        <w:t>R/V</w:t>
-      </w:r>
-      <w:r>
-        <w:rPr>
-          <w:rFonts w:asciiTheme="minorHAnsi" w:hAnsiTheme="minorHAnsi" w:cstheme="minorHAnsi"/>
-          <w:szCs w:val="24"/>
-        </w:rPr>
-        <w:t xml:space="preserve"> </w:t>
-      </w:r>
-      <w:r>
-        <w:rPr>
-          <w:rFonts w:asciiTheme="minorHAnsi" w:hAnsiTheme="minorHAnsi" w:cstheme="minorHAnsi"/>
-          <w:szCs w:val="24"/>
-        </w:rPr>
-        <w:t>_</w:t>
-      </w:r>
-      <w:r>
-        <w:rPr>
-          <w:rFonts w:asciiTheme="minorHAnsi" w:hAnsiTheme="minorHAnsi" w:cstheme="minorHAnsi"/>
-          <w:szCs w:val="24"/>
-        </w:rPr>
-        <w:t>Dr Fridtjof Nansen_</w:t>
-      </w:r>
-      <w:r>
-        <w:rPr>
-          <w:rFonts w:asciiTheme="minorHAnsi" w:hAnsiTheme="minorHAnsi" w:cstheme="minorHAnsi"/>
-          <w:szCs w:val="24"/>
-        </w:rPr>
-        <w:t xml:space="preserve"> are provided by the EAF-Nansen Programme Science Plan which covers three main pillars (Figure </w:t>
-      </w:r>
-      <w:r>
-        <w:rPr>
-          <w:rFonts w:asciiTheme="minorHAnsi" w:hAnsiTheme="minorHAnsi" w:cstheme="minorHAnsi"/>
-          <w:spacing w:val="-3"/>
-          <w:szCs w:val="24"/>
-          <w:lang w:val="en-US"/>
-        </w:rPr>
-        <w:t>\@ref(fig:</w:t>
-      </w:r>
-      <w:r>
-        <w:rPr>
-          <w:rFonts w:asciiTheme="minorHAnsi" w:hAnsiTheme="minorHAnsi" w:cstheme="minorHAnsi"/>
-          <w:spacing w:val="-3"/>
-          <w:szCs w:val="24"/>
-          <w:lang w:val="en-US"/>
-        </w:rPr>
-        <w:t>scienceplanSOfig</w:t>
-      </w:r>
-      <w:r>
-        <w:rPr>
-          <w:rFonts w:asciiTheme="minorHAnsi" w:hAnsiTheme="minorHAnsi" w:cstheme="minorHAnsi"/>
-          <w:spacing w:val="-3"/>
-          <w:szCs w:val="24"/>
-          <w:lang w:val="en-US"/>
-        </w:rPr>
-        <w:t>)</w:t>
-      </w:r>
-      <w:r>
-        <w:rPr>
-          <w:rFonts w:asciiTheme="minorHAnsi" w:hAnsiTheme="minorHAnsi" w:cstheme="minorHAnsi"/>
-          <w:szCs w:val="24"/>
-        </w:rPr>
-        <w:t xml:space="preserve">). Within this framework, the scope and objectives of the surveys in 2021 have been identified with partners, based on national and regional priorities. In addition, data recorded, and samples collected during the survey will be analysed through collaborations initiated through the various Science Plan Themes. </w:t>
-      </w:r>
-    </w:p>
-    <w:p>
-      <w:pPr>
-        <w:rPr>
-          <w:rFonts w:asciiTheme="minorHAnsi" w:hAnsiTheme="minorHAnsi" w:cstheme="minorHAnsi"/>
-          <w:szCs w:val="24"/>
-        </w:rPr>
-      </w:pPr>
-      <w:r>
-        <w:rPr>
-          <w:rFonts w:asciiTheme="minorHAnsi" w:hAnsiTheme="minorHAnsi" w:cstheme="minorHAnsi"/>
-          <w:szCs w:val="24"/>
-        </w:rPr>
-        <w:t xml:space="preserve">An overview of the Science Plan themes for which this survey is most relevant and associated projects is provided in Table </w:t>
-      </w:r>
-      <w:r>
-        <w:rPr>
-          <w:rFonts w:asciiTheme="minorHAnsi" w:hAnsiTheme="minorHAnsi" w:cstheme="minorHAnsi"/>
-          <w:szCs w:val="24"/>
-          <w:lang w:val="en-US"/>
-        </w:rPr>
-        <w:t>\@ref(tab:SOsciencethemestab).</w:t>
-      </w:r>
-    </w:p>
-    <w:p>
-      <w:pPr>
-        <w:pStyle w:val="Heading3"/>
-        <w:rPr>
-          <w:rFonts w:asciiTheme="minorHAnsi" w:hAnsiTheme="minorHAnsi" w:cstheme="minorHAnsi"/>
-          <w:szCs w:val="24"/>
-        </w:rPr>
-      </w:pPr>
-      <w:r>
-        <w:rPr>
-          <w:rFonts w:asciiTheme="minorHAnsi" w:hAnsiTheme="minorHAnsi" w:cstheme="minorHAnsi"/>
-          <w:szCs w:val="24"/>
-        </w:rPr>
-        <w:t>6.</w:t>
       </w:r>
       <w:r>
         <w:rPr>
@@ -1553,7 +1574,7 @@
           <w:rFonts w:asciiTheme="minorHAnsi" w:hAnsiTheme="minorHAnsi" w:cstheme="minorHAnsi"/>
           <w:szCs w:val="24"/>
         </w:rPr>
-        <w:t>Length-weight relationships for priority fish species caught in the bottom trawl measuring the length and weight of the first 30 out of 100 invidual fish and only the length of the remaining 70 (when available), at each trawl station.</w:t>
+        <w:t>Length-weight relationships for priority fish species caught in the bottom trawl measuring the length and weight of the first 100 invidual fish at each trawl station.</w:t>
       </w:r>
     </w:p>
     <w:p>
@@ -2488,16 +2509,7 @@
           <w:color w:val="000000" w:themeColor="text1"/>
           <w:szCs w:val="24"/>
         </w:rPr>
-        <w:t xml:space="preserve">Collection of samples for taxonomic courses and further analysis in the framework of </w:t>
-      </w:r>
-      <w:r>
-        <w:rPr>
-          <w:rFonts w:asciiTheme="minorHAnsi" w:eastAsia="Arial" w:hAnsiTheme="minorHAnsi" w:cstheme="minorHAnsi"/>
-          <w:color w:val="000000" w:themeColor="text1"/>
-          <w:szCs w:val="24"/>
-        </w:rPr>
-        <w:lastRenderedPageBreak/>
-        <w:t>the EAF-Nansen Programme.</w:t>
+        <w:t>Collection of samples for taxonomic courses and further analysis in the framework of the EAF-Nansen Programme.</w:t>
       </w:r>
     </w:p>
     <w:p>
@@ -2521,6 +2533,7 @@
           <w:rFonts w:asciiTheme="minorHAnsi" w:hAnsiTheme="minorHAnsi" w:cstheme="minorHAnsi"/>
           <w:szCs w:val="24"/>
         </w:rPr>
+        <w:lastRenderedPageBreak/>
         <w:t>Record the occurrence of marine debris collected during demersal trawling by using the draft protocol and take photos for future inclusion in the protocol itself.</w:t>
       </w:r>
     </w:p>
@@ -2827,7 +2840,10 @@
         <w:pStyle w:val="Heading2"/>
       </w:pPr>
       <w:r>
-        <w:t>6.</w:t>
+        <w:t>1</w:t>
+      </w:r>
+      <w:r>
+        <w:t>.</w:t>
       </w:r>
       <w:r>
         <w:t>3</w:t>
@@ -2852,7 +2868,14 @@
           <w:rFonts w:asciiTheme="minorHAnsi" w:hAnsiTheme="minorHAnsi" w:cstheme="minorHAnsi"/>
           <w:szCs w:val="24"/>
         </w:rPr>
-        <w:t>6.</w:t>
+        <w:t>1</w:t>
+      </w:r>
+      <w:r>
+        <w:rPr>
+          <w:rFonts w:asciiTheme="minorHAnsi" w:hAnsiTheme="minorHAnsi" w:cstheme="minorHAnsi"/>
+          <w:szCs w:val="24"/>
+        </w:rPr>
+        <w:t>.</w:t>
       </w:r>
       <w:r>
         <w:rPr>
@@ -3134,25 +3157,25 @@
           <w:color w:val="000000" w:themeColor="text1"/>
           <w:szCs w:val="24"/>
         </w:rPr>
+        <w:t xml:space="preserve">Zooplankton sampling will also be carried out at stations along the environmental superstation transects (see above), using WP2 and Bongo nets. </w:t>
+      </w:r>
+    </w:p>
+    <w:p>
+      <w:pPr>
+        <w:jc w:val="both"/>
+        <w:rPr>
+          <w:rFonts w:asciiTheme="minorHAnsi" w:hAnsiTheme="minorHAnsi" w:cstheme="minorHAnsi"/>
+          <w:color w:val="000000" w:themeColor="text1"/>
+          <w:szCs w:val="24"/>
+        </w:rPr>
+      </w:pPr>
+      <w:r>
+        <w:rPr>
+          <w:rFonts w:asciiTheme="minorHAnsi" w:hAnsiTheme="minorHAnsi" w:cstheme="minorHAnsi"/>
+          <w:color w:val="000000" w:themeColor="text1"/>
+          <w:szCs w:val="24"/>
+        </w:rPr>
         <w:lastRenderedPageBreak/>
-        <w:t xml:space="preserve">Zooplankton sampling will also be carried out at stations along the environmental superstation transects (see above), using WP2 and Bongo nets. </w:t>
-      </w:r>
-    </w:p>
-    <w:p>
-      <w:pPr>
-        <w:jc w:val="both"/>
-        <w:rPr>
-          <w:rFonts w:asciiTheme="minorHAnsi" w:hAnsiTheme="minorHAnsi" w:cstheme="minorHAnsi"/>
-          <w:color w:val="000000" w:themeColor="text1"/>
-          <w:szCs w:val="24"/>
-        </w:rPr>
-      </w:pPr>
-      <w:r>
-        <w:rPr>
-          <w:rFonts w:asciiTheme="minorHAnsi" w:hAnsiTheme="minorHAnsi" w:cstheme="minorHAnsi"/>
-          <w:color w:val="000000" w:themeColor="text1"/>
-          <w:szCs w:val="24"/>
-        </w:rPr>
         <w:t xml:space="preserve">Microplastic sampling using manta trawl will be carried out at the same stations as for zooplankton sampling. </w:t>
       </w:r>
     </w:p>
@@ -3315,7 +3338,14 @@
           <w:rFonts w:asciiTheme="minorHAnsi" w:hAnsiTheme="minorHAnsi" w:cstheme="minorHAnsi"/>
           <w:szCs w:val="24"/>
         </w:rPr>
-        <w:t>6.</w:t>
+        <w:t>1</w:t>
+      </w:r>
+      <w:r>
+        <w:rPr>
+          <w:rFonts w:asciiTheme="minorHAnsi" w:hAnsiTheme="minorHAnsi" w:cstheme="minorHAnsi"/>
+          <w:szCs w:val="24"/>
+        </w:rPr>
+        <w:t>.</w:t>
       </w:r>
       <w:r>
         <w:rPr>
@@ -3366,7 +3396,14 @@
           <w:rFonts w:asciiTheme="minorHAnsi" w:hAnsiTheme="minorHAnsi" w:cstheme="minorHAnsi"/>
           <w:szCs w:val="24"/>
         </w:rPr>
-        <w:t>6.3</w:t>
+        <w:t>1</w:t>
+      </w:r>
+      <w:r>
+        <w:rPr>
+          <w:rFonts w:asciiTheme="minorHAnsi" w:hAnsiTheme="minorHAnsi" w:cstheme="minorHAnsi"/>
+          <w:szCs w:val="24"/>
+        </w:rPr>
+        <w:t>.3</w:t>
       </w:r>
       <w:r>
         <w:rPr>
@@ -3432,7 +3469,14 @@
           <w:rFonts w:asciiTheme="minorHAnsi" w:hAnsiTheme="minorHAnsi" w:cstheme="minorHAnsi"/>
           <w:szCs w:val="24"/>
         </w:rPr>
-        <w:t>6.3</w:t>
+        <w:t>1</w:t>
+      </w:r>
+      <w:r>
+        <w:rPr>
+          <w:rFonts w:asciiTheme="minorHAnsi" w:hAnsiTheme="minorHAnsi" w:cstheme="minorHAnsi"/>
+          <w:szCs w:val="24"/>
+        </w:rPr>
+        <w:t>.3</w:t>
       </w:r>
       <w:r>
         <w:rPr>
@@ -3498,7 +3542,14 @@
           <w:rFonts w:asciiTheme="minorHAnsi" w:hAnsiTheme="minorHAnsi" w:cstheme="minorHAnsi"/>
           <w:szCs w:val="24"/>
         </w:rPr>
-        <w:t>6.3</w:t>
+        <w:t>1</w:t>
+      </w:r>
+      <w:r>
+        <w:rPr>
+          <w:rFonts w:asciiTheme="minorHAnsi" w:hAnsiTheme="minorHAnsi" w:cstheme="minorHAnsi"/>
+          <w:szCs w:val="24"/>
+        </w:rPr>
+        <w:t>.3</w:t>
       </w:r>
       <w:r>
         <w:rPr>
@@ -3634,50 +3685,80 @@
           <w:rFonts w:asciiTheme="minorHAnsi" w:hAnsiTheme="minorHAnsi" w:cstheme="minorHAnsi"/>
           <w:szCs w:val="24"/>
         </w:rPr>
+        <w:t>1</w:t>
+      </w:r>
+      <w:r>
+        <w:rPr>
+          <w:rFonts w:asciiTheme="minorHAnsi" w:hAnsiTheme="minorHAnsi" w:cstheme="minorHAnsi"/>
+          <w:szCs w:val="24"/>
+        </w:rPr>
+        <w:t>.3</w:t>
+      </w:r>
+      <w:r>
+        <w:rPr>
+          <w:rFonts w:asciiTheme="minorHAnsi" w:hAnsiTheme="minorHAnsi" w:cstheme="minorHAnsi"/>
+          <w:szCs w:val="24"/>
+        </w:rPr>
+        <w:t>.</w:t>
+      </w:r>
+      <w:r>
+        <w:rPr>
+          <w:rFonts w:asciiTheme="minorHAnsi" w:hAnsiTheme="minorHAnsi" w:cstheme="minorHAnsi"/>
+          <w:szCs w:val="24"/>
+        </w:rPr>
+        <w:t>2</w:t>
+      </w:r>
+      <w:r>
+        <w:rPr>
+          <w:rFonts w:asciiTheme="minorHAnsi" w:hAnsiTheme="minorHAnsi" w:cstheme="minorHAnsi"/>
+          <w:szCs w:val="24"/>
+        </w:rPr>
+        <w:t>.</w:t>
+      </w:r>
+      <w:r>
+        <w:rPr>
+          <w:rFonts w:asciiTheme="minorHAnsi" w:hAnsiTheme="minorHAnsi" w:cstheme="minorHAnsi"/>
+          <w:szCs w:val="24"/>
+        </w:rPr>
+        <w:t xml:space="preserve">4 </w:t>
+      </w:r>
+      <w:r>
+        <w:rPr>
+          <w:rFonts w:asciiTheme="minorHAnsi" w:hAnsiTheme="minorHAnsi" w:cstheme="minorHAnsi"/>
+          <w:szCs w:val="24"/>
+        </w:rPr>
+        <w:t>Current speed and direction measurements</w:t>
+      </w:r>
+      <w:r>
+        <w:rPr>
+          <w:rFonts w:asciiTheme="minorHAnsi" w:hAnsiTheme="minorHAnsi" w:cstheme="minorHAnsi"/>
+          <w:szCs w:val="24"/>
+        </w:rPr>
+        <w:t xml:space="preserve"> - ADCP</w:t>
+      </w:r>
+    </w:p>
+    <w:p>
+      <w:pPr>
+        <w:spacing w:after="120" w:line="240" w:lineRule="auto"/>
+        <w:rPr>
+          <w:rFonts w:asciiTheme="minorHAnsi" w:hAnsiTheme="minorHAnsi" w:cstheme="minorHAnsi"/>
+          <w:szCs w:val="24"/>
+        </w:rPr>
+      </w:pPr>
+      <w:r>
+        <w:rPr>
+          <w:rFonts w:asciiTheme="minorHAnsi" w:hAnsiTheme="minorHAnsi" w:cstheme="minorHAnsi"/>
+          <w:szCs w:val="24"/>
+        </w:rPr>
+        <w:t xml:space="preserve">Ocean current data is collected with a vessel-mounted Teledyne RDI Ocean Surveyor Acoustic Doppler Profiler operating at 150 kHz with a depth range of 400 m. The ADCP runs </w:t>
+      </w:r>
+      <w:r>
+        <w:rPr>
+          <w:rFonts w:asciiTheme="minorHAnsi" w:hAnsiTheme="minorHAnsi" w:cstheme="minorHAnsi"/>
+          <w:szCs w:val="24"/>
+        </w:rPr>
         <w:lastRenderedPageBreak/>
-        <w:t>6.3</w:t>
-      </w:r>
-      <w:r>
-        <w:rPr>
-          <w:rFonts w:asciiTheme="minorHAnsi" w:hAnsiTheme="minorHAnsi" w:cstheme="minorHAnsi"/>
-          <w:szCs w:val="24"/>
-        </w:rPr>
-        <w:t>.</w:t>
-      </w:r>
-      <w:r>
-        <w:rPr>
-          <w:rFonts w:asciiTheme="minorHAnsi" w:hAnsiTheme="minorHAnsi" w:cstheme="minorHAnsi"/>
-          <w:szCs w:val="24"/>
-        </w:rPr>
-        <w:t>2</w:t>
-      </w:r>
-      <w:r>
-        <w:rPr>
-          <w:rFonts w:asciiTheme="minorHAnsi" w:hAnsiTheme="minorHAnsi" w:cstheme="minorHAnsi"/>
-          <w:szCs w:val="24"/>
-        </w:rPr>
-        <w:t>.</w:t>
-      </w:r>
-      <w:r>
-        <w:rPr>
-          <w:rFonts w:asciiTheme="minorHAnsi" w:hAnsiTheme="minorHAnsi" w:cstheme="minorHAnsi"/>
-          <w:szCs w:val="24"/>
-        </w:rPr>
-        <w:t xml:space="preserve">4 </w:t>
-      </w:r>
-      <w:r>
-        <w:rPr>
-          <w:rFonts w:asciiTheme="minorHAnsi" w:hAnsiTheme="minorHAnsi" w:cstheme="minorHAnsi"/>
-          <w:szCs w:val="24"/>
-        </w:rPr>
-        <w:t>Current speed and direction measurements</w:t>
-      </w:r>
-      <w:r>
-        <w:rPr>
-          <w:rFonts w:asciiTheme="minorHAnsi" w:hAnsiTheme="minorHAnsi" w:cstheme="minorHAnsi"/>
-          <w:szCs w:val="24"/>
-        </w:rPr>
-        <w:t xml:space="preserve"> - ADCP</w:t>
+        <w:t>in narrow band mode and averages data in 8 m vertical bins. Heading, pitch, roll and positional data are acquired by a Kongsberg Marine SEAPATH unit. Teledyne’s VmDAS software is used to collect the raw current data, whereas the data is processed using software created at IMR.</w:t>
       </w:r>
     </w:p>
     <w:p>
@@ -3688,22 +3769,6 @@
           <w:szCs w:val="24"/>
         </w:rPr>
       </w:pPr>
-      <w:r>
-        <w:rPr>
-          <w:rFonts w:asciiTheme="minorHAnsi" w:hAnsiTheme="minorHAnsi" w:cstheme="minorHAnsi"/>
-          <w:szCs w:val="24"/>
-        </w:rPr>
-        <w:t>Ocean current data is collected with a vessel-mounted Teledyne RDI Ocean Surveyor Acoustic Doppler Profiler operating at 150 kHz with a depth range of 400 m. The ADCP runs in narrow band mode and averages data in 8 m vertical bins. Heading, pitch, roll and positional data are acquired by a Kongsberg Marine SEAPATH unit. Teledyne’s VmDAS software is used to collect the raw current data, whereas the data is processed using software created at IMR.</w:t>
-      </w:r>
-    </w:p>
-    <w:p>
-      <w:pPr>
-        <w:spacing w:after="120" w:line="240" w:lineRule="auto"/>
-        <w:rPr>
-          <w:rFonts w:asciiTheme="minorHAnsi" w:hAnsiTheme="minorHAnsi" w:cstheme="minorHAnsi"/>
-          <w:szCs w:val="24"/>
-        </w:rPr>
-      </w:pPr>
     </w:p>
     <w:p>
       <w:pPr>
@@ -3718,7 +3783,14 @@
           <w:rFonts w:asciiTheme="minorHAnsi" w:hAnsiTheme="minorHAnsi" w:cstheme="minorHAnsi"/>
           <w:szCs w:val="24"/>
         </w:rPr>
-        <w:t>6.3</w:t>
+        <w:t>1</w:t>
+      </w:r>
+      <w:r>
+        <w:rPr>
+          <w:rFonts w:asciiTheme="minorHAnsi" w:hAnsiTheme="minorHAnsi" w:cstheme="minorHAnsi"/>
+          <w:szCs w:val="24"/>
+        </w:rPr>
+        <w:t>.3</w:t>
       </w:r>
       <w:r>
         <w:rPr>
@@ -3764,7 +3836,7 @@
           <w:color w:val="4F81BD"/>
           <w:szCs w:val="24"/>
         </w:rPr>
-        <w:t>6.3</w:t>
+        <w:t>1</w:t>
       </w:r>
       <w:r>
         <w:rPr>
@@ -3776,7 +3848,7 @@
           <w:color w:val="4F81BD"/>
           <w:szCs w:val="24"/>
         </w:rPr>
-        <w:t>.</w:t>
+        <w:t>.3</w:t>
       </w:r>
       <w:r>
         <w:rPr>
@@ -3788,7 +3860,7 @@
           <w:color w:val="4F81BD"/>
           <w:szCs w:val="24"/>
         </w:rPr>
-        <w:t>3</w:t>
+        <w:t>.</w:t>
       </w:r>
       <w:r>
         <w:rPr>
@@ -3800,6 +3872,18 @@
           <w:color w:val="4F81BD"/>
           <w:szCs w:val="24"/>
         </w:rPr>
+        <w:t>3</w:t>
+      </w:r>
+      <w:r>
+        <w:rPr>
+          <w:rFonts w:asciiTheme="minorHAnsi" w:eastAsia="Times New Roman" w:hAnsiTheme="minorHAnsi" w:cstheme="minorHAnsi"/>
+          <w:b/>
+          <w:bCs/>
+          <w:i/>
+          <w:iCs/>
+          <w:color w:val="4F81BD"/>
+          <w:szCs w:val="24"/>
+        </w:rPr>
         <w:t>.1 CTD</w:t>
       </w:r>
     </w:p>
@@ -4002,7 +4086,7 @@
           <w:rFonts w:asciiTheme="minorHAnsi" w:hAnsiTheme="minorHAnsi" w:cstheme="minorHAnsi"/>
           <w:szCs w:val="24"/>
         </w:rPr>
-        <w:t>. Additional sampling devices will be deployed for collection of plankton (including ichthyoplankton) and microplastics. Additional CTD deployments will be carried out at each multinet station at Nola Bank (to 200 m) and 6 additional deep stations at Nola Bank. The water samples from the rosette bottles will be used for measurements of pH, total alkalinity, dissolved nutrients (nitrite, nitrate, silicate and phosphate), dissolved oxygen, chlorophyll-</w:t>
+        <w:t>. Additional sampling devices will be deployed for collection of plankton (including ichthyoplankton) and microplastics. The water samples from the rosette bottles will be used for measurements of pH, total alkalinity, dissolved nutrients (nitrite, nitrate, silicate and phosphate), dissolved oxygen, chlorophyll-</w:t>
       </w:r>
       <w:r>
         <w:rPr>
@@ -4071,7 +4155,19 @@
           <w:color w:val="4F81BD"/>
           <w:szCs w:val="24"/>
         </w:rPr>
-        <w:t>6.3</w:t>
+        <w:t>1</w:t>
+      </w:r>
+      <w:r>
+        <w:rPr>
+          <w:rFonts w:asciiTheme="minorHAnsi" w:eastAsia="Times New Roman" w:hAnsiTheme="minorHAnsi" w:cstheme="minorHAnsi"/>
+          <w:b/>
+          <w:bCs/>
+          <w:i/>
+          <w:iCs/>
+          <w:color w:val="4F81BD"/>
+          <w:szCs w:val="24"/>
+        </w:rPr>
+        <w:t>.3</w:t>
       </w:r>
       <w:r>
         <w:rPr>
@@ -4197,7 +4293,6 @@
           <w:rFonts w:asciiTheme="minorHAnsi" w:eastAsia="Arial" w:hAnsiTheme="minorHAnsi" w:cstheme="minorHAnsi"/>
           <w:szCs w:val="24"/>
         </w:rPr>
-        <w:lastRenderedPageBreak/>
         <w:t xml:space="preserve">pH is determined using an Agilent Cary 8454 UV-Vis Diode Array spectrophotometer and a 2-mM m-cresol purple indicator dye solution. See the pH protocol for further details in addition to sampling and analysis procedures. </w:t>
       </w:r>
     </w:p>
@@ -4221,6 +4316,7 @@
           <w:rFonts w:asciiTheme="minorHAnsi" w:eastAsia="Arial" w:hAnsiTheme="minorHAnsi" w:cstheme="minorHAnsi"/>
           <w:szCs w:val="24"/>
         </w:rPr>
+        <w:lastRenderedPageBreak/>
         <w:t>Total alkalinity is determined via an open-cell potentiometric titration using a 0.05 M HCl solution with a sodium chloride background as the titrant (Dickson et al. 2007). See the total alkalinity protocol for further details in addition to sampling and analysis procedures.</w:t>
       </w:r>
     </w:p>
@@ -4288,7 +4384,7 @@
           <w:color w:val="4F81BD"/>
           <w:szCs w:val="24"/>
         </w:rPr>
-        <w:t>6.3</w:t>
+        <w:t>1</w:t>
       </w:r>
       <w:r>
         <w:rPr>
@@ -4300,7 +4396,7 @@
           <w:color w:val="4F81BD"/>
           <w:szCs w:val="24"/>
         </w:rPr>
-        <w:t>.</w:t>
+        <w:t>.3</w:t>
       </w:r>
       <w:r>
         <w:rPr>
@@ -4312,7 +4408,7 @@
           <w:color w:val="4F81BD"/>
           <w:szCs w:val="24"/>
         </w:rPr>
-        <w:t>3</w:t>
+        <w:t>.</w:t>
       </w:r>
       <w:r>
         <w:rPr>
@@ -4324,7 +4420,7 @@
           <w:color w:val="4F81BD"/>
           <w:szCs w:val="24"/>
         </w:rPr>
-        <w:t xml:space="preserve">.3 </w:t>
+        <w:t>3</w:t>
       </w:r>
       <w:r>
         <w:rPr>
@@ -4336,6 +4432,18 @@
           <w:color w:val="4F81BD"/>
           <w:szCs w:val="24"/>
         </w:rPr>
+        <w:t xml:space="preserve">.3 </w:t>
+      </w:r>
+      <w:r>
+        <w:rPr>
+          <w:rFonts w:asciiTheme="minorHAnsi" w:eastAsia="Times New Roman" w:hAnsiTheme="minorHAnsi" w:cstheme="minorHAnsi"/>
+          <w:b/>
+          <w:bCs/>
+          <w:i/>
+          <w:iCs/>
+          <w:color w:val="4F81BD"/>
+          <w:szCs w:val="24"/>
+        </w:rPr>
         <w:t>Dissolved Nutrients</w:t>
       </w:r>
     </w:p>
@@ -4367,7 +4475,14 @@
           <w:rFonts w:asciiTheme="minorHAnsi" w:hAnsiTheme="minorHAnsi" w:cstheme="minorHAnsi"/>
           <w:szCs w:val="24"/>
         </w:rPr>
-        <w:t>6.3</w:t>
+        <w:t>1</w:t>
+      </w:r>
+      <w:r>
+        <w:rPr>
+          <w:rFonts w:asciiTheme="minorHAnsi" w:hAnsiTheme="minorHAnsi" w:cstheme="minorHAnsi"/>
+          <w:szCs w:val="24"/>
+        </w:rPr>
+        <w:t>.3</w:t>
       </w:r>
       <w:r>
         <w:rPr>
@@ -4424,41 +4539,6 @@
     </w:p>
     <w:p>
       <w:pPr>
-        <w:shd w:val="clear" w:color="auto" w:fill="FFFFFF" w:themeFill="background1"/>
-        <w:autoSpaceDE w:val="0"/>
-        <w:autoSpaceDN w:val="0"/>
-        <w:adjustRightInd w:val="0"/>
-        <w:spacing w:after="0"/>
-        <w:rPr>
-          <w:rFonts w:asciiTheme="minorHAnsi" w:hAnsiTheme="minorHAnsi" w:cstheme="minorHAnsi"/>
-          <w:color w:val="000000"/>
-          <w:szCs w:val="24"/>
-        </w:rPr>
-      </w:pPr>
-      <w:r>
-        <w:rPr>
-          <w:rFonts w:asciiTheme="minorHAnsi" w:hAnsiTheme="minorHAnsi" w:cstheme="minorHAnsi"/>
-          <w:szCs w:val="24"/>
-        </w:rPr>
-        <w:t>Qualitative phytoplankton samples are collected at selected stations in the studied area. A phytoplankton net (35 cm in diameter and mesh-size of 10 µm), is hauled vertically at a speed &lt;0.1 m s</w:t>
-      </w:r>
-      <w:r>
-        <w:rPr>
-          <w:rFonts w:asciiTheme="minorHAnsi" w:hAnsiTheme="minorHAnsi" w:cstheme="minorHAnsi"/>
-          <w:szCs w:val="24"/>
-        </w:rPr>
-        <w:t>^-1^</w:t>
-      </w:r>
-      <w:r>
-        <w:rPr>
-          <w:rFonts w:asciiTheme="minorHAnsi" w:hAnsiTheme="minorHAnsi" w:cstheme="minorHAnsi"/>
-          <w:szCs w:val="24"/>
-        </w:rPr>
-        <w:t>from the depth of 30 m to the surface (5 m above bottom at the 30 m stations). Samples will be preserved in the 100 ml dark glass bottles with the addition of 2 ml of neutral Lugol solution.</w:t>
-      </w:r>
-    </w:p>
-    <w:p>
-      <w:pPr>
         <w:spacing w:after="120"/>
         <w:rPr>
           <w:rFonts w:asciiTheme="minorHAnsi" w:hAnsiTheme="minorHAnsi" w:cstheme="minorHAnsi"/>
@@ -4479,8 +4559,14 @@
           <w:rFonts w:asciiTheme="minorHAnsi" w:hAnsiTheme="minorHAnsi" w:cstheme="minorHAnsi"/>
           <w:szCs w:val="24"/>
         </w:rPr>
-        <w:lastRenderedPageBreak/>
-        <w:t>6.3</w:t>
+        <w:t>1</w:t>
+      </w:r>
+      <w:r>
+        <w:rPr>
+          <w:rFonts w:asciiTheme="minorHAnsi" w:hAnsiTheme="minorHAnsi" w:cstheme="minorHAnsi"/>
+          <w:szCs w:val="24"/>
+        </w:rPr>
+        <w:t>.3</w:t>
       </w:r>
       <w:r>
         <w:rPr>
@@ -4532,7 +4618,56 @@
           <w:rFonts w:asciiTheme="minorHAnsi" w:hAnsiTheme="minorHAnsi" w:cstheme="minorHAnsi"/>
           <w:szCs w:val="24"/>
         </w:rPr>
-        <w:t xml:space="preserve"> collected at 29 selected stations. Samples will be collected by vertical hauls of a WP2 net (56 cm diameter, mesh size 180 µm) at a speed of 0.5 m sec</w:t>
+        <w:t xml:space="preserve"> collected </w:t>
+      </w:r>
+      <w:r>
+        <w:rPr>
+          <w:rFonts w:asciiTheme="minorHAnsi" w:hAnsiTheme="minorHAnsi" w:cstheme="minorHAnsi"/>
+          <w:szCs w:val="24"/>
+        </w:rPr>
+        <w:t xml:space="preserve">at </w:t>
+      </w:r>
+      <w:r>
+        <w:rPr>
+          <w:rFonts w:asciiTheme="minorHAnsi" w:hAnsiTheme="minorHAnsi" w:cstheme="minorHAnsi"/>
+          <w:szCs w:val="24"/>
+        </w:rPr>
+        <w:t xml:space="preserve">selected </w:t>
+      </w:r>
+      <w:r>
+        <w:rPr>
+          <w:rFonts w:asciiTheme="minorHAnsi" w:hAnsiTheme="minorHAnsi" w:cstheme="minorHAnsi"/>
+          <w:szCs w:val="24"/>
+        </w:rPr>
+        <w:t xml:space="preserve">superstations </w:t>
+      </w:r>
+      <w:r>
+        <w:rPr>
+          <w:rFonts w:asciiTheme="minorHAnsi" w:hAnsiTheme="minorHAnsi" w:cstheme="minorHAnsi"/>
+          <w:szCs w:val="24"/>
+        </w:rPr>
+        <w:t>stations</w:t>
+      </w:r>
+      <w:r>
+        <w:rPr>
+          <w:rFonts w:asciiTheme="minorHAnsi" w:hAnsiTheme="minorHAnsi" w:cstheme="minorHAnsi"/>
+          <w:szCs w:val="24"/>
+        </w:rPr>
+        <w:t xml:space="preserve"> </w:t>
+      </w:r>
+      <w:r>
+        <w:rPr>
+          <w:rFonts w:asciiTheme="minorHAnsi" w:hAnsiTheme="minorHAnsi" w:cstheme="minorHAnsi"/>
+          <w:szCs w:val="24"/>
+        </w:rPr>
+        <w:t>positioned at the isobaths 30 m, 100 m, 500 or 1000 m)</w:t>
+      </w:r>
+      <w:r>
+        <w:rPr>
+          <w:rFonts w:asciiTheme="minorHAnsi" w:hAnsiTheme="minorHAnsi" w:cstheme="minorHAnsi"/>
+          <w:szCs w:val="24"/>
+        </w:rPr>
+        <w:t>. Samples will be collected by vertical hauls of a WP2 net (56 cm diameter, mesh size 180 µm) at a speed of 0.5 m sec</w:t>
       </w:r>
       <w:r>
         <w:rPr>
@@ -4547,6 +4682,13 @@
           <w:szCs w:val="24"/>
         </w:rPr>
         <w:t xml:space="preserve">The net will be towed </w:t>
+      </w:r>
+      <w:r>
+        <w:rPr>
+          <w:rFonts w:asciiTheme="minorHAnsi" w:hAnsiTheme="minorHAnsi" w:cstheme="minorHAnsi"/>
+          <w:szCs w:val="24"/>
+        </w:rPr>
+        <w:t>**</w:t>
       </w:r>
       <w:r>
         <w:rPr>
@@ -4556,6 +4698,15 @@
           <w:szCs w:val="24"/>
         </w:rPr>
         <w:t>within 5 m from the bottom</w:t>
+      </w:r>
+      <w:r>
+        <w:rPr>
+          <w:rFonts w:asciiTheme="minorHAnsi" w:hAnsiTheme="minorHAnsi" w:cstheme="minorHAnsi"/>
+          <w:b/>
+          <w:bCs/>
+          <w:szCs w:val="24"/>
+        </w:rPr>
+        <w:t>**</w:t>
       </w:r>
       <w:r>
         <w:rPr>
@@ -4613,6 +4764,7 @@
           <w:szCs w:val="24"/>
           <w:lang w:val="en-US"/>
         </w:rPr>
+        <w:lastRenderedPageBreak/>
         <w:t xml:space="preserve">The sample will be halved into parts with a Motoda splitter. </w:t>
       </w:r>
     </w:p>
@@ -4780,7 +4932,14 @@
           <w:rFonts w:asciiTheme="minorHAnsi" w:hAnsiTheme="minorHAnsi" w:cstheme="minorHAnsi"/>
           <w:szCs w:val="24"/>
         </w:rPr>
-        <w:t>6.3</w:t>
+        <w:t>1</w:t>
+      </w:r>
+      <w:r>
+        <w:rPr>
+          <w:rFonts w:asciiTheme="minorHAnsi" w:hAnsiTheme="minorHAnsi" w:cstheme="minorHAnsi"/>
+          <w:szCs w:val="24"/>
+        </w:rPr>
+        <w:t>.3</w:t>
       </w:r>
       <w:r>
         <w:rPr>
@@ -5007,7 +5166,27 @@
           <w:szCs w:val="24"/>
           <w:lang w:val="en-US"/>
         </w:rPr>
-        <w:t xml:space="preserve">The sample of the left net (V) will be preserved directly in 4% borax buffered formaldehyde solution (especially made for ichthyoplankton).  </w:t>
+        <w:t xml:space="preserve">The sample of the right net (H) </w:t>
+      </w:r>
+      <w:r>
+        <w:rPr>
+          <w:rFonts w:asciiTheme="minorHAnsi" w:hAnsiTheme="minorHAnsi" w:cstheme="minorHAnsi"/>
+          <w:i w:val="0"/>
+          <w:iCs/>
+          <w:szCs w:val="24"/>
+          <w:lang w:val="en-US"/>
+        </w:rPr>
+        <w:t xml:space="preserve">will be preserved directly in </w:t>
+      </w:r>
+      <w:r>
+        <w:rPr>
+          <w:rFonts w:asciiTheme="minorHAnsi" w:hAnsiTheme="minorHAnsi" w:cstheme="minorHAnsi"/>
+          <w:i w:val="0"/>
+          <w:iCs/>
+          <w:szCs w:val="24"/>
+          <w:lang w:val="en-US"/>
+        </w:rPr>
+        <w:t>95% ethanol.</w:t>
       </w:r>
     </w:p>
     <w:p>
@@ -5052,7 +5231,7 @@
           <w:szCs w:val="24"/>
           <w:lang w:val="en-US"/>
         </w:rPr>
-        <w:t xml:space="preserve">The sample of the right net (H) will be used for estimation of the Zooplankton Displacement Volume (details in the Nansen Plankton Guidelines). Afterwards, the sample will be examined under the microscope and all fish larvae (and eggs if possible) will be sorted out. </w:t>
+        <w:t xml:space="preserve">The sample of the left net (V) </w:t>
       </w:r>
       <w:r>
         <w:rPr>
@@ -5060,8 +5239,9 @@
           <w:i w:val="0"/>
           <w:iCs/>
           <w:szCs w:val="24"/>
-        </w:rPr>
-        <w:t>Plankton examination should be done thoroughly and in small amounts</w:t>
+          <w:lang w:val="en-US"/>
+        </w:rPr>
+        <w:t xml:space="preserve">will be used for estimation of the Zooplankton Displacement Volume (details in the Nansen Plankton Guidelines). Afterwards, the sample will be examined under the microscope and all fish larvae (and eggs if possible) will be sorted out. </w:t>
       </w:r>
       <w:r>
         <w:rPr>
@@ -5069,9 +5249,8 @@
           <w:i w:val="0"/>
           <w:iCs/>
           <w:szCs w:val="24"/>
-          <w:lang w:val="en-US"/>
-        </w:rPr>
-        <w:t>;</w:t>
+        </w:rPr>
+        <w:t>Plankton examination should be done thoroughly and in small amounts</w:t>
       </w:r>
       <w:r>
         <w:rPr>
@@ -5080,7 +5259,7 @@
           <w:iCs/>
           <w:szCs w:val="24"/>
         </w:rPr>
-        <w:t xml:space="preserve"> during this process the rest of the sample should be kept cool (by the use of ice packs, fridge etc.). When sorting has finished, the bulk sample should be preserved in 96% ethanol (in bottles labelled bottles </w:t>
+        <w:t>.</w:t>
       </w:r>
       <w:r>
         <w:rPr>
@@ -5088,9 +5267,8 @@
           <w:i w:val="0"/>
           <w:iCs/>
           <w:szCs w:val="24"/>
-          <w:lang w:val="en-US"/>
-        </w:rPr>
-        <w:t>as “sorted”)</w:t>
+        </w:rPr>
+        <w:t xml:space="preserve"> When sorting has finished, the bulk sample should be preserved in </w:t>
       </w:r>
       <w:r>
         <w:rPr>
@@ -5099,7 +5277,7 @@
           <w:iCs/>
           <w:szCs w:val="24"/>
         </w:rPr>
-        <w:t xml:space="preserve">. </w:t>
+        <w:t>4%</w:t>
       </w:r>
       <w:r>
         <w:rPr>
@@ -5107,9 +5285,8 @@
           <w:i w:val="0"/>
           <w:iCs/>
           <w:szCs w:val="24"/>
-          <w:lang w:val="en-US"/>
-        </w:rPr>
-        <w:t xml:space="preserve">The sorted ichthyoplankton will be photographed and preserved in 96% ethanol for genetics in small labelled scintillation vials indicating clearly which net was used for sorting, the preservative, station etc. In case of lack of time or bad weather conditions, an alternative approach is to fix the total sample for ichthyoplankton without separating larvae from the sample onboard. </w:t>
+        </w:rPr>
+        <w:t xml:space="preserve"> </w:t>
       </w:r>
       <w:r>
         <w:rPr>
@@ -5117,10 +5294,112 @@
           <w:i w:val="0"/>
           <w:iCs/>
           <w:szCs w:val="24"/>
-          <w:lang w:val="en-US"/>
-        </w:rPr>
-        <w:lastRenderedPageBreak/>
-        <w:t xml:space="preserve">However, to the extent possible this method should be avoided. More details on the sample processing can be found in the </w:t>
+        </w:rPr>
+        <w:t xml:space="preserve"> formlaldehyde solution (especially made for ichthyoplankton)</w:t>
+      </w:r>
+      <w:r>
+        <w:rPr>
+          <w:rFonts w:asciiTheme="minorHAnsi" w:hAnsiTheme="minorHAnsi" w:cstheme="minorHAnsi"/>
+          <w:i w:val="0"/>
+          <w:iCs/>
+          <w:szCs w:val="24"/>
+        </w:rPr>
+        <w:t xml:space="preserve"> in bottles labelled bottles </w:t>
+      </w:r>
+      <w:r>
+        <w:rPr>
+          <w:rFonts w:asciiTheme="minorHAnsi" w:hAnsiTheme="minorHAnsi" w:cstheme="minorHAnsi"/>
+          <w:i w:val="0"/>
+          <w:iCs/>
+          <w:szCs w:val="24"/>
+          <w:lang w:val="en-US"/>
+        </w:rPr>
+        <w:t>as “sorted”</w:t>
+      </w:r>
+      <w:r>
+        <w:rPr>
+          <w:rFonts w:asciiTheme="minorHAnsi" w:hAnsiTheme="minorHAnsi" w:cstheme="minorHAnsi"/>
+          <w:i w:val="0"/>
+          <w:iCs/>
+          <w:szCs w:val="24"/>
+        </w:rPr>
+        <w:t xml:space="preserve">. </w:t>
+      </w:r>
+      <w:r>
+        <w:rPr>
+          <w:rFonts w:asciiTheme="minorHAnsi" w:hAnsiTheme="minorHAnsi" w:cstheme="minorHAnsi"/>
+          <w:i w:val="0"/>
+          <w:iCs/>
+          <w:szCs w:val="24"/>
+          <w:lang w:val="en-US"/>
+        </w:rPr>
+        <w:t>The sorted ichthyoplankton will be photographed and</w:t>
+      </w:r>
+      <w:r>
+        <w:rPr>
+          <w:rFonts w:asciiTheme="minorHAnsi" w:hAnsiTheme="minorHAnsi" w:cstheme="minorHAnsi"/>
+          <w:i w:val="0"/>
+          <w:iCs/>
+          <w:szCs w:val="24"/>
+          <w:lang w:val="en-US"/>
+        </w:rPr>
+        <w:t xml:space="preserve"> preserved with</w:t>
+      </w:r>
+      <w:r>
+        <w:rPr>
+          <w:rFonts w:asciiTheme="minorHAnsi" w:hAnsiTheme="minorHAnsi" w:cstheme="minorHAnsi"/>
+          <w:i w:val="0"/>
+          <w:iCs/>
+          <w:szCs w:val="24"/>
+          <w:lang w:val="en-US"/>
+        </w:rPr>
+        <w:t xml:space="preserve"> </w:t>
+      </w:r>
+      <w:r>
+        <w:rPr>
+          <w:rFonts w:asciiTheme="minorHAnsi" w:hAnsiTheme="minorHAnsi" w:cstheme="minorHAnsi"/>
+          <w:i w:val="0"/>
+          <w:iCs/>
+          <w:szCs w:val="24"/>
+        </w:rPr>
+        <w:t>4%</w:t>
+      </w:r>
+      <w:r>
+        <w:rPr>
+          <w:rFonts w:asciiTheme="minorHAnsi" w:hAnsiTheme="minorHAnsi" w:cstheme="minorHAnsi"/>
+          <w:i w:val="0"/>
+          <w:iCs/>
+          <w:szCs w:val="24"/>
+        </w:rPr>
+        <w:t xml:space="preserve"> </w:t>
+      </w:r>
+      <w:r>
+        <w:rPr>
+          <w:rFonts w:asciiTheme="minorHAnsi" w:hAnsiTheme="minorHAnsi" w:cstheme="minorHAnsi"/>
+          <w:i w:val="0"/>
+          <w:iCs/>
+          <w:szCs w:val="24"/>
+        </w:rPr>
+        <w:t xml:space="preserve"> formlaldehyde solution (especially made for ichthyoplankton)</w:t>
+      </w:r>
+      <w:r>
+        <w:rPr>
+          <w:rFonts w:asciiTheme="minorHAnsi" w:hAnsiTheme="minorHAnsi" w:cstheme="minorHAnsi"/>
+          <w:i w:val="0"/>
+          <w:iCs/>
+          <w:szCs w:val="24"/>
+        </w:rPr>
+        <w:t xml:space="preserve"> </w:t>
+      </w:r>
+      <w:r>
+        <w:rPr>
+          <w:rFonts w:asciiTheme="minorHAnsi" w:hAnsiTheme="minorHAnsi" w:cstheme="minorHAnsi"/>
+          <w:i w:val="0"/>
+          <w:iCs/>
+          <w:szCs w:val="24"/>
+          <w:lang w:val="en-US"/>
+        </w:rPr>
+        <w:t xml:space="preserve">in small labelled scintillation vials indicating clearly which net was used for sorting, the preservative, station etc. In case of lack of time or bad weather conditions, an alternative approach is to fix the total sample for ichthyoplankton without separating larvae from the sample onboard. However, to the extent possible this method should be avoided. More details on the sample processing can be found in the </w:t>
       </w:r>
       <w:r>
         <w:rPr>
@@ -5177,6 +5456,57 @@
     <w:p>
       <w:pPr>
         <w:pStyle w:val="BodyText"/>
+        <w:widowControl w:val="0"/>
+        <w:tabs>
+          <w:tab w:val="clear" w:pos="-720"/>
+          <w:tab w:val="left" w:pos="720"/>
+          <w:tab w:val="left" w:pos="1440"/>
+          <w:tab w:val="left" w:pos="2160"/>
+          <w:tab w:val="left" w:pos="2880"/>
+          <w:tab w:val="left" w:pos="3600"/>
+          <w:tab w:val="left" w:pos="4320"/>
+          <w:tab w:val="left" w:pos="5040"/>
+          <w:tab w:val="left" w:pos="5760"/>
+          <w:tab w:val="left" w:pos="6480"/>
+          <w:tab w:val="left" w:pos="7200"/>
+          <w:tab w:val="left" w:pos="7920"/>
+          <w:tab w:val="left" w:pos="8640"/>
+        </w:tabs>
+        <w:snapToGrid w:val="0"/>
+        <w:spacing w:after="120" w:line="276" w:lineRule="auto"/>
+        <w:rPr>
+          <w:rFonts w:asciiTheme="minorHAnsi" w:hAnsiTheme="minorHAnsi" w:cstheme="minorHAnsi"/>
+          <w:i w:val="0"/>
+          <w:iCs/>
+          <w:szCs w:val="24"/>
+          <w:lang w:val="en-US"/>
+        </w:rPr>
+      </w:pPr>
+    </w:p>
+    <w:p>
+      <w:pPr>
+        <w:pStyle w:val="BodyText"/>
+        <w:widowControl w:val="0"/>
+        <w:numPr>
+          <w:ilvl w:val="0"/>
+          <w:numId w:val="11"/>
+        </w:numPr>
+        <w:tabs>
+          <w:tab w:val="clear" w:pos="-720"/>
+          <w:tab w:val="left" w:pos="720"/>
+          <w:tab w:val="left" w:pos="1440"/>
+          <w:tab w:val="left" w:pos="2160"/>
+          <w:tab w:val="left" w:pos="2880"/>
+          <w:tab w:val="left" w:pos="3600"/>
+          <w:tab w:val="left" w:pos="4320"/>
+          <w:tab w:val="left" w:pos="5040"/>
+          <w:tab w:val="left" w:pos="5760"/>
+          <w:tab w:val="left" w:pos="6480"/>
+          <w:tab w:val="left" w:pos="7200"/>
+          <w:tab w:val="left" w:pos="7920"/>
+          <w:tab w:val="left" w:pos="8640"/>
+        </w:tabs>
+        <w:snapToGrid w:val="0"/>
         <w:spacing w:after="120" w:line="276" w:lineRule="auto"/>
         <w:rPr>
           <w:rFonts w:asciiTheme="minorHAnsi" w:hAnsiTheme="minorHAnsi" w:cstheme="minorHAnsi"/>
@@ -5276,7 +5606,15 @@
           <w:rFonts w:asciiTheme="minorHAnsi" w:hAnsiTheme="minorHAnsi" w:cstheme="minorHAnsi"/>
           <w:szCs w:val="24"/>
         </w:rPr>
-        <w:t>6.3</w:t>
+        <w:lastRenderedPageBreak/>
+        <w:t>1</w:t>
+      </w:r>
+      <w:r>
+        <w:rPr>
+          <w:rFonts w:asciiTheme="minorHAnsi" w:hAnsiTheme="minorHAnsi" w:cstheme="minorHAnsi"/>
+          <w:szCs w:val="24"/>
+        </w:rPr>
+        <w:t>.3</w:t>
       </w:r>
       <w:r>
         <w:rPr>
@@ -5329,7 +5667,7 @@
           <w:color w:val="4F81BD"/>
           <w:szCs w:val="24"/>
         </w:rPr>
-        <w:t>6.3</w:t>
+        <w:t>1</w:t>
       </w:r>
       <w:r>
         <w:rPr>
@@ -5341,7 +5679,7 @@
           <w:color w:val="4F81BD"/>
           <w:szCs w:val="24"/>
         </w:rPr>
-        <w:t>.</w:t>
+        <w:t>.3</w:t>
       </w:r>
       <w:r>
         <w:rPr>
@@ -5353,7 +5691,7 @@
           <w:color w:val="4F81BD"/>
           <w:szCs w:val="24"/>
         </w:rPr>
-        <w:t>7</w:t>
+        <w:t>.</w:t>
       </w:r>
       <w:r>
         <w:rPr>
@@ -5365,7 +5703,7 @@
           <w:color w:val="4F81BD"/>
           <w:szCs w:val="24"/>
         </w:rPr>
-        <w:t xml:space="preserve">.1 </w:t>
+        <w:t>7</w:t>
       </w:r>
       <w:r>
         <w:rPr>
@@ -5377,6 +5715,18 @@
           <w:color w:val="4F81BD"/>
           <w:szCs w:val="24"/>
         </w:rPr>
+        <w:t xml:space="preserve">.1 </w:t>
+      </w:r>
+      <w:r>
+        <w:rPr>
+          <w:rFonts w:asciiTheme="minorHAnsi" w:eastAsia="Times New Roman" w:hAnsiTheme="minorHAnsi" w:cstheme="minorHAnsi"/>
+          <w:b/>
+          <w:bCs/>
+          <w:i/>
+          <w:iCs/>
+          <w:color w:val="4F81BD"/>
+          <w:szCs w:val="24"/>
+        </w:rPr>
         <w:t>Bottom habitats</w:t>
       </w:r>
     </w:p>
@@ -5398,38 +5748,194 @@
         </w:rPr>
         <w:t xml:space="preserve">The EM 710 and EM 302 multibeam </w:t>
       </w:r>
-      <w:hyperlink r:id="rId17">
+      <w:r>
+        <w:rPr>
+          <w:rFonts w:asciiTheme="minorHAnsi" w:hAnsiTheme="minorHAnsi" w:cstheme="minorHAnsi"/>
+          <w:i w:val="0"/>
+          <w:szCs w:val="24"/>
+        </w:rPr>
+        <w:t>bottom mapping echosounders</w:t>
+      </w:r>
+      <w:r>
+        <w:rPr>
+          <w:rFonts w:asciiTheme="minorHAnsi" w:hAnsiTheme="minorHAnsi" w:cstheme="minorHAnsi"/>
+          <w:i w:val="0"/>
+          <w:color w:val="000000" w:themeColor="text1"/>
+          <w:szCs w:val="24"/>
+        </w:rPr>
+        <w:t xml:space="preserve"> will be used to record and store bottom depth information in the Olex system onboard. The EM 710 is a high to very high-resolution seabed mapping system for depth &lt;1500 m while the EM 302 is designed to map the ocean floor at depths down to 7000 m.</w:t>
+      </w:r>
+    </w:p>
+    <w:p>
+      <w:pPr>
+        <w:jc w:val="both"/>
+        <w:rPr>
+          <w:rFonts w:asciiTheme="minorHAnsi" w:hAnsiTheme="minorHAnsi" w:cstheme="minorHAnsi"/>
+          <w:b/>
+          <w:bCs/>
+          <w:szCs w:val="24"/>
+          <w:lang w:val="en-US"/>
+        </w:rPr>
+      </w:pPr>
+      <w:r>
+        <w:rPr>
+          <w:rFonts w:asciiTheme="minorHAnsi" w:hAnsiTheme="minorHAnsi" w:cstheme="minorHAnsi"/>
+          <w:b/>
+          <w:bCs/>
+          <w:szCs w:val="24"/>
+          <w:lang w:val="en-US"/>
+        </w:rPr>
+        <w:t>_</w:t>
+      </w:r>
+      <w:r>
+        <w:rPr>
+          <w:rFonts w:asciiTheme="minorHAnsi" w:hAnsiTheme="minorHAnsi" w:cstheme="minorHAnsi"/>
+          <w:b/>
+          <w:bCs/>
+          <w:szCs w:val="24"/>
+          <w:lang w:val="en-US"/>
+        </w:rPr>
+        <w:t>Benthic macrofauna and sediment</w:t>
+      </w:r>
+      <w:r>
+        <w:rPr>
+          <w:rFonts w:asciiTheme="minorHAnsi" w:hAnsiTheme="minorHAnsi" w:cstheme="minorHAnsi"/>
+          <w:b/>
+          <w:bCs/>
+          <w:szCs w:val="24"/>
+          <w:lang w:val="en-US"/>
+        </w:rPr>
+        <w:t>_</w:t>
+      </w:r>
+    </w:p>
+    <w:p>
+      <w:pPr>
+        <w:jc w:val="both"/>
+        <w:rPr>
+          <w:rFonts w:asciiTheme="minorHAnsi" w:hAnsiTheme="minorHAnsi" w:cstheme="minorHAnsi"/>
+          <w:szCs w:val="24"/>
+          <w:lang w:val="en-US"/>
+        </w:rPr>
+      </w:pPr>
+      <w:r>
+        <w:rPr>
+          <w:rFonts w:asciiTheme="minorHAnsi" w:hAnsiTheme="minorHAnsi" w:cstheme="minorHAnsi"/>
+          <w:szCs w:val="24"/>
+          <w:lang w:val="en-US"/>
+        </w:rPr>
+        <w:t>CHECK PROTOCOL</w:t>
+      </w:r>
+    </w:p>
+    <w:p>
+      <w:pPr>
+        <w:jc w:val="both"/>
+        <w:rPr>
+          <w:rFonts w:asciiTheme="minorHAnsi" w:hAnsiTheme="minorHAnsi" w:cstheme="minorHAnsi"/>
+          <w:szCs w:val="24"/>
+          <w:lang w:val="en-US"/>
+        </w:rPr>
+      </w:pPr>
+      <w:r>
+        <w:rPr>
+          <w:rFonts w:asciiTheme="minorHAnsi" w:hAnsiTheme="minorHAnsi" w:cstheme="minorHAnsi"/>
+          <w:szCs w:val="24"/>
+          <w:lang w:val="en-US"/>
+        </w:rPr>
+        <w:t xml:space="preserve">The benthic macrofauna sampled using a 0.1 m2 van Veen grab BOX CORER?. Three stations, at 50 m; 100 m and 500 m depth, to be sampled </w:t>
+      </w:r>
+      <w:r>
+        <w:rPr>
+          <w:rFonts w:asciiTheme="minorHAnsi" w:hAnsiTheme="minorHAnsi" w:cstheme="minorHAnsi"/>
+          <w:szCs w:val="24"/>
+          <w:lang w:val="en-US"/>
+        </w:rPr>
+        <w:t>along the evironmental transect with superstations (</w:t>
+      </w:r>
+      <w:r>
+        <w:rPr>
+          <w:rFonts w:asciiTheme="minorHAnsi" w:hAnsiTheme="minorHAnsi" w:cstheme="minorHAnsi"/>
+          <w:szCs w:val="24"/>
+          <w:lang w:val="en-US"/>
+        </w:rPr>
+        <w:t xml:space="preserve">every 1° latitude during the whole cruise </w:t>
+      </w:r>
+      <w:r>
+        <w:rPr>
+          <w:rFonts w:asciiTheme="minorHAnsi" w:hAnsiTheme="minorHAnsi" w:cstheme="minorHAnsi"/>
+          <w:szCs w:val="24"/>
+          <w:lang w:val="en-US"/>
+        </w:rPr>
+        <w:t xml:space="preserve">- </w:t>
+      </w:r>
+      <w:r>
+        <w:rPr>
+          <w:rFonts w:asciiTheme="minorHAnsi" w:hAnsiTheme="minorHAnsi" w:cstheme="minorHAnsi"/>
+          <w:szCs w:val="24"/>
+          <w:lang w:val="en-US"/>
+        </w:rPr>
+        <w:t xml:space="preserve">every third transect). Two replicates will be taken at each grab station. </w:t>
+      </w:r>
+      <w:r>
+        <w:rPr>
+          <w:rFonts w:asciiTheme="minorHAnsi" w:hAnsiTheme="minorHAnsi" w:cstheme="minorHAnsi"/>
+          <w:szCs w:val="24"/>
+          <w:lang w:val="en-US"/>
+        </w:rPr>
+        <w:t xml:space="preserve">Sampling will be done in accordance with the </w:t>
+      </w:r>
+      <w:r>
+        <w:rPr>
+          <w:rFonts w:asciiTheme="minorHAnsi" w:hAnsiTheme="minorHAnsi" w:cstheme="minorHAnsi"/>
+          <w:b/>
+          <w:bCs/>
+          <w:szCs w:val="24"/>
+          <w:lang w:val="en-US"/>
+        </w:rPr>
+        <w:t xml:space="preserve">Nansen Benthos Sampling </w:t>
+      </w:r>
+      <w:r>
+        <w:rPr>
+          <w:rFonts w:asciiTheme="minorHAnsi" w:hAnsiTheme="minorHAnsi" w:cstheme="minorHAnsi"/>
+          <w:b/>
+          <w:bCs/>
+          <w:szCs w:val="24"/>
+          <w:lang w:val="en-US"/>
+        </w:rPr>
+        <w:t>Procedures</w:t>
+      </w:r>
+      <w:r>
+        <w:rPr>
+          <w:rFonts w:asciiTheme="minorHAnsi" w:hAnsiTheme="minorHAnsi" w:cstheme="minorHAnsi"/>
+          <w:b/>
+          <w:bCs/>
+          <w:szCs w:val="24"/>
+          <w:lang w:val="en-US"/>
+        </w:rPr>
+        <w:t xml:space="preserve"> (see: </w:t>
+      </w:r>
+      <w:hyperlink r:id="rId17" w:history="1">
         <w:r>
           <w:rPr>
             <w:rStyle w:val="Hyperlink"/>
             <w:rFonts w:asciiTheme="minorHAnsi" w:hAnsiTheme="minorHAnsi" w:cstheme="minorHAnsi"/>
-            <w:i w:val="0"/>
+            <w:b/>
+            <w:bCs/>
             <w:szCs w:val="24"/>
+            <w:lang w:val="en-US"/>
           </w:rPr>
-          <w:t>bottom mapping echosounders</w:t>
+          <w:t>https://nansen-surveys.imr.no/lib/exe/fetch.php?media=nansen-surveys:benthos_benthos_sampling_procedure_nansen.pdf</w:t>
         </w:r>
       </w:hyperlink>
       <w:r>
         <w:rPr>
           <w:rFonts w:asciiTheme="minorHAnsi" w:hAnsiTheme="minorHAnsi" w:cstheme="minorHAnsi"/>
-          <w:i w:val="0"/>
-          <w:color w:val="000000" w:themeColor="text1"/>
-          <w:szCs w:val="24"/>
-        </w:rPr>
-        <w:t xml:space="preserve"> will be used to record and store bottom depth information in the Olex system onboard. The EM 710 is a high to very high-resolution seabed mapping system for depth &lt;1500 m while the EM 302 is designed to map the ocean floor at depths down to 7000 m.</w:t>
-      </w:r>
-    </w:p>
-    <w:p>
-      <w:pPr>
-        <w:jc w:val="both"/>
-        <w:rPr>
-          <w:rFonts w:asciiTheme="minorHAnsi" w:hAnsiTheme="minorHAnsi" w:cstheme="minorHAnsi"/>
           <w:b/>
           <w:bCs/>
           <w:szCs w:val="24"/>
           <w:lang w:val="en-US"/>
         </w:rPr>
-      </w:pPr>
+        <w:t>)</w:t>
+      </w:r>
       <w:r>
         <w:rPr>
           <w:rFonts w:asciiTheme="minorHAnsi" w:hAnsiTheme="minorHAnsi" w:cstheme="minorHAnsi"/>
@@ -5438,7 +5944,7 @@
           <w:szCs w:val="24"/>
           <w:lang w:val="en-US"/>
         </w:rPr>
-        <w:t>_</w:t>
+        <w:t xml:space="preserve"> and the Sampling </w:t>
       </w:r>
       <w:r>
         <w:rPr>
@@ -5448,8 +5954,21 @@
           <w:szCs w:val="24"/>
           <w:lang w:val="en-US"/>
         </w:rPr>
-        <w:t>Benthic macrofauna and sediment</w:t>
-      </w:r>
+        <w:t xml:space="preserve">Processing diagrams (see: </w:t>
+      </w:r>
+      <w:hyperlink r:id="rId18" w:history="1">
+        <w:r>
+          <w:rPr>
+            <w:rStyle w:val="Hyperlink"/>
+            <w:rFonts w:asciiTheme="minorHAnsi" w:hAnsiTheme="minorHAnsi" w:cstheme="minorHAnsi"/>
+            <w:b/>
+            <w:bCs/>
+            <w:szCs w:val="24"/>
+            <w:lang w:val="en-US"/>
+          </w:rPr>
+          <w:t>https://nansen-surveys.imr.no/lib/exe/fetch.php?media=nansen-surveys:benthos_processing_benthos_samples_float_diagrams_for_general_overview.docx</w:t>
+        </w:r>
+      </w:hyperlink>
       <w:r>
         <w:rPr>
           <w:rFonts w:asciiTheme="minorHAnsi" w:hAnsiTheme="minorHAnsi" w:cstheme="minorHAnsi"/>
@@ -5458,7 +5977,15 @@
           <w:szCs w:val="24"/>
           <w:lang w:val="en-US"/>
         </w:rPr>
-        <w:t>_</w:t>
+        <w:t xml:space="preserve">) </w:t>
+      </w:r>
+      <w:r>
+        <w:rPr>
+          <w:rFonts w:asciiTheme="minorHAnsi" w:hAnsiTheme="minorHAnsi" w:cstheme="minorHAnsi"/>
+          <w:szCs w:val="24"/>
+          <w:lang w:val="en-US"/>
+        </w:rPr>
+        <w:t xml:space="preserve">.  </w:t>
       </w:r>
     </w:p>
     <w:p>
@@ -5476,7 +6003,7 @@
           <w:szCs w:val="24"/>
           <w:lang w:val="en-US"/>
         </w:rPr>
-        <w:t>CHECK PROTOCOL</w:t>
+        <w:t xml:space="preserve">Separate sediment into light- and heavy fraction and fix in 8% borax pre-buffered formaldehyde (formalin) or 95% ethanol. </w:t>
       </w:r>
     </w:p>
     <w:p>
@@ -5494,42 +6021,6 @@
           <w:szCs w:val="24"/>
           <w:lang w:val="en-US"/>
         </w:rPr>
-        <w:t xml:space="preserve">The benthic macrofauna sampled using a 0.1 m2 van Veen grab BOX CORER?. Three stations, at 50 m; 100 m and 500 m depth, to be sampled every 1° latitude during the whole cruise (every third transect). Two replicates will be taken at each grab station. </w:t>
-      </w:r>
-    </w:p>
-    <w:p>
-      <w:pPr>
-        <w:jc w:val="both"/>
-        <w:rPr>
-          <w:rFonts w:asciiTheme="minorHAnsi" w:hAnsiTheme="minorHAnsi" w:cstheme="minorHAnsi"/>
-          <w:szCs w:val="24"/>
-          <w:lang w:val="en-US"/>
-        </w:rPr>
-      </w:pPr>
-      <w:r>
-        <w:rPr>
-          <w:rFonts w:asciiTheme="minorHAnsi" w:hAnsiTheme="minorHAnsi" w:cstheme="minorHAnsi"/>
-          <w:szCs w:val="24"/>
-          <w:lang w:val="en-US"/>
-        </w:rPr>
-        <w:t xml:space="preserve">Separate sediment into light- and heavy fraction and fix in 8% borax pre-buffered formaldehyde (formalin) or 95% ethanol. </w:t>
-      </w:r>
-    </w:p>
-    <w:p>
-      <w:pPr>
-        <w:jc w:val="both"/>
-        <w:rPr>
-          <w:rFonts w:asciiTheme="minorHAnsi" w:hAnsiTheme="minorHAnsi" w:cstheme="minorHAnsi"/>
-          <w:szCs w:val="24"/>
-          <w:lang w:val="en-US"/>
-        </w:rPr>
-      </w:pPr>
-      <w:r>
-        <w:rPr>
-          <w:rFonts w:asciiTheme="minorHAnsi" w:hAnsiTheme="minorHAnsi" w:cstheme="minorHAnsi"/>
-          <w:szCs w:val="24"/>
-          <w:lang w:val="en-US"/>
-        </w:rPr>
         <w:t>Screen the heavy fraction through two sieves of mesh size 1.0 mm and 0.5 mm, the light fraction only through a sieve with mesh size 0.5 mm. Transfer the sediment retained in each sieve to plastic containers and label. Larger animals to be sorted out immediately and fixed on separate containers. For the samples fixed in ethanol, this to be changed within 24 hours and then again, the next day to secure the quality of the material</w:t>
       </w:r>
       <w:r>
@@ -5543,22 +6034,6 @@
     </w:p>
     <w:p>
       <w:pPr>
-        <w:jc w:val="both"/>
-        <w:rPr>
-          <w:rFonts w:asciiTheme="minorHAnsi" w:hAnsiTheme="minorHAnsi" w:cstheme="minorHAnsi"/>
-          <w:szCs w:val="24"/>
-        </w:rPr>
-      </w:pPr>
-      <w:r>
-        <w:rPr>
-          <w:rFonts w:asciiTheme="minorHAnsi" w:hAnsiTheme="minorHAnsi" w:cstheme="minorHAnsi"/>
-          <w:szCs w:val="24"/>
-        </w:rPr>
-        <w:t>Collect sediment cores in selected sites to reconstruct development in OMZ.</w:t>
-      </w:r>
-    </w:p>
-    <w:p>
-      <w:pPr>
         <w:pStyle w:val="Heading3"/>
         <w:rPr>
           <w:rFonts w:asciiTheme="minorHAnsi" w:hAnsiTheme="minorHAnsi" w:cstheme="minorHAnsi"/>
@@ -5570,7 +6045,14 @@
           <w:rFonts w:asciiTheme="minorHAnsi" w:hAnsiTheme="minorHAnsi" w:cstheme="minorHAnsi"/>
           <w:szCs w:val="24"/>
         </w:rPr>
-        <w:t>6.3</w:t>
+        <w:t>1</w:t>
+      </w:r>
+      <w:r>
+        <w:rPr>
+          <w:rFonts w:asciiTheme="minorHAnsi" w:hAnsiTheme="minorHAnsi" w:cstheme="minorHAnsi"/>
+          <w:szCs w:val="24"/>
+        </w:rPr>
+        <w:t>.3</w:t>
       </w:r>
       <w:r>
         <w:rPr>
@@ -5682,7 +6164,6 @@
           <w:szCs w:val="24"/>
           <w:lang w:val="sv-SE"/>
         </w:rPr>
-        <w:lastRenderedPageBreak/>
         <w:t>**Microplastics</w:t>
       </w:r>
       <w:r>
@@ -5729,6 +6210,7 @@
           <w:szCs w:val="24"/>
           <w:lang w:val="sv-SE"/>
         </w:rPr>
+        <w:lastRenderedPageBreak/>
         <w:t>**Larval fish:**</w:t>
       </w:r>
       <w:r>
@@ -5806,7 +6288,14 @@
           <w:rFonts w:asciiTheme="minorHAnsi" w:hAnsiTheme="minorHAnsi" w:cstheme="minorHAnsi"/>
           <w:szCs w:val="24"/>
         </w:rPr>
-        <w:t>6.3</w:t>
+        <w:t>1</w:t>
+      </w:r>
+      <w:r>
+        <w:rPr>
+          <w:rFonts w:asciiTheme="minorHAnsi" w:hAnsiTheme="minorHAnsi" w:cstheme="minorHAnsi"/>
+          <w:szCs w:val="24"/>
+        </w:rPr>
+        <w:t>.3</w:t>
       </w:r>
       <w:r>
         <w:rPr>
@@ -5993,7 +6482,14 @@
           <w:rFonts w:asciiTheme="minorHAnsi" w:hAnsiTheme="minorHAnsi" w:cstheme="minorHAnsi"/>
           <w:szCs w:val="24"/>
         </w:rPr>
-        <w:t>6.3</w:t>
+        <w:t>1</w:t>
+      </w:r>
+      <w:r>
+        <w:rPr>
+          <w:rFonts w:asciiTheme="minorHAnsi" w:hAnsiTheme="minorHAnsi" w:cstheme="minorHAnsi"/>
+          <w:szCs w:val="24"/>
+        </w:rPr>
+        <w:t>.3</w:t>
       </w:r>
       <w:r>
         <w:rPr>
@@ -6054,167 +6550,71 @@
     </w:p>
     <w:p>
       <w:pPr>
-        <w:pStyle w:val="BodyText"/>
-        <w:snapToGrid w:val="0"/>
-        <w:spacing w:after="120" w:line="276" w:lineRule="auto"/>
-        <w:rPr>
-          <w:rFonts w:asciiTheme="minorHAnsi" w:hAnsiTheme="minorHAnsi" w:cstheme="minorHAnsi"/>
-          <w:i w:val="0"/>
-          <w:spacing w:val="0"/>
-          <w:szCs w:val="24"/>
-        </w:rPr>
-      </w:pPr>
-      <w:r>
-        <w:rPr>
-          <w:rFonts w:asciiTheme="minorHAnsi" w:hAnsiTheme="minorHAnsi" w:cstheme="minorHAnsi"/>
-          <w:i w:val="0"/>
-          <w:spacing w:val="0"/>
-          <w:szCs w:val="24"/>
-        </w:rPr>
-        <w:t>Conduct length-weight measurements (up to 100 length and 30 weight measurements for each species caught), and standard biological sampling for all priority species at all stations that they are caught according to the length-stratified sampling protocol</w:t>
-      </w:r>
-      <w:r>
-        <w:rPr>
-          <w:rFonts w:asciiTheme="minorHAnsi" w:hAnsiTheme="minorHAnsi" w:cstheme="minorHAnsi"/>
-          <w:i w:val="0"/>
-          <w:spacing w:val="0"/>
+        <w:rPr>
+          <w:rFonts w:asciiTheme="minorHAnsi" w:hAnsiTheme="minorHAnsi" w:cstheme="minorHAnsi"/>
+          <w:szCs w:val="24"/>
+        </w:rPr>
+      </w:pPr>
+      <w:r>
+        <w:rPr>
+          <w:rFonts w:asciiTheme="minorHAnsi" w:hAnsiTheme="minorHAnsi" w:cstheme="minorHAnsi"/>
+          <w:szCs w:val="24"/>
+        </w:rPr>
+        <w:t xml:space="preserve">Conduct length-weight measurements (up to 100 length and 30 weight measurements for each species caught), and standard biological sampling for all priority species at all stations that they are caught according to Table \@ref(tab:SObiosamplingtab). Further samples for genetics, and taxonomy will be taken for priority species according to the sampling protocols (Table \@ref(tab:SObiosamplingtab)).  </w:t>
+      </w:r>
+    </w:p>
+    <w:p>
+      <w:pPr>
+        <w:rPr>
+          <w:rFonts w:asciiTheme="minorHAnsi" w:hAnsiTheme="minorHAnsi" w:cstheme="minorHAnsi"/>
+          <w:szCs w:val="24"/>
+        </w:rPr>
+      </w:pPr>
+      <w:r>
+        <w:rPr>
+          <w:rFonts w:asciiTheme="minorHAnsi" w:hAnsiTheme="minorHAnsi" w:cstheme="minorHAnsi"/>
+          <w:szCs w:val="24"/>
+        </w:rPr>
+        <w:t>The catch will be sorted, subsampled if necessary, and subsamples will be taken to measure number and weight by taxon. Taxa in the catch are to be identified to the lowest possible taxonomic level. At each trawl haul, length measurements will be taken for all priority species (Table \@ref(tab:SObiosamplingtab)) with an Electronic Fish Meter connected to a customized data acquisition system (Sea2Data).</w:t>
+      </w:r>
+      <w:r>
+        <w:rPr>
+          <w:rFonts w:asciiTheme="minorHAnsi" w:hAnsiTheme="minorHAnsi" w:cstheme="minorHAnsi"/>
           <w:szCs w:val="24"/>
         </w:rPr>
         <w:t xml:space="preserve"> </w:t>
       </w:r>
-      <w:r>
-        <w:rPr>
-          <w:rFonts w:asciiTheme="minorHAnsi" w:hAnsiTheme="minorHAnsi" w:cstheme="minorHAnsi"/>
-          <w:i w:val="0"/>
-          <w:spacing w:val="0"/>
-          <w:szCs w:val="24"/>
-        </w:rPr>
-        <w:t>(</w:t>
-      </w:r>
-      <w:r>
-        <w:rPr>
-          <w:rFonts w:asciiTheme="minorHAnsi" w:hAnsiTheme="minorHAnsi" w:cstheme="minorHAnsi"/>
-          <w:i w:val="0"/>
-          <w:iCs/>
-          <w:szCs w:val="24"/>
-        </w:rPr>
-        <w:t>[ANNEX V](ANNEX_V)</w:t>
-      </w:r>
-      <w:r>
-        <w:rPr>
-          <w:rFonts w:asciiTheme="minorHAnsi" w:hAnsiTheme="minorHAnsi" w:cstheme="minorHAnsi"/>
-          <w:i w:val="0"/>
-          <w:iCs/>
-          <w:szCs w:val="24"/>
-        </w:rPr>
-        <w:t>)</w:t>
-      </w:r>
-      <w:r>
-        <w:rPr>
-          <w:rFonts w:asciiTheme="minorHAnsi" w:hAnsiTheme="minorHAnsi" w:cstheme="minorHAnsi"/>
-          <w:i w:val="0"/>
-          <w:spacing w:val="0"/>
-          <w:szCs w:val="24"/>
-        </w:rPr>
-        <w:t>. Further samples for genetics, and taxonomy will be taken for priority species according to the sampling protocols (</w:t>
-      </w:r>
-      <w:r>
-        <w:rPr>
-          <w:rFonts w:asciiTheme="minorHAnsi" w:hAnsiTheme="minorHAnsi" w:cstheme="minorHAnsi"/>
-          <w:i w:val="0"/>
-          <w:iCs/>
-          <w:szCs w:val="24"/>
-        </w:rPr>
-        <w:t>[ANNEX V](ANNEX_V)</w:t>
-      </w:r>
-      <w:r>
-        <w:rPr>
-          <w:rFonts w:asciiTheme="minorHAnsi" w:hAnsiTheme="minorHAnsi" w:cstheme="minorHAnsi"/>
-          <w:i w:val="0"/>
-          <w:spacing w:val="0"/>
-          <w:szCs w:val="24"/>
-        </w:rPr>
-        <w:t>)</w:t>
-      </w:r>
-      <w:r>
-        <w:rPr>
-          <w:rFonts w:asciiTheme="minorHAnsi" w:hAnsiTheme="minorHAnsi" w:cstheme="minorHAnsi"/>
-          <w:i w:val="0"/>
-          <w:spacing w:val="0"/>
+    </w:p>
+    <w:p>
+      <w:pPr>
+        <w:rPr>
+          <w:rFonts w:asciiTheme="minorHAnsi" w:hAnsiTheme="minorHAnsi" w:cstheme="minorHAnsi"/>
+          <w:szCs w:val="24"/>
+        </w:rPr>
+      </w:pPr>
+    </w:p>
+    <w:p>
+      <w:pPr>
+        <w:rPr>
+          <w:rFonts w:asciiTheme="minorHAnsi" w:hAnsiTheme="minorHAnsi" w:cstheme="minorHAnsi"/>
+          <w:szCs w:val="24"/>
+        </w:rPr>
+      </w:pPr>
+      <w:r>
+        <w:rPr>
+          <w:rFonts w:asciiTheme="minorHAnsi" w:hAnsiTheme="minorHAnsi" w:cstheme="minorHAnsi"/>
+          <w:szCs w:val="24"/>
+        </w:rPr>
+        <w:lastRenderedPageBreak/>
+        <w:t>Length frequencies and standard biological sampling for all priority species at all stations they are caught are given in Table \@ref(tab:SObiosamplingtab). Also, length frequency of any species that may be abundant in the catches</w:t>
+      </w:r>
+      <w:r>
+        <w:rPr>
+          <w:rFonts w:asciiTheme="minorHAnsi" w:hAnsiTheme="minorHAnsi" w:cstheme="minorHAnsi"/>
           <w:szCs w:val="24"/>
         </w:rPr>
         <w:t>.</w:t>
       </w:r>
-      <w:r>
-        <w:rPr>
-          <w:rFonts w:asciiTheme="minorHAnsi" w:hAnsiTheme="minorHAnsi" w:cstheme="minorHAnsi"/>
-          <w:i w:val="0"/>
-          <w:spacing w:val="0"/>
-          <w:szCs w:val="24"/>
-        </w:rPr>
-        <w:t xml:space="preserve"> </w:t>
-      </w:r>
-    </w:p>
-    <w:p>
-      <w:pPr>
-        <w:rPr>
-          <w:rFonts w:asciiTheme="minorHAnsi" w:hAnsiTheme="minorHAnsi" w:cstheme="minorHAnsi"/>
-          <w:szCs w:val="24"/>
-        </w:rPr>
-      </w:pPr>
-      <w:r>
-        <w:rPr>
-          <w:rFonts w:asciiTheme="minorHAnsi" w:hAnsiTheme="minorHAnsi" w:cstheme="minorHAnsi"/>
-          <w:szCs w:val="24"/>
-        </w:rPr>
-        <w:t xml:space="preserve">The catch will be sorted, subsampled if necessary, and subsamples will be taken to measure number and weight by taxon. Taxa in the catch are to be identified to the lowest possible taxonomic level. At each trawl haul, length measurements will be taken for all priority species </w:t>
-      </w:r>
-      <w:r>
-        <w:rPr>
-          <w:rFonts w:asciiTheme="minorHAnsi" w:hAnsiTheme="minorHAnsi" w:cstheme="minorHAnsi"/>
-          <w:color w:val="000000"/>
-          <w:szCs w:val="24"/>
-        </w:rPr>
-        <w:t>(</w:t>
-      </w:r>
-      <w:r>
-        <w:rPr>
-          <w:rFonts w:asciiTheme="minorHAnsi" w:hAnsiTheme="minorHAnsi" w:cstheme="minorHAnsi"/>
-          <w:spacing w:val="-3"/>
-          <w:szCs w:val="24"/>
-        </w:rPr>
-        <w:t>[ANNEX V](ANNEX_V))</w:t>
-      </w:r>
-      <w:r>
-        <w:rPr>
-          <w:rFonts w:asciiTheme="minorHAnsi" w:hAnsiTheme="minorHAnsi" w:cstheme="minorHAnsi"/>
-          <w:szCs w:val="24"/>
-        </w:rPr>
-        <w:t xml:space="preserve"> with an Electronic Fish Meter connected to a customized data acquisition system (Sea2Data). </w:t>
-      </w:r>
-    </w:p>
-    <w:p>
-      <w:pPr>
-        <w:rPr>
-          <w:rFonts w:asciiTheme="minorHAnsi" w:hAnsiTheme="minorHAnsi" w:cstheme="minorHAnsi"/>
-          <w:szCs w:val="24"/>
-        </w:rPr>
-      </w:pPr>
-    </w:p>
-    <w:p>
-      <w:pPr>
-        <w:rPr>
-          <w:rFonts w:asciiTheme="minorHAnsi" w:hAnsiTheme="minorHAnsi" w:cstheme="minorHAnsi"/>
-          <w:szCs w:val="24"/>
-        </w:rPr>
-      </w:pPr>
-      <w:r>
-        <w:rPr>
-          <w:rFonts w:asciiTheme="minorHAnsi" w:hAnsiTheme="minorHAnsi" w:cstheme="minorHAnsi"/>
-          <w:szCs w:val="24"/>
-        </w:rPr>
-        <w:t>Length frequencies and standard biological sampling for all priority species at all stations they are caught are given in Table II below. Also, length frequency of any species that may be abundant in the catches.</w:t>
-      </w:r>
     </w:p>
     <w:p>
       <w:pPr>
@@ -6257,7 +6657,21 @@
           <w:rFonts w:asciiTheme="minorHAnsi" w:hAnsiTheme="minorHAnsi" w:cstheme="minorHAnsi"/>
           <w:szCs w:val="24"/>
         </w:rPr>
-        <w:t>Length: 100 fish (all fish with less than 100 individuals in the catch)</w:t>
+        <w:t>Length</w:t>
+      </w:r>
+      <w:r>
+        <w:rPr>
+          <w:rFonts w:asciiTheme="minorHAnsi" w:hAnsiTheme="minorHAnsi" w:cstheme="minorHAnsi"/>
+          <w:szCs w:val="24"/>
+        </w:rPr>
+        <w:t xml:space="preserve"> and weight</w:t>
+      </w:r>
+      <w:r>
+        <w:rPr>
+          <w:rFonts w:asciiTheme="minorHAnsi" w:hAnsiTheme="minorHAnsi" w:cstheme="minorHAnsi"/>
+          <w:szCs w:val="24"/>
+        </w:rPr>
+        <w:t>: 100 fish (all fish with less than 100 individuals in the catch)</w:t>
       </w:r>
       <w:r>
         <w:rPr>
@@ -6274,13 +6688,6 @@
           <w:szCs w:val="24"/>
         </w:rPr>
       </w:pPr>
-      <w:r>
-        <w:rPr>
-          <w:rFonts w:asciiTheme="minorHAnsi" w:hAnsiTheme="minorHAnsi" w:cstheme="minorHAnsi"/>
-          <w:szCs w:val="24"/>
-        </w:rPr>
-        <w:t xml:space="preserve">Weight: 30 fish out of the sample of 100 for which length was measured. </w:t>
-      </w:r>
     </w:p>
     <w:p>
       <w:pPr>
@@ -6528,7 +6935,14 @@
           <w:rFonts w:asciiTheme="minorHAnsi" w:hAnsiTheme="minorHAnsi" w:cstheme="minorHAnsi"/>
           <w:szCs w:val="24"/>
         </w:rPr>
-        <w:t>6.3</w:t>
+        <w:t>1</w:t>
+      </w:r>
+      <w:r>
+        <w:rPr>
+          <w:rFonts w:asciiTheme="minorHAnsi" w:hAnsiTheme="minorHAnsi" w:cstheme="minorHAnsi"/>
+          <w:szCs w:val="24"/>
+        </w:rPr>
+        <w:t>.3</w:t>
       </w:r>
       <w:r>
         <w:rPr>
@@ -6602,70 +7016,80 @@
           <w:rFonts w:asciiTheme="minorHAnsi" w:hAnsiTheme="minorHAnsi" w:cstheme="minorHAnsi"/>
           <w:szCs w:val="24"/>
         </w:rPr>
+        <w:t>1</w:t>
+      </w:r>
+      <w:r>
+        <w:rPr>
+          <w:rFonts w:asciiTheme="minorHAnsi" w:hAnsiTheme="minorHAnsi" w:cstheme="minorHAnsi"/>
+          <w:szCs w:val="24"/>
+        </w:rPr>
+        <w:t>.3</w:t>
+      </w:r>
+      <w:r>
+        <w:rPr>
+          <w:rFonts w:asciiTheme="minorHAnsi" w:hAnsiTheme="minorHAnsi" w:cstheme="minorHAnsi"/>
+          <w:szCs w:val="24"/>
+        </w:rPr>
+        <w:t>.</w:t>
+      </w:r>
+      <w:r>
+        <w:rPr>
+          <w:rFonts w:asciiTheme="minorHAnsi" w:hAnsiTheme="minorHAnsi" w:cstheme="minorHAnsi"/>
+          <w:szCs w:val="24"/>
+        </w:rPr>
+        <w:t>9</w:t>
+      </w:r>
+      <w:r>
+        <w:rPr>
+          <w:rFonts w:asciiTheme="minorHAnsi" w:hAnsiTheme="minorHAnsi" w:cstheme="minorHAnsi"/>
+          <w:szCs w:val="24"/>
+        </w:rPr>
+        <w:t>.</w:t>
+      </w:r>
+      <w:r>
+        <w:rPr>
+          <w:rFonts w:asciiTheme="minorHAnsi" w:hAnsiTheme="minorHAnsi" w:cstheme="minorHAnsi"/>
+          <w:szCs w:val="24"/>
+        </w:rPr>
+        <w:t>3</w:t>
+      </w:r>
+      <w:r>
+        <w:rPr>
+          <w:rFonts w:asciiTheme="minorHAnsi" w:hAnsiTheme="minorHAnsi" w:cstheme="minorHAnsi"/>
+          <w:szCs w:val="24"/>
+        </w:rPr>
+        <w:t xml:space="preserve"> Other trawl-related sampling</w:t>
+      </w:r>
+    </w:p>
+    <w:p>
+      <w:pPr>
+        <w:rPr>
+          <w:rFonts w:asciiTheme="minorHAnsi" w:hAnsiTheme="minorHAnsi" w:cstheme="minorHAnsi"/>
+          <w:szCs w:val="24"/>
+        </w:rPr>
+      </w:pPr>
+    </w:p>
+    <w:p>
+      <w:pPr>
+        <w:pStyle w:val="Heading4"/>
+      </w:pPr>
+      <w:r>
         <w:lastRenderedPageBreak/>
-        <w:t>6.3</w:t>
-      </w:r>
-      <w:r>
-        <w:rPr>
-          <w:rFonts w:asciiTheme="minorHAnsi" w:hAnsiTheme="minorHAnsi" w:cstheme="minorHAnsi"/>
-          <w:szCs w:val="24"/>
-        </w:rPr>
+        <w:t>1</w:t>
+      </w:r>
+      <w:r>
+        <w:t>.3</w:t>
+      </w:r>
+      <w:r>
         <w:t>.</w:t>
       </w:r>
       <w:r>
-        <w:rPr>
-          <w:rFonts w:asciiTheme="minorHAnsi" w:hAnsiTheme="minorHAnsi" w:cstheme="minorHAnsi"/>
-          <w:szCs w:val="24"/>
-        </w:rPr>
         <w:t>9</w:t>
       </w:r>
       <w:r>
-        <w:rPr>
-          <w:rFonts w:asciiTheme="minorHAnsi" w:hAnsiTheme="minorHAnsi" w:cstheme="minorHAnsi"/>
-          <w:szCs w:val="24"/>
-        </w:rPr>
         <w:t>.</w:t>
       </w:r>
       <w:r>
-        <w:rPr>
-          <w:rFonts w:asciiTheme="minorHAnsi" w:hAnsiTheme="minorHAnsi" w:cstheme="minorHAnsi"/>
-          <w:szCs w:val="24"/>
-        </w:rPr>
-        <w:t>3</w:t>
-      </w:r>
-      <w:r>
-        <w:rPr>
-          <w:rFonts w:asciiTheme="minorHAnsi" w:hAnsiTheme="minorHAnsi" w:cstheme="minorHAnsi"/>
-          <w:szCs w:val="24"/>
-        </w:rPr>
-        <w:t xml:space="preserve"> Other trawl-related sampling</w:t>
-      </w:r>
-    </w:p>
-    <w:p>
-      <w:pPr>
-        <w:rPr>
-          <w:rFonts w:asciiTheme="minorHAnsi" w:hAnsiTheme="minorHAnsi" w:cstheme="minorHAnsi"/>
-          <w:szCs w:val="24"/>
-        </w:rPr>
-      </w:pPr>
-    </w:p>
-    <w:p>
-      <w:pPr>
-        <w:pStyle w:val="Heading4"/>
-      </w:pPr>
-      <w:r>
-        <w:t>6.3</w:t>
-      </w:r>
-      <w:r>
-        <w:t>.</w:t>
-      </w:r>
-      <w:r>
-        <w:t>9</w:t>
-      </w:r>
-      <w:r>
-        <w:t>.</w:t>
-      </w:r>
-      <w:r>
         <w:t>3.1</w:t>
       </w:r>
       <w:r>
@@ -6747,15 +7171,7 @@
           <w:spacing w:val="-3"/>
           <w:szCs w:val="24"/>
         </w:rPr>
-        <w:t>[ANNEX V](ANNEX_V)</w:t>
-      </w:r>
-      <w:r>
-        <w:rPr>
-          <w:rFonts w:asciiTheme="minorHAnsi" w:hAnsiTheme="minorHAnsi" w:cstheme="minorHAnsi"/>
-          <w:spacing w:val="-3"/>
-          <w:szCs w:val="24"/>
-        </w:rPr>
-        <w:t xml:space="preserve"> (</w:t>
+        <w:t>[ANNEX V](ANNEX_V) (</w:t>
       </w:r>
       <w:r>
         <w:rPr>
@@ -6880,7 +7296,14 @@
           <w:rFonts w:asciiTheme="minorHAnsi" w:hAnsiTheme="minorHAnsi" w:cstheme="minorHAnsi"/>
           <w:szCs w:val="24"/>
         </w:rPr>
-        <w:t>6.3</w:t>
+        <w:t>1</w:t>
+      </w:r>
+      <w:r>
+        <w:rPr>
+          <w:rFonts w:asciiTheme="minorHAnsi" w:hAnsiTheme="minorHAnsi" w:cstheme="minorHAnsi"/>
+          <w:szCs w:val="24"/>
+        </w:rPr>
+        <w:t>.3</w:t>
       </w:r>
       <w:r>
         <w:rPr>
@@ -6961,7 +7384,14 @@
           <w:rFonts w:asciiTheme="minorHAnsi" w:hAnsiTheme="minorHAnsi" w:cstheme="minorHAnsi"/>
           <w:szCs w:val="24"/>
         </w:rPr>
-        <w:t>6.3</w:t>
+        <w:t>1</w:t>
+      </w:r>
+      <w:r>
+        <w:rPr>
+          <w:rFonts w:asciiTheme="minorHAnsi" w:hAnsiTheme="minorHAnsi" w:cstheme="minorHAnsi"/>
+          <w:szCs w:val="24"/>
+        </w:rPr>
+        <w:t>.3</w:t>
       </w:r>
       <w:r>
         <w:rPr>
@@ -7003,7 +7433,7 @@
           <w:rFonts w:asciiTheme="minorHAnsi" w:hAnsiTheme="minorHAnsi" w:cstheme="minorHAnsi"/>
           <w:szCs w:val="24"/>
         </w:rPr>
-        <w:t>Sardinella samples for food safety analysis</w:t>
+        <w:t>Samples for food safety studies and nutrition</w:t>
       </w:r>
       <w:r>
         <w:rPr>
@@ -7025,7 +7455,153 @@
           <w:rFonts w:asciiTheme="minorHAnsi" w:hAnsiTheme="minorHAnsi" w:cstheme="minorHAnsi"/>
           <w:szCs w:val="24"/>
         </w:rPr>
-        <w:t>From stations with catches of Sardinella, freeze one whole fish in a plastic bag, labelled the same way as for the taxonomic samples. These samples are intended for food safety analysis.</w:t>
+        <w:t>From stations with catches of Sardinella,</w:t>
+      </w:r>
+      <w:r>
+        <w:rPr>
+          <w:rFonts w:asciiTheme="minorHAnsi" w:hAnsiTheme="minorHAnsi" w:cstheme="minorHAnsi"/>
+          <w:szCs w:val="24"/>
+        </w:rPr>
+        <w:t xml:space="preserve"> and anchovy, samples </w:t>
+      </w:r>
+      <w:r>
+        <w:rPr>
+          <w:rFonts w:asciiTheme="minorHAnsi" w:hAnsiTheme="minorHAnsi" w:cstheme="minorHAnsi"/>
+          <w:szCs w:val="24"/>
+        </w:rPr>
+        <w:t xml:space="preserve"> </w:t>
+      </w:r>
+      <w:r>
+        <w:rPr>
+          <w:rFonts w:asciiTheme="minorHAnsi" w:hAnsiTheme="minorHAnsi" w:cstheme="minorHAnsi"/>
+          <w:szCs w:val="24"/>
+        </w:rPr>
+        <w:t xml:space="preserve">will be taken and analysed for nutrients profiles, contaminants and microplastics. </w:t>
+      </w:r>
+    </w:p>
+    <w:p>
+      <w:pPr>
+        <w:rPr>
+          <w:rFonts w:asciiTheme="minorHAnsi" w:hAnsiTheme="minorHAnsi" w:cstheme="minorHAnsi"/>
+          <w:szCs w:val="24"/>
+          <w:lang w:val="en-US"/>
+        </w:rPr>
+      </w:pPr>
+      <w:r>
+        <w:rPr>
+          <w:rFonts w:asciiTheme="minorHAnsi" w:hAnsiTheme="minorHAnsi" w:cstheme="minorHAnsi"/>
+          <w:szCs w:val="24"/>
+          <w:lang w:val="en-US"/>
+        </w:rPr>
+        <w:t>A total of 25 specimens</w:t>
+      </w:r>
+      <w:r>
+        <w:rPr>
+          <w:rFonts w:asciiTheme="minorHAnsi" w:hAnsiTheme="minorHAnsi" w:cstheme="minorHAnsi"/>
+          <w:szCs w:val="24"/>
+          <w:lang w:val="en-US"/>
+        </w:rPr>
+        <w:t xml:space="preserve"> </w:t>
+      </w:r>
+      <w:r>
+        <w:rPr>
+          <w:rFonts w:asciiTheme="minorHAnsi" w:hAnsiTheme="minorHAnsi" w:cstheme="minorHAnsi"/>
+          <w:szCs w:val="24"/>
+          <w:lang w:val="en-US"/>
+        </w:rPr>
+        <w:t xml:space="preserve"> </w:t>
+      </w:r>
+      <w:r>
+        <w:rPr>
+          <w:rFonts w:asciiTheme="minorHAnsi" w:hAnsiTheme="minorHAnsi" w:cstheme="minorHAnsi"/>
+          <w:szCs w:val="24"/>
+          <w:lang w:val="en-US"/>
+        </w:rPr>
+        <w:t xml:space="preserve">of each species </w:t>
+      </w:r>
+      <w:r>
+        <w:rPr>
+          <w:rFonts w:asciiTheme="minorHAnsi" w:hAnsiTheme="minorHAnsi" w:cstheme="minorHAnsi"/>
+          <w:szCs w:val="24"/>
+          <w:lang w:val="en-US"/>
+        </w:rPr>
+        <w:t>at 3 different stations will be frozen and later analyzed for determination of nutrients and food safety parameters.  </w:t>
+      </w:r>
+      <w:r>
+        <w:rPr>
+          <w:rFonts w:asciiTheme="minorHAnsi" w:hAnsiTheme="minorHAnsi" w:cstheme="minorHAnsi"/>
+          <w:szCs w:val="24"/>
+          <w:lang w:val="en-US"/>
+        </w:rPr>
+        <w:t>If catches</w:t>
+      </w:r>
+      <w:r>
+        <w:rPr>
+          <w:rFonts w:asciiTheme="minorHAnsi" w:hAnsiTheme="minorHAnsi" w:cstheme="minorHAnsi"/>
+          <w:szCs w:val="24"/>
+          <w:lang w:val="en-US"/>
+        </w:rPr>
+        <w:t xml:space="preserve"> are small</w:t>
+      </w:r>
+      <w:r>
+        <w:rPr>
+          <w:rFonts w:asciiTheme="minorHAnsi" w:hAnsiTheme="minorHAnsi" w:cstheme="minorHAnsi"/>
+          <w:szCs w:val="24"/>
+          <w:lang w:val="en-US"/>
+        </w:rPr>
+        <w:t xml:space="preserve">, </w:t>
+      </w:r>
+      <w:r>
+        <w:rPr>
+          <w:rFonts w:asciiTheme="minorHAnsi" w:hAnsiTheme="minorHAnsi" w:cstheme="minorHAnsi"/>
+          <w:szCs w:val="24"/>
+          <w:lang w:val="en-US"/>
+        </w:rPr>
+        <w:t xml:space="preserve"> sample </w:t>
+      </w:r>
+      <w:r>
+        <w:rPr>
+          <w:rFonts w:asciiTheme="minorHAnsi" w:hAnsiTheme="minorHAnsi" w:cstheme="minorHAnsi"/>
+          <w:szCs w:val="24"/>
+          <w:lang w:val="en-US"/>
+        </w:rPr>
+        <w:t>a minimum of 5 fish from each station.</w:t>
+      </w:r>
+    </w:p>
+    <w:p>
+      <w:pPr>
+        <w:rPr>
+          <w:rFonts w:asciiTheme="minorHAnsi" w:hAnsiTheme="minorHAnsi" w:cstheme="minorHAnsi"/>
+          <w:szCs w:val="24"/>
+          <w:lang w:val="en-US"/>
+        </w:rPr>
+      </w:pPr>
+      <w:r>
+        <w:rPr>
+          <w:rFonts w:asciiTheme="minorHAnsi" w:hAnsiTheme="minorHAnsi" w:cstheme="minorHAnsi"/>
+          <w:szCs w:val="24"/>
+          <w:lang w:val="en-US"/>
+        </w:rPr>
+        <w:t xml:space="preserve">The fish will be stored in plastic bags marked with species, station, and date. The trawl form with station information should follow the samples. An electronical copy should be sent to </w:t>
+      </w:r>
+      <w:hyperlink r:id="rId19">
+        <w:r>
+          <w:rPr>
+            <w:rStyle w:val="Hyperlink"/>
+            <w:rFonts w:asciiTheme="minorHAnsi" w:hAnsiTheme="minorHAnsi" w:cstheme="minorHAnsi"/>
+            <w:szCs w:val="24"/>
+            <w:lang w:val="en-US"/>
+          </w:rPr>
+          <w:t>marian.kjellevold@hi.no</w:t>
+        </w:r>
+      </w:hyperlink>
+      <w:r>
+        <w:rPr>
+          <w:rFonts w:asciiTheme="minorHAnsi" w:hAnsiTheme="minorHAnsi" w:cstheme="minorHAnsi"/>
+          <w:szCs w:val="24"/>
+          <w:lang w:val="en-US"/>
+        </w:rPr>
+        <w:t xml:space="preserve">. </w:t>
       </w:r>
     </w:p>
     <w:p>
@@ -7041,7 +7617,14 @@
           <w:rFonts w:asciiTheme="minorHAnsi" w:hAnsiTheme="minorHAnsi" w:cstheme="minorHAnsi"/>
           <w:szCs w:val="24"/>
         </w:rPr>
-        <w:t>6.3</w:t>
+        <w:t>1</w:t>
+      </w:r>
+      <w:r>
+        <w:rPr>
+          <w:rFonts w:asciiTheme="minorHAnsi" w:hAnsiTheme="minorHAnsi" w:cstheme="minorHAnsi"/>
+          <w:szCs w:val="24"/>
+        </w:rPr>
+        <w:t>.3</w:t>
       </w:r>
       <w:r>
         <w:rPr>
@@ -7100,7 +7683,7 @@
         </w:rPr>
         <w:t>Marine debris will be registered and classified at each station according to the categories listed in the sampling protocol for marine litter (</w:t>
       </w:r>
-      <w:hyperlink r:id="rId18" w:history="1">
+      <w:hyperlink r:id="rId20" w:history="1">
         <w:r>
           <w:rPr>
             <w:rStyle w:val="Hyperlink"/>
@@ -7122,7 +7705,38 @@
           <w:rFonts w:asciiTheme="minorHAnsi" w:hAnsiTheme="minorHAnsi" w:cstheme="minorHAnsi"/>
           <w:szCs w:val="24"/>
         </w:rPr>
-        <w:t xml:space="preserve">. All pieces of litter should be weighed and counted, and when possible, photos should be taken of the individual pieces for a reference catalogue. The data and the reference photos should be recorded using Fish2Data. One person from each shift will be responsible for recording this data. </w:t>
+        <w:t xml:space="preserve">. All pieces of litter should be weighed and counted, and when possible, photos should be taken of the individual pieces for a reference catalogue. </w:t>
+      </w:r>
+      <w:r>
+        <w:rPr>
+          <w:rFonts w:asciiTheme="minorHAnsi" w:hAnsiTheme="minorHAnsi" w:cstheme="minorHAnsi"/>
+          <w:szCs w:val="24"/>
+          <w:lang w:val="en-US"/>
+        </w:rPr>
+        <w:t xml:space="preserve">Data should be recorded in designated Excel sheet and photos  </w:t>
+      </w:r>
+      <w:r>
+        <w:rPr>
+          <w:rFonts w:asciiTheme="minorHAnsi" w:hAnsiTheme="minorHAnsi" w:cstheme="minorHAnsi"/>
+          <w:szCs w:val="24"/>
+          <w:lang w:val="en-US"/>
+        </w:rPr>
+        <w:lastRenderedPageBreak/>
+        <w:t>should be clearly labelled and saved in a folder in the work catalogue marked 'Marine Debris'</w:t>
+      </w:r>
+      <w:r>
+        <w:rPr>
+          <w:rFonts w:asciiTheme="minorHAnsi" w:hAnsiTheme="minorHAnsi" w:cstheme="minorHAnsi"/>
+          <w:szCs w:val="24"/>
+        </w:rPr>
+        <w:t xml:space="preserve">. </w:t>
+      </w:r>
+      <w:r>
+        <w:rPr>
+          <w:rFonts w:asciiTheme="minorHAnsi" w:hAnsiTheme="minorHAnsi" w:cstheme="minorHAnsi"/>
+          <w:szCs w:val="24"/>
+        </w:rPr>
+        <w:t xml:space="preserve"> One person from each shift will be responsible for recording this data. </w:t>
       </w:r>
     </w:p>
     <w:p>
@@ -7138,8 +7752,14 @@
           <w:rFonts w:asciiTheme="minorHAnsi" w:hAnsiTheme="minorHAnsi" w:cstheme="minorHAnsi"/>
           <w:szCs w:val="24"/>
         </w:rPr>
-        <w:lastRenderedPageBreak/>
-        <w:t>6.3</w:t>
+        <w:t>1</w:t>
+      </w:r>
+      <w:r>
+        <w:rPr>
+          <w:rFonts w:asciiTheme="minorHAnsi" w:hAnsiTheme="minorHAnsi" w:cstheme="minorHAnsi"/>
+          <w:szCs w:val="24"/>
+        </w:rPr>
+        <w:t>.3</w:t>
       </w:r>
       <w:r>
         <w:rPr>
@@ -7193,10 +7813,11 @@
     </w:p>
     <w:p>
       <w:pPr>
-        <w:spacing w:after="120"/>
-        <w:rPr>
-          <w:rFonts w:asciiTheme="minorHAnsi" w:hAnsiTheme="minorHAnsi" w:cstheme="minorHAnsi"/>
-          <w:szCs w:val="24"/>
+        <w:jc w:val="both"/>
+        <w:rPr>
+          <w:rFonts w:asciiTheme="minorHAnsi" w:hAnsiTheme="minorHAnsi" w:cstheme="minorHAnsi"/>
+          <w:szCs w:val="24"/>
+          <w:lang w:val="en-US"/>
         </w:rPr>
       </w:pPr>
       <w:r>
@@ -7222,14 +7843,96 @@
         </w:rPr>
         <w:t>) should be taken.</w:t>
       </w:r>
-    </w:p>
-    <w:p>
-      <w:pPr>
-        <w:rPr>
-          <w:rFonts w:asciiTheme="minorHAnsi" w:hAnsiTheme="minorHAnsi" w:cstheme="minorHAnsi"/>
-          <w:szCs w:val="24"/>
-        </w:rPr>
-      </w:pPr>
+      <w:r>
+        <w:rPr>
+          <w:rFonts w:asciiTheme="minorHAnsi" w:hAnsiTheme="minorHAnsi" w:cstheme="minorHAnsi"/>
+          <w:szCs w:val="24"/>
+          <w:lang w:val="en-US"/>
+        </w:rPr>
+        <w:t xml:space="preserve"> </w:t>
+      </w:r>
+      <w:r>
+        <w:rPr>
+          <w:rFonts w:asciiTheme="minorHAnsi" w:hAnsiTheme="minorHAnsi" w:cstheme="minorHAnsi"/>
+          <w:szCs w:val="24"/>
+          <w:lang w:val="en-US"/>
+        </w:rPr>
+        <w:t xml:space="preserve">Sampling will be done in accordance with the </w:t>
+      </w:r>
+      <w:r>
+        <w:rPr>
+          <w:rFonts w:asciiTheme="minorHAnsi" w:hAnsiTheme="minorHAnsi" w:cstheme="minorHAnsi"/>
+          <w:b/>
+          <w:bCs/>
+          <w:szCs w:val="24"/>
+          <w:lang w:val="en-US"/>
+        </w:rPr>
+        <w:t xml:space="preserve">Nansen Benthos Sampling Procedures (see: </w:t>
+      </w:r>
+      <w:hyperlink r:id="rId21" w:history="1">
+        <w:r>
+          <w:rPr>
+            <w:rStyle w:val="Hyperlink"/>
+            <w:rFonts w:asciiTheme="minorHAnsi" w:hAnsiTheme="minorHAnsi" w:cstheme="minorHAnsi"/>
+            <w:b/>
+            <w:bCs/>
+            <w:szCs w:val="24"/>
+            <w:lang w:val="en-US"/>
+          </w:rPr>
+          <w:t>https://nansen-surveys.imr.no/lib/exe/fetch.php?media=nansen-surveys:benthos_benthos_sampling_procedure_nansen.pdf</w:t>
+        </w:r>
+      </w:hyperlink>
+      <w:r>
+        <w:rPr>
+          <w:rFonts w:asciiTheme="minorHAnsi" w:hAnsiTheme="minorHAnsi" w:cstheme="minorHAnsi"/>
+          <w:b/>
+          <w:bCs/>
+          <w:szCs w:val="24"/>
+          <w:lang w:val="en-US"/>
+        </w:rPr>
+        <w:t>)</w:t>
+      </w:r>
+      <w:r>
+        <w:rPr>
+          <w:rFonts w:asciiTheme="minorHAnsi" w:hAnsiTheme="minorHAnsi" w:cstheme="minorHAnsi"/>
+          <w:b/>
+          <w:bCs/>
+          <w:szCs w:val="24"/>
+          <w:lang w:val="en-US"/>
+        </w:rPr>
+        <w:t xml:space="preserve"> and the Sampling Processing diagrams (see: </w:t>
+      </w:r>
+      <w:hyperlink r:id="rId22" w:history="1">
+        <w:r>
+          <w:rPr>
+            <w:rStyle w:val="Hyperlink"/>
+            <w:rFonts w:asciiTheme="minorHAnsi" w:hAnsiTheme="minorHAnsi" w:cstheme="minorHAnsi"/>
+            <w:b/>
+            <w:bCs/>
+            <w:szCs w:val="24"/>
+            <w:lang w:val="en-US"/>
+          </w:rPr>
+          <w:t>https://nansen-surveys.imr.no/lib/exe/fetch.php?media=nansen-surveys:benthos_processing_benthos_samples_float_diagrams_for_general_overview.docx</w:t>
+        </w:r>
+      </w:hyperlink>
+      <w:r>
+        <w:rPr>
+          <w:rFonts w:asciiTheme="minorHAnsi" w:hAnsiTheme="minorHAnsi" w:cstheme="minorHAnsi"/>
+          <w:b/>
+          <w:bCs/>
+          <w:szCs w:val="24"/>
+          <w:lang w:val="en-US"/>
+        </w:rPr>
+        <w:t xml:space="preserve">) </w:t>
+      </w:r>
+      <w:r>
+        <w:rPr>
+          <w:rFonts w:asciiTheme="minorHAnsi" w:hAnsiTheme="minorHAnsi" w:cstheme="minorHAnsi"/>
+          <w:szCs w:val="24"/>
+          <w:lang w:val="en-US"/>
+        </w:rPr>
+        <w:t xml:space="preserve">.  </w:t>
+      </w:r>
     </w:p>
     <w:p>
       <w:pPr>
@@ -7245,6 +7948,13 @@
         </w:rPr>
         <w:t>MORE DETAILED PROTOCOL NEEEDED</w:t>
       </w:r>
+      <w:r>
+        <w:rPr>
+          <w:rFonts w:asciiTheme="minorHAnsi" w:hAnsiTheme="minorHAnsi" w:cstheme="minorHAnsi"/>
+          <w:szCs w:val="24"/>
+        </w:rPr>
+        <w:t>?</w:t>
+      </w:r>
     </w:p>
     <w:p>
       <w:pPr>
@@ -7274,7 +7984,14 @@
           <w:rFonts w:asciiTheme="minorHAnsi" w:hAnsiTheme="minorHAnsi" w:cstheme="minorHAnsi"/>
           <w:szCs w:val="24"/>
         </w:rPr>
-        <w:t>6.3</w:t>
+        <w:t>1</w:t>
+      </w:r>
+      <w:r>
+        <w:rPr>
+          <w:rFonts w:asciiTheme="minorHAnsi" w:hAnsiTheme="minorHAnsi" w:cstheme="minorHAnsi"/>
+          <w:szCs w:val="24"/>
+        </w:rPr>
+        <w:t>.3</w:t>
       </w:r>
       <w:r>
         <w:rPr>
@@ -7343,7 +8060,7 @@
         </w:rPr>
         <w:t>The biomass indices of priority demersal fish (see below) will be estimated by the swept area method (</w:t>
       </w:r>
-      <w:hyperlink r:id="rId19">
+      <w:hyperlink r:id="rId23">
         <w:r>
           <w:rPr>
             <w:rStyle w:val="Hyperlink"/>
@@ -7360,7 +8077,7 @@
         </w:rPr>
         <w:t>) using the StoX [</w:t>
       </w:r>
-      <w:hyperlink r:id="rId20">
+      <w:hyperlink r:id="rId24">
         <w:r>
           <w:rPr>
             <w:rStyle w:val="Hyperlink"/>
@@ -7707,7 +8424,10 @@
         <w:pStyle w:val="Heading2"/>
       </w:pPr>
       <w:r>
-        <w:t>6.</w:t>
+        <w:t>1</w:t>
+      </w:r>
+      <w:r>
+        <w:t>.</w:t>
       </w:r>
       <w:r>
         <w:t>4</w:t>
@@ -7737,25 +8457,18 @@
     <w:p>
       <w:pPr>
         <w:rPr>
-          <w:rFonts w:asciiTheme="minorHAnsi" w:hAnsiTheme="minorHAnsi" w:cstheme="minorHAnsi"/>
-          <w:szCs w:val="24"/>
-        </w:rPr>
-      </w:pPr>
-      <w:r>
-        <w:rPr>
           <w:rStyle w:val="normaltextrun"/>
           <w:rFonts w:asciiTheme="minorHAnsi" w:hAnsiTheme="minorHAnsi" w:cstheme="minorHAnsi"/>
           <w:szCs w:val="24"/>
         </w:rPr>
-        <w:t xml:space="preserve">In line with the Nansen Data Policy, the Cruise Leader is to ensure that each national institution represented in the survey receives a copy of the draft report and the basic data (e.g. catch data) pertaining to the particular survey and for their national waters before leaving the vessel and document what data </w:t>
-      </w:r>
+      </w:pPr>
       <w:r>
         <w:rPr>
           <w:rStyle w:val="normaltextrun"/>
           <w:rFonts w:asciiTheme="minorHAnsi" w:hAnsiTheme="minorHAnsi" w:cstheme="minorHAnsi"/>
           <w:szCs w:val="24"/>
         </w:rPr>
-        <w:t xml:space="preserve">and samples </w:t>
+        <w:t xml:space="preserve">In line with the Nansen Data Policy, the Cruise Leader is to ensure that each national institution represented in the survey receives a copy of the draft report and the basic data (e.g. catch data) pertaining to the particular survey and for their national waters before </w:t>
       </w:r>
       <w:r>
         <w:rPr>
@@ -7763,307 +8476,225 @@
           <w:rFonts w:asciiTheme="minorHAnsi" w:hAnsiTheme="minorHAnsi" w:cstheme="minorHAnsi"/>
           <w:szCs w:val="24"/>
         </w:rPr>
-        <w:t xml:space="preserve">has been shared and with whom </w:t>
-      </w:r>
-      <w:r>
-        <w:rPr>
-          <w:rFonts w:asciiTheme="minorHAnsi" w:hAnsiTheme="minorHAnsi" w:cstheme="minorHAnsi"/>
-          <w:szCs w:val="24"/>
-        </w:rPr>
-        <w:t>(</w:t>
-      </w:r>
-      <w:r>
-        <w:rPr>
-          <w:rFonts w:asciiTheme="minorHAnsi" w:hAnsiTheme="minorHAnsi" w:cstheme="minorHAnsi"/>
-          <w:i/>
-          <w:iCs/>
-          <w:spacing w:val="-3"/>
-          <w:szCs w:val="24"/>
-        </w:rPr>
-        <w:t>[ANNEX V</w:t>
-      </w:r>
-      <w:r>
-        <w:rPr>
-          <w:rFonts w:asciiTheme="minorHAnsi" w:hAnsiTheme="minorHAnsi" w:cstheme="minorHAnsi"/>
-          <w:i/>
-          <w:iCs/>
-          <w:spacing w:val="-3"/>
+        <w:lastRenderedPageBreak/>
+        <w:t>leaving the vessel</w:t>
+      </w:r>
+      <w:r>
+        <w:rPr>
+          <w:rStyle w:val="normaltextrun"/>
+          <w:rFonts w:asciiTheme="minorHAnsi" w:hAnsiTheme="minorHAnsi" w:cstheme="minorHAnsi"/>
+          <w:szCs w:val="24"/>
+        </w:rPr>
+        <w:t xml:space="preserve">. </w:t>
+      </w:r>
+      <w:r>
+        <w:rPr>
+          <w:rStyle w:val="normaltextrun"/>
+          <w:rFonts w:asciiTheme="minorHAnsi" w:hAnsiTheme="minorHAnsi" w:cstheme="minorHAnsi"/>
+          <w:szCs w:val="24"/>
+        </w:rPr>
+        <w:t>An overview of the equipment that is going to be use</w:t>
+      </w:r>
+      <w:r>
+        <w:rPr>
+          <w:rStyle w:val="normaltextrun"/>
+          <w:rFonts w:asciiTheme="minorHAnsi" w:hAnsiTheme="minorHAnsi" w:cstheme="minorHAnsi"/>
+          <w:szCs w:val="24"/>
+        </w:rPr>
+        <w:t xml:space="preserve">d for the collection of the various data can be found in </w:t>
+      </w:r>
+      <w:r>
+        <w:rPr>
+          <w:rStyle w:val="normaltextrun"/>
+          <w:rFonts w:asciiTheme="minorHAnsi" w:hAnsiTheme="minorHAnsi" w:cstheme="minorHAnsi"/>
+          <w:szCs w:val="24"/>
+        </w:rPr>
+        <w:t>Table \@ref(tab:SOequipmenttab) ([ANNEX VI](ANNEX_VI))</w:t>
+      </w:r>
+      <w:r>
+        <w:rPr>
+          <w:rStyle w:val="normaltextrun"/>
+          <w:rFonts w:asciiTheme="minorHAnsi" w:hAnsiTheme="minorHAnsi" w:cstheme="minorHAnsi"/>
+          <w:szCs w:val="24"/>
+        </w:rPr>
+        <w:t>. The different types of data expected to be recorded, their storage and delivery</w:t>
+      </w:r>
+      <w:r>
+        <w:rPr>
+          <w:rStyle w:val="normaltextrun"/>
+          <w:rFonts w:asciiTheme="minorHAnsi" w:hAnsiTheme="minorHAnsi" w:cstheme="minorHAnsi"/>
+          <w:szCs w:val="24"/>
+        </w:rPr>
+        <w:t xml:space="preserve"> can be found in Table \@ref(tab:</w:t>
+      </w:r>
+      <w:r>
+        <w:rPr>
+          <w:rStyle w:val="normaltextrun"/>
+          <w:rFonts w:asciiTheme="minorHAnsi" w:hAnsiTheme="minorHAnsi" w:cstheme="minorHAnsi"/>
+          <w:szCs w:val="24"/>
+        </w:rPr>
+        <w:t>SOdatahandovertab</w:t>
+      </w:r>
+      <w:r>
+        <w:rPr>
+          <w:rStyle w:val="normaltextrun"/>
+          <w:rFonts w:asciiTheme="minorHAnsi" w:hAnsiTheme="minorHAnsi" w:cstheme="minorHAnsi"/>
+          <w:szCs w:val="24"/>
+        </w:rPr>
+        <w:t>)</w:t>
+      </w:r>
+      <w:r>
+        <w:rPr>
+          <w:rStyle w:val="normaltextrun"/>
+          <w:rFonts w:asciiTheme="minorHAnsi" w:hAnsiTheme="minorHAnsi" w:cstheme="minorHAnsi"/>
+          <w:szCs w:val="24"/>
+        </w:rPr>
+        <w:t xml:space="preserve"> </w:t>
+      </w:r>
+      <w:r>
+        <w:rPr>
+          <w:rStyle w:val="normaltextrun"/>
+          <w:rFonts w:asciiTheme="minorHAnsi" w:hAnsiTheme="minorHAnsi" w:cstheme="minorHAnsi"/>
+          <w:szCs w:val="24"/>
+        </w:rPr>
+        <w:t>([ANNEX VII](ANNEX_VII))</w:t>
+      </w:r>
+      <w:r>
+        <w:rPr>
+          <w:rStyle w:val="normaltextrun"/>
+          <w:rFonts w:asciiTheme="minorHAnsi" w:hAnsiTheme="minorHAnsi" w:cstheme="minorHAnsi"/>
+          <w:szCs w:val="24"/>
+        </w:rPr>
+        <w:t>. Finally, the s</w:t>
+      </w:r>
+      <w:r>
+        <w:rPr>
+          <w:rStyle w:val="normaltextrun"/>
+          <w:rFonts w:asciiTheme="minorHAnsi" w:hAnsiTheme="minorHAnsi" w:cstheme="minorHAnsi"/>
+          <w:szCs w:val="24"/>
+        </w:rPr>
+        <w:t xml:space="preserve">amples to be collected, </w:t>
+      </w:r>
+      <w:r>
+        <w:rPr>
+          <w:rStyle w:val="normaltextrun"/>
+          <w:rFonts w:asciiTheme="minorHAnsi" w:hAnsiTheme="minorHAnsi" w:cstheme="minorHAnsi"/>
+          <w:szCs w:val="24"/>
+        </w:rPr>
+        <w:t xml:space="preserve">their </w:t>
+      </w:r>
+      <w:r>
+        <w:rPr>
+          <w:rStyle w:val="normaltextrun"/>
+          <w:rFonts w:asciiTheme="minorHAnsi" w:hAnsiTheme="minorHAnsi" w:cstheme="minorHAnsi"/>
+          <w:szCs w:val="24"/>
+        </w:rPr>
+        <w:t xml:space="preserve">preservation and </w:t>
+      </w:r>
+      <w:r>
+        <w:rPr>
+          <w:rStyle w:val="normaltextrun"/>
+          <w:rFonts w:asciiTheme="minorHAnsi" w:hAnsiTheme="minorHAnsi" w:cstheme="minorHAnsi"/>
+          <w:szCs w:val="24"/>
+        </w:rPr>
+        <w:t xml:space="preserve">planned </w:t>
+      </w:r>
+      <w:r>
+        <w:rPr>
+          <w:rStyle w:val="normaltextrun"/>
+          <w:rFonts w:asciiTheme="minorHAnsi" w:hAnsiTheme="minorHAnsi" w:cstheme="minorHAnsi"/>
+          <w:szCs w:val="24"/>
+        </w:rPr>
+        <w:t>follow-up work</w:t>
+      </w:r>
+      <w:r>
+        <w:rPr>
+          <w:rStyle w:val="normaltextrun"/>
+          <w:rFonts w:asciiTheme="minorHAnsi" w:hAnsiTheme="minorHAnsi" w:cstheme="minorHAnsi"/>
+          <w:szCs w:val="24"/>
+        </w:rPr>
+        <w:t xml:space="preserve"> is detailed in </w:t>
+      </w:r>
+      <w:r>
+        <w:rPr>
+          <w:rStyle w:val="normaltextrun"/>
+          <w:rFonts w:asciiTheme="minorHAnsi" w:hAnsiTheme="minorHAnsi" w:cstheme="minorHAnsi"/>
+          <w:szCs w:val="24"/>
+        </w:rPr>
+        <w:t>Table \@ref(tab:</w:t>
+      </w:r>
+      <w:r>
+        <w:rPr>
+          <w:rStyle w:val="normaltextrun"/>
+          <w:rFonts w:asciiTheme="minorHAnsi" w:hAnsiTheme="minorHAnsi" w:cstheme="minorHAnsi"/>
+          <w:szCs w:val="24"/>
+        </w:rPr>
+        <w:t>SOcollectedsamplestab</w:t>
+      </w:r>
+      <w:r>
+        <w:rPr>
+          <w:rStyle w:val="normaltextrun"/>
+          <w:rFonts w:asciiTheme="minorHAnsi" w:hAnsiTheme="minorHAnsi" w:cstheme="minorHAnsi"/>
+          <w:szCs w:val="24"/>
+        </w:rPr>
+        <w:t>) ([ANNEX VI</w:t>
+      </w:r>
+      <w:r>
+        <w:rPr>
+          <w:rStyle w:val="normaltextrun"/>
+          <w:rFonts w:asciiTheme="minorHAnsi" w:hAnsiTheme="minorHAnsi" w:cstheme="minorHAnsi"/>
           <w:szCs w:val="24"/>
         </w:rPr>
         <w:t>I</w:t>
       </w:r>
       <w:r>
         <w:rPr>
-          <w:rFonts w:asciiTheme="minorHAnsi" w:hAnsiTheme="minorHAnsi" w:cstheme="minorHAnsi"/>
-          <w:i/>
-          <w:iCs/>
-          <w:spacing w:val="-3"/>
-          <w:szCs w:val="24"/>
-        </w:rPr>
-        <w:t>](ANNEX_V</w:t>
-      </w:r>
-      <w:r>
-        <w:rPr>
-          <w:rFonts w:asciiTheme="minorHAnsi" w:hAnsiTheme="minorHAnsi" w:cstheme="minorHAnsi"/>
-          <w:i/>
-          <w:iCs/>
-          <w:spacing w:val="-3"/>
+          <w:rStyle w:val="normaltextrun"/>
+          <w:rFonts w:asciiTheme="minorHAnsi" w:hAnsiTheme="minorHAnsi" w:cstheme="minorHAnsi"/>
+          <w:szCs w:val="24"/>
+        </w:rPr>
+        <w:t>I](ANNEX_VII</w:t>
+      </w:r>
+      <w:r>
+        <w:rPr>
+          <w:rStyle w:val="normaltextrun"/>
+          <w:rFonts w:asciiTheme="minorHAnsi" w:hAnsiTheme="minorHAnsi" w:cstheme="minorHAnsi"/>
           <w:szCs w:val="24"/>
         </w:rPr>
         <w:t>I</w:t>
       </w:r>
       <w:r>
         <w:rPr>
-          <w:rFonts w:asciiTheme="minorHAnsi" w:hAnsiTheme="minorHAnsi" w:cstheme="minorHAnsi"/>
-          <w:i/>
-          <w:iCs/>
-          <w:spacing w:val="-3"/>
-          <w:szCs w:val="24"/>
-        </w:rPr>
-        <w:t>)</w:t>
-      </w:r>
-      <w:r>
-        <w:rPr>
-          <w:rFonts w:asciiTheme="minorHAnsi" w:hAnsiTheme="minorHAnsi" w:cstheme="minorHAnsi"/>
-          <w:szCs w:val="24"/>
-        </w:rPr>
-        <w:t>)</w:t>
-      </w:r>
-      <w:r>
-        <w:rPr>
-          <w:rFonts w:asciiTheme="minorHAnsi" w:hAnsiTheme="minorHAnsi" w:cstheme="minorHAnsi"/>
-          <w:szCs w:val="24"/>
-        </w:rPr>
-        <w:t xml:space="preserve"> </w:t>
-      </w:r>
-      <w:r>
-        <w:rPr>
-          <w:rFonts w:asciiTheme="minorHAnsi" w:hAnsiTheme="minorHAnsi" w:cstheme="minorHAnsi"/>
-          <w:szCs w:val="24"/>
-        </w:rPr>
-        <w:t xml:space="preserve">and </w:t>
-      </w:r>
-      <w:r>
-        <w:rPr>
-          <w:rFonts w:asciiTheme="minorHAnsi" w:hAnsiTheme="minorHAnsi" w:cstheme="minorHAnsi"/>
-          <w:szCs w:val="24"/>
-        </w:rPr>
-        <w:t>(</w:t>
-      </w:r>
-      <w:r>
-        <w:rPr>
-          <w:rFonts w:asciiTheme="minorHAnsi" w:hAnsiTheme="minorHAnsi" w:cstheme="minorHAnsi"/>
-          <w:i/>
-          <w:iCs/>
-          <w:spacing w:val="-3"/>
-          <w:szCs w:val="24"/>
-        </w:rPr>
-        <w:t>[ANNEX V</w:t>
-      </w:r>
-      <w:r>
-        <w:rPr>
-          <w:rFonts w:asciiTheme="minorHAnsi" w:hAnsiTheme="minorHAnsi" w:cstheme="minorHAnsi"/>
-          <w:i/>
-          <w:iCs/>
-          <w:spacing w:val="-3"/>
-          <w:szCs w:val="24"/>
-        </w:rPr>
-        <w:t>II</w:t>
-      </w:r>
-      <w:r>
-        <w:rPr>
-          <w:rFonts w:asciiTheme="minorHAnsi" w:hAnsiTheme="minorHAnsi" w:cstheme="minorHAnsi"/>
-          <w:i/>
-          <w:iCs/>
-          <w:spacing w:val="-3"/>
-          <w:szCs w:val="24"/>
-        </w:rPr>
-        <w:t>](ANNEX_V</w:t>
-      </w:r>
-      <w:r>
-        <w:rPr>
-          <w:rFonts w:asciiTheme="minorHAnsi" w:hAnsiTheme="minorHAnsi" w:cstheme="minorHAnsi"/>
-          <w:i/>
-          <w:iCs/>
-          <w:spacing w:val="-3"/>
-          <w:szCs w:val="24"/>
-        </w:rPr>
-        <w:t>II</w:t>
-      </w:r>
-      <w:r>
-        <w:rPr>
-          <w:rFonts w:asciiTheme="minorHAnsi" w:hAnsiTheme="minorHAnsi" w:cstheme="minorHAnsi"/>
-          <w:i/>
-          <w:iCs/>
-          <w:spacing w:val="-3"/>
-          <w:szCs w:val="24"/>
-        </w:rPr>
-        <w:t>)</w:t>
-      </w:r>
-      <w:r>
-        <w:rPr>
-          <w:rFonts w:asciiTheme="minorHAnsi" w:hAnsiTheme="minorHAnsi" w:cstheme="minorHAnsi"/>
-          <w:szCs w:val="24"/>
-        </w:rPr>
-        <w:t>).</w:t>
-      </w:r>
-    </w:p>
-    <w:p>
-      <w:pPr>
-        <w:rPr>
-          <w:rFonts w:asciiTheme="minorHAnsi" w:hAnsiTheme="minorHAnsi" w:cstheme="minorHAnsi"/>
-          <w:szCs w:val="24"/>
-        </w:rPr>
-      </w:pPr>
-      <w:r>
-        <w:rPr>
-          <w:rFonts w:asciiTheme="minorHAnsi" w:hAnsiTheme="minorHAnsi" w:cstheme="minorHAnsi"/>
-          <w:szCs w:val="24"/>
-        </w:rPr>
-        <w:t xml:space="preserve">An overview of the equipment that is going to be used, data expected to be recorded and samples planned to be collected can be found in Table </w:t>
-      </w:r>
-      <w:r>
-        <w:rPr>
-          <w:rFonts w:asciiTheme="minorHAnsi" w:hAnsiTheme="minorHAnsi" w:cstheme="minorHAnsi"/>
-          <w:spacing w:val="-3"/>
-          <w:szCs w:val="24"/>
-          <w:lang w:val="en-US"/>
-        </w:rPr>
-        <w:t>\@ref(tab:</w:t>
-      </w:r>
-      <w:r>
-        <w:rPr>
-          <w:rFonts w:asciiTheme="minorHAnsi" w:hAnsiTheme="minorHAnsi" w:cstheme="minorHAnsi"/>
-          <w:szCs w:val="24"/>
-        </w:rPr>
-        <w:t>SOequipmenttab</w:t>
-      </w:r>
-      <w:r>
-        <w:rPr>
-          <w:rFonts w:asciiTheme="minorHAnsi" w:hAnsiTheme="minorHAnsi" w:cstheme="minorHAnsi"/>
-          <w:spacing w:val="-3"/>
-          <w:szCs w:val="24"/>
-          <w:lang w:val="en-US"/>
-        </w:rPr>
-        <w:t xml:space="preserve">), </w:t>
-      </w:r>
-      <w:r>
-        <w:rPr>
-          <w:rFonts w:asciiTheme="minorHAnsi" w:hAnsiTheme="minorHAnsi" w:cstheme="minorHAnsi"/>
-          <w:szCs w:val="24"/>
-        </w:rPr>
-        <w:t xml:space="preserve">Table </w:t>
-      </w:r>
-      <w:r>
-        <w:rPr>
-          <w:rFonts w:asciiTheme="minorHAnsi" w:hAnsiTheme="minorHAnsi" w:cstheme="minorHAnsi"/>
-          <w:szCs w:val="24"/>
-        </w:rPr>
-        <w:t>(</w:t>
-      </w:r>
-      <w:r>
-        <w:rPr>
-          <w:rFonts w:asciiTheme="minorHAnsi" w:hAnsiTheme="minorHAnsi" w:cstheme="minorHAnsi"/>
-          <w:i/>
-          <w:iCs/>
-          <w:spacing w:val="-3"/>
-          <w:szCs w:val="24"/>
-        </w:rPr>
-        <w:t>[ANNEX V</w:t>
-      </w:r>
-      <w:r>
-        <w:rPr>
-          <w:rFonts w:asciiTheme="minorHAnsi" w:hAnsiTheme="minorHAnsi" w:cstheme="minorHAnsi"/>
-          <w:i/>
-          <w:iCs/>
-          <w:spacing w:val="-3"/>
-          <w:szCs w:val="24"/>
-        </w:rPr>
-        <w:t>I</w:t>
-      </w:r>
-      <w:r>
-        <w:rPr>
-          <w:rFonts w:asciiTheme="minorHAnsi" w:hAnsiTheme="minorHAnsi" w:cstheme="minorHAnsi"/>
-          <w:i/>
-          <w:iCs/>
-          <w:spacing w:val="-3"/>
-          <w:szCs w:val="24"/>
-        </w:rPr>
-        <w:t>](ANNEX_V</w:t>
-      </w:r>
-      <w:r>
-        <w:rPr>
-          <w:rFonts w:asciiTheme="minorHAnsi" w:hAnsiTheme="minorHAnsi" w:cstheme="minorHAnsi"/>
-          <w:i/>
-          <w:iCs/>
-          <w:spacing w:val="-3"/>
-          <w:szCs w:val="24"/>
-        </w:rPr>
-        <w:t>I</w:t>
-      </w:r>
-      <w:r>
-        <w:rPr>
-          <w:rFonts w:asciiTheme="minorHAnsi" w:hAnsiTheme="minorHAnsi" w:cstheme="minorHAnsi"/>
-          <w:i/>
-          <w:iCs/>
-          <w:spacing w:val="-3"/>
-          <w:szCs w:val="24"/>
-        </w:rPr>
-        <w:t>)</w:t>
-      </w:r>
-      <w:r>
-        <w:rPr>
-          <w:rFonts w:asciiTheme="minorHAnsi" w:hAnsiTheme="minorHAnsi" w:cstheme="minorHAnsi"/>
-          <w:szCs w:val="24"/>
-        </w:rPr>
-        <w:t>)</w:t>
-      </w:r>
-      <w:r>
-        <w:rPr>
-          <w:rFonts w:asciiTheme="minorHAnsi" w:hAnsiTheme="minorHAnsi" w:cstheme="minorHAnsi"/>
-          <w:szCs w:val="24"/>
-        </w:rPr>
-        <w:t xml:space="preserve"> </w:t>
-      </w:r>
-      <w:r>
-        <w:rPr>
-          <w:rFonts w:asciiTheme="minorHAnsi" w:hAnsiTheme="minorHAnsi" w:cstheme="minorHAnsi"/>
-          <w:szCs w:val="24"/>
-        </w:rPr>
-        <w:t>and (</w:t>
-      </w:r>
-      <w:r>
-        <w:rPr>
-          <w:rFonts w:asciiTheme="minorHAnsi" w:hAnsiTheme="minorHAnsi" w:cstheme="minorHAnsi"/>
-          <w:i/>
-          <w:iCs/>
-          <w:spacing w:val="-3"/>
-          <w:szCs w:val="24"/>
-        </w:rPr>
-        <w:t>[ANNEX V](ANNEX_V)</w:t>
-      </w:r>
-      <w:r>
-        <w:rPr>
-          <w:rFonts w:asciiTheme="minorHAnsi" w:hAnsiTheme="minorHAnsi" w:cstheme="minorHAnsi"/>
-          <w:szCs w:val="24"/>
-        </w:rPr>
-        <w:t>)</w:t>
-      </w:r>
-      <w:r>
-        <w:rPr>
-          <w:rFonts w:asciiTheme="minorHAnsi" w:hAnsiTheme="minorHAnsi" w:cstheme="minorHAnsi"/>
-          <w:szCs w:val="24"/>
-        </w:rPr>
-        <w:t>, respectively.</w:t>
-      </w:r>
-    </w:p>
-    <w:p>
-      <w:pPr>
-        <w:rPr>
-          <w:rFonts w:asciiTheme="minorHAnsi" w:hAnsiTheme="minorHAnsi" w:cstheme="minorHAnsi"/>
-          <w:szCs w:val="24"/>
-        </w:rPr>
-      </w:pPr>
+          <w:rStyle w:val="normaltextrun"/>
+          <w:rFonts w:asciiTheme="minorHAnsi" w:hAnsiTheme="minorHAnsi" w:cstheme="minorHAnsi"/>
+          <w:szCs w:val="24"/>
+        </w:rPr>
+        <w:t>))</w:t>
+      </w:r>
+      <w:r>
+        <w:rPr>
+          <w:rStyle w:val="normaltextrun"/>
+          <w:rFonts w:asciiTheme="minorHAnsi" w:hAnsiTheme="minorHAnsi" w:cstheme="minorHAnsi"/>
+          <w:szCs w:val="24"/>
+        </w:rPr>
+        <w:t>.</w:t>
+      </w:r>
+      <w:r>
+        <w:rPr>
+          <w:rStyle w:val="normaltextrun"/>
+          <w:rFonts w:asciiTheme="minorHAnsi" w:hAnsiTheme="minorHAnsi" w:cstheme="minorHAnsi"/>
+          <w:szCs w:val="24"/>
+        </w:rPr>
+        <w:t xml:space="preserve"> The Cruise Leader is expected to document </w:t>
+      </w:r>
+      <w:r>
+        <w:rPr>
+          <w:rStyle w:val="normaltextrun"/>
+          <w:rFonts w:asciiTheme="minorHAnsi" w:hAnsiTheme="minorHAnsi" w:cstheme="minorHAnsi"/>
+          <w:szCs w:val="24"/>
+        </w:rPr>
+        <w:t xml:space="preserve">what data and samples has been shared and with whom. </w:t>
+      </w:r>
     </w:p>
     <w:p>
       <w:pPr>
@@ -8080,7 +8711,6 @@
           <w:rStyle w:val="normaltextrun"/>
           <w:rFonts w:asciiTheme="minorHAnsi" w:hAnsiTheme="minorHAnsi" w:cstheme="minorHAnsi"/>
         </w:rPr>
-        <w:lastRenderedPageBreak/>
         <w:t>The cruise participants are expected to sign and conform the Data policy of the EAF-Nansen Programme</w:t>
       </w:r>
       <w:r>
@@ -8126,7 +8756,7 @@
         </w:rPr>
         <w:t>Persons responsible for samples need to inform about the status of analysis, and report about this at the post-survey meeting as well as send a copy of the analysis/results to IMR (</w:t>
       </w:r>
-      <w:hyperlink r:id="rId21" w:history="1">
+      <w:hyperlink r:id="rId25" w:history="1">
         <w:r>
           <w:rPr>
             <w:rStyle w:val="Hyperlink"/>
@@ -8362,7 +8992,10 @@
         <w:pStyle w:val="Heading2"/>
       </w:pPr>
       <w:r>
-        <w:t>6.</w:t>
+        <w:t>1</w:t>
+      </w:r>
+      <w:r>
+        <w:t>.</w:t>
       </w:r>
       <w:r>
         <w:t>5</w:t>
@@ -8379,7 +9012,10 @@
         <w:pStyle w:val="Heading2"/>
       </w:pPr>
       <w:r>
-        <w:t>6.6</w:t>
+        <w:t>1</w:t>
+      </w:r>
+      <w:r>
+        <w:t>.6</w:t>
       </w:r>
       <w:r>
         <w:t xml:space="preserve"> </w:t>
@@ -8401,7 +9037,14 @@
           <w:rFonts w:asciiTheme="minorHAnsi" w:hAnsiTheme="minorHAnsi" w:cstheme="minorHAnsi"/>
           <w:szCs w:val="24"/>
         </w:rPr>
-        <w:t>6.6</w:t>
+        <w:t>1</w:t>
+      </w:r>
+      <w:r>
+        <w:rPr>
+          <w:rFonts w:asciiTheme="minorHAnsi" w:hAnsiTheme="minorHAnsi" w:cstheme="minorHAnsi"/>
+          <w:szCs w:val="24"/>
+        </w:rPr>
+        <w:t>.6</w:t>
       </w:r>
       <w:r>
         <w:rPr>
@@ -8482,7 +9125,15 @@
           <w:szCs w:val="24"/>
           <w:lang w:val="en-US"/>
         </w:rPr>
-        <w:t>6.6</w:t>
+        <w:t>1</w:t>
+      </w:r>
+      <w:r>
+        <w:rPr>
+          <w:rFonts w:asciiTheme="minorHAnsi" w:hAnsiTheme="minorHAnsi" w:cstheme="minorHAnsi"/>
+          <w:szCs w:val="24"/>
+          <w:lang w:val="en-US"/>
+        </w:rPr>
+        <w:t>.6</w:t>
       </w:r>
       <w:r>
         <w:rPr>
@@ -8528,7 +9179,7 @@
           <w:rFonts w:asciiTheme="minorHAnsi" w:hAnsiTheme="minorHAnsi" w:cstheme="minorHAnsi"/>
           <w:szCs w:val="24"/>
         </w:rPr>
-        <w:t>Planned list of participants</w:t>
+        <w:t>Planned participation</w:t>
       </w:r>
     </w:p>
     <w:p>
@@ -8546,7 +9197,15 @@
           <w:szCs w:val="24"/>
           <w:lang w:val="en-US"/>
         </w:rPr>
-        <w:t>6.6</w:t>
+        <w:t>1</w:t>
+      </w:r>
+      <w:r>
+        <w:rPr>
+          <w:rFonts w:asciiTheme="minorHAnsi" w:hAnsiTheme="minorHAnsi" w:cstheme="minorHAnsi"/>
+          <w:szCs w:val="24"/>
+          <w:lang w:val="en-US"/>
+        </w:rPr>
+        <w:t>.6</w:t>
       </w:r>
       <w:r>
         <w:rPr>
@@ -8619,7 +9278,15 @@
           <w:szCs w:val="24"/>
           <w:lang w:val="en-US"/>
         </w:rPr>
-        <w:t>6.6</w:t>
+        <w:t>1</w:t>
+      </w:r>
+      <w:r>
+        <w:rPr>
+          <w:rFonts w:asciiTheme="minorHAnsi" w:hAnsiTheme="minorHAnsi" w:cstheme="minorHAnsi"/>
+          <w:szCs w:val="24"/>
+          <w:lang w:val="en-US"/>
+        </w:rPr>
+        <w:t>.6</w:t>
       </w:r>
       <w:r>
         <w:rPr>
@@ -8698,15 +9365,20 @@
         <w:rPr>
           <w:rFonts w:asciiTheme="minorHAnsi" w:hAnsiTheme="minorHAnsi" w:cstheme="minorHAnsi"/>
           <w:szCs w:val="24"/>
-          <w:lang w:val="nb-NO"/>
-        </w:rPr>
-        <w:t>6.6</w:t>
-      </w:r>
-      <w:r>
-        <w:rPr>
-          <w:rFonts w:asciiTheme="minorHAnsi" w:hAnsiTheme="minorHAnsi" w:cstheme="minorHAnsi"/>
-          <w:szCs w:val="24"/>
-          <w:lang w:val="nb-NO"/>
+        </w:rPr>
+        <w:t>1</w:t>
+      </w:r>
+      <w:r>
+        <w:rPr>
+          <w:rFonts w:asciiTheme="minorHAnsi" w:hAnsiTheme="minorHAnsi" w:cstheme="minorHAnsi"/>
+          <w:szCs w:val="24"/>
+        </w:rPr>
+        <w:t>.6</w:t>
+      </w:r>
+      <w:r>
+        <w:rPr>
+          <w:rFonts w:asciiTheme="minorHAnsi" w:hAnsiTheme="minorHAnsi" w:cstheme="minorHAnsi"/>
+          <w:szCs w:val="24"/>
         </w:rPr>
         <w:t>.</w:t>
       </w:r>
@@ -8714,7 +9386,6 @@
         <w:rPr>
           <w:rFonts w:asciiTheme="minorHAnsi" w:hAnsiTheme="minorHAnsi" w:cstheme="minorHAnsi"/>
           <w:szCs w:val="24"/>
-          <w:lang w:val="nb-NO"/>
         </w:rPr>
         <w:t>5</w:t>
       </w:r>
@@ -8722,7 +9393,6 @@
         <w:rPr>
           <w:rFonts w:asciiTheme="minorHAnsi" w:hAnsiTheme="minorHAnsi" w:cstheme="minorHAnsi"/>
           <w:szCs w:val="24"/>
-          <w:lang w:val="nb-NO"/>
         </w:rPr>
         <w:t xml:space="preserve"> </w:t>
       </w:r>
@@ -8737,15 +9407,13 @@
         <w:rPr>
           <w:rFonts w:asciiTheme="minorHAnsi" w:hAnsiTheme="minorHAnsi" w:cstheme="minorHAnsi"/>
           <w:szCs w:val="24"/>
-          <w:lang w:val="nb-NO"/>
-        </w:rPr>
-        <w:t xml:space="preserve"> VI</w:t>
-      </w:r>
-      <w:r>
-        <w:rPr>
-          <w:rFonts w:asciiTheme="minorHAnsi" w:hAnsiTheme="minorHAnsi" w:cstheme="minorHAnsi"/>
-          <w:szCs w:val="24"/>
-          <w:lang w:val="nb-NO"/>
+        </w:rPr>
+        <w:t xml:space="preserve"> V</w:t>
+      </w:r>
+      <w:r>
+        <w:rPr>
+          <w:rFonts w:asciiTheme="minorHAnsi" w:hAnsiTheme="minorHAnsi" w:cstheme="minorHAnsi"/>
+          <w:szCs w:val="24"/>
         </w:rPr>
         <w:t xml:space="preserve">. </w:t>
       </w:r>
@@ -8840,7 +9508,6 @@
           <w:rFonts w:asciiTheme="minorHAnsi" w:hAnsiTheme="minorHAnsi" w:cstheme="minorHAnsi"/>
           <w:szCs w:val="24"/>
         </w:rPr>
-        <w:lastRenderedPageBreak/>
         <w:t>Specimens included in a list of relevant/problematic taxa will be retained for post-survey taxonomy studies. For this activity, the collectors will follow a standard step-by step sampling procedure (protocol available among the survey documents). Specimens, will be: 1) photographed in fresh condition, 2) labelled, 3) tissue sampled, 4) measured, 5) registered on a excel spreadsheet and 6 preserved either in frozen condition (e.g. large specimens such as sharks)</w:t>
       </w:r>
       <w:r>
@@ -8863,7 +9530,10 @@
         <w:pStyle w:val="Heading4"/>
       </w:pPr>
       <w:r>
-        <w:t>6.6</w:t>
+        <w:t>1</w:t>
+      </w:r>
+      <w:r>
+        <w:t>.6</w:t>
       </w:r>
       <w:r>
         <w:t>.5</w:t>
@@ -8880,7 +9550,10 @@
         <w:pStyle w:val="Heading4"/>
       </w:pPr>
       <w:r>
-        <w:t>6.6</w:t>
+        <w:t>1</w:t>
+      </w:r>
+      <w:r>
+        <w:t>.6</w:t>
       </w:r>
       <w:r>
         <w:t>.5</w:t>
@@ -9005,7 +9678,10 @@
         <w:pStyle w:val="Heading4"/>
       </w:pPr>
       <w:r>
-        <w:t>6.6</w:t>
+        <w:t>1</w:t>
+      </w:r>
+      <w:r>
+        <w:t>.6</w:t>
       </w:r>
       <w:r>
         <w:t>.5</w:t>
@@ -9095,7 +9771,10 @@
         <w:pStyle w:val="Heading4"/>
       </w:pPr>
       <w:r>
-        <w:t>6.6</w:t>
+        <w:t>1</w:t>
+      </w:r>
+      <w:r>
+        <w:t>.6</w:t>
       </w:r>
       <w:r>
         <w:t>.5</w:t>
@@ -9125,7 +9804,15 @@
           <w:rFonts w:asciiTheme="minorHAnsi" w:hAnsiTheme="minorHAnsi" w:cstheme="minorHAnsi"/>
           <w:szCs w:val="24"/>
         </w:rPr>
-        <w:t xml:space="preserve">Cut off the small running number included at the bottom of the waterproof tag (it corresponds to the running number printed on the same tag) and place it inside the vial together with the fin clip taken from the specimens’ right pelvic fin. Use high concentration (95%) ethanol for fixation. Please remember to wash forceps and scissors with 95% ethanol in-between different samples. The vial containing the fixed fin clip should then be stored inside a white box, which has numbered slots corresponding to the running numbers (see example </w:t>
+        <w:t xml:space="preserve">Cut off the small running number included at the bottom of the waterproof tag (it corresponds to the running number printed on the same tag) and place it inside the vial together with the fin clip taken from the specimens’ right pelvic fin. Use high concentration (95%) ethanol for fixation. Please remember to wash forceps and scissors with 95% ethanol in-between different samples. The vial containing the fixed fin clip should then be stored inside a white box, which has numbered slots corresponding to the running numbers (see </w:t>
+      </w:r>
+      <w:r>
+        <w:rPr>
+          <w:rFonts w:asciiTheme="minorHAnsi" w:hAnsiTheme="minorHAnsi" w:cstheme="minorHAnsi"/>
+          <w:szCs w:val="24"/>
+        </w:rPr>
+        <w:lastRenderedPageBreak/>
+        <w:t xml:space="preserve">example </w:t>
       </w:r>
       <w:r>
         <w:rPr>
@@ -9208,8 +9895,10 @@
         <w:pStyle w:val="Heading4"/>
       </w:pPr>
       <w:r>
-        <w:lastRenderedPageBreak/>
-        <w:t>6.6</w:t>
+        <w:t>1</w:t>
+      </w:r>
+      <w:r>
+        <w:t>.6</w:t>
       </w:r>
       <w:r>
         <w:t>.5</w:t>
@@ -9392,7 +10081,10 @@
         <w:pStyle w:val="Heading4"/>
       </w:pPr>
       <w:r>
-        <w:t>6.6</w:t>
+        <w:t>1</w:t>
+      </w:r>
+      <w:r>
+        <w:t>.6</w:t>
       </w:r>
       <w:r>
         <w:t>.5</w:t>
@@ -9533,7 +10225,10 @@
         <w:pStyle w:val="Heading4"/>
       </w:pPr>
       <w:r>
-        <w:t>6.6</w:t>
+        <w:t>1</w:t>
+      </w:r>
+      <w:r>
+        <w:t>.6</w:t>
       </w:r>
       <w:r>
         <w:t>.5</w:t>
@@ -9668,6 +10363,7 @@
           <w:rFonts w:asciiTheme="minorHAnsi" w:hAnsiTheme="minorHAnsi" w:cstheme="minorHAnsi"/>
           <w:szCs w:val="24"/>
         </w:rPr>
+        <w:lastRenderedPageBreak/>
         <w:t>The log is to be sent to peter.psomadakis@gmail.com at the end of the survey, together with trawl station information data.</w:t>
       </w:r>
     </w:p>
@@ -9698,7 +10394,6 @@
           <w:rFonts w:asciiTheme="minorHAnsi" w:hAnsiTheme="minorHAnsi" w:cstheme="minorHAnsi"/>
           <w:szCs w:val="24"/>
         </w:rPr>
-        <w:lastRenderedPageBreak/>
         <w:t xml:space="preserve">Representative specimens from selected families/genera will be frozen in clearly labelled zip lock bags. </w:t>
       </w:r>
     </w:p>
@@ -9714,22 +10409,7 @@
           <w:rFonts w:asciiTheme="minorHAnsi" w:hAnsiTheme="minorHAnsi" w:cstheme="minorHAnsi"/>
           <w:szCs w:val="24"/>
         </w:rPr>
-        <w:t xml:space="preserve">One or two specimens of each species, from the list provided </w:t>
-      </w:r>
-      <w:r>
-        <w:rPr>
-          <w:rFonts w:asciiTheme="minorHAnsi" w:hAnsiTheme="minorHAnsi" w:cstheme="minorHAnsi"/>
-          <w:szCs w:val="24"/>
-          <w:highlight w:val="yellow"/>
-        </w:rPr>
-        <w:t>(species_capeverde_species for collection IMR.xlsx</w:t>
-      </w:r>
-      <w:r>
-        <w:rPr>
-          <w:rFonts w:asciiTheme="minorHAnsi" w:hAnsiTheme="minorHAnsi" w:cstheme="minorHAnsi"/>
-          <w:szCs w:val="24"/>
-        </w:rPr>
-        <w:t>) are to be preserved. Specimens in good conditions should be chosen. These samples are to be sent to IMR and preserved for training purposes.</w:t>
+        <w:t>One or two specimens of each species, from the list provided are to be preserved. Specimens in good conditions should be chosen. These samples are to be sent to IMR and preserved for training purposes.</w:t>
       </w:r>
     </w:p>
     <w:p>
@@ -9763,7 +10443,15 @@
           <w:szCs w:val="24"/>
           <w:lang w:val="en-US"/>
         </w:rPr>
-        <w:t>6.6</w:t>
+        <w:t>1</w:t>
+      </w:r>
+      <w:r>
+        <w:rPr>
+          <w:rFonts w:asciiTheme="minorHAnsi" w:hAnsiTheme="minorHAnsi" w:cstheme="minorHAnsi"/>
+          <w:szCs w:val="24"/>
+          <w:lang w:val="en-US"/>
+        </w:rPr>
+        <w:t>.6</w:t>
       </w:r>
       <w:r>
         <w:rPr>
@@ -9787,8 +10475,90 @@
           <w:szCs w:val="24"/>
           <w:lang w:val="en-US"/>
         </w:rPr>
+        <w:t xml:space="preserve"> Annex VI</w:t>
+      </w:r>
+      <w:r>
+        <w:rPr>
+          <w:rFonts w:asciiTheme="minorHAnsi" w:hAnsiTheme="minorHAnsi" w:cstheme="minorHAnsi"/>
+          <w:szCs w:val="24"/>
+          <w:lang w:val="en-US"/>
+        </w:rPr>
+        <w:t xml:space="preserve">. </w:t>
+      </w:r>
+      <w:r>
+        <w:rPr>
+          <w:rFonts w:asciiTheme="minorHAnsi" w:hAnsiTheme="minorHAnsi" w:cstheme="minorHAnsi"/>
+          <w:szCs w:val="24"/>
+          <w:lang w:val="en-US"/>
+        </w:rPr>
+        <w:t>Overview of component sampled and equipment used during the survey</w:t>
+      </w:r>
+    </w:p>
+    <w:p>
+      <w:pPr>
+        <w:pStyle w:val="Heading3"/>
+        <w:rPr>
+          <w:rFonts w:asciiTheme="minorHAnsi" w:hAnsiTheme="minorHAnsi" w:cstheme="minorHAnsi"/>
+          <w:szCs w:val="24"/>
+          <w:lang w:val="en-US"/>
+        </w:rPr>
+      </w:pPr>
+      <w:r>
+        <w:rPr>
+          <w:rFonts w:asciiTheme="minorHAnsi" w:hAnsiTheme="minorHAnsi" w:cstheme="minorHAnsi"/>
+          <w:szCs w:val="24"/>
+          <w:lang w:val="en-US"/>
+        </w:rPr>
+        <w:t>1</w:t>
+      </w:r>
+      <w:r>
+        <w:rPr>
+          <w:rFonts w:asciiTheme="minorHAnsi" w:hAnsiTheme="minorHAnsi" w:cstheme="minorHAnsi"/>
+          <w:szCs w:val="24"/>
+          <w:lang w:val="en-US"/>
+        </w:rPr>
+        <w:t>.6</w:t>
+      </w:r>
+      <w:r>
+        <w:rPr>
+          <w:rFonts w:asciiTheme="minorHAnsi" w:hAnsiTheme="minorHAnsi" w:cstheme="minorHAnsi"/>
+          <w:szCs w:val="24"/>
+          <w:lang w:val="en-US"/>
+        </w:rPr>
+        <w:t>.</w:t>
+      </w:r>
+      <w:r>
+        <w:rPr>
+          <w:rFonts w:asciiTheme="minorHAnsi" w:hAnsiTheme="minorHAnsi" w:cstheme="minorHAnsi"/>
+          <w:szCs w:val="24"/>
+          <w:lang w:val="en-US"/>
+        </w:rPr>
+        <w:t>7</w:t>
+      </w:r>
+      <w:r>
+        <w:rPr>
+          <w:rFonts w:asciiTheme="minorHAnsi" w:hAnsiTheme="minorHAnsi" w:cstheme="minorHAnsi"/>
+          <w:szCs w:val="24"/>
+          <w:lang w:val="en-US"/>
+        </w:rPr>
         <w:t xml:space="preserve"> Annex VII</w:t>
       </w:r>
+      <w:r>
+        <w:rPr>
+          <w:rFonts w:asciiTheme="minorHAnsi" w:hAnsiTheme="minorHAnsi" w:cstheme="minorHAnsi"/>
+          <w:szCs w:val="24"/>
+          <w:lang w:val="en-US"/>
+        </w:rPr>
+        <w:t xml:space="preserve">. </w:t>
+      </w:r>
+      <w:r>
+        <w:rPr>
+          <w:rFonts w:asciiTheme="minorHAnsi" w:hAnsiTheme="minorHAnsi" w:cstheme="minorHAnsi"/>
+          <w:szCs w:val="24"/>
+          <w:lang w:val="en-US"/>
+        </w:rPr>
+        <w:t>Data to be collected and handover plan</w:t>
+      </w:r>
     </w:p>
     <w:p>
       <w:pPr>
@@ -9805,7 +10575,15 @@
           <w:szCs w:val="24"/>
           <w:lang w:val="en-US"/>
         </w:rPr>
-        <w:t>6.6</w:t>
+        <w:t>1</w:t>
+      </w:r>
+      <w:r>
+        <w:rPr>
+          <w:rFonts w:asciiTheme="minorHAnsi" w:hAnsiTheme="minorHAnsi" w:cstheme="minorHAnsi"/>
+          <w:szCs w:val="24"/>
+          <w:lang w:val="en-US"/>
+        </w:rPr>
+        <w:t>.6</w:t>
       </w:r>
       <w:r>
         <w:rPr>
@@ -9821,48 +10599,6 @@
           <w:szCs w:val="24"/>
           <w:lang w:val="en-US"/>
         </w:rPr>
-        <w:t>7</w:t>
-      </w:r>
-      <w:r>
-        <w:rPr>
-          <w:rFonts w:asciiTheme="minorHAnsi" w:hAnsiTheme="minorHAnsi" w:cstheme="minorHAnsi"/>
-          <w:szCs w:val="24"/>
-          <w:lang w:val="en-US"/>
-        </w:rPr>
-        <w:t xml:space="preserve"> Annex VIII</w:t>
-      </w:r>
-    </w:p>
-    <w:p>
-      <w:pPr>
-        <w:pStyle w:val="Heading3"/>
-        <w:rPr>
-          <w:rFonts w:asciiTheme="minorHAnsi" w:hAnsiTheme="minorHAnsi" w:cstheme="minorHAnsi"/>
-          <w:szCs w:val="24"/>
-          <w:lang w:val="en-US"/>
-        </w:rPr>
-      </w:pPr>
-      <w:r>
-        <w:rPr>
-          <w:rFonts w:asciiTheme="minorHAnsi" w:hAnsiTheme="minorHAnsi" w:cstheme="minorHAnsi"/>
-          <w:szCs w:val="24"/>
-          <w:lang w:val="en-US"/>
-        </w:rPr>
-        <w:t>6.6</w:t>
-      </w:r>
-      <w:r>
-        <w:rPr>
-          <w:rFonts w:asciiTheme="minorHAnsi" w:hAnsiTheme="minorHAnsi" w:cstheme="minorHAnsi"/>
-          <w:szCs w:val="24"/>
-          <w:lang w:val="en-US"/>
-        </w:rPr>
-        <w:t>.</w:t>
-      </w:r>
-      <w:r>
-        <w:rPr>
-          <w:rFonts w:asciiTheme="minorHAnsi" w:hAnsiTheme="minorHAnsi" w:cstheme="minorHAnsi"/>
-          <w:szCs w:val="24"/>
-          <w:lang w:val="en-US"/>
-        </w:rPr>
         <w:t>8</w:t>
       </w:r>
       <w:r>
@@ -9871,7 +10607,23 @@
           <w:szCs w:val="24"/>
           <w:lang w:val="en-US"/>
         </w:rPr>
-        <w:t xml:space="preserve"> Annex IV</w:t>
+        <w:t xml:space="preserve"> Annex V</w:t>
+      </w:r>
+      <w:r>
+        <w:rPr>
+          <w:rFonts w:asciiTheme="minorHAnsi" w:hAnsiTheme="minorHAnsi" w:cstheme="minorHAnsi"/>
+          <w:szCs w:val="24"/>
+          <w:lang w:val="en-US"/>
+        </w:rPr>
+        <w:t xml:space="preserve">III. </w:t>
+      </w:r>
+      <w:r>
+        <w:rPr>
+          <w:rFonts w:asciiTheme="minorHAnsi" w:hAnsiTheme="minorHAnsi" w:cstheme="minorHAnsi"/>
+          <w:szCs w:val="24"/>
+          <w:lang w:val="en-US"/>
+        </w:rPr>
+        <w:t>Samples to be collected, preservation and follow-up work</w:t>
       </w:r>
     </w:p>
     <w:p>
@@ -9929,7 +10681,7 @@
           <w:szCs w:val="24"/>
         </w:rPr>
         <w:lastRenderedPageBreak/>
-        <w:t>7</w:t>
+        <w:t>2</w:t>
       </w:r>
       <w:r>
         <w:rPr>
@@ -9951,9 +10703,9 @@
       </w:pPr>
     </w:p>
     <w:sectPr>
-      <w:headerReference w:type="even" r:id="rId22"/>
-      <w:headerReference w:type="default" r:id="rId23"/>
-      <w:headerReference w:type="first" r:id="rId24"/>
+      <w:headerReference w:type="even" r:id="rId26"/>
+      <w:headerReference w:type="default" r:id="rId27"/>
+      <w:headerReference w:type="first" r:id="rId28"/>
       <w:pgSz w:w="11907" w:h="16840" w:code="9"/>
       <w:pgMar w:top="1418" w:right="1418" w:bottom="1418" w:left="1418" w:header="709" w:footer="709" w:gutter="0"/>
       <w:cols w:space="708"/>
@@ -10029,7 +10781,7 @@
       <mc:AlternateContent>
         <mc:Choice Requires="wps">
           <w:drawing>
-            <wp:anchor distT="0" distB="0" distL="114300" distR="114300" simplePos="0" relativeHeight="251657216" behindDoc="1" locked="0" layoutInCell="0" allowOverlap="1" wp14:anchorId="2E3D9B54" wp14:editId="560B2F69">
+            <wp:anchor distT="0" distB="0" distL="114300" distR="114300" simplePos="0" relativeHeight="251658241" behindDoc="1" locked="0" layoutInCell="0" allowOverlap="1" wp14:anchorId="2E3D9B54" wp14:editId="560B2F69">
               <wp:simplePos x="0" y="0"/>
               <wp:positionH relativeFrom="margin">
                 <wp:align>center</wp:align>
@@ -10123,7 +10875,7 @@
               <v:stroke joinstyle="miter"/>
               <v:path gradientshapeok="t" o:connecttype="rect"/>
             </v:shapetype>
-            <v:shape id="WordArt 14" o:spid="_x0000_s1026" type="#_x0000_t202" style="position:absolute;margin-left:0;margin-top:0;width:456.75pt;height:182.7pt;rotation:-45;z-index:-251659264;visibility:visible;mso-wrap-style:square;mso-width-percent:0;mso-height-percent:0;mso-wrap-distance-left:9pt;mso-wrap-distance-top:0;mso-wrap-distance-right:9pt;mso-wrap-distance-bottom:0;mso-position-horizontal:center;mso-position-horizontal-relative:margin;mso-position-vertical:center;mso-position-vertical-relative:margin;mso-width-percent:0;mso-height-percent:0;mso-width-relative:page;mso-height-relative:page;v-text-anchor:top" o:gfxdata="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" o:allowincell="f" filled="f" stroked="f">
+            <v:shape id="WordArt 14" o:spid="_x0000_s1026" type="#_x0000_t202" style="position:absolute;margin-left:0;margin-top:0;width:456.75pt;height:182.7pt;rotation:-45;z-index:-251658239;visibility:visible;mso-wrap-style:square;mso-width-percent:0;mso-height-percent:0;mso-wrap-distance-left:9pt;mso-wrap-distance-top:0;mso-wrap-distance-right:9pt;mso-wrap-distance-bottom:0;mso-position-horizontal:center;mso-position-horizontal-relative:margin;mso-position-vertical:center;mso-position-vertical-relative:margin;mso-width-percent:0;mso-height-percent:0;mso-width-relative:page;mso-height-relative:page;v-text-anchor:top" o:gfxdata="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" o:allowincell="f" filled="f" stroked="f">
               <v:stroke joinstyle="round"/>
               <o:lock v:ext="edit" shapetype="t"/>
               <v:textbox style="mso-fit-shape-to-text:t">
@@ -10201,7 +10953,7 @@
       <mc:AlternateContent>
         <mc:Choice Requires="wps">
           <w:drawing>
-            <wp:anchor distT="0" distB="0" distL="114300" distR="114300" simplePos="0" relativeHeight="251658240" behindDoc="1" locked="0" layoutInCell="0" allowOverlap="1" wp14:anchorId="0C7CC042" wp14:editId="79624149">
+            <wp:anchor distT="0" distB="0" distL="114300" distR="114300" simplePos="0" relativeHeight="251658242" behindDoc="1" locked="0" layoutInCell="0" allowOverlap="1" wp14:anchorId="0C7CC042" wp14:editId="79624149">
               <wp:simplePos x="0" y="0"/>
               <wp:positionH relativeFrom="margin">
                 <wp:align>center</wp:align>
@@ -10295,7 +11047,7 @@
               <v:stroke joinstyle="miter"/>
               <v:path gradientshapeok="t" o:connecttype="rect"/>
             </v:shapetype>
-            <v:shape id="WordArt 15" o:spid="_x0000_s1027" type="#_x0000_t202" style="position:absolute;left:0;text-align:left;margin-left:0;margin-top:0;width:456.75pt;height:182.7pt;rotation:-45;z-index:-251658240;visibility:visible;mso-wrap-style:square;mso-width-percent:0;mso-height-percent:0;mso-wrap-distance-left:9pt;mso-wrap-distance-top:0;mso-wrap-distance-right:9pt;mso-wrap-distance-bottom:0;mso-position-horizontal:center;mso-position-horizontal-relative:margin;mso-position-vertical:center;mso-position-vertical-relative:margin;mso-width-percent:0;mso-height-percent:0;mso-width-relative:page;mso-height-relative:page;v-text-anchor:top" o:gfxdata="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" o:allowincell="f" filled="f" stroked="f">
+            <v:shape id="WordArt 15" o:spid="_x0000_s1027" type="#_x0000_t202" style="position:absolute;left:0;text-align:left;margin-left:0;margin-top:0;width:456.75pt;height:182.7pt;rotation:-45;z-index:-251658238;visibility:visible;mso-wrap-style:square;mso-width-percent:0;mso-height-percent:0;mso-wrap-distance-left:9pt;mso-wrap-distance-top:0;mso-wrap-distance-right:9pt;mso-wrap-distance-bottom:0;mso-position-horizontal:center;mso-position-horizontal-relative:margin;mso-position-vertical:center;mso-position-vertical-relative:margin;mso-width-percent:0;mso-height-percent:0;mso-width-relative:page;mso-height-relative:page;v-text-anchor:top" o:gfxdata="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" o:allowincell="f" filled="f" stroked="f">
               <v:stroke joinstyle="round"/>
               <o:lock v:ext="edit" shapetype="t"/>
               <v:textbox style="mso-fit-shape-to-text:t">
@@ -10354,7 +11106,7 @@
       <mc:AlternateContent>
         <mc:Choice Requires="wps">
           <w:drawing>
-            <wp:anchor distT="0" distB="0" distL="114300" distR="114300" simplePos="0" relativeHeight="251656192" behindDoc="1" locked="0" layoutInCell="0" allowOverlap="1" wp14:anchorId="28E8562E" wp14:editId="459B3869">
+            <wp:anchor distT="0" distB="0" distL="114300" distR="114300" simplePos="0" relativeHeight="251658240" behindDoc="1" locked="0" layoutInCell="0" allowOverlap="1" wp14:anchorId="28E8562E" wp14:editId="459B3869">
               <wp:simplePos x="0" y="0"/>
               <wp:positionH relativeFrom="margin">
                 <wp:align>center</wp:align>
@@ -10448,7 +11200,7 @@
               <v:stroke joinstyle="miter"/>
               <v:path gradientshapeok="t" o:connecttype="rect"/>
             </v:shapetype>
-            <v:shape id="WordArt 13" o:spid="_x0000_s1028" type="#_x0000_t202" style="position:absolute;margin-left:0;margin-top:0;width:456.75pt;height:182.7pt;rotation:-45;z-index:-251660288;visibility:visible;mso-wrap-style:square;mso-width-percent:0;mso-height-percent:0;mso-wrap-distance-left:9pt;mso-wrap-distance-top:0;mso-wrap-distance-right:9pt;mso-wrap-distance-bottom:0;mso-position-horizontal:center;mso-position-horizontal-relative:margin;mso-position-vertical:center;mso-position-vertical-relative:margin;mso-width-percent:0;mso-height-percent:0;mso-width-relative:page;mso-height-relative:page;v-text-anchor:top" o:gfxdata="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" o:allowincell="f" filled="f" stroked="f">
+            <v:shape id="WordArt 13" o:spid="_x0000_s1028" type="#_x0000_t202" style="position:absolute;margin-left:0;margin-top:0;width:456.75pt;height:182.7pt;rotation:-45;z-index:-251658240;visibility:visible;mso-wrap-style:square;mso-width-percent:0;mso-height-percent:0;mso-wrap-distance-left:9pt;mso-wrap-distance-top:0;mso-wrap-distance-right:9pt;mso-wrap-distance-bottom:0;mso-position-horizontal:center;mso-position-horizontal-relative:margin;mso-position-vertical:center;mso-position-vertical-relative:margin;mso-width-percent:0;mso-height-percent:0;mso-width-relative:page;mso-height-relative:page;v-text-anchor:top" o:gfxdata="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" o:allowincell="f" filled="f" stroked="f">
               <v:stroke joinstyle="round"/>
               <o:lock v:ext="edit" shapetype="t"/>
               <v:textbox style="mso-fit-shape-to-text:t">
@@ -17292,6 +18044,12 @@
 </file>
 
 <file path=customXml/item1.xml><?xml version="1.0" encoding="utf-8"?>
+<p:properties xmlns:p="http://schemas.microsoft.com/office/2006/metadata/properties" xmlns:xsi="http://www.w3.org/2001/XMLSchema-instance" xmlns:pc="http://schemas.microsoft.com/office/infopath/2007/PartnerControls">
+  <documentManagement/>
+</p:properties>
+</file>
+
+<file path=customXml/item2.xml><?xml version="1.0" encoding="utf-8"?>
 <ct:contentTypeSchema xmlns:ct="http://schemas.microsoft.com/office/2006/metadata/contentType" xmlns:ma="http://schemas.microsoft.com/office/2006/metadata/properties/metaAttributes" ct:_="" ma:_="" ma:contentTypeName="Document" ma:contentTypeID="0x010100B79A833CF10F444BBAB252802BF889FD" ma:contentTypeVersion="13" ma:contentTypeDescription="Create a new document." ma:contentTypeScope="" ma:versionID="64f677fd2253f5247049a9cf21871e2a">
   <xsd:schema xmlns:xsd="http://www.w3.org/2001/XMLSchema" xmlns:xs="http://www.w3.org/2001/XMLSchema" xmlns:p="http://schemas.microsoft.com/office/2006/metadata/properties" xmlns:ns2="c01e712b-8f9b-4625-8219-31b20605feb3" xmlns:ns3="2b166a80-dccc-42cc-be33-87bca7e0d87c" targetNamespace="http://schemas.microsoft.com/office/2006/metadata/properties" ma:root="true" ma:fieldsID="2fddc4c226a27c0868f3cab2348c32e7" ns2:_="" ns3:_="">
     <xsd:import namespace="c01e712b-8f9b-4625-8219-31b20605feb3"/>
@@ -17514,11 +18272,11 @@
 </ct:contentTypeSchema>
 </file>
 
-<file path=customXml/item2.xml><?xml version="1.0" encoding="utf-8"?>
+<file path=customXml/item3.xml><?xml version="1.0" encoding="utf-8"?>
 <b:Sources xmlns:b="http://schemas.openxmlformats.org/officeDocument/2006/bibliography" xmlns="http://schemas.openxmlformats.org/officeDocument/2006/bibliography" SelectedStyle="\APA.XSL" StyleName="APA Fifth Edition"/>
 </file>
 
-<file path=customXml/item3.xml><?xml version="1.0" encoding="utf-8"?>
+<file path=customXml/item4.xml><?xml version="1.0" encoding="utf-8"?>
 <?mso-contentType ?>
 <FormTemplates xmlns="http://schemas.microsoft.com/sharepoint/v3/contenttype/forms">
   <Display>DocumentLibraryForm</Display>
@@ -17527,13 +18285,16 @@
 </FormTemplates>
 </file>
 
-<file path=customXml/item4.xml><?xml version="1.0" encoding="utf-8"?>
-<p:properties xmlns:p="http://schemas.microsoft.com/office/2006/metadata/properties" xmlns:xsi="http://www.w3.org/2001/XMLSchema-instance" xmlns:pc="http://schemas.microsoft.com/office/infopath/2007/PartnerControls">
-  <documentManagement/>
-</p:properties>
+<file path=customXml/itemProps1.xml><?xml version="1.0" encoding="utf-8"?>
+<ds:datastoreItem xmlns:ds="http://schemas.openxmlformats.org/officeDocument/2006/customXml" ds:itemID="{F8D6F061-B7CA-4BC4-8B5B-692C2D9970D9}">
+  <ds:schemaRefs>
+    <ds:schemaRef ds:uri="http://schemas.microsoft.com/office/2006/metadata/properties"/>
+    <ds:schemaRef ds:uri="http://schemas.microsoft.com/office/infopath/2007/PartnerControls"/>
+  </ds:schemaRefs>
+</ds:datastoreItem>
 </file>
 
-<file path=customXml/itemProps1.xml><?xml version="1.0" encoding="utf-8"?>
+<file path=customXml/itemProps2.xml><?xml version="1.0" encoding="utf-8"?>
 <ds:datastoreItem xmlns:ds="http://schemas.openxmlformats.org/officeDocument/2006/customXml" ds:itemID="{512DDFFD-0BCE-4451-979E-05B4028F04A3}">
   <ds:schemaRefs>
     <ds:schemaRef ds:uri="http://schemas.microsoft.com/office/2006/metadata/contentType"/>
@@ -17552,7 +18313,7 @@
 </ds:datastoreItem>
 </file>
 
-<file path=customXml/itemProps2.xml><?xml version="1.0" encoding="utf-8"?>
+<file path=customXml/itemProps3.xml><?xml version="1.0" encoding="utf-8"?>
 <ds:datastoreItem xmlns:ds="http://schemas.openxmlformats.org/officeDocument/2006/customXml" ds:itemID="{AA00162B-AAF6-4E5D-B2D5-D918EFED2F71}">
   <ds:schemaRefs>
     <ds:schemaRef ds:uri="http://schemas.openxmlformats.org/officeDocument/2006/bibliography"/>
@@ -17560,19 +18321,10 @@
 </ds:datastoreItem>
 </file>
 
-<file path=customXml/itemProps3.xml><?xml version="1.0" encoding="utf-8"?>
+<file path=customXml/itemProps4.xml><?xml version="1.0" encoding="utf-8"?>
 <ds:datastoreItem xmlns:ds="http://schemas.openxmlformats.org/officeDocument/2006/customXml" ds:itemID="{69595501-9542-49DE-8795-703C0188D075}">
   <ds:schemaRefs>
     <ds:schemaRef ds:uri="http://schemas.microsoft.com/sharepoint/v3/contenttype/forms"/>
   </ds:schemaRefs>
 </ds:datastoreItem>
-</file>
-
-<file path=customXml/itemProps4.xml><?xml version="1.0" encoding="utf-8"?>
-<ds:datastoreItem xmlns:ds="http://schemas.openxmlformats.org/officeDocument/2006/customXml" ds:itemID="{F8D6F061-B7CA-4BC4-8B5B-692C2D9970D9}">
-  <ds:schemaRefs>
-    <ds:schemaRef ds:uri="http://schemas.microsoft.com/office/2006/metadata/properties"/>
-    <ds:schemaRef ds:uri="http://schemas.microsoft.com/office/infopath/2007/PartnerControls"/>
-  </ds:schemaRefs>
-</ds:datastoreItem>
 </file>
</xml_diff>

<commit_message>
minor code update and compilation based on teh latest input_text/tables
</commit_message>
<xml_diff>
--- a/_text/SailingOrders/input_text_Sailing_Order.docx
+++ b/_text/SailingOrders/input_text_Sailing_Order.docx
@@ -104,21 +104,7 @@
           <w:rFonts w:asciiTheme="minorHAnsi" w:hAnsiTheme="minorHAnsi" w:cstheme="minorHAnsi"/>
           <w:szCs w:val="24"/>
         </w:rPr>
-        <w:t>.</w:t>
-      </w:r>
-      <w:r>
-        <w:rPr>
-          <w:rFonts w:asciiTheme="minorHAnsi" w:hAnsiTheme="minorHAnsi" w:cstheme="minorHAnsi"/>
-          <w:szCs w:val="24"/>
-        </w:rPr>
-        <w:t>1</w:t>
-      </w:r>
-      <w:r>
-        <w:rPr>
-          <w:rFonts w:asciiTheme="minorHAnsi" w:hAnsiTheme="minorHAnsi" w:cstheme="minorHAnsi"/>
-          <w:szCs w:val="24"/>
-        </w:rPr>
-        <w:t>.1</w:t>
+        <w:t>.1.1</w:t>
       </w:r>
       <w:r>
         <w:rPr>
@@ -485,7 +471,23 @@
           <w:szCs w:val="24"/>
           <w:lang w:val="en-US"/>
         </w:rPr>
-        <w:t xml:space="preserve">The survey area is within one of the major upwelling regions of the world, characterised by high productivity and important pelagic and demersal fishery resources. Leg 2 (2.1 and 2.2) covers the demersal resources in the deeper part of the continental shelf and the upper slope of Northwest Africa, from Casablanca (Morocco) to the southern border of Guinée </w:t>
+        <w:t>The survey area is within one of the major upwelling regions of the world, characterised by high productivity and important pelagic and demersal fishery resources. Leg 2 (2.1 and 2.2) covers the demersal resources in the deeper part of the continental shelf and the upper slope of Northwest Africa, from Casablanca (Morocco) to the southern border of Guin</w:t>
+      </w:r>
+      <w:r>
+        <w:rPr>
+          <w:rFonts w:asciiTheme="minorHAnsi" w:hAnsiTheme="minorHAnsi" w:cstheme="minorHAnsi"/>
+          <w:szCs w:val="24"/>
+          <w:lang w:val="en-US"/>
+        </w:rPr>
+        <w:t>ea</w:t>
+      </w:r>
+      <w:r>
+        <w:rPr>
+          <w:rFonts w:asciiTheme="minorHAnsi" w:hAnsiTheme="minorHAnsi" w:cstheme="minorHAnsi"/>
+          <w:szCs w:val="24"/>
+          <w:lang w:val="en-US"/>
+        </w:rPr>
+        <w:t xml:space="preserve"> </w:t>
       </w:r>
       <w:r>
         <w:rPr>
@@ -688,63 +690,6 @@
     </w:p>
     <w:p>
       <w:pPr>
-        <w:rPr>
-          <w:rFonts w:asciiTheme="minorHAnsi" w:hAnsiTheme="minorHAnsi" w:cstheme="minorHAnsi"/>
-          <w:szCs w:val="24"/>
-          <w:lang w:val="en-US"/>
-        </w:rPr>
-      </w:pPr>
-      <w:r>
-        <w:rPr>
-          <w:rFonts w:asciiTheme="minorHAnsi" w:hAnsiTheme="minorHAnsi" w:cstheme="minorHAnsi"/>
-          <w:szCs w:val="24"/>
-          <w:lang w:val="en-US"/>
-        </w:rPr>
-        <w:t xml:space="preserve">Standard sampling will be carried out as during most surveys conducted by </w:t>
-      </w:r>
-      <w:r>
-        <w:rPr>
-          <w:rFonts w:asciiTheme="minorHAnsi" w:hAnsiTheme="minorHAnsi" w:cstheme="minorHAnsi"/>
-          <w:szCs w:val="24"/>
-          <w:lang w:val="en-US"/>
-        </w:rPr>
-        <w:t>R/V</w:t>
-      </w:r>
-      <w:r>
-        <w:rPr>
-          <w:rFonts w:asciiTheme="minorHAnsi" w:hAnsiTheme="minorHAnsi" w:cstheme="minorHAnsi"/>
-          <w:szCs w:val="24"/>
-          <w:lang w:val="en-US"/>
-        </w:rPr>
-        <w:t xml:space="preserve"> </w:t>
-      </w:r>
-      <w:r>
-        <w:rPr>
-          <w:rFonts w:asciiTheme="minorHAnsi" w:hAnsiTheme="minorHAnsi" w:cstheme="minorHAnsi"/>
-          <w:szCs w:val="24"/>
-          <w:lang w:val="en-US"/>
-        </w:rPr>
-        <w:t>_</w:t>
-      </w:r>
-      <w:r>
-        <w:rPr>
-          <w:rFonts w:asciiTheme="minorHAnsi" w:hAnsiTheme="minorHAnsi" w:cstheme="minorHAnsi"/>
-          <w:szCs w:val="24"/>
-          <w:lang w:val="en-US"/>
-        </w:rPr>
-        <w:t>Dr Fridtjof Nansen_</w:t>
-      </w:r>
-      <w:r>
-        <w:rPr>
-          <w:rFonts w:asciiTheme="minorHAnsi" w:hAnsiTheme="minorHAnsi" w:cstheme="minorHAnsi"/>
-          <w:szCs w:val="24"/>
-          <w:lang w:val="en-US"/>
-        </w:rPr>
-        <w:t xml:space="preserve"> (e.g., oceanographic conditions, including oceans pH and carbonate system, primary productivity, food safety, microplastics, marine debris, biodiversity, pelagic and demersal fish resources). Sampling protocols are standardized to the extent possible to allow comparability across larger geographic scales.</w:t>
-      </w:r>
-    </w:p>
-    <w:p>
-      <w:pPr>
         <w:pStyle w:val="Heading3"/>
         <w:rPr>
           <w:rFonts w:asciiTheme="minorHAnsi" w:hAnsiTheme="minorHAnsi" w:cstheme="minorHAnsi"/>
@@ -784,239 +729,173 @@
       <w:pPr>
         <w:spacing w:after="120"/>
         <w:rPr>
-          <w:rFonts w:asciiTheme="minorHAnsi" w:hAnsiTheme="minorHAnsi" w:cstheme="minorHAnsi"/>
+          <w:rFonts w:asciiTheme="minorHAnsi" w:hAnsiTheme="minorHAnsi" w:cstheme="minorBidi"/>
+          <w:color w:val="000000" w:themeColor="text1"/>
+        </w:rPr>
+      </w:pPr>
+      <w:r>
+        <w:rPr>
+          <w:rFonts w:asciiTheme="minorHAnsi" w:hAnsiTheme="minorHAnsi" w:cstheme="minorBidi"/>
           <w:color w:val="000000"/>
           <w:spacing w:val="-3"/>
-          <w:szCs w:val="24"/>
-        </w:rPr>
-      </w:pPr>
-      <w:r>
-        <w:rPr>
-          <w:rFonts w:asciiTheme="minorHAnsi" w:hAnsiTheme="minorHAnsi" w:cstheme="minorHAnsi"/>
+        </w:rPr>
+        <w:t xml:space="preserve">Typically, the surveys with the </w:t>
+      </w:r>
+      <w:r>
+        <w:rPr>
+          <w:rFonts w:asciiTheme="minorHAnsi" w:hAnsiTheme="minorHAnsi" w:cstheme="minorBidi"/>
           <w:color w:val="000000"/>
           <w:spacing w:val="-3"/>
-          <w:szCs w:val="24"/>
-        </w:rPr>
-        <w:t xml:space="preserve">Typically, the surveys with the </w:t>
-      </w:r>
-      <w:r>
-        <w:rPr>
-          <w:rFonts w:asciiTheme="minorHAnsi" w:hAnsiTheme="minorHAnsi" w:cstheme="minorHAnsi"/>
+        </w:rPr>
+        <w:t>R/V</w:t>
+      </w:r>
+      <w:r>
+        <w:rPr>
+          <w:rFonts w:asciiTheme="minorHAnsi" w:hAnsiTheme="minorHAnsi" w:cstheme="minorBidi"/>
           <w:color w:val="000000"/>
           <w:spacing w:val="-3"/>
-          <w:szCs w:val="24"/>
-        </w:rPr>
-        <w:t>R/V</w:t>
-      </w:r>
-      <w:r>
-        <w:rPr>
-          <w:rFonts w:asciiTheme="minorHAnsi" w:hAnsiTheme="minorHAnsi" w:cstheme="minorHAnsi"/>
+        </w:rPr>
+        <w:t xml:space="preserve"> </w:t>
+      </w:r>
+      <w:r>
+        <w:rPr>
+          <w:rFonts w:asciiTheme="minorHAnsi" w:hAnsiTheme="minorHAnsi" w:cstheme="minorBidi"/>
           <w:color w:val="000000"/>
           <w:spacing w:val="-3"/>
-          <w:szCs w:val="24"/>
-        </w:rPr>
-        <w:t xml:space="preserve"> </w:t>
-      </w:r>
-      <w:r>
-        <w:rPr>
-          <w:rFonts w:asciiTheme="minorHAnsi" w:hAnsiTheme="minorHAnsi" w:cstheme="minorHAnsi"/>
+        </w:rPr>
+        <w:t>_</w:t>
+      </w:r>
+      <w:r>
+        <w:rPr>
+          <w:rFonts w:asciiTheme="minorHAnsi" w:hAnsiTheme="minorHAnsi" w:cstheme="minorBidi"/>
           <w:color w:val="000000"/>
           <w:spacing w:val="-3"/>
-          <w:szCs w:val="24"/>
-        </w:rPr>
-        <w:t>_</w:t>
-      </w:r>
-      <w:r>
-        <w:rPr>
-          <w:rFonts w:asciiTheme="minorHAnsi" w:hAnsiTheme="minorHAnsi" w:cstheme="minorHAnsi"/>
+        </w:rPr>
+        <w:t>Dr Fridtjof Nansen</w:t>
+      </w:r>
+      <w:r>
+        <w:rPr>
+          <w:rFonts w:asciiTheme="minorHAnsi" w:hAnsiTheme="minorHAnsi" w:cstheme="minorBidi"/>
           <w:color w:val="000000"/>
           <w:spacing w:val="-3"/>
-          <w:szCs w:val="24"/>
-        </w:rPr>
-        <w:t>Dr Fridtjof Nansen</w:t>
-      </w:r>
-      <w:r>
-        <w:rPr>
-          <w:rFonts w:asciiTheme="minorHAnsi" w:hAnsiTheme="minorHAnsi" w:cstheme="minorHAnsi"/>
+        </w:rPr>
+        <w:t>_</w:t>
+      </w:r>
+      <w:r>
+        <w:rPr>
+          <w:rFonts w:asciiTheme="minorHAnsi" w:hAnsiTheme="minorHAnsi" w:cstheme="minorBidi"/>
           <w:color w:val="000000"/>
           <w:spacing w:val="-3"/>
-          <w:szCs w:val="24"/>
-        </w:rPr>
-        <w:t>_</w:t>
-      </w:r>
-      <w:r>
-        <w:rPr>
-          <w:rFonts w:asciiTheme="minorHAnsi" w:hAnsiTheme="minorHAnsi" w:cstheme="minorHAnsi"/>
+        </w:rPr>
+        <w:t xml:space="preserve"> include participations from different countries and institutions. Regarding qualifications, a mix of experienced scientists /technicians and less experienced ones, to receive training, will receive on-the-job training in sampling procedures. Scientists from Spain, and IEO (Instituto Español de Oceanografia) and the University of Vigo, will also be invited to deliver specific expertise, given their experience in the field of fisheries and marine habitats in the region. </w:t>
+      </w:r>
+      <w:r>
+        <w:rPr>
+          <w:rFonts w:asciiTheme="minorHAnsi" w:hAnsiTheme="minorHAnsi" w:cstheme="minorBidi"/>
+          <w:color w:val="000000" w:themeColor="text1"/>
+        </w:rPr>
+        <w:t xml:space="preserve">An overview of the main types of expertise and number of participants required for Leg 2 is provided in </w:t>
+      </w:r>
+      <w:r>
+        <w:rPr>
+          <w:rFonts w:asciiTheme="minorHAnsi" w:hAnsiTheme="minorHAnsi" w:cstheme="minorBidi"/>
+          <w:color w:val="000000" w:themeColor="text1"/>
+          <w:lang w:val="en-US"/>
+        </w:rPr>
+        <w:t>[ANNEX</w:t>
+      </w:r>
+      <w:r>
+        <w:rPr>
+          <w:rFonts w:asciiTheme="minorHAnsi" w:hAnsiTheme="minorHAnsi" w:cstheme="minorBidi"/>
+          <w:color w:val="000000" w:themeColor="text1"/>
+          <w:lang w:val="en-US"/>
+        </w:rPr>
+        <w:t xml:space="preserve"> </w:t>
+      </w:r>
+      <w:r>
+        <w:rPr>
+          <w:rFonts w:asciiTheme="minorHAnsi" w:hAnsiTheme="minorHAnsi" w:cstheme="minorBidi"/>
+          <w:color w:val="000000" w:themeColor="text1"/>
+          <w:lang w:val="en-US"/>
+        </w:rPr>
+        <w:t>I]</w:t>
+      </w:r>
+      <w:r>
+        <w:rPr>
+          <w:rFonts w:asciiTheme="minorHAnsi" w:hAnsiTheme="minorHAnsi" w:cstheme="minorBidi"/>
+          <w:color w:val="000000" w:themeColor="text1"/>
+          <w:lang w:val="en-US"/>
+        </w:rPr>
+        <w:t>(#ANNEX_I)</w:t>
+      </w:r>
+      <w:r>
+        <w:rPr>
+          <w:rFonts w:asciiTheme="minorHAnsi" w:hAnsiTheme="minorHAnsi" w:cstheme="minorBidi"/>
+          <w:color w:val="000000" w:themeColor="text1"/>
+          <w:lang w:val="en-US"/>
+        </w:rPr>
+        <w:t xml:space="preserve"> </w:t>
+      </w:r>
+      <w:r>
+        <w:rPr>
+          <w:rFonts w:asciiTheme="minorHAnsi" w:hAnsiTheme="minorHAnsi" w:cstheme="minorBidi"/>
+          <w:color w:val="000000" w:themeColor="text1"/>
+        </w:rPr>
+        <w:t xml:space="preserve">and the list of the </w:t>
+      </w:r>
+      <w:r>
+        <w:rPr>
+          <w:rFonts w:asciiTheme="minorHAnsi" w:hAnsiTheme="minorHAnsi" w:cstheme="minorBidi"/>
+          <w:color w:val="000000" w:themeColor="text1"/>
+        </w:rPr>
+        <w:t xml:space="preserve">planned </w:t>
+      </w:r>
+      <w:r>
+        <w:rPr>
+          <w:rFonts w:asciiTheme="minorHAnsi" w:hAnsiTheme="minorHAnsi" w:cstheme="minorBidi"/>
+          <w:color w:val="000000" w:themeColor="text1"/>
+        </w:rPr>
+        <w:t xml:space="preserve">survey participants is shown in </w:t>
+      </w:r>
+      <w:r>
+        <w:rPr>
+          <w:rFonts w:asciiTheme="minorHAnsi" w:hAnsiTheme="minorHAnsi" w:cstheme="minorBidi"/>
+          <w:color w:val="000000" w:themeColor="text1"/>
+          <w:lang w:val="en-US"/>
+        </w:rPr>
+        <w:t>[ANNEX II](#ANNEX_II)</w:t>
+      </w:r>
+      <w:r>
+        <w:rPr>
+          <w:rFonts w:asciiTheme="minorHAnsi" w:hAnsiTheme="minorHAnsi" w:cstheme="minorBidi"/>
+          <w:color w:val="000000" w:themeColor="text1"/>
+        </w:rPr>
+        <w:t>.</w:t>
+      </w:r>
+      <w:r>
+        <w:rPr>
+          <w:rFonts w:asciiTheme="minorHAnsi" w:hAnsiTheme="minorHAnsi" w:cstheme="minorBidi"/>
+          <w:color w:val="000000" w:themeColor="text1"/>
+        </w:rPr>
+        <w:t xml:space="preserve"> </w:t>
+      </w:r>
+    </w:p>
+    <w:p>
+      <w:pPr>
+        <w:spacing w:after="120"/>
+        <w:rPr>
+          <w:rFonts w:asciiTheme="minorHAnsi" w:hAnsiTheme="minorHAnsi" w:cstheme="minorBidi"/>
           <w:color w:val="000000"/>
           <w:spacing w:val="-3"/>
-          <w:szCs w:val="24"/>
-        </w:rPr>
-        <w:t xml:space="preserve"> include participations from different countries and institutions. Regarding qualifications, a mix of experienced scientists /technicians and less experienced ones, to receive training, will receive on-the-job training in sampling procedures. Scientists from Spain, and IEO (Instituto Español de Oceanografia) and the </w:t>
-      </w:r>
-      <w:r>
-        <w:rPr>
-          <w:rFonts w:asciiTheme="minorHAnsi" w:hAnsiTheme="minorHAnsi" w:cstheme="minorHAnsi"/>
+        </w:rPr>
+      </w:pPr>
+      <w:r>
+        <w:rPr>
+          <w:rFonts w:asciiTheme="minorHAnsi" w:hAnsiTheme="minorHAnsi" w:cstheme="minorBidi"/>
           <w:color w:val="000000"/>
           <w:spacing w:val="-3"/>
-          <w:szCs w:val="24"/>
         </w:rPr>
         <w:lastRenderedPageBreak/>
-        <w:t xml:space="preserve">University of Vigo, will also be invited to deliver specific expertise, given their experience in the field of fisheries and marine habitats in the region. </w:t>
-      </w:r>
-      <w:r>
-        <w:rPr>
-          <w:rFonts w:asciiTheme="minorHAnsi" w:hAnsiTheme="minorHAnsi" w:cstheme="minorHAnsi"/>
-          <w:color w:val="000000"/>
-          <w:spacing w:val="-3"/>
-          <w:szCs w:val="24"/>
-        </w:rPr>
-        <w:t xml:space="preserve">An overview of the main types of expertise and number of participants required for Leg 2 is provided in </w:t>
-      </w:r>
-      <w:r>
-        <w:rPr>
-          <w:rFonts w:asciiTheme="minorHAnsi" w:hAnsiTheme="minorHAnsi" w:cstheme="minorHAnsi"/>
-          <w:color w:val="000000"/>
-          <w:spacing w:val="-3"/>
-          <w:szCs w:val="24"/>
-          <w:lang w:val="en-US"/>
-        </w:rPr>
-        <w:t>[A</w:t>
-      </w:r>
-      <w:r>
-        <w:rPr>
-          <w:rFonts w:asciiTheme="minorHAnsi" w:hAnsiTheme="minorHAnsi" w:cstheme="minorHAnsi"/>
-          <w:color w:val="000000"/>
-          <w:spacing w:val="-3"/>
-          <w:szCs w:val="24"/>
-          <w:lang w:val="en-US"/>
-        </w:rPr>
-        <w:t>NNEX I](#</w:t>
-      </w:r>
-      <w:r>
-        <w:rPr>
-          <w:rFonts w:asciiTheme="minorHAnsi" w:hAnsiTheme="minorHAnsi" w:cstheme="minorHAnsi"/>
-          <w:color w:val="000000"/>
-          <w:spacing w:val="-3"/>
-          <w:szCs w:val="24"/>
-          <w:lang w:val="en-US"/>
-        </w:rPr>
-        <w:t>A</w:t>
-      </w:r>
-      <w:r>
-        <w:rPr>
-          <w:rFonts w:asciiTheme="minorHAnsi" w:hAnsiTheme="minorHAnsi" w:cstheme="minorHAnsi"/>
-          <w:color w:val="000000"/>
-          <w:spacing w:val="-3"/>
-          <w:szCs w:val="24"/>
-          <w:lang w:val="en-US"/>
-        </w:rPr>
-        <w:t xml:space="preserve">NNEX_I) </w:t>
-      </w:r>
-      <w:r>
-        <w:rPr>
-          <w:rFonts w:asciiTheme="minorHAnsi" w:hAnsiTheme="minorHAnsi" w:cstheme="minorHAnsi"/>
-          <w:color w:val="000000"/>
-          <w:spacing w:val="-3"/>
-          <w:szCs w:val="24"/>
-        </w:rPr>
-        <w:t xml:space="preserve">and the list of the </w:t>
-      </w:r>
-      <w:r>
-        <w:rPr>
-          <w:rFonts w:asciiTheme="minorHAnsi" w:hAnsiTheme="minorHAnsi" w:cstheme="minorHAnsi"/>
-          <w:color w:val="000000"/>
-          <w:spacing w:val="-3"/>
-          <w:szCs w:val="24"/>
-        </w:rPr>
-        <w:t xml:space="preserve">planned </w:t>
-      </w:r>
-      <w:r>
-        <w:rPr>
-          <w:rFonts w:asciiTheme="minorHAnsi" w:hAnsiTheme="minorHAnsi" w:cstheme="minorHAnsi"/>
-          <w:color w:val="000000"/>
-          <w:spacing w:val="-3"/>
-          <w:szCs w:val="24"/>
-        </w:rPr>
-        <w:t xml:space="preserve">survey participants is shown in </w:t>
-      </w:r>
-      <w:r>
-        <w:rPr>
-          <w:rFonts w:asciiTheme="minorHAnsi" w:hAnsiTheme="minorHAnsi" w:cstheme="minorHAnsi"/>
-          <w:color w:val="000000"/>
-          <w:spacing w:val="-3"/>
-          <w:szCs w:val="24"/>
-          <w:lang w:val="en-US"/>
-        </w:rPr>
-        <w:t>[A</w:t>
-      </w:r>
-      <w:r>
-        <w:rPr>
-          <w:rFonts w:asciiTheme="minorHAnsi" w:hAnsiTheme="minorHAnsi" w:cstheme="minorHAnsi"/>
-          <w:color w:val="000000"/>
-          <w:spacing w:val="-3"/>
-          <w:szCs w:val="24"/>
-          <w:lang w:val="en-US"/>
-        </w:rPr>
-        <w:t>NNEX II](#</w:t>
-      </w:r>
-      <w:r>
-        <w:rPr>
-          <w:rFonts w:asciiTheme="minorHAnsi" w:hAnsiTheme="minorHAnsi" w:cstheme="minorHAnsi"/>
-          <w:color w:val="000000"/>
-          <w:spacing w:val="-3"/>
-          <w:szCs w:val="24"/>
-          <w:lang w:val="en-US"/>
-        </w:rPr>
-        <w:t>A</w:t>
-      </w:r>
-      <w:r>
-        <w:rPr>
-          <w:rFonts w:asciiTheme="minorHAnsi" w:hAnsiTheme="minorHAnsi" w:cstheme="minorHAnsi"/>
-          <w:color w:val="000000"/>
-          <w:spacing w:val="-3"/>
-          <w:szCs w:val="24"/>
-          <w:lang w:val="en-US"/>
-        </w:rPr>
-        <w:t>NNEX_II)</w:t>
-      </w:r>
-      <w:r>
-        <w:rPr>
-          <w:rFonts w:asciiTheme="minorHAnsi" w:hAnsiTheme="minorHAnsi" w:cstheme="minorHAnsi"/>
-          <w:color w:val="000000"/>
-          <w:spacing w:val="-3"/>
-          <w:szCs w:val="24"/>
-        </w:rPr>
-        <w:t>.</w:t>
-      </w:r>
-    </w:p>
-    <w:p>
-      <w:pPr>
-        <w:spacing w:after="120"/>
-        <w:rPr>
-          <w:rFonts w:asciiTheme="minorHAnsi" w:hAnsiTheme="minorHAnsi" w:cstheme="minorHAnsi"/>
-          <w:color w:val="000000"/>
-          <w:spacing w:val="-3"/>
-          <w:szCs w:val="24"/>
-        </w:rPr>
-      </w:pPr>
-    </w:p>
-    <w:p>
-      <w:pPr>
-        <w:spacing w:after="120"/>
-        <w:rPr>
-          <w:rFonts w:asciiTheme="minorHAnsi" w:hAnsiTheme="minorHAnsi" w:cstheme="minorHAnsi"/>
-          <w:color w:val="000000"/>
-          <w:spacing w:val="-3"/>
-          <w:szCs w:val="24"/>
-        </w:rPr>
-      </w:pPr>
-      <w:r>
-        <w:rPr>
-          <w:rFonts w:asciiTheme="minorHAnsi" w:hAnsiTheme="minorHAnsi" w:cstheme="minorHAnsi"/>
-          <w:color w:val="000000"/>
-          <w:spacing w:val="-3"/>
-          <w:szCs w:val="24"/>
-        </w:rPr>
         <w:t xml:space="preserve">It should be noted that a maximum number of 19 local participants can be allowed, in addition to the scientific crew from Norway and the FAO taxonomy expert. </w:t>
       </w:r>
     </w:p>
@@ -1430,7 +1309,6 @@
           <w:rFonts w:asciiTheme="minorHAnsi" w:hAnsiTheme="minorHAnsi" w:cstheme="minorHAnsi"/>
           <w:szCs w:val="24"/>
         </w:rPr>
-        <w:lastRenderedPageBreak/>
         <w:t>Map the occurrence of microplastics to identify hotspots or degree of pollution</w:t>
       </w:r>
     </w:p>
@@ -1459,7 +1337,226 @@
           <w:rFonts w:asciiTheme="minorHAnsi" w:hAnsiTheme="minorHAnsi" w:cstheme="minorHAnsi"/>
           <w:szCs w:val="24"/>
         </w:rPr>
+        <w:t xml:space="preserve"> (see also section 1.3.8)</w:t>
+      </w:r>
+      <w:r>
+        <w:rPr>
+          <w:rFonts w:asciiTheme="minorHAnsi" w:hAnsiTheme="minorHAnsi" w:cstheme="minorHAnsi"/>
+          <w:szCs w:val="24"/>
+        </w:rPr>
         <w:t>:</w:t>
+      </w:r>
+    </w:p>
+    <w:p>
+      <w:pPr>
+        <w:widowControl w:val="0"/>
+        <w:numPr>
+          <w:ilvl w:val="1"/>
+          <w:numId w:val="6"/>
+        </w:numPr>
+        <w:spacing w:after="120" w:line="240" w:lineRule="auto"/>
+        <w:rPr>
+          <w:rFonts w:asciiTheme="minorHAnsi" w:hAnsiTheme="minorHAnsi" w:cstheme="minorHAnsi"/>
+          <w:szCs w:val="24"/>
+        </w:rPr>
+      </w:pPr>
+      <w:r>
+        <w:rPr>
+          <w:rFonts w:asciiTheme="minorHAnsi" w:hAnsiTheme="minorHAnsi" w:cstheme="minorHAnsi"/>
+          <w:szCs w:val="24"/>
+        </w:rPr>
+        <w:t xml:space="preserve">Swept-area biomass estimation of </w:t>
+      </w:r>
+      <w:r>
+        <w:rPr>
+          <w:rFonts w:asciiTheme="minorHAnsi" w:hAnsiTheme="minorHAnsi" w:cstheme="minorHAnsi"/>
+          <w:szCs w:val="24"/>
+        </w:rPr>
+        <w:t xml:space="preserve">the following </w:t>
+      </w:r>
+      <w:r>
+        <w:rPr>
+          <w:rFonts w:asciiTheme="minorHAnsi" w:hAnsiTheme="minorHAnsi" w:cstheme="minorHAnsi"/>
+          <w:szCs w:val="24"/>
+        </w:rPr>
+        <w:t>priority demersal resources</w:t>
+      </w:r>
+      <w:r>
+        <w:rPr>
+          <w:rFonts w:asciiTheme="minorHAnsi" w:hAnsiTheme="minorHAnsi" w:cstheme="minorHAnsi"/>
+          <w:szCs w:val="24"/>
+        </w:rPr>
+        <w:t>:</w:t>
+      </w:r>
+    </w:p>
+    <w:p>
+      <w:pPr>
+        <w:widowControl w:val="0"/>
+        <w:spacing w:after="120" w:line="240" w:lineRule="auto"/>
+        <w:ind w:left="720"/>
+        <w:rPr>
+          <w:rFonts w:asciiTheme="minorHAnsi" w:hAnsiTheme="minorHAnsi" w:cstheme="minorHAnsi"/>
+          <w:szCs w:val="24"/>
+        </w:rPr>
+      </w:pPr>
+    </w:p>
+    <w:p>
+      <w:pPr>
+        <w:widowControl w:val="0"/>
+        <w:spacing w:after="120" w:line="240" w:lineRule="auto"/>
+        <w:ind w:left="720"/>
+        <w:rPr>
+          <w:rFonts w:asciiTheme="minorHAnsi" w:hAnsiTheme="minorHAnsi" w:cstheme="minorHAnsi"/>
+          <w:szCs w:val="24"/>
+        </w:rPr>
+      </w:pPr>
+      <w:r>
+        <w:rPr>
+          <w:rFonts w:asciiTheme="minorHAnsi" w:hAnsiTheme="minorHAnsi" w:cstheme="minorHAnsi"/>
+          <w:szCs w:val="24"/>
+        </w:rPr>
+        <w:t>**_</w:t>
+      </w:r>
+      <w:r>
+        <w:rPr>
+          <w:rStyle w:val="normaltextrun"/>
+          <w:rFonts w:ascii="Calibri" w:hAnsi="Calibri" w:cs="Calibri"/>
+          <w:color w:val="000000"/>
+          <w:bdr w:val="none" w:sz="0" w:space="0" w:color="auto" w:frame="1"/>
+        </w:rPr>
+        <w:t>Merluccius merluccius_**,</w:t>
+      </w:r>
+      <w:r>
+        <w:rPr>
+          <w:rFonts w:asciiTheme="minorHAnsi" w:hAnsiTheme="minorHAnsi" w:cstheme="minorHAnsi"/>
+          <w:szCs w:val="24"/>
+        </w:rPr>
+        <w:t xml:space="preserve"> **_M. senegalensis_**, **_M. polli_**, </w:t>
+      </w:r>
+    </w:p>
+    <w:p>
+      <w:pPr>
+        <w:pStyle w:val="ListParagraph"/>
+        <w:widowControl w:val="0"/>
+        <w:spacing w:after="0" w:line="240" w:lineRule="auto"/>
+        <w:ind w:left="360" w:firstLine="360"/>
+        <w:jc w:val="both"/>
+        <w:rPr>
+          <w:rFonts w:asciiTheme="minorHAnsi" w:hAnsiTheme="minorHAnsi" w:cstheme="minorHAnsi"/>
+          <w:szCs w:val="24"/>
+        </w:rPr>
+      </w:pPr>
+      <w:r>
+        <w:rPr>
+          <w:rFonts w:asciiTheme="minorHAnsi" w:hAnsiTheme="minorHAnsi" w:cstheme="minorHAnsi"/>
+          <w:szCs w:val="24"/>
+        </w:rPr>
+        <w:lastRenderedPageBreak/>
+        <w:t>**</w:t>
+      </w:r>
+      <w:r>
+        <w:rPr>
+          <w:rFonts w:asciiTheme="minorHAnsi" w:hAnsiTheme="minorHAnsi" w:cstheme="minorHAnsi"/>
+          <w:szCs w:val="24"/>
+        </w:rPr>
+        <w:t>_Pagellus bellottii_</w:t>
+      </w:r>
+      <w:r>
+        <w:rPr>
+          <w:rFonts w:asciiTheme="minorHAnsi" w:hAnsiTheme="minorHAnsi" w:cstheme="minorHAnsi"/>
+          <w:szCs w:val="24"/>
+        </w:rPr>
+        <w:t>**</w:t>
+      </w:r>
+      <w:r>
+        <w:rPr>
+          <w:rFonts w:asciiTheme="minorHAnsi" w:hAnsiTheme="minorHAnsi" w:cstheme="minorHAnsi"/>
+          <w:szCs w:val="24"/>
+        </w:rPr>
+        <w:t xml:space="preserve">, </w:t>
+      </w:r>
+      <w:r>
+        <w:rPr>
+          <w:rFonts w:asciiTheme="minorHAnsi" w:hAnsiTheme="minorHAnsi" w:cstheme="minorHAnsi"/>
+          <w:szCs w:val="24"/>
+        </w:rPr>
+        <w:t>**</w:t>
+      </w:r>
+      <w:r>
+        <w:rPr>
+          <w:rFonts w:asciiTheme="minorHAnsi" w:hAnsiTheme="minorHAnsi" w:cstheme="minorHAnsi"/>
+          <w:szCs w:val="24"/>
+        </w:rPr>
+        <w:t>_P. acarne_</w:t>
+      </w:r>
+      <w:r>
+        <w:rPr>
+          <w:rFonts w:asciiTheme="minorHAnsi" w:hAnsiTheme="minorHAnsi" w:cstheme="minorHAnsi"/>
+          <w:szCs w:val="24"/>
+        </w:rPr>
+        <w:t>**</w:t>
+      </w:r>
+      <w:r>
+        <w:rPr>
+          <w:rFonts w:asciiTheme="minorHAnsi" w:hAnsiTheme="minorHAnsi" w:cstheme="minorHAnsi"/>
+          <w:szCs w:val="24"/>
+        </w:rPr>
+        <w:t xml:space="preserve">, </w:t>
+      </w:r>
+      <w:r>
+        <w:rPr>
+          <w:rFonts w:asciiTheme="minorHAnsi" w:hAnsiTheme="minorHAnsi" w:cstheme="minorHAnsi"/>
+          <w:szCs w:val="24"/>
+        </w:rPr>
+        <w:t>**</w:t>
+      </w:r>
+      <w:r>
+        <w:rPr>
+          <w:rFonts w:asciiTheme="minorHAnsi" w:hAnsiTheme="minorHAnsi" w:cstheme="minorHAnsi"/>
+          <w:szCs w:val="24"/>
+        </w:rPr>
+        <w:t>_Pagellus_ spp.</w:t>
+      </w:r>
+      <w:r>
+        <w:rPr>
+          <w:rFonts w:asciiTheme="minorHAnsi" w:hAnsiTheme="minorHAnsi" w:cstheme="minorHAnsi"/>
+          <w:szCs w:val="24"/>
+        </w:rPr>
+        <w:t xml:space="preserve">** and </w:t>
+      </w:r>
+    </w:p>
+    <w:p>
+      <w:pPr>
+        <w:pStyle w:val="ListParagraph"/>
+        <w:widowControl w:val="0"/>
+        <w:spacing w:after="0" w:line="240" w:lineRule="auto"/>
+        <w:ind w:left="360" w:firstLine="360"/>
+        <w:jc w:val="both"/>
+        <w:rPr>
+          <w:rFonts w:asciiTheme="minorHAnsi" w:hAnsiTheme="minorHAnsi" w:cstheme="minorHAnsi"/>
+          <w:szCs w:val="24"/>
+        </w:rPr>
+      </w:pPr>
+      <w:r>
+        <w:rPr>
+          <w:rFonts w:asciiTheme="minorHAnsi" w:hAnsiTheme="minorHAnsi" w:cstheme="minorHAnsi"/>
+          <w:szCs w:val="24"/>
+        </w:rPr>
+        <w:t>**</w:t>
+      </w:r>
+      <w:r>
+        <w:rPr>
+          <w:rFonts w:asciiTheme="minorHAnsi" w:hAnsiTheme="minorHAnsi" w:cstheme="minorHAnsi"/>
+          <w:szCs w:val="24"/>
+        </w:rPr>
+        <w:t>_Dentex macrophthalmus_</w:t>
+      </w:r>
+      <w:r>
+        <w:rPr>
+          <w:rFonts w:asciiTheme="minorHAnsi" w:hAnsiTheme="minorHAnsi" w:cstheme="minorHAnsi"/>
+          <w:szCs w:val="24"/>
+        </w:rPr>
+        <w:t>**.</w:t>
       </w:r>
     </w:p>
     <w:p>
@@ -1938,298 +2035,6 @@
     <w:p>
       <w:pPr>
         <w:widowControl w:val="0"/>
-        <w:numPr>
-          <w:ilvl w:val="1"/>
-          <w:numId w:val="6"/>
-        </w:numPr>
-        <w:spacing w:after="120" w:line="240" w:lineRule="auto"/>
-        <w:rPr>
-          <w:rFonts w:asciiTheme="minorHAnsi" w:hAnsiTheme="minorHAnsi" w:cstheme="minorHAnsi"/>
-          <w:szCs w:val="24"/>
-        </w:rPr>
-      </w:pPr>
-      <w:r>
-        <w:rPr>
-          <w:rFonts w:asciiTheme="minorHAnsi" w:hAnsiTheme="minorHAnsi" w:cstheme="minorHAnsi"/>
-          <w:szCs w:val="24"/>
-        </w:rPr>
-        <w:t xml:space="preserve">Swept-area biomass estimation of </w:t>
-      </w:r>
-      <w:r>
-        <w:rPr>
-          <w:rFonts w:asciiTheme="minorHAnsi" w:hAnsiTheme="minorHAnsi" w:cstheme="minorHAnsi"/>
-          <w:szCs w:val="24"/>
-        </w:rPr>
-        <w:t xml:space="preserve">the following </w:t>
-      </w:r>
-      <w:r>
-        <w:rPr>
-          <w:rFonts w:asciiTheme="minorHAnsi" w:hAnsiTheme="minorHAnsi" w:cstheme="minorHAnsi"/>
-          <w:szCs w:val="24"/>
-        </w:rPr>
-        <w:t>priority demersal resources</w:t>
-      </w:r>
-      <w:r>
-        <w:rPr>
-          <w:rFonts w:asciiTheme="minorHAnsi" w:hAnsiTheme="minorHAnsi" w:cstheme="minorHAnsi"/>
-          <w:szCs w:val="24"/>
-        </w:rPr>
-        <w:t>:</w:t>
-      </w:r>
-    </w:p>
-    <w:p>
-      <w:pPr>
-        <w:widowControl w:val="0"/>
-        <w:spacing w:after="120" w:line="240" w:lineRule="auto"/>
-        <w:ind w:left="720"/>
-        <w:rPr>
-          <w:rFonts w:asciiTheme="minorHAnsi" w:hAnsiTheme="minorHAnsi" w:cstheme="minorHAnsi"/>
-          <w:szCs w:val="24"/>
-        </w:rPr>
-      </w:pPr>
-    </w:p>
-    <w:p>
-      <w:pPr>
-        <w:widowControl w:val="0"/>
-        <w:spacing w:after="120" w:line="240" w:lineRule="auto"/>
-        <w:ind w:left="720"/>
-        <w:rPr>
-          <w:rFonts w:asciiTheme="minorHAnsi" w:hAnsiTheme="minorHAnsi" w:cstheme="minorHAnsi"/>
-          <w:szCs w:val="24"/>
-        </w:rPr>
-      </w:pPr>
-      <w:r>
-        <w:rPr>
-          <w:rFonts w:asciiTheme="minorHAnsi" w:hAnsiTheme="minorHAnsi" w:cstheme="minorHAnsi"/>
-          <w:szCs w:val="24"/>
-        </w:rPr>
-        <w:t>**</w:t>
-      </w:r>
-      <w:r>
-        <w:rPr>
-          <w:rFonts w:asciiTheme="minorHAnsi" w:hAnsiTheme="minorHAnsi" w:cstheme="minorHAnsi"/>
-          <w:szCs w:val="24"/>
-        </w:rPr>
-        <w:t>_</w:t>
-      </w:r>
-      <w:r>
-        <w:rPr>
-          <w:rStyle w:val="normaltextrun"/>
-          <w:rFonts w:ascii="Calibri" w:hAnsi="Calibri" w:cs="Calibri"/>
-          <w:color w:val="000000"/>
-          <w:bdr w:val="none" w:sz="0" w:space="0" w:color="auto" w:frame="1"/>
-        </w:rPr>
-        <w:t>Merluccius merluccius_</w:t>
-      </w:r>
-      <w:r>
-        <w:rPr>
-          <w:rStyle w:val="normaltextrun"/>
-          <w:rFonts w:ascii="Calibri" w:hAnsi="Calibri" w:cs="Calibri"/>
-          <w:color w:val="000000"/>
-          <w:bdr w:val="none" w:sz="0" w:space="0" w:color="auto" w:frame="1"/>
-        </w:rPr>
-        <w:t>**</w:t>
-      </w:r>
-      <w:r>
-        <w:rPr>
-          <w:rStyle w:val="normaltextrun"/>
-          <w:rFonts w:ascii="Calibri" w:hAnsi="Calibri" w:cs="Calibri"/>
-          <w:color w:val="000000"/>
-          <w:bdr w:val="none" w:sz="0" w:space="0" w:color="auto" w:frame="1"/>
-        </w:rPr>
-        <w:t>,</w:t>
-      </w:r>
-      <w:r>
-        <w:rPr>
-          <w:rFonts w:asciiTheme="minorHAnsi" w:hAnsiTheme="minorHAnsi" w:cstheme="minorHAnsi"/>
-          <w:szCs w:val="24"/>
-        </w:rPr>
-        <w:t xml:space="preserve"> </w:t>
-      </w:r>
-      <w:r>
-        <w:rPr>
-          <w:rFonts w:asciiTheme="minorHAnsi" w:hAnsiTheme="minorHAnsi" w:cstheme="minorHAnsi"/>
-          <w:szCs w:val="24"/>
-        </w:rPr>
-        <w:t>**</w:t>
-      </w:r>
-      <w:r>
-        <w:rPr>
-          <w:rFonts w:asciiTheme="minorHAnsi" w:hAnsiTheme="minorHAnsi" w:cstheme="minorHAnsi"/>
-          <w:szCs w:val="24"/>
-        </w:rPr>
-        <w:t>_M. senegalensis_</w:t>
-      </w:r>
-      <w:r>
-        <w:rPr>
-          <w:rFonts w:asciiTheme="minorHAnsi" w:hAnsiTheme="minorHAnsi" w:cstheme="minorHAnsi"/>
-          <w:szCs w:val="24"/>
-        </w:rPr>
-        <w:t>**</w:t>
-      </w:r>
-      <w:r>
-        <w:rPr>
-          <w:rFonts w:asciiTheme="minorHAnsi" w:hAnsiTheme="minorHAnsi" w:cstheme="minorHAnsi"/>
-          <w:szCs w:val="24"/>
-        </w:rPr>
-        <w:t xml:space="preserve">, </w:t>
-      </w:r>
-      <w:r>
-        <w:rPr>
-          <w:rFonts w:asciiTheme="minorHAnsi" w:hAnsiTheme="minorHAnsi" w:cstheme="minorHAnsi"/>
-          <w:szCs w:val="24"/>
-        </w:rPr>
-        <w:t>**</w:t>
-      </w:r>
-      <w:r>
-        <w:rPr>
-          <w:rFonts w:asciiTheme="minorHAnsi" w:hAnsiTheme="minorHAnsi" w:cstheme="minorHAnsi"/>
-          <w:szCs w:val="24"/>
-        </w:rPr>
-        <w:t>_M. polli_</w:t>
-      </w:r>
-      <w:r>
-        <w:rPr>
-          <w:rFonts w:asciiTheme="minorHAnsi" w:hAnsiTheme="minorHAnsi" w:cstheme="minorHAnsi"/>
-          <w:szCs w:val="24"/>
-        </w:rPr>
-        <w:t xml:space="preserve">**, </w:t>
-      </w:r>
-    </w:p>
-    <w:p>
-      <w:pPr>
-        <w:pStyle w:val="ListParagraph"/>
-        <w:widowControl w:val="0"/>
-        <w:spacing w:after="0" w:line="240" w:lineRule="auto"/>
-        <w:ind w:left="360" w:firstLine="360"/>
-        <w:jc w:val="both"/>
-        <w:rPr>
-          <w:rFonts w:asciiTheme="minorHAnsi" w:hAnsiTheme="minorHAnsi" w:cstheme="minorHAnsi"/>
-          <w:szCs w:val="24"/>
-        </w:rPr>
-      </w:pPr>
-      <w:r>
-        <w:rPr>
-          <w:rFonts w:asciiTheme="minorHAnsi" w:hAnsiTheme="minorHAnsi" w:cstheme="minorHAnsi"/>
-          <w:szCs w:val="24"/>
-        </w:rPr>
-        <w:t>**</w:t>
-      </w:r>
-      <w:r>
-        <w:rPr>
-          <w:rFonts w:asciiTheme="minorHAnsi" w:hAnsiTheme="minorHAnsi" w:cstheme="minorHAnsi"/>
-          <w:szCs w:val="24"/>
-        </w:rPr>
-        <w:t>_Pagellus bellottii_</w:t>
-      </w:r>
-      <w:r>
-        <w:rPr>
-          <w:rFonts w:asciiTheme="minorHAnsi" w:hAnsiTheme="minorHAnsi" w:cstheme="minorHAnsi"/>
-          <w:szCs w:val="24"/>
-        </w:rPr>
-        <w:t>**</w:t>
-      </w:r>
-      <w:r>
-        <w:rPr>
-          <w:rFonts w:asciiTheme="minorHAnsi" w:hAnsiTheme="minorHAnsi" w:cstheme="minorHAnsi"/>
-          <w:szCs w:val="24"/>
-        </w:rPr>
-        <w:t xml:space="preserve">, </w:t>
-      </w:r>
-      <w:r>
-        <w:rPr>
-          <w:rFonts w:asciiTheme="minorHAnsi" w:hAnsiTheme="minorHAnsi" w:cstheme="minorHAnsi"/>
-          <w:szCs w:val="24"/>
-        </w:rPr>
-        <w:t>**</w:t>
-      </w:r>
-      <w:r>
-        <w:rPr>
-          <w:rFonts w:asciiTheme="minorHAnsi" w:hAnsiTheme="minorHAnsi" w:cstheme="minorHAnsi"/>
-          <w:szCs w:val="24"/>
-        </w:rPr>
-        <w:t>_P. acarne_</w:t>
-      </w:r>
-      <w:r>
-        <w:rPr>
-          <w:rFonts w:asciiTheme="minorHAnsi" w:hAnsiTheme="minorHAnsi" w:cstheme="minorHAnsi"/>
-          <w:szCs w:val="24"/>
-        </w:rPr>
-        <w:t>**</w:t>
-      </w:r>
-      <w:r>
-        <w:rPr>
-          <w:rFonts w:asciiTheme="minorHAnsi" w:hAnsiTheme="minorHAnsi" w:cstheme="minorHAnsi"/>
-          <w:szCs w:val="24"/>
-        </w:rPr>
-        <w:t xml:space="preserve">, </w:t>
-      </w:r>
-      <w:r>
-        <w:rPr>
-          <w:rFonts w:asciiTheme="minorHAnsi" w:hAnsiTheme="minorHAnsi" w:cstheme="minorHAnsi"/>
-          <w:szCs w:val="24"/>
-        </w:rPr>
-        <w:t>**</w:t>
-      </w:r>
-      <w:r>
-        <w:rPr>
-          <w:rFonts w:asciiTheme="minorHAnsi" w:hAnsiTheme="minorHAnsi" w:cstheme="minorHAnsi"/>
-          <w:szCs w:val="24"/>
-        </w:rPr>
-        <w:t>_Pagellus_ spp.</w:t>
-      </w:r>
-      <w:r>
-        <w:rPr>
-          <w:rFonts w:asciiTheme="minorHAnsi" w:hAnsiTheme="minorHAnsi" w:cstheme="minorHAnsi"/>
-          <w:szCs w:val="24"/>
-        </w:rPr>
-        <w:t xml:space="preserve">** and </w:t>
-      </w:r>
-    </w:p>
-    <w:p>
-      <w:pPr>
-        <w:pStyle w:val="ListParagraph"/>
-        <w:widowControl w:val="0"/>
-        <w:spacing w:after="0" w:line="240" w:lineRule="auto"/>
-        <w:ind w:left="360" w:firstLine="360"/>
-        <w:jc w:val="both"/>
-        <w:rPr>
-          <w:rFonts w:asciiTheme="minorHAnsi" w:hAnsiTheme="minorHAnsi" w:cstheme="minorHAnsi"/>
-          <w:szCs w:val="24"/>
-        </w:rPr>
-      </w:pPr>
-      <w:r>
-        <w:rPr>
-          <w:rFonts w:asciiTheme="minorHAnsi" w:hAnsiTheme="minorHAnsi" w:cstheme="minorHAnsi"/>
-          <w:szCs w:val="24"/>
-        </w:rPr>
-        <w:t>**</w:t>
-      </w:r>
-      <w:r>
-        <w:rPr>
-          <w:rFonts w:asciiTheme="minorHAnsi" w:hAnsiTheme="minorHAnsi" w:cstheme="minorHAnsi"/>
-          <w:szCs w:val="24"/>
-        </w:rPr>
-        <w:t>_Dentex macrophthalmus_</w:t>
-      </w:r>
-      <w:r>
-        <w:rPr>
-          <w:rFonts w:asciiTheme="minorHAnsi" w:hAnsiTheme="minorHAnsi" w:cstheme="minorHAnsi"/>
-          <w:szCs w:val="24"/>
-        </w:rPr>
-        <w:t>**</w:t>
-      </w:r>
-      <w:r>
-        <w:rPr>
-          <w:rFonts w:asciiTheme="minorHAnsi" w:hAnsiTheme="minorHAnsi" w:cstheme="minorHAnsi"/>
-          <w:szCs w:val="24"/>
-        </w:rPr>
-        <w:t>.</w:t>
-      </w:r>
-    </w:p>
-    <w:p>
-      <w:pPr>
-        <w:widowControl w:val="0"/>
         <w:spacing w:after="120" w:line="240" w:lineRule="auto"/>
         <w:ind w:left="792"/>
         <w:rPr>
@@ -2398,6 +2203,44 @@
           <w:lang w:val="fr-FR"/>
         </w:rPr>
       </w:pPr>
+    </w:p>
+    <w:p>
+      <w:pPr>
+        <w:spacing w:after="120" w:line="240" w:lineRule="auto"/>
+        <w:ind w:left="720"/>
+        <w:rPr>
+          <w:rFonts w:asciiTheme="minorHAnsi" w:hAnsiTheme="minorHAnsi" w:cstheme="minorHAnsi"/>
+          <w:szCs w:val="24"/>
+          <w:highlight w:val="yellow"/>
+        </w:rPr>
+      </w:pPr>
+    </w:p>
+    <w:p>
+      <w:pPr>
+        <w:numPr>
+          <w:ilvl w:val="0"/>
+          <w:numId w:val="6"/>
+        </w:numPr>
+        <w:spacing w:after="120" w:line="240" w:lineRule="auto"/>
+        <w:rPr>
+          <w:rFonts w:asciiTheme="minorHAnsi" w:hAnsiTheme="minorHAnsi" w:cstheme="minorHAnsi"/>
+          <w:szCs w:val="24"/>
+        </w:rPr>
+      </w:pPr>
+      <w:r>
+        <w:rPr>
+          <w:rFonts w:asciiTheme="minorHAnsi" w:hAnsiTheme="minorHAnsi" w:cstheme="minorHAnsi"/>
+          <w:szCs w:val="24"/>
+        </w:rPr>
+        <w:t>Other trawl-related sampling</w:t>
+      </w:r>
+      <w:r>
+        <w:rPr>
+          <w:rFonts w:asciiTheme="minorHAnsi" w:hAnsiTheme="minorHAnsi" w:cstheme="minorHAnsi"/>
+          <w:szCs w:val="24"/>
+        </w:rPr>
+        <w:t>:</w:t>
+      </w:r>
     </w:p>
     <w:p>
       <w:pPr>
@@ -2411,55 +2254,17 @@
         <w:jc w:val="both"/>
         <w:rPr>
           <w:rFonts w:asciiTheme="minorHAnsi" w:hAnsiTheme="minorHAnsi" w:cstheme="minorHAnsi"/>
-          <w:szCs w:val="24"/>
-          <w:lang w:val="fr-FR"/>
-        </w:rPr>
-      </w:pPr>
-      <w:r>
-        <w:rPr>
-          <w:rFonts w:asciiTheme="minorHAnsi" w:hAnsiTheme="minorHAnsi" w:cstheme="minorHAnsi"/>
           <w:color w:val="000000" w:themeColor="text1"/>
           <w:szCs w:val="24"/>
         </w:rPr>
-        <w:t>Frozen samples of whole sardinella for food safety analysis.</w:t>
-      </w:r>
-    </w:p>
-    <w:p>
-      <w:pPr>
-        <w:spacing w:after="120" w:line="240" w:lineRule="auto"/>
-        <w:ind w:left="720"/>
-        <w:rPr>
-          <w:rFonts w:asciiTheme="minorHAnsi" w:hAnsiTheme="minorHAnsi" w:cstheme="minorHAnsi"/>
-          <w:szCs w:val="24"/>
-          <w:highlight w:val="yellow"/>
-        </w:rPr>
-      </w:pPr>
-    </w:p>
-    <w:p>
-      <w:pPr>
-        <w:numPr>
-          <w:ilvl w:val="0"/>
-          <w:numId w:val="6"/>
-        </w:numPr>
-        <w:spacing w:after="120" w:line="240" w:lineRule="auto"/>
-        <w:rPr>
-          <w:rFonts w:asciiTheme="minorHAnsi" w:hAnsiTheme="minorHAnsi" w:cstheme="minorHAnsi"/>
-          <w:szCs w:val="24"/>
-        </w:rPr>
-      </w:pPr>
-      <w:r>
-        <w:rPr>
-          <w:rFonts w:asciiTheme="minorHAnsi" w:hAnsiTheme="minorHAnsi" w:cstheme="minorHAnsi"/>
-          <w:szCs w:val="24"/>
-        </w:rPr>
-        <w:t>Other trawl-related sampling</w:t>
-      </w:r>
-      <w:r>
-        <w:rPr>
-          <w:rFonts w:asciiTheme="minorHAnsi" w:hAnsiTheme="minorHAnsi" w:cstheme="minorHAnsi"/>
-          <w:szCs w:val="24"/>
-        </w:rPr>
-        <w:t>:</w:t>
+      </w:pPr>
+      <w:r>
+        <w:rPr>
+          <w:rFonts w:asciiTheme="minorHAnsi" w:hAnsiTheme="minorHAnsi" w:cstheme="minorHAnsi"/>
+          <w:color w:val="000000" w:themeColor="text1"/>
+          <w:szCs w:val="24"/>
+        </w:rPr>
+        <w:t>Map occurrence, abundance and biological parameters (length, weight, sex, and maturity staging for males) of priority cartilaginous fish.</w:t>
       </w:r>
     </w:p>
     <w:p>
@@ -2480,11 +2285,23 @@
       </w:pPr>
       <w:r>
         <w:rPr>
-          <w:rFonts w:asciiTheme="minorHAnsi" w:hAnsiTheme="minorHAnsi" w:cstheme="minorHAnsi"/>
+          <w:rFonts w:asciiTheme="minorHAnsi" w:eastAsia="Arial" w:hAnsiTheme="minorHAnsi" w:cstheme="minorHAnsi"/>
           <w:color w:val="000000" w:themeColor="text1"/>
           <w:szCs w:val="24"/>
         </w:rPr>
-        <w:t>Map occurrence, abundance and biological parameters (length, weight, sex, and maturity staging for males) of priority cartilaginous fish.</w:t>
+        <w:t>Collection of samples for taxonomic courses and further analysis in the framework of the EAF-Nansen Programme.</w:t>
+      </w:r>
+    </w:p>
+    <w:p>
+      <w:pPr>
+        <w:pStyle w:val="Compact"/>
+        <w:numPr>
+          <w:ilvl w:val="1"/>
+          <w:numId w:val="6"/>
+        </w:numPr>
+      </w:pPr>
+      <w:r>
+        <w:t>Collection of frozen samples of whole sardinella for food safety analysis.</w:t>
       </w:r>
     </w:p>
     <w:p>
@@ -2505,11 +2322,10 @@
       </w:pPr>
       <w:r>
         <w:rPr>
-          <w:rFonts w:asciiTheme="minorHAnsi" w:eastAsia="Arial" w:hAnsiTheme="minorHAnsi" w:cstheme="minorHAnsi"/>
-          <w:color w:val="000000" w:themeColor="text1"/>
-          <w:szCs w:val="24"/>
-        </w:rPr>
-        <w:t>Collection of samples for taxonomic courses and further analysis in the framework of the EAF-Nansen Programme.</w:t>
+          <w:rFonts w:asciiTheme="minorHAnsi" w:hAnsiTheme="minorHAnsi" w:cstheme="minorHAnsi"/>
+          <w:szCs w:val="24"/>
+        </w:rPr>
+        <w:t>Record the occurrence of marine debris collected during demersal trawling by using the draft protocol and take photos for future inclusion in the protocol itself.</w:t>
       </w:r>
     </w:p>
     <w:p>
@@ -2530,103 +2346,79 @@
       </w:pPr>
       <w:r>
         <w:rPr>
-          <w:rFonts w:asciiTheme="minorHAnsi" w:hAnsiTheme="minorHAnsi" w:cstheme="minorHAnsi"/>
-          <w:szCs w:val="24"/>
-        </w:rPr>
-        <w:lastRenderedPageBreak/>
-        <w:t>Record the occurrence of marine debris collected during demersal trawling by using the draft protocol and take photos for future inclusion in the protocol itself.</w:t>
-      </w:r>
-    </w:p>
-    <w:p>
-      <w:pPr>
-        <w:pStyle w:val="ListParagraph"/>
-        <w:widowControl w:val="0"/>
+          <w:rFonts w:asciiTheme="minorHAnsi" w:eastAsiaTheme="minorEastAsia" w:hAnsiTheme="minorHAnsi" w:cstheme="minorHAnsi"/>
+          <w:color w:val="000000" w:themeColor="text1"/>
+          <w:szCs w:val="24"/>
+        </w:rPr>
+        <w:t>Record epibenthic macrofauna</w:t>
+      </w:r>
+      <w:r>
+        <w:rPr>
+          <w:rFonts w:asciiTheme="minorHAnsi" w:eastAsiaTheme="minorEastAsia" w:hAnsiTheme="minorHAnsi" w:cstheme="minorHAnsi"/>
+          <w:color w:val="000000" w:themeColor="text1"/>
+          <w:szCs w:val="24"/>
+        </w:rPr>
+        <w:t xml:space="preserve"> organisms</w:t>
+      </w:r>
+    </w:p>
+    <w:p>
+      <w:pPr>
+        <w:numPr>
+          <w:ilvl w:val="0"/>
+          <w:numId w:val="6"/>
+        </w:numPr>
+        <w:spacing w:after="120" w:line="240" w:lineRule="auto"/>
+        <w:rPr>
+          <w:rFonts w:asciiTheme="minorHAnsi" w:eastAsiaTheme="minorEastAsia" w:hAnsiTheme="minorHAnsi" w:cstheme="minorHAnsi"/>
+          <w:color w:val="000000" w:themeColor="text1"/>
+          <w:szCs w:val="24"/>
+        </w:rPr>
+      </w:pPr>
+      <w:r>
+        <w:rPr>
+          <w:rFonts w:asciiTheme="minorHAnsi" w:eastAsiaTheme="minorEastAsia" w:hAnsiTheme="minorHAnsi" w:cstheme="minorHAnsi"/>
+          <w:color w:val="000000" w:themeColor="text1"/>
+          <w:szCs w:val="24"/>
+        </w:rPr>
+        <w:t xml:space="preserve">Benthic studies (sediments and </w:t>
+      </w:r>
+      <w:r>
+        <w:rPr>
+          <w:rFonts w:asciiTheme="minorHAnsi" w:eastAsiaTheme="minorEastAsia" w:hAnsiTheme="minorHAnsi" w:cstheme="minorHAnsi"/>
+          <w:color w:val="000000" w:themeColor="text1"/>
+          <w:szCs w:val="24"/>
+        </w:rPr>
+        <w:t>bathymetry</w:t>
+      </w:r>
+      <w:r>
+        <w:rPr>
+          <w:rFonts w:asciiTheme="minorHAnsi" w:eastAsiaTheme="minorEastAsia" w:hAnsiTheme="minorHAnsi" w:cstheme="minorHAnsi"/>
+          <w:color w:val="000000" w:themeColor="text1"/>
+          <w:szCs w:val="24"/>
+        </w:rPr>
+        <w:t>):</w:t>
+      </w:r>
+    </w:p>
+    <w:p>
+      <w:pPr>
         <w:numPr>
           <w:ilvl w:val="1"/>
           <w:numId w:val="6"/>
         </w:numPr>
         <w:spacing w:after="120" w:line="240" w:lineRule="auto"/>
-        <w:jc w:val="both"/>
-        <w:rPr>
-          <w:rFonts w:asciiTheme="minorHAnsi" w:hAnsiTheme="minorHAnsi" w:cstheme="minorHAnsi"/>
-          <w:color w:val="000000" w:themeColor="text1"/>
-          <w:szCs w:val="24"/>
-        </w:rPr>
-      </w:pPr>
-      <w:r>
         <w:rPr>
           <w:rFonts w:asciiTheme="minorHAnsi" w:eastAsiaTheme="minorEastAsia" w:hAnsiTheme="minorHAnsi" w:cstheme="minorHAnsi"/>
           <w:color w:val="000000" w:themeColor="text1"/>
           <w:szCs w:val="24"/>
         </w:rPr>
-        <w:t>Record epibenthic macrofauna</w:t>
-      </w:r>
+      </w:pPr>
       <w:r>
         <w:rPr>
           <w:rFonts w:asciiTheme="minorHAnsi" w:eastAsiaTheme="minorEastAsia" w:hAnsiTheme="minorHAnsi" w:cstheme="minorHAnsi"/>
           <w:color w:val="000000" w:themeColor="text1"/>
           <w:szCs w:val="24"/>
         </w:rPr>
-        <w:t xml:space="preserve"> organisms</w:t>
-      </w:r>
-    </w:p>
-    <w:p>
-      <w:pPr>
-        <w:numPr>
-          <w:ilvl w:val="0"/>
-          <w:numId w:val="6"/>
-        </w:numPr>
-        <w:spacing w:after="120" w:line="240" w:lineRule="auto"/>
-        <w:rPr>
-          <w:rFonts w:asciiTheme="minorHAnsi" w:eastAsiaTheme="minorEastAsia" w:hAnsiTheme="minorHAnsi" w:cstheme="minorHAnsi"/>
-          <w:color w:val="000000" w:themeColor="text1"/>
-          <w:szCs w:val="24"/>
-        </w:rPr>
-      </w:pPr>
-      <w:r>
-        <w:rPr>
-          <w:rFonts w:asciiTheme="minorHAnsi" w:eastAsiaTheme="minorEastAsia" w:hAnsiTheme="minorHAnsi" w:cstheme="minorHAnsi"/>
-          <w:color w:val="000000" w:themeColor="text1"/>
-          <w:szCs w:val="24"/>
-        </w:rPr>
-        <w:t xml:space="preserve">Benthic studies (sediments and </w:t>
-      </w:r>
-      <w:r>
-        <w:rPr>
-          <w:rFonts w:asciiTheme="minorHAnsi" w:eastAsiaTheme="minorEastAsia" w:hAnsiTheme="minorHAnsi" w:cstheme="minorHAnsi"/>
-          <w:color w:val="000000" w:themeColor="text1"/>
-          <w:szCs w:val="24"/>
-        </w:rPr>
-        <w:t>bathymetry</w:t>
-      </w:r>
-      <w:r>
-        <w:rPr>
-          <w:rFonts w:asciiTheme="minorHAnsi" w:eastAsiaTheme="minorEastAsia" w:hAnsiTheme="minorHAnsi" w:cstheme="minorHAnsi"/>
-          <w:color w:val="000000" w:themeColor="text1"/>
-          <w:szCs w:val="24"/>
-        </w:rPr>
-        <w:t>):</w:t>
-      </w:r>
-    </w:p>
-    <w:p>
-      <w:pPr>
-        <w:numPr>
-          <w:ilvl w:val="1"/>
-          <w:numId w:val="6"/>
-        </w:numPr>
-        <w:spacing w:after="120" w:line="240" w:lineRule="auto"/>
-        <w:rPr>
-          <w:rFonts w:asciiTheme="minorHAnsi" w:eastAsiaTheme="minorEastAsia" w:hAnsiTheme="minorHAnsi" w:cstheme="minorHAnsi"/>
-          <w:color w:val="000000" w:themeColor="text1"/>
-          <w:szCs w:val="24"/>
-        </w:rPr>
-      </w:pPr>
-      <w:r>
-        <w:rPr>
-          <w:rFonts w:asciiTheme="minorHAnsi" w:eastAsiaTheme="minorEastAsia" w:hAnsiTheme="minorHAnsi" w:cstheme="minorHAnsi"/>
-          <w:color w:val="000000" w:themeColor="text1"/>
-          <w:szCs w:val="24"/>
-        </w:rPr>
+        <w:lastRenderedPageBreak/>
         <w:t xml:space="preserve">Collect sediment samples for analysis of sediment and of </w:t>
       </w:r>
       <w:r>
@@ -2759,7 +2551,14 @@
           <w:rFonts w:asciiTheme="minorHAnsi" w:eastAsiaTheme="minorEastAsia" w:hAnsiTheme="minorHAnsi" w:cstheme="minorHAnsi"/>
           <w:szCs w:val="24"/>
         </w:rPr>
-        <w:t>Other activities</w:t>
+        <w:t xml:space="preserve">Other </w:t>
+      </w:r>
+      <w:r>
+        <w:rPr>
+          <w:rFonts w:asciiTheme="minorHAnsi" w:eastAsiaTheme="minorEastAsia" w:hAnsiTheme="minorHAnsi" w:cstheme="minorHAnsi"/>
+          <w:szCs w:val="24"/>
+        </w:rPr>
+        <w:t>objectives</w:t>
       </w:r>
       <w:r>
         <w:rPr>
@@ -2901,177 +2700,29 @@
     </w:p>
     <w:p>
       <w:pPr>
-        <w:spacing w:after="120"/>
-        <w:jc w:val="both"/>
-        <w:rPr>
-          <w:rFonts w:asciiTheme="minorHAnsi" w:hAnsiTheme="minorHAnsi" w:cstheme="minorHAnsi"/>
-          <w:szCs w:val="24"/>
-        </w:rPr>
-      </w:pPr>
-      <w:r>
-        <w:rPr>
-          <w:rFonts w:asciiTheme="minorHAnsi" w:hAnsiTheme="minorHAnsi" w:cstheme="minorHAnsi"/>
-          <w:szCs w:val="24"/>
-        </w:rPr>
-        <w:t>In Leg 2 the area will be surveyed for demersal species catch rates using bottom trawling. Specific environmental transects</w:t>
-      </w:r>
-      <w:r>
-        <w:rPr>
-          <w:rFonts w:asciiTheme="minorHAnsi" w:hAnsiTheme="minorHAnsi" w:cstheme="minorHAnsi"/>
-          <w:szCs w:val="24"/>
-          <w:lang w:val="en-US"/>
-        </w:rPr>
-        <w:t xml:space="preserve"> with supersta</w:t>
-      </w:r>
-      <w:r>
-        <w:rPr>
-          <w:rFonts w:asciiTheme="minorHAnsi" w:hAnsiTheme="minorHAnsi" w:cstheme="minorHAnsi"/>
-          <w:szCs w:val="24"/>
-        </w:rPr>
-        <w:t>t</w:t>
-      </w:r>
-      <w:r>
-        <w:rPr>
-          <w:rFonts w:asciiTheme="minorHAnsi" w:hAnsiTheme="minorHAnsi" w:cstheme="minorHAnsi"/>
-          <w:szCs w:val="24"/>
-          <w:lang w:val="en-US"/>
-        </w:rPr>
-        <w:t>ions</w:t>
-      </w:r>
-      <w:r>
-        <w:rPr>
-          <w:rFonts w:asciiTheme="minorHAnsi" w:hAnsiTheme="minorHAnsi" w:cstheme="minorHAnsi"/>
-          <w:szCs w:val="24"/>
-        </w:rPr>
-        <w:t xml:space="preserve"> and box-core sediment sampling will be carried out at every </w:t>
-      </w:r>
-      <w:r>
-        <w:rPr>
-          <w:rFonts w:asciiTheme="minorHAnsi" w:hAnsiTheme="minorHAnsi" w:cstheme="minorHAnsi"/>
-          <w:szCs w:val="24"/>
-          <w:lang w:val="en-US"/>
-        </w:rPr>
-        <w:t xml:space="preserve">third transect (every </w:t>
-      </w:r>
-      <w:r>
-        <w:rPr>
-          <w:rFonts w:asciiTheme="minorHAnsi" w:hAnsiTheme="minorHAnsi" w:cstheme="minorHAnsi"/>
-          <w:szCs w:val="24"/>
-        </w:rPr>
-        <w:t>1</w:t>
-      </w:r>
-      <w:r>
-        <w:rPr>
-          <w:rFonts w:asciiTheme="minorHAnsi" w:eastAsia="Symbol" w:hAnsiTheme="minorHAnsi" w:cstheme="minorHAnsi"/>
-          <w:szCs w:val="24"/>
-        </w:rPr>
-        <w:t>°</w:t>
-      </w:r>
-      <w:r>
-        <w:rPr>
-          <w:rFonts w:asciiTheme="minorHAnsi" w:hAnsiTheme="minorHAnsi" w:cstheme="minorHAnsi"/>
-          <w:szCs w:val="24"/>
-        </w:rPr>
-        <w:t xml:space="preserve"> Latitude). In addition, a CTD station will be carried out at each bottom trawl station.</w:t>
-      </w:r>
-    </w:p>
-    <w:p>
-      <w:pPr>
-        <w:jc w:val="both"/>
-        <w:rPr>
-          <w:rFonts w:asciiTheme="minorHAnsi" w:hAnsiTheme="minorHAnsi" w:cstheme="minorHAnsi"/>
-          <w:color w:val="000000" w:themeColor="text1"/>
-          <w:szCs w:val="24"/>
-        </w:rPr>
-      </w:pPr>
-      <w:r>
-        <w:rPr>
-          <w:rFonts w:asciiTheme="minorHAnsi" w:hAnsiTheme="minorHAnsi" w:cstheme="minorHAnsi"/>
-          <w:color w:val="000000" w:themeColor="text1"/>
-          <w:szCs w:val="24"/>
+        <w:rPr>
+          <w:lang w:val="en-US"/>
+        </w:rPr>
+      </w:pPr>
+      <w:r>
+        <w:rPr>
+          <w:lang w:val="en-US"/>
         </w:rPr>
         <w:t>The survey design will consist of parallel transects spaced 20 NM and perpendicular to the coast, with depth-stratified random sampling along the transects, from 50 to 1000 m.</w:t>
       </w:r>
     </w:p>
     <w:p>
-      <w:pPr>
-        <w:jc w:val="both"/>
-        <w:rPr>
-          <w:rFonts w:asciiTheme="minorHAnsi" w:hAnsiTheme="minorHAnsi" w:cstheme="minorHAnsi"/>
-          <w:color w:val="000000" w:themeColor="text1"/>
-          <w:szCs w:val="24"/>
-        </w:rPr>
-      </w:pPr>
-    </w:p>
-    <w:p>
-      <w:pPr>
-        <w:jc w:val="both"/>
-        <w:rPr>
-          <w:rFonts w:asciiTheme="minorHAnsi" w:hAnsiTheme="minorHAnsi" w:cstheme="minorHAnsi"/>
-          <w:color w:val="000000" w:themeColor="text1"/>
-          <w:szCs w:val="24"/>
-          <w:u w:val="single"/>
-        </w:rPr>
-      </w:pPr>
-      <w:r>
-        <w:rPr>
-          <w:rFonts w:asciiTheme="minorHAnsi" w:hAnsiTheme="minorHAnsi" w:cstheme="minorHAnsi"/>
-          <w:color w:val="000000" w:themeColor="text1"/>
-          <w:szCs w:val="24"/>
-          <w:u w:val="single"/>
-        </w:rPr>
-        <w:t>**Depth stratification**</w:t>
-      </w:r>
-    </w:p>
-    <w:p>
-      <w:pPr>
-        <w:jc w:val="both"/>
-        <w:rPr>
-          <w:rFonts w:asciiTheme="minorHAnsi" w:hAnsiTheme="minorHAnsi" w:cstheme="minorHAnsi"/>
-          <w:color w:val="000000" w:themeColor="text1"/>
-          <w:szCs w:val="24"/>
-        </w:rPr>
-      </w:pPr>
-      <w:r>
-        <w:rPr>
-          <w:rFonts w:asciiTheme="minorHAnsi" w:hAnsiTheme="minorHAnsi" w:cstheme="minorHAnsi"/>
-          <w:color w:val="000000" w:themeColor="text1"/>
-          <w:szCs w:val="24"/>
-        </w:rPr>
-        <w:t xml:space="preserve">The depth </w:t>
-      </w:r>
-      <w:r>
-        <w:rPr>
-          <w:rFonts w:asciiTheme="minorHAnsi" w:hAnsiTheme="minorHAnsi" w:cstheme="minorHAnsi"/>
-          <w:szCs w:val="24"/>
-        </w:rPr>
-        <w:t xml:space="preserve">stratification for the bottom trawl stations is as </w:t>
-      </w:r>
-      <w:r>
-        <w:rPr>
-          <w:rFonts w:asciiTheme="minorHAnsi" w:hAnsiTheme="minorHAnsi" w:cstheme="minorHAnsi"/>
-          <w:color w:val="000000" w:themeColor="text1"/>
-          <w:szCs w:val="24"/>
-        </w:rPr>
-        <w:t>follows:</w:t>
-      </w:r>
-    </w:p>
-    <w:p>
-      <w:pPr>
-        <w:jc w:val="both"/>
-        <w:rPr>
-          <w:rFonts w:asciiTheme="minorHAnsi" w:hAnsiTheme="minorHAnsi" w:cstheme="minorHAnsi"/>
-          <w:color w:val="000000" w:themeColor="text1"/>
-          <w:szCs w:val="24"/>
-        </w:rPr>
-      </w:pPr>
-      <w:r>
-        <w:rPr>
-          <w:rFonts w:asciiTheme="minorHAnsi" w:hAnsiTheme="minorHAnsi" w:cstheme="minorHAnsi"/>
-          <w:color w:val="000000" w:themeColor="text1"/>
-          <w:szCs w:val="24"/>
-        </w:rPr>
-        <w:t>50-100 m, 100-200, 200-300, 300-500 m, 500-700 m, 700-1000 m.</w:t>
+      <w:r>
+        <w:rPr>
+          <w:lang w:val="en-US"/>
+        </w:rPr>
+        <w:t>Specific environmental transects with superstations and box-core sediment sampling will be carried out at every third transect (every 1° Latitude</w:t>
+      </w:r>
+      <w:r>
+        <w:rPr>
+          <w:lang w:val="en-US"/>
+        </w:rPr>
+        <w:t>).</w:t>
       </w:r>
     </w:p>
     <w:p>
@@ -3175,60 +2826,102 @@
           <w:color w:val="000000" w:themeColor="text1"/>
           <w:szCs w:val="24"/>
         </w:rPr>
+        <w:t xml:space="preserve">Microplastic sampling using manta trawl will be carried out at the same stations as for zooplankton sampling. </w:t>
+      </w:r>
+    </w:p>
+    <w:p>
+      <w:pPr>
+        <w:jc w:val="both"/>
+        <w:rPr>
+          <w:rFonts w:asciiTheme="minorHAnsi" w:hAnsiTheme="minorHAnsi" w:cstheme="minorHAnsi"/>
+          <w:color w:val="000000" w:themeColor="text1"/>
+          <w:szCs w:val="24"/>
+        </w:rPr>
+      </w:pPr>
+      <w:r>
+        <w:rPr>
+          <w:rFonts w:asciiTheme="minorHAnsi" w:hAnsiTheme="minorHAnsi" w:cstheme="minorHAnsi"/>
+          <w:color w:val="000000" w:themeColor="text1"/>
+          <w:szCs w:val="24"/>
+        </w:rPr>
+        <w:t xml:space="preserve">Sediment sampling using box-corer will be carried out at the same stations as for zooplankton, with two grab deployments per station. </w:t>
+      </w:r>
+    </w:p>
+    <w:p>
+      <w:pPr>
+        <w:jc w:val="both"/>
+        <w:rPr>
+          <w:rFonts w:asciiTheme="minorHAnsi" w:hAnsiTheme="minorHAnsi" w:cstheme="minorHAnsi"/>
+          <w:color w:val="0078D4"/>
+          <w:szCs w:val="24"/>
+          <w:u w:val="single"/>
+        </w:rPr>
+      </w:pPr>
+      <w:r>
+        <w:rPr>
+          <w:rFonts w:asciiTheme="minorHAnsi" w:hAnsiTheme="minorHAnsi" w:cstheme="minorHAnsi"/>
+          <w:szCs w:val="24"/>
+          <w:u w:val="single"/>
+        </w:rPr>
+        <w:t>**Bottom trawl stations**</w:t>
+      </w:r>
+    </w:p>
+    <w:p>
+      <w:pPr>
+        <w:rPr>
+          <w:rFonts w:asciiTheme="minorHAnsi" w:hAnsiTheme="minorHAnsi" w:cstheme="minorHAnsi"/>
+          <w:szCs w:val="24"/>
+          <w:lang w:val="en-US"/>
+        </w:rPr>
+      </w:pPr>
+      <w:r>
+        <w:rPr>
+          <w:rFonts w:asciiTheme="minorHAnsi" w:hAnsiTheme="minorHAnsi" w:cstheme="minorHAnsi"/>
+          <w:szCs w:val="24"/>
+          <w:lang w:val="en-US"/>
+        </w:rPr>
+        <w:t>The depth stratification for the bottom trawl stations is as follows:</w:t>
+      </w:r>
+    </w:p>
+    <w:p>
+      <w:pPr>
+        <w:rPr>
+          <w:rFonts w:asciiTheme="minorHAnsi" w:hAnsiTheme="minorHAnsi" w:cstheme="minorHAnsi"/>
+          <w:szCs w:val="24"/>
+          <w:lang w:val="en-US"/>
+        </w:rPr>
+      </w:pPr>
+      <w:r>
+        <w:rPr>
+          <w:rFonts w:asciiTheme="minorHAnsi" w:hAnsiTheme="minorHAnsi" w:cstheme="minorHAnsi"/>
+          <w:szCs w:val="24"/>
+          <w:lang w:val="en-US"/>
+        </w:rPr>
+        <w:t>50-100 m, 100-200, 200-300, 300-500 m, 500-700 m, 700-1000 m.</w:t>
+      </w:r>
+    </w:p>
+    <w:p>
+      <w:pPr>
+        <w:rPr>
+          <w:rFonts w:asciiTheme="minorHAnsi" w:hAnsiTheme="minorHAnsi" w:cstheme="minorHAnsi"/>
+          <w:szCs w:val="24"/>
+        </w:rPr>
+      </w:pPr>
+    </w:p>
+    <w:p>
+      <w:pPr>
+        <w:rPr>
+          <w:rFonts w:asciiTheme="minorHAnsi" w:hAnsiTheme="minorHAnsi" w:cstheme="minorHAnsi"/>
+          <w:color w:val="000000" w:themeColor="text1"/>
+          <w:szCs w:val="24"/>
+        </w:rPr>
+      </w:pPr>
+      <w:r>
+        <w:rPr>
+          <w:rFonts w:asciiTheme="minorHAnsi" w:hAnsiTheme="minorHAnsi" w:cstheme="minorHAnsi"/>
+          <w:szCs w:val="24"/>
+        </w:rPr>
         <w:lastRenderedPageBreak/>
-        <w:t xml:space="preserve">Microplastic sampling using manta trawl will be carried out at the same stations as for zooplankton sampling. </w:t>
-      </w:r>
-    </w:p>
-    <w:p>
-      <w:pPr>
-        <w:jc w:val="both"/>
-        <w:rPr>
-          <w:rFonts w:asciiTheme="minorHAnsi" w:hAnsiTheme="minorHAnsi" w:cstheme="minorHAnsi"/>
-          <w:color w:val="000000" w:themeColor="text1"/>
-          <w:szCs w:val="24"/>
-        </w:rPr>
-      </w:pPr>
-      <w:r>
-        <w:rPr>
-          <w:rFonts w:asciiTheme="minorHAnsi" w:hAnsiTheme="minorHAnsi" w:cstheme="minorHAnsi"/>
-          <w:color w:val="000000" w:themeColor="text1"/>
-          <w:szCs w:val="24"/>
-        </w:rPr>
-        <w:t xml:space="preserve">Sediment sampling using box-corer will be carried out at the same stations as for zooplankton, with two grab deployments per station. </w:t>
-      </w:r>
-    </w:p>
-    <w:p>
-      <w:pPr>
-        <w:jc w:val="both"/>
-        <w:rPr>
-          <w:rFonts w:asciiTheme="minorHAnsi" w:hAnsiTheme="minorHAnsi" w:cstheme="minorHAnsi"/>
-          <w:color w:val="0078D4"/>
-          <w:szCs w:val="24"/>
-          <w:u w:val="single"/>
-        </w:rPr>
-      </w:pPr>
-      <w:r>
-        <w:rPr>
-          <w:rFonts w:asciiTheme="minorHAnsi" w:hAnsiTheme="minorHAnsi" w:cstheme="minorHAnsi"/>
-          <w:szCs w:val="24"/>
-          <w:u w:val="single"/>
-        </w:rPr>
-        <w:t>**Bottom trawl stations**</w:t>
-      </w:r>
-    </w:p>
-    <w:p>
-      <w:pPr>
-        <w:rPr>
-          <w:rFonts w:asciiTheme="minorHAnsi" w:hAnsiTheme="minorHAnsi" w:cstheme="minorHAnsi"/>
-          <w:color w:val="000000" w:themeColor="text1"/>
-          <w:szCs w:val="24"/>
-        </w:rPr>
-      </w:pPr>
-      <w:r>
-        <w:rPr>
-          <w:rFonts w:asciiTheme="minorHAnsi" w:hAnsiTheme="minorHAnsi" w:cstheme="minorHAnsi"/>
-          <w:szCs w:val="24"/>
-        </w:rPr>
         <w:t xml:space="preserve">Bottom trawl stations for the estimation of catch rates of demersal resources will be placed at approximately the same positions as during the survey in 2011, to ensure comparability between the two surveys. The possibility to carry out additional bottom trawl stations will be explored depending on time availability. </w:t>
       </w:r>
       <w:r>
@@ -3750,39 +3443,32 @@
           <w:rFonts w:asciiTheme="minorHAnsi" w:hAnsiTheme="minorHAnsi" w:cstheme="minorHAnsi"/>
           <w:szCs w:val="24"/>
         </w:rPr>
-        <w:t xml:space="preserve">Ocean current data is collected with a vessel-mounted Teledyne RDI Ocean Surveyor Acoustic Doppler Profiler operating at 150 kHz with a depth range of 400 m. The ADCP runs </w:t>
-      </w:r>
+        <w:t>Ocean current data is collected with a vessel-mounted Teledyne RDI Ocean Surveyor Acoustic Doppler Profiler operating at 150 kHz with a depth range of 400 m. The ADCP runs in narrow band mode and averages data in 8 m vertical bins. Heading, pitch, roll and positional data are acquired by a Kongsberg Marine SEAPATH unit. Teledyne’s VmDAS software is used to collect the raw current data, whereas the data is processed using software created at IMR.</w:t>
+      </w:r>
+    </w:p>
+    <w:p>
+      <w:pPr>
+        <w:spacing w:after="120" w:line="240" w:lineRule="auto"/>
+        <w:rPr>
+          <w:rFonts w:asciiTheme="minorHAnsi" w:hAnsiTheme="minorHAnsi" w:cstheme="minorHAnsi"/>
+          <w:szCs w:val="24"/>
+        </w:rPr>
+      </w:pPr>
+    </w:p>
+    <w:p>
+      <w:pPr>
+        <w:pStyle w:val="Heading3"/>
+        <w:rPr>
+          <w:rFonts w:asciiTheme="minorHAnsi" w:hAnsiTheme="minorHAnsi" w:cstheme="minorHAnsi"/>
+          <w:szCs w:val="24"/>
+        </w:rPr>
+      </w:pPr>
       <w:r>
         <w:rPr>
           <w:rFonts w:asciiTheme="minorHAnsi" w:hAnsiTheme="minorHAnsi" w:cstheme="minorHAnsi"/>
           <w:szCs w:val="24"/>
         </w:rPr>
         <w:lastRenderedPageBreak/>
-        <w:t>in narrow band mode and averages data in 8 m vertical bins. Heading, pitch, roll and positional data are acquired by a Kongsberg Marine SEAPATH unit. Teledyne’s VmDAS software is used to collect the raw current data, whereas the data is processed using software created at IMR.</w:t>
-      </w:r>
-    </w:p>
-    <w:p>
-      <w:pPr>
-        <w:spacing w:after="120" w:line="240" w:lineRule="auto"/>
-        <w:rPr>
-          <w:rFonts w:asciiTheme="minorHAnsi" w:hAnsiTheme="minorHAnsi" w:cstheme="minorHAnsi"/>
-          <w:szCs w:val="24"/>
-        </w:rPr>
-      </w:pPr>
-    </w:p>
-    <w:p>
-      <w:pPr>
-        <w:pStyle w:val="Heading3"/>
-        <w:rPr>
-          <w:rFonts w:asciiTheme="minorHAnsi" w:hAnsiTheme="minorHAnsi" w:cstheme="minorHAnsi"/>
-          <w:szCs w:val="24"/>
-        </w:rPr>
-      </w:pPr>
-      <w:r>
-        <w:rPr>
-          <w:rFonts w:asciiTheme="minorHAnsi" w:hAnsiTheme="minorHAnsi" w:cstheme="minorHAnsi"/>
-          <w:szCs w:val="24"/>
-        </w:rPr>
         <w:t>1</w:t>
       </w:r>
       <w:r>
@@ -4316,7 +4002,6 @@
           <w:rFonts w:asciiTheme="minorHAnsi" w:eastAsia="Arial" w:hAnsiTheme="minorHAnsi" w:cstheme="minorHAnsi"/>
           <w:szCs w:val="24"/>
         </w:rPr>
-        <w:lastRenderedPageBreak/>
         <w:t>Total alkalinity is determined via an open-cell potentiometric titration using a 0.05 M HCl solution with a sodium chloride background as the titrant (Dickson et al. 2007). See the total alkalinity protocol for further details in addition to sampling and analysis procedures.</w:t>
       </w:r>
     </w:p>
@@ -4334,7 +4019,15 @@
           <w:rFonts w:asciiTheme="minorHAnsi" w:eastAsia="Arial" w:hAnsiTheme="minorHAnsi" w:cstheme="minorHAnsi"/>
           <w:szCs w:val="24"/>
         </w:rPr>
-        <w:t>To assess the ocean acidification state and change in the region, the pH and total alkalinity data will be combined with phosphate, silicate, temperature, salinity and depth to calculate additional parameters of the carbonate system such as dissolved inorganic carbon, pCO</w:t>
+        <w:t xml:space="preserve">To assess the ocean acidification state and change in the region, the pH and total alkalinity data will be combined with phosphate, silicate, temperature, salinity and depth to calculate </w:t>
+      </w:r>
+      <w:r>
+        <w:rPr>
+          <w:rFonts w:asciiTheme="minorHAnsi" w:eastAsia="Arial" w:hAnsiTheme="minorHAnsi" w:cstheme="minorHAnsi"/>
+          <w:szCs w:val="24"/>
+        </w:rPr>
+        <w:lastRenderedPageBreak/>
+        <w:t>additional parameters of the carbonate system such as dissolved inorganic carbon, pCO</w:t>
       </w:r>
       <w:r>
         <w:rPr>
@@ -4764,7 +4457,6 @@
           <w:szCs w:val="24"/>
           <w:lang w:val="en-US"/>
         </w:rPr>
-        <w:lastRenderedPageBreak/>
         <w:t xml:space="preserve">The sample will be halved into parts with a Motoda splitter. </w:t>
       </w:r>
     </w:p>
@@ -5606,7 +5298,6 @@
           <w:rFonts w:asciiTheme="minorHAnsi" w:hAnsiTheme="minorHAnsi" w:cstheme="minorHAnsi"/>
           <w:szCs w:val="24"/>
         </w:rPr>
-        <w:lastRenderedPageBreak/>
         <w:t>1</w:t>
       </w:r>
       <w:r>
@@ -5763,7 +5454,25 @@
           <w:color w:val="000000" w:themeColor="text1"/>
           <w:szCs w:val="24"/>
         </w:rPr>
-        <w:t xml:space="preserve"> will be used to record and store bottom depth information in the Olex system onboard. The EM 710 is a high to very high-resolution seabed mapping system for depth &lt;1500 m while the EM 302 is designed to map the ocean floor at depths down to 7000 m.</w:t>
+        <w:t xml:space="preserve"> will be used to record and store bottom depth information in the Olex system onboard. The EM 710 is a high to very high-resolution seabed mapping system for depth &lt;1500 m while the EM 302 is designed to map the ocean floor at depths down to 7000 m</w:t>
+      </w:r>
+      <w:r>
+        <w:rPr>
+          <w:rFonts w:asciiTheme="minorHAnsi" w:hAnsiTheme="minorHAnsi" w:cstheme="minorHAnsi"/>
+          <w:i w:val="0"/>
+          <w:color w:val="000000" w:themeColor="text1"/>
+          <w:szCs w:val="24"/>
+        </w:rPr>
+        <w:t>, but no high-resolution data will be collected</w:t>
+      </w:r>
+      <w:r>
+        <w:rPr>
+          <w:rFonts w:asciiTheme="minorHAnsi" w:hAnsiTheme="minorHAnsi" w:cstheme="minorHAnsi"/>
+          <w:i w:val="0"/>
+          <w:color w:val="000000" w:themeColor="text1"/>
+          <w:szCs w:val="24"/>
+        </w:rPr>
+        <w:t>.</w:t>
       </w:r>
     </w:p>
     <w:p>
@@ -5785,6 +5494,7 @@
           <w:szCs w:val="24"/>
           <w:lang w:val="en-US"/>
         </w:rPr>
+        <w:lastRenderedPageBreak/>
         <w:t>_</w:t>
       </w:r>
       <w:r>
@@ -5823,7 +5533,24 @@
           <w:szCs w:val="24"/>
           <w:lang w:val="en-US"/>
         </w:rPr>
-        <w:t>CHECK PROTOCOL</w:t>
+        <w:t>NEW PROTOCOL COMING THURSDAY 24</w:t>
+      </w:r>
+      <w:r>
+        <w:rPr>
+          <w:rFonts w:asciiTheme="minorHAnsi" w:hAnsiTheme="minorHAnsi" w:cstheme="minorHAnsi"/>
+          <w:szCs w:val="24"/>
+          <w:vertAlign w:val="superscript"/>
+          <w:lang w:val="en-US"/>
+        </w:rPr>
+        <w:t>th</w:t>
+      </w:r>
+      <w:r>
+        <w:rPr>
+          <w:rFonts w:asciiTheme="minorHAnsi" w:hAnsiTheme="minorHAnsi" w:cstheme="minorHAnsi"/>
+          <w:szCs w:val="24"/>
+          <w:lang w:val="en-US"/>
+        </w:rPr>
+        <w:t xml:space="preserve"> FEB</w:t>
       </w:r>
     </w:p>
     <w:p>
@@ -5831,58 +5558,22 @@
         <w:jc w:val="both"/>
         <w:rPr>
           <w:rFonts w:asciiTheme="minorHAnsi" w:hAnsiTheme="minorHAnsi" w:cstheme="minorHAnsi"/>
-          <w:szCs w:val="24"/>
-          <w:lang w:val="en-US"/>
-        </w:rPr>
-      </w:pPr>
-      <w:r>
-        <w:rPr>
-          <w:rFonts w:asciiTheme="minorHAnsi" w:hAnsiTheme="minorHAnsi" w:cstheme="minorHAnsi"/>
-          <w:szCs w:val="24"/>
-          <w:lang w:val="en-US"/>
-        </w:rPr>
-        <w:t xml:space="preserve">The benthic macrofauna sampled using a 0.1 m2 van Veen grab BOX CORER?. Three stations, at 50 m; 100 m and 500 m depth, to be sampled </w:t>
-      </w:r>
-      <w:r>
-        <w:rPr>
-          <w:rFonts w:asciiTheme="minorHAnsi" w:hAnsiTheme="minorHAnsi" w:cstheme="minorHAnsi"/>
-          <w:szCs w:val="24"/>
-          <w:lang w:val="en-US"/>
-        </w:rPr>
-        <w:t>along the evironmental transect with superstations (</w:t>
-      </w:r>
-      <w:r>
-        <w:rPr>
-          <w:rFonts w:asciiTheme="minorHAnsi" w:hAnsiTheme="minorHAnsi" w:cstheme="minorHAnsi"/>
-          <w:szCs w:val="24"/>
-          <w:lang w:val="en-US"/>
-        </w:rPr>
-        <w:t xml:space="preserve">every 1° latitude during the whole cruise </w:t>
-      </w:r>
-      <w:r>
-        <w:rPr>
-          <w:rFonts w:asciiTheme="minorHAnsi" w:hAnsiTheme="minorHAnsi" w:cstheme="minorHAnsi"/>
-          <w:szCs w:val="24"/>
-          <w:lang w:val="en-US"/>
-        </w:rPr>
-        <w:t xml:space="preserve">- </w:t>
-      </w:r>
-      <w:r>
-        <w:rPr>
-          <w:rFonts w:asciiTheme="minorHAnsi" w:hAnsiTheme="minorHAnsi" w:cstheme="minorHAnsi"/>
-          <w:szCs w:val="24"/>
-          <w:lang w:val="en-US"/>
-        </w:rPr>
-        <w:t xml:space="preserve">every third transect). Two replicates will be taken at each grab station. </w:t>
-      </w:r>
-      <w:r>
-        <w:rPr>
-          <w:rFonts w:asciiTheme="minorHAnsi" w:hAnsiTheme="minorHAnsi" w:cstheme="minorHAnsi"/>
-          <w:szCs w:val="24"/>
-          <w:lang w:val="en-US"/>
-        </w:rPr>
-        <w:t xml:space="preserve">Sampling will be done in accordance with the </w:t>
-      </w:r>
+          <w:b/>
+          <w:bCs/>
+          <w:szCs w:val="24"/>
+          <w:lang w:val="en-US"/>
+        </w:rPr>
+      </w:pPr>
+    </w:p>
+    <w:p>
+      <w:pPr>
+        <w:jc w:val="both"/>
+        <w:rPr>
+          <w:rFonts w:asciiTheme="minorHAnsi" w:hAnsiTheme="minorHAnsi" w:cstheme="minorHAnsi"/>
+          <w:szCs w:val="24"/>
+          <w:lang w:val="en-US"/>
+        </w:rPr>
+      </w:pPr>
       <w:r>
         <w:rPr>
           <w:rFonts w:asciiTheme="minorHAnsi" w:hAnsiTheme="minorHAnsi" w:cstheme="minorHAnsi"/>
@@ -5997,40 +5688,6 @@
           <w:lang w:val="en-US"/>
         </w:rPr>
       </w:pPr>
-      <w:r>
-        <w:rPr>
-          <w:rFonts w:asciiTheme="minorHAnsi" w:hAnsiTheme="minorHAnsi" w:cstheme="minorHAnsi"/>
-          <w:szCs w:val="24"/>
-          <w:lang w:val="en-US"/>
-        </w:rPr>
-        <w:t xml:space="preserve">Separate sediment into light- and heavy fraction and fix in 8% borax pre-buffered formaldehyde (formalin) or 95% ethanol. </w:t>
-      </w:r>
-    </w:p>
-    <w:p>
-      <w:pPr>
-        <w:jc w:val="both"/>
-        <w:rPr>
-          <w:rFonts w:asciiTheme="minorHAnsi" w:hAnsiTheme="minorHAnsi" w:cstheme="minorHAnsi"/>
-          <w:szCs w:val="24"/>
-          <w:lang w:val="en-US"/>
-        </w:rPr>
-      </w:pPr>
-      <w:r>
-        <w:rPr>
-          <w:rFonts w:asciiTheme="minorHAnsi" w:hAnsiTheme="minorHAnsi" w:cstheme="minorHAnsi"/>
-          <w:szCs w:val="24"/>
-          <w:lang w:val="en-US"/>
-        </w:rPr>
-        <w:t>Screen the heavy fraction through two sieves of mesh size 1.0 mm and 0.5 mm, the light fraction only through a sieve with mesh size 0.5 mm. Transfer the sediment retained in each sieve to plastic containers and label. Larger animals to be sorted out immediately and fixed on separate containers. For the samples fixed in ethanol, this to be changed within 24 hours and then again, the next day to secure the quality of the material</w:t>
-      </w:r>
-      <w:r>
-        <w:rPr>
-          <w:rFonts w:asciiTheme="minorHAnsi" w:hAnsiTheme="minorHAnsi" w:cstheme="minorHAnsi"/>
-          <w:szCs w:val="24"/>
-          <w:lang w:val="en-US"/>
-        </w:rPr>
-        <w:t xml:space="preserve">. </w:t>
-      </w:r>
     </w:p>
     <w:p>
       <w:pPr>
@@ -6210,7 +5867,6 @@
           <w:szCs w:val="24"/>
           <w:lang w:val="sv-SE"/>
         </w:rPr>
-        <w:lastRenderedPageBreak/>
         <w:t>**Larval fish:**</w:t>
       </w:r>
       <w:r>
@@ -6316,22 +5972,65 @@
           <w:rFonts w:asciiTheme="minorHAnsi" w:hAnsiTheme="minorHAnsi" w:cstheme="minorHAnsi"/>
           <w:szCs w:val="24"/>
         </w:rPr>
-        <w:t xml:space="preserve"> Biological sampling for fisheries resources</w:t>
-      </w:r>
-    </w:p>
-    <w:p>
-      <w:pPr>
-        <w:rPr>
-          <w:rFonts w:asciiTheme="minorHAnsi" w:hAnsiTheme="minorHAnsi" w:cstheme="minorHAnsi"/>
-          <w:szCs w:val="24"/>
-        </w:rPr>
-      </w:pPr>
-      <w:r>
-        <w:rPr>
-          <w:rFonts w:asciiTheme="minorHAnsi" w:hAnsiTheme="minorHAnsi" w:cstheme="minorHAnsi"/>
-          <w:szCs w:val="24"/>
-        </w:rPr>
-        <w:t>Once the catch is on deck, it is assessed, and, if necessary, subsamples are taken. At all trawl hauls, the catch is sorted according to species, and length and weight measurements will be taken for all fish species using an electronic fish meter connected to a customized data acquisition system (Fish2Data and Biotic Editor) running on the server of the vessel. In addition, further biological sampling will be done for pre-agreed priority species</w:t>
+        <w:t xml:space="preserve"> Biological sampling </w:t>
+      </w:r>
+      <w:r>
+        <w:rPr>
+          <w:rFonts w:asciiTheme="minorHAnsi" w:hAnsiTheme="minorHAnsi" w:cstheme="minorHAnsi"/>
+          <w:szCs w:val="24"/>
+        </w:rPr>
+        <w:t>of demersal species caught in the bottom trawl</w:t>
+      </w:r>
+    </w:p>
+    <w:p>
+      <w:pPr>
+        <w:rPr>
+          <w:rFonts w:asciiTheme="minorHAnsi" w:hAnsiTheme="minorHAnsi" w:cstheme="minorHAnsi"/>
+          <w:szCs w:val="24"/>
+        </w:rPr>
+      </w:pPr>
+      <w:r>
+        <w:rPr>
+          <w:rFonts w:asciiTheme="minorHAnsi" w:hAnsiTheme="minorHAnsi" w:cstheme="minorHAnsi"/>
+          <w:szCs w:val="24"/>
+          <w:lang w:val="en-US"/>
+        </w:rPr>
+        <w:t xml:space="preserve">According to the size of the catch, either the whole catch is sorted and measured or </w:t>
+      </w:r>
+      <w:r>
+        <w:rPr>
+          <w:rFonts w:asciiTheme="minorHAnsi" w:hAnsiTheme="minorHAnsi" w:cstheme="minorHAnsi"/>
+          <w:szCs w:val="24"/>
+        </w:rPr>
+        <w:t xml:space="preserve">subsamples are taken. At all trawl hauls, the catch is sorted according to species, and </w:t>
+      </w:r>
+      <w:r>
+        <w:rPr>
+          <w:rFonts w:asciiTheme="minorHAnsi" w:hAnsiTheme="minorHAnsi" w:cstheme="minorHAnsi"/>
+          <w:szCs w:val="24"/>
+        </w:rPr>
+        <w:t>number</w:t>
+      </w:r>
+      <w:r>
+        <w:rPr>
+          <w:rFonts w:asciiTheme="minorHAnsi" w:hAnsiTheme="minorHAnsi" w:cstheme="minorHAnsi"/>
+          <w:szCs w:val="24"/>
+        </w:rPr>
+        <w:t xml:space="preserve"> and weight measurements will be taken for all fish species</w:t>
+      </w:r>
+      <w:r>
+        <w:rPr>
+          <w:rFonts w:asciiTheme="minorHAnsi" w:hAnsiTheme="minorHAnsi" w:cstheme="minorHAnsi"/>
+          <w:szCs w:val="24"/>
+        </w:rPr>
+        <w:t>. For priority species length and weight are recorded</w:t>
+      </w:r>
+      <w:r>
+        <w:rPr>
+          <w:rFonts w:asciiTheme="minorHAnsi" w:hAnsiTheme="minorHAnsi" w:cstheme="minorHAnsi"/>
+          <w:szCs w:val="24"/>
+        </w:rPr>
+        <w:t xml:space="preserve"> using an electronic fish meter connected to a customized data acquisition system (Fish2Data and Biotic Editor) running on the server of the vessel. In addition, further biological sampling will be done for pre-agreed priority species</w:t>
       </w:r>
       <w:r>
         <w:rPr>
@@ -6385,6 +6084,7 @@
           <w:spacing w:val="-3"/>
           <w:szCs w:val="24"/>
         </w:rPr>
+        <w:lastRenderedPageBreak/>
         <w:t>In [ANNEX III](ANNEX_III)</w:t>
       </w:r>
       <w:r>
@@ -6471,25 +6171,60 @@
     </w:p>
     <w:p>
       <w:pPr>
-        <w:pStyle w:val="Heading4"/>
-        <w:rPr>
-          <w:rFonts w:asciiTheme="minorHAnsi" w:hAnsiTheme="minorHAnsi" w:cstheme="minorHAnsi"/>
-          <w:szCs w:val="24"/>
-        </w:rPr>
-      </w:pPr>
-      <w:r>
-        <w:rPr>
-          <w:rFonts w:asciiTheme="minorHAnsi" w:hAnsiTheme="minorHAnsi" w:cstheme="minorHAnsi"/>
-          <w:szCs w:val="24"/>
-        </w:rPr>
-        <w:t>1</w:t>
-      </w:r>
-      <w:r>
-        <w:rPr>
-          <w:rFonts w:asciiTheme="minorHAnsi" w:hAnsiTheme="minorHAnsi" w:cstheme="minorHAnsi"/>
-          <w:szCs w:val="24"/>
-        </w:rPr>
-        <w:t>.3</w:t>
+        <w:rPr>
+          <w:rFonts w:asciiTheme="minorHAnsi" w:hAnsiTheme="minorHAnsi" w:cstheme="minorHAnsi"/>
+          <w:szCs w:val="24"/>
+        </w:rPr>
+      </w:pPr>
+      <w:r>
+        <w:rPr>
+          <w:rFonts w:asciiTheme="minorHAnsi" w:hAnsiTheme="minorHAnsi" w:cstheme="minorHAnsi"/>
+          <w:szCs w:val="24"/>
+        </w:rPr>
+        <w:t xml:space="preserve">**Stratification of sampling </w:t>
+      </w:r>
+      <w:r>
+        <w:rPr>
+          <w:rFonts w:asciiTheme="minorHAnsi" w:hAnsiTheme="minorHAnsi" w:cstheme="minorHAnsi"/>
+          <w:szCs w:val="24"/>
+        </w:rPr>
+        <w:t xml:space="preserve">of priority species </w:t>
+      </w:r>
+      <w:r>
+        <w:rPr>
+          <w:rFonts w:asciiTheme="minorHAnsi" w:hAnsiTheme="minorHAnsi" w:cstheme="minorHAnsi"/>
+          <w:szCs w:val="24"/>
+        </w:rPr>
+        <w:t>at each trawl station**</w:t>
+      </w:r>
+    </w:p>
+    <w:p>
+      <w:pPr>
+        <w:rPr>
+          <w:rFonts w:asciiTheme="minorHAnsi" w:hAnsiTheme="minorHAnsi" w:cstheme="minorHAnsi"/>
+          <w:szCs w:val="24"/>
+        </w:rPr>
+      </w:pPr>
+      <w:r>
+        <w:rPr>
+          <w:rFonts w:asciiTheme="minorHAnsi" w:hAnsiTheme="minorHAnsi" w:cstheme="minorHAnsi"/>
+          <w:szCs w:val="24"/>
+        </w:rPr>
+        <w:t>Length</w:t>
+      </w:r>
+      <w:r>
+        <w:rPr>
+          <w:rFonts w:asciiTheme="minorHAnsi" w:hAnsiTheme="minorHAnsi" w:cstheme="minorHAnsi"/>
+          <w:szCs w:val="24"/>
+        </w:rPr>
+        <w:t xml:space="preserve"> and weight</w:t>
+      </w:r>
+      <w:r>
+        <w:rPr>
+          <w:rFonts w:asciiTheme="minorHAnsi" w:hAnsiTheme="minorHAnsi" w:cstheme="minorHAnsi"/>
+          <w:szCs w:val="24"/>
+        </w:rPr>
+        <w:t>: 100 fish (all fish with less than 100 individuals in the catch)</w:t>
       </w:r>
       <w:r>
         <w:rPr>
@@ -6498,115 +6233,28 @@
         </w:rPr>
         <w:t>.</w:t>
       </w:r>
-      <w:r>
-        <w:rPr>
-          <w:rFonts w:asciiTheme="minorHAnsi" w:hAnsiTheme="minorHAnsi" w:cstheme="minorHAnsi"/>
-          <w:szCs w:val="24"/>
-        </w:rPr>
-        <w:t>9</w:t>
-      </w:r>
-      <w:r>
-        <w:rPr>
-          <w:rFonts w:asciiTheme="minorHAnsi" w:hAnsiTheme="minorHAnsi" w:cstheme="minorHAnsi"/>
-          <w:szCs w:val="24"/>
-        </w:rPr>
-        <w:t>.1 Demersal fish</w:t>
-      </w:r>
-    </w:p>
-    <w:p>
-      <w:pPr>
-        <w:pStyle w:val="BodyText"/>
-        <w:snapToGrid w:val="0"/>
-        <w:spacing w:after="120" w:line="276" w:lineRule="auto"/>
-        <w:rPr>
-          <w:rFonts w:asciiTheme="minorHAnsi" w:hAnsiTheme="minorHAnsi" w:cstheme="minorHAnsi"/>
-          <w:i w:val="0"/>
-          <w:spacing w:val="0"/>
-          <w:szCs w:val="24"/>
-        </w:rPr>
-      </w:pPr>
-    </w:p>
-    <w:p>
-      <w:pPr>
-        <w:pStyle w:val="BodyText"/>
-        <w:snapToGrid w:val="0"/>
-        <w:spacing w:after="120" w:line="276" w:lineRule="auto"/>
-        <w:rPr>
-          <w:rFonts w:asciiTheme="minorHAnsi" w:hAnsiTheme="minorHAnsi" w:cstheme="minorHAnsi"/>
-          <w:i w:val="0"/>
-          <w:spacing w:val="0"/>
-          <w:szCs w:val="24"/>
-        </w:rPr>
-      </w:pPr>
-      <w:r>
-        <w:rPr>
-          <w:rFonts w:asciiTheme="minorHAnsi" w:hAnsiTheme="minorHAnsi" w:cstheme="minorHAnsi"/>
-          <w:i w:val="0"/>
-          <w:spacing w:val="0"/>
-          <w:szCs w:val="24"/>
-        </w:rPr>
-        <w:t>For all species caught the total catch weight and the total catch number shall be recorded.</w:t>
-      </w:r>
-    </w:p>
-    <w:p>
-      <w:pPr>
-        <w:rPr>
-          <w:rFonts w:asciiTheme="minorHAnsi" w:hAnsiTheme="minorHAnsi" w:cstheme="minorHAnsi"/>
-          <w:szCs w:val="24"/>
-        </w:rPr>
-      </w:pPr>
-      <w:r>
-        <w:rPr>
-          <w:rFonts w:asciiTheme="minorHAnsi" w:hAnsiTheme="minorHAnsi" w:cstheme="minorHAnsi"/>
-          <w:szCs w:val="24"/>
-        </w:rPr>
-        <w:t xml:space="preserve">Conduct length-weight measurements (up to 100 length and 30 weight measurements for each species caught), and standard biological sampling for all priority species at all stations that they are caught according to Table \@ref(tab:SObiosamplingtab). Further samples for genetics, and taxonomy will be taken for priority species according to the sampling protocols (Table \@ref(tab:SObiosamplingtab)).  </w:t>
-      </w:r>
-    </w:p>
-    <w:p>
-      <w:pPr>
-        <w:rPr>
-          <w:rFonts w:asciiTheme="minorHAnsi" w:hAnsiTheme="minorHAnsi" w:cstheme="minorHAnsi"/>
-          <w:szCs w:val="24"/>
-        </w:rPr>
-      </w:pPr>
-      <w:r>
-        <w:rPr>
-          <w:rFonts w:asciiTheme="minorHAnsi" w:hAnsiTheme="minorHAnsi" w:cstheme="minorHAnsi"/>
-          <w:szCs w:val="24"/>
-        </w:rPr>
-        <w:t>The catch will be sorted, subsampled if necessary, and subsamples will be taken to measure number and weight by taxon. Taxa in the catch are to be identified to the lowest possible taxonomic level. At each trawl haul, length measurements will be taken for all priority species (Table \@ref(tab:SObiosamplingtab)) with an Electronic Fish Meter connected to a customized data acquisition system (Sea2Data).</w:t>
-      </w:r>
-      <w:r>
-        <w:rPr>
-          <w:rFonts w:asciiTheme="minorHAnsi" w:hAnsiTheme="minorHAnsi" w:cstheme="minorHAnsi"/>
-          <w:szCs w:val="24"/>
-        </w:rPr>
-        <w:t xml:space="preserve"> </w:t>
-      </w:r>
-    </w:p>
-    <w:p>
-      <w:pPr>
-        <w:rPr>
-          <w:rFonts w:asciiTheme="minorHAnsi" w:hAnsiTheme="minorHAnsi" w:cstheme="minorHAnsi"/>
-          <w:szCs w:val="24"/>
-        </w:rPr>
-      </w:pPr>
-    </w:p>
-    <w:p>
-      <w:pPr>
-        <w:rPr>
-          <w:rFonts w:asciiTheme="minorHAnsi" w:hAnsiTheme="minorHAnsi" w:cstheme="minorHAnsi"/>
-          <w:szCs w:val="24"/>
-        </w:rPr>
-      </w:pPr>
-      <w:r>
-        <w:rPr>
-          <w:rFonts w:asciiTheme="minorHAnsi" w:hAnsiTheme="minorHAnsi" w:cstheme="minorHAnsi"/>
-          <w:szCs w:val="24"/>
-        </w:rPr>
-        <w:lastRenderedPageBreak/>
-        <w:t>Length frequencies and standard biological sampling for all priority species at all stations they are caught are given in Table \@ref(tab:SObiosamplingtab). Also, length frequency of any species that may be abundant in the catches</w:t>
+    </w:p>
+    <w:p>
+      <w:pPr>
+        <w:rPr>
+          <w:rFonts w:asciiTheme="minorHAnsi" w:hAnsiTheme="minorHAnsi" w:cstheme="minorHAnsi"/>
+          <w:szCs w:val="24"/>
+        </w:rPr>
+      </w:pPr>
+    </w:p>
+    <w:p>
+      <w:pPr>
+        <w:rPr>
+          <w:rFonts w:asciiTheme="minorHAnsi" w:hAnsiTheme="minorHAnsi" w:cstheme="minorHAnsi"/>
+          <w:szCs w:val="24"/>
+        </w:rPr>
+      </w:pPr>
+      <w:r>
+        <w:rPr>
+          <w:rFonts w:asciiTheme="minorHAnsi" w:hAnsiTheme="minorHAnsi" w:cstheme="minorHAnsi"/>
+          <w:szCs w:val="24"/>
+        </w:rPr>
+        <w:t>Sex, maturity and otoliths: 1 fish per 5cm length group at all stations</w:t>
       </w:r>
       <w:r>
         <w:rPr>
@@ -6623,101 +6271,6 @@
           <w:szCs w:val="24"/>
         </w:rPr>
       </w:pPr>
-      <w:r>
-        <w:rPr>
-          <w:rFonts w:asciiTheme="minorHAnsi" w:hAnsiTheme="minorHAnsi" w:cstheme="minorHAnsi"/>
-          <w:szCs w:val="24"/>
-        </w:rPr>
-        <w:t xml:space="preserve">**Stratification of sampling </w:t>
-      </w:r>
-      <w:r>
-        <w:rPr>
-          <w:rFonts w:asciiTheme="minorHAnsi" w:hAnsiTheme="minorHAnsi" w:cstheme="minorHAnsi"/>
-          <w:szCs w:val="24"/>
-        </w:rPr>
-        <w:t xml:space="preserve">of priority species </w:t>
-      </w:r>
-      <w:r>
-        <w:rPr>
-          <w:rFonts w:asciiTheme="minorHAnsi" w:hAnsiTheme="minorHAnsi" w:cstheme="minorHAnsi"/>
-          <w:szCs w:val="24"/>
-        </w:rPr>
-        <w:t>at each trawl station**</w:t>
-      </w:r>
-    </w:p>
-    <w:p>
-      <w:pPr>
-        <w:rPr>
-          <w:rFonts w:asciiTheme="minorHAnsi" w:hAnsiTheme="minorHAnsi" w:cstheme="minorHAnsi"/>
-          <w:szCs w:val="24"/>
-        </w:rPr>
-      </w:pPr>
-      <w:r>
-        <w:rPr>
-          <w:rFonts w:asciiTheme="minorHAnsi" w:hAnsiTheme="minorHAnsi" w:cstheme="minorHAnsi"/>
-          <w:szCs w:val="24"/>
-        </w:rPr>
-        <w:t>Length</w:t>
-      </w:r>
-      <w:r>
-        <w:rPr>
-          <w:rFonts w:asciiTheme="minorHAnsi" w:hAnsiTheme="minorHAnsi" w:cstheme="minorHAnsi"/>
-          <w:szCs w:val="24"/>
-        </w:rPr>
-        <w:t xml:space="preserve"> and weight</w:t>
-      </w:r>
-      <w:r>
-        <w:rPr>
-          <w:rFonts w:asciiTheme="minorHAnsi" w:hAnsiTheme="minorHAnsi" w:cstheme="minorHAnsi"/>
-          <w:szCs w:val="24"/>
-        </w:rPr>
-        <w:t>: 100 fish (all fish with less than 100 individuals in the catch)</w:t>
-      </w:r>
-      <w:r>
-        <w:rPr>
-          <w:rFonts w:asciiTheme="minorHAnsi" w:hAnsiTheme="minorHAnsi" w:cstheme="minorHAnsi"/>
-          <w:szCs w:val="24"/>
-        </w:rPr>
-        <w:t>.</w:t>
-      </w:r>
-    </w:p>
-    <w:p>
-      <w:pPr>
-        <w:rPr>
-          <w:rFonts w:asciiTheme="minorHAnsi" w:hAnsiTheme="minorHAnsi" w:cstheme="minorHAnsi"/>
-          <w:szCs w:val="24"/>
-        </w:rPr>
-      </w:pPr>
-    </w:p>
-    <w:p>
-      <w:pPr>
-        <w:rPr>
-          <w:rFonts w:asciiTheme="minorHAnsi" w:hAnsiTheme="minorHAnsi" w:cstheme="minorHAnsi"/>
-          <w:szCs w:val="24"/>
-        </w:rPr>
-      </w:pPr>
-      <w:r>
-        <w:rPr>
-          <w:rFonts w:asciiTheme="minorHAnsi" w:hAnsiTheme="minorHAnsi" w:cstheme="minorHAnsi"/>
-          <w:szCs w:val="24"/>
-        </w:rPr>
-        <w:t>Sex, maturity and otoliths: 1 fish per 5cm length group at all stations</w:t>
-      </w:r>
-      <w:r>
-        <w:rPr>
-          <w:rFonts w:asciiTheme="minorHAnsi" w:hAnsiTheme="minorHAnsi" w:cstheme="minorHAnsi"/>
-          <w:szCs w:val="24"/>
-        </w:rPr>
-        <w:t>.</w:t>
-      </w:r>
-    </w:p>
-    <w:p>
-      <w:pPr>
-        <w:rPr>
-          <w:rFonts w:asciiTheme="minorHAnsi" w:hAnsiTheme="minorHAnsi" w:cstheme="minorHAnsi"/>
-          <w:szCs w:val="24"/>
-        </w:rPr>
-      </w:pPr>
     </w:p>
     <w:p>
       <w:pPr>
@@ -6754,7 +6307,21 @@
           <w:rFonts w:asciiTheme="minorHAnsi" w:hAnsiTheme="minorHAnsi" w:cstheme="minorHAnsi"/>
           <w:szCs w:val="24"/>
         </w:rPr>
-        <w:t>**Samples for parasites, genetics and morphometrics**</w:t>
+        <w:t xml:space="preserve">**Samples for </w:t>
+      </w:r>
+      <w:r>
+        <w:rPr>
+          <w:rFonts w:asciiTheme="minorHAnsi" w:hAnsiTheme="minorHAnsi" w:cstheme="minorHAnsi"/>
+          <w:szCs w:val="24"/>
+        </w:rPr>
+        <w:t>population structure of priority species</w:t>
+      </w:r>
+      <w:r>
+        <w:rPr>
+          <w:rFonts w:asciiTheme="minorHAnsi" w:hAnsiTheme="minorHAnsi" w:cstheme="minorHAnsi"/>
+          <w:szCs w:val="24"/>
+        </w:rPr>
+        <w:t>**</w:t>
       </w:r>
     </w:p>
     <w:p>
@@ -6778,7 +6345,7 @@
           <w:rFonts w:ascii="Calibri" w:hAnsi="Calibri" w:cs="Calibri"/>
           <w:shd w:val="clear" w:color="auto" w:fill="FFFFFF"/>
         </w:rPr>
-        <w:t xml:space="preserve">From the </w:t>
+        <w:t>Samples of</w:t>
       </w:r>
       <w:r>
         <w:rPr>
@@ -6786,7 +6353,7 @@
           <w:rFonts w:ascii="Calibri" w:hAnsi="Calibri" w:cs="Calibri"/>
           <w:shd w:val="clear" w:color="auto" w:fill="FFFFFF"/>
         </w:rPr>
-        <w:t>_</w:t>
+        <w:t xml:space="preserve"> </w:t>
       </w:r>
       <w:r>
         <w:rPr>
@@ -6794,7 +6361,7 @@
           <w:rFonts w:ascii="Calibri" w:hAnsi="Calibri" w:cs="Calibri"/>
           <w:shd w:val="clear" w:color="auto" w:fill="FFFFFF"/>
         </w:rPr>
-        <w:t>Merluccius</w:t>
+        <w:t>_</w:t>
       </w:r>
       <w:r>
         <w:rPr>
@@ -6802,7 +6369,7 @@
           <w:rFonts w:ascii="Calibri" w:hAnsi="Calibri" w:cs="Calibri"/>
           <w:shd w:val="clear" w:color="auto" w:fill="FFFFFF"/>
         </w:rPr>
-        <w:t>_</w:t>
+        <w:t>Merluccius</w:t>
       </w:r>
       <w:r>
         <w:rPr>
@@ -6810,7 +6377,31 @@
           <w:rFonts w:ascii="Calibri" w:hAnsi="Calibri" w:cs="Calibri"/>
           <w:shd w:val="clear" w:color="auto" w:fill="FFFFFF"/>
         </w:rPr>
-        <w:t xml:space="preserve"> species sampled for sex, maturity and otoliths take additional samples as follows:</w:t>
+        <w:t>_</w:t>
+      </w:r>
+      <w:r>
+        <w:rPr>
+          <w:rStyle w:val="normaltextrun"/>
+          <w:rFonts w:ascii="Calibri" w:hAnsi="Calibri" w:cs="Calibri"/>
+          <w:shd w:val="clear" w:color="auto" w:fill="FFFFFF"/>
+        </w:rPr>
+        <w:t xml:space="preserve"> species </w:t>
+      </w:r>
+      <w:r>
+        <w:rPr>
+          <w:rStyle w:val="normaltextrun"/>
+          <w:rFonts w:ascii="Calibri" w:hAnsi="Calibri" w:cs="Calibri"/>
+          <w:shd w:val="clear" w:color="auto" w:fill="FFFFFF"/>
+        </w:rPr>
+        <w:t>for s</w:t>
+      </w:r>
+      <w:r>
+        <w:rPr>
+          <w:rStyle w:val="normaltextrun"/>
+          <w:rFonts w:ascii="Calibri" w:hAnsi="Calibri" w:cs="Calibri"/>
+          <w:shd w:val="clear" w:color="auto" w:fill="FFFFFF"/>
+        </w:rPr>
+        <w:t xml:space="preserve">tudies of population structure will be taken as follows:  </w:t>
       </w:r>
     </w:p>
     <w:p>
@@ -6917,6 +6508,19 @@
       <w:pPr>
         <w:rPr>
           <w:rFonts w:asciiTheme="minorHAnsi" w:hAnsiTheme="minorHAnsi" w:cstheme="minorHAnsi"/>
+        </w:rPr>
+      </w:pPr>
+      <w:r>
+        <w:rPr>
+          <w:rFonts w:asciiTheme="minorHAnsi" w:hAnsiTheme="minorHAnsi" w:cstheme="minorHAnsi"/>
+        </w:rPr>
+        <w:t>Extraction of otoliths, parasites and measurements for morphometrics will be carried out on  land.</w:t>
+      </w:r>
+    </w:p>
+    <w:p>
+      <w:pPr>
+        <w:rPr>
+          <w:rFonts w:asciiTheme="minorHAnsi" w:hAnsiTheme="minorHAnsi" w:cstheme="minorHAnsi"/>
           <w:i/>
           <w:szCs w:val="24"/>
         </w:rPr>
@@ -6970,127 +6574,34 @@
           <w:rFonts w:asciiTheme="minorHAnsi" w:hAnsiTheme="minorHAnsi" w:cstheme="minorHAnsi"/>
           <w:szCs w:val="24"/>
         </w:rPr>
-        <w:t>2</w:t>
-      </w:r>
-      <w:r>
-        <w:rPr>
-          <w:rFonts w:asciiTheme="minorHAnsi" w:hAnsiTheme="minorHAnsi" w:cstheme="minorHAnsi"/>
-          <w:szCs w:val="24"/>
-        </w:rPr>
-        <w:t xml:space="preserve"> Pelagic fish</w:t>
-      </w:r>
-    </w:p>
-    <w:p>
-      <w:pPr>
-        <w:rPr>
-          <w:rFonts w:asciiTheme="minorHAnsi" w:hAnsiTheme="minorHAnsi" w:cstheme="minorHAnsi"/>
-          <w:szCs w:val="24"/>
-          <w:lang w:val="en-US" w:eastAsia="nb-NO"/>
-        </w:rPr>
-      </w:pPr>
-      <w:r>
-        <w:rPr>
-          <w:rFonts w:asciiTheme="minorHAnsi" w:hAnsiTheme="minorHAnsi" w:cstheme="minorHAnsi"/>
-          <w:szCs w:val="24"/>
-        </w:rPr>
-        <w:t xml:space="preserve">No </w:t>
-      </w:r>
-      <w:r>
-        <w:rPr>
-          <w:rFonts w:asciiTheme="minorHAnsi" w:hAnsiTheme="minorHAnsi" w:cstheme="minorHAnsi"/>
-          <w:szCs w:val="24"/>
-        </w:rPr>
-        <w:t>acoustic biomass estimation is planned for the survey</w:t>
-      </w:r>
+        <w:t>1</w:t>
+      </w:r>
+      <w:r>
+        <w:rPr>
+          <w:rFonts w:asciiTheme="minorHAnsi" w:hAnsiTheme="minorHAnsi" w:cstheme="minorHAnsi"/>
+          <w:szCs w:val="24"/>
+        </w:rPr>
+        <w:t xml:space="preserve"> Other trawl-related sampling</w:t>
+      </w:r>
+    </w:p>
+    <w:p>
+      <w:pPr>
+        <w:rPr>
+          <w:rFonts w:asciiTheme="minorHAnsi" w:hAnsiTheme="minorHAnsi" w:cstheme="minorHAnsi"/>
+          <w:szCs w:val="24"/>
+        </w:rPr>
+      </w:pPr>
     </w:p>
     <w:p>
       <w:pPr>
         <w:pStyle w:val="Heading4"/>
-        <w:rPr>
-          <w:rFonts w:asciiTheme="minorHAnsi" w:hAnsiTheme="minorHAnsi" w:cstheme="minorHAnsi"/>
-          <w:szCs w:val="24"/>
-        </w:rPr>
-      </w:pPr>
-      <w:r>
-        <w:rPr>
-          <w:rFonts w:asciiTheme="minorHAnsi" w:hAnsiTheme="minorHAnsi" w:cstheme="minorHAnsi"/>
-          <w:szCs w:val="24"/>
-        </w:rPr>
-        <w:t>1</w:t>
-      </w:r>
-      <w:r>
-        <w:rPr>
-          <w:rFonts w:asciiTheme="minorHAnsi" w:hAnsiTheme="minorHAnsi" w:cstheme="minorHAnsi"/>
-          <w:szCs w:val="24"/>
-        </w:rPr>
-        <w:t>.3</w:t>
-      </w:r>
-      <w:r>
-        <w:rPr>
-          <w:rFonts w:asciiTheme="minorHAnsi" w:hAnsiTheme="minorHAnsi" w:cstheme="minorHAnsi"/>
-          <w:szCs w:val="24"/>
-        </w:rPr>
-        <w:t>.</w:t>
-      </w:r>
-      <w:r>
-        <w:rPr>
-          <w:rFonts w:asciiTheme="minorHAnsi" w:hAnsiTheme="minorHAnsi" w:cstheme="minorHAnsi"/>
-          <w:szCs w:val="24"/>
-        </w:rPr>
-        <w:t>9</w:t>
-      </w:r>
-      <w:r>
-        <w:rPr>
-          <w:rFonts w:asciiTheme="minorHAnsi" w:hAnsiTheme="minorHAnsi" w:cstheme="minorHAnsi"/>
-          <w:szCs w:val="24"/>
-        </w:rPr>
-        <w:t>.</w:t>
-      </w:r>
-      <w:r>
-        <w:rPr>
-          <w:rFonts w:asciiTheme="minorHAnsi" w:hAnsiTheme="minorHAnsi" w:cstheme="minorHAnsi"/>
-          <w:szCs w:val="24"/>
-        </w:rPr>
-        <w:t>3</w:t>
-      </w:r>
-      <w:r>
-        <w:rPr>
-          <w:rFonts w:asciiTheme="minorHAnsi" w:hAnsiTheme="minorHAnsi" w:cstheme="minorHAnsi"/>
-          <w:szCs w:val="24"/>
-        </w:rPr>
-        <w:t xml:space="preserve"> Other trawl-related sampling</w:t>
-      </w:r>
-    </w:p>
-    <w:p>
-      <w:pPr>
-        <w:rPr>
-          <w:rFonts w:asciiTheme="minorHAnsi" w:hAnsiTheme="minorHAnsi" w:cstheme="minorHAnsi"/>
-          <w:szCs w:val="24"/>
-        </w:rPr>
-      </w:pPr>
-    </w:p>
-    <w:p>
-      <w:pPr>
-        <w:pStyle w:val="Heading4"/>
       </w:pPr>
       <w:r>
         <w:lastRenderedPageBreak/>
-        <w:t>1</w:t>
-      </w:r>
-      <w:r>
-        <w:t>.3</w:t>
-      </w:r>
-      <w:r>
-        <w:t>.</w:t>
-      </w:r>
-      <w:r>
-        <w:t>9</w:t>
-      </w:r>
-      <w:r>
-        <w:t>.</w:t>
-      </w:r>
-      <w:r>
-        <w:t>3.1</w:t>
+        <w:t>1.3.9.1</w:t>
+      </w:r>
+      <w:r>
+        <w:t>.1</w:t>
       </w:r>
       <w:r>
         <w:t xml:space="preserve"> </w:t>
@@ -7296,42 +6807,14 @@
           <w:rFonts w:asciiTheme="minorHAnsi" w:hAnsiTheme="minorHAnsi" w:cstheme="minorHAnsi"/>
           <w:szCs w:val="24"/>
         </w:rPr>
-        <w:t>1</w:t>
-      </w:r>
-      <w:r>
-        <w:rPr>
-          <w:rFonts w:asciiTheme="minorHAnsi" w:hAnsiTheme="minorHAnsi" w:cstheme="minorHAnsi"/>
-          <w:szCs w:val="24"/>
-        </w:rPr>
-        <w:t>.3</w:t>
-      </w:r>
-      <w:r>
-        <w:rPr>
-          <w:rFonts w:asciiTheme="minorHAnsi" w:hAnsiTheme="minorHAnsi" w:cstheme="minorHAnsi"/>
-          <w:szCs w:val="24"/>
-        </w:rPr>
-        <w:t>.</w:t>
-      </w:r>
-      <w:r>
-        <w:rPr>
-          <w:rFonts w:asciiTheme="minorHAnsi" w:hAnsiTheme="minorHAnsi" w:cstheme="minorHAnsi"/>
-          <w:szCs w:val="24"/>
-        </w:rPr>
-        <w:t>9</w:t>
-      </w:r>
-      <w:r>
-        <w:rPr>
-          <w:rFonts w:asciiTheme="minorHAnsi" w:hAnsiTheme="minorHAnsi" w:cstheme="minorHAnsi"/>
-          <w:szCs w:val="24"/>
-        </w:rPr>
-        <w:t>.</w:t>
-      </w:r>
-      <w:r>
-        <w:rPr>
-          <w:rFonts w:asciiTheme="minorHAnsi" w:hAnsiTheme="minorHAnsi" w:cstheme="minorHAnsi"/>
-          <w:szCs w:val="24"/>
-        </w:rPr>
-        <w:t>3.2</w:t>
+        <w:t>1.3.9.1</w:t>
+      </w:r>
+      <w:r>
+        <w:rPr>
+          <w:rFonts w:asciiTheme="minorHAnsi" w:hAnsiTheme="minorHAnsi" w:cstheme="minorHAnsi"/>
+          <w:szCs w:val="24"/>
+        </w:rPr>
+        <w:t>.2</w:t>
       </w:r>
       <w:r>
         <w:rPr>
@@ -7375,108 +6858,37 @@
       <w:pPr>
         <w:pStyle w:val="Heading4"/>
         <w:rPr>
-          <w:rFonts w:asciiTheme="minorHAnsi" w:hAnsiTheme="minorHAnsi" w:cstheme="minorHAnsi"/>
-          <w:szCs w:val="24"/>
-        </w:rPr>
-      </w:pPr>
-      <w:r>
-        <w:rPr>
-          <w:rFonts w:asciiTheme="minorHAnsi" w:hAnsiTheme="minorHAnsi" w:cstheme="minorHAnsi"/>
-          <w:szCs w:val="24"/>
-        </w:rPr>
-        <w:t>1</w:t>
-      </w:r>
-      <w:r>
-        <w:rPr>
-          <w:rFonts w:asciiTheme="minorHAnsi" w:hAnsiTheme="minorHAnsi" w:cstheme="minorHAnsi"/>
-          <w:szCs w:val="24"/>
-        </w:rPr>
-        <w:t>.3</w:t>
-      </w:r>
-      <w:r>
-        <w:rPr>
-          <w:rFonts w:asciiTheme="minorHAnsi" w:hAnsiTheme="minorHAnsi" w:cstheme="minorHAnsi"/>
-          <w:szCs w:val="24"/>
-        </w:rPr>
-        <w:t>.</w:t>
-      </w:r>
-      <w:r>
-        <w:rPr>
-          <w:rFonts w:asciiTheme="minorHAnsi" w:hAnsiTheme="minorHAnsi" w:cstheme="minorHAnsi"/>
-          <w:szCs w:val="24"/>
-        </w:rPr>
-        <w:t>9</w:t>
-      </w:r>
-      <w:r>
-        <w:rPr>
-          <w:rFonts w:asciiTheme="minorHAnsi" w:hAnsiTheme="minorHAnsi" w:cstheme="minorHAnsi"/>
-          <w:szCs w:val="24"/>
-        </w:rPr>
-        <w:t>.3.</w:t>
-      </w:r>
-      <w:r>
-        <w:rPr>
-          <w:rFonts w:asciiTheme="minorHAnsi" w:hAnsiTheme="minorHAnsi" w:cstheme="minorHAnsi"/>
-          <w:szCs w:val="24"/>
-        </w:rPr>
-        <w:t>3</w:t>
-      </w:r>
-      <w:r>
-        <w:rPr>
-          <w:rFonts w:asciiTheme="minorHAnsi" w:hAnsiTheme="minorHAnsi" w:cstheme="minorHAnsi"/>
-          <w:szCs w:val="24"/>
-        </w:rPr>
-        <w:t xml:space="preserve"> </w:t>
-      </w:r>
-      <w:r>
-        <w:rPr>
-          <w:rFonts w:asciiTheme="minorHAnsi" w:hAnsiTheme="minorHAnsi" w:cstheme="minorHAnsi"/>
-          <w:szCs w:val="24"/>
-        </w:rPr>
-        <w:t>Samples for food safety studies and nutrition</w:t>
-      </w:r>
-      <w:r>
-        <w:rPr>
-          <w:rFonts w:asciiTheme="minorHAnsi" w:hAnsiTheme="minorHAnsi" w:cstheme="minorHAnsi"/>
-          <w:szCs w:val="24"/>
-        </w:rPr>
-        <w:t xml:space="preserve"> </w:t>
-      </w:r>
-    </w:p>
-    <w:p>
-      <w:pPr>
-        <w:rPr>
-          <w:rFonts w:asciiTheme="minorHAnsi" w:hAnsiTheme="minorHAnsi" w:cstheme="minorHAnsi"/>
-          <w:szCs w:val="24"/>
-        </w:rPr>
-      </w:pPr>
-      <w:r>
-        <w:rPr>
-          <w:rFonts w:asciiTheme="minorHAnsi" w:hAnsiTheme="minorHAnsi" w:cstheme="minorHAnsi"/>
-          <w:szCs w:val="24"/>
-        </w:rPr>
-        <w:t>From stations with catches of Sardinella,</w:t>
-      </w:r>
-      <w:r>
-        <w:rPr>
-          <w:rFonts w:asciiTheme="minorHAnsi" w:hAnsiTheme="minorHAnsi" w:cstheme="minorHAnsi"/>
-          <w:szCs w:val="24"/>
-        </w:rPr>
-        <w:t xml:space="preserve"> and anchovy, samples </w:t>
-      </w:r>
-      <w:r>
-        <w:rPr>
-          <w:rFonts w:asciiTheme="minorHAnsi" w:hAnsiTheme="minorHAnsi" w:cstheme="minorHAnsi"/>
-          <w:szCs w:val="24"/>
-        </w:rPr>
-        <w:t xml:space="preserve"> </w:t>
-      </w:r>
-      <w:r>
-        <w:rPr>
-          <w:rFonts w:asciiTheme="minorHAnsi" w:hAnsiTheme="minorHAnsi" w:cstheme="minorHAnsi"/>
-          <w:szCs w:val="24"/>
-        </w:rPr>
-        <w:t xml:space="preserve">will be taken and analysed for nutrients profiles, contaminants and microplastics. </w:t>
+          <w:rFonts w:asciiTheme="minorHAnsi" w:hAnsiTheme="minorHAnsi" w:cstheme="minorBidi"/>
+        </w:rPr>
+      </w:pPr>
+      <w:r>
+        <w:rPr>
+          <w:rFonts w:asciiTheme="minorHAnsi" w:hAnsiTheme="minorHAnsi" w:cstheme="minorBidi"/>
+        </w:rPr>
+        <w:t>1.3.9.1</w:t>
+      </w:r>
+      <w:r>
+        <w:rPr>
+          <w:rFonts w:asciiTheme="minorHAnsi" w:hAnsiTheme="minorHAnsi" w:cstheme="minorBidi"/>
+        </w:rPr>
+        <w:t xml:space="preserve">.3 Samples for food safety studies and nutrition </w:t>
+      </w:r>
+    </w:p>
+    <w:p>
+      <w:pPr>
+        <w:rPr>
+          <w:rFonts w:asciiTheme="minorHAnsi" w:hAnsiTheme="minorHAnsi" w:cstheme="minorHAnsi"/>
+          <w:szCs w:val="24"/>
+          <w:lang w:val="en-US"/>
+        </w:rPr>
+      </w:pPr>
+      <w:r>
+        <w:rPr>
+          <w:rFonts w:asciiTheme="minorHAnsi" w:hAnsiTheme="minorHAnsi" w:cstheme="minorHAnsi"/>
+          <w:szCs w:val="24"/>
+          <w:lang w:val="en-US"/>
+        </w:rPr>
+        <w:t>Samples will be taken of sardinella and anchovy for future analysis of nutrient profiles, contaminants and microplastics.</w:t>
       </w:r>
     </w:p>
     <w:p>
@@ -7617,14 +7029,7 @@
           <w:rFonts w:asciiTheme="minorHAnsi" w:hAnsiTheme="minorHAnsi" w:cstheme="minorHAnsi"/>
           <w:szCs w:val="24"/>
         </w:rPr>
-        <w:t>1</w:t>
-      </w:r>
-      <w:r>
-        <w:rPr>
-          <w:rFonts w:asciiTheme="minorHAnsi" w:hAnsiTheme="minorHAnsi" w:cstheme="minorHAnsi"/>
-          <w:szCs w:val="24"/>
-        </w:rPr>
-        <w:t>.3</w:t>
+        <w:t>1.3.9.1</w:t>
       </w:r>
       <w:r>
         <w:rPr>
@@ -7632,27 +7037,6 @@
           <w:szCs w:val="24"/>
         </w:rPr>
         <w:t>.</w:t>
-      </w:r>
-      <w:r>
-        <w:rPr>
-          <w:rFonts w:asciiTheme="minorHAnsi" w:hAnsiTheme="minorHAnsi" w:cstheme="minorHAnsi"/>
-          <w:szCs w:val="24"/>
-        </w:rPr>
-        <w:t>9</w:t>
-      </w:r>
-      <w:r>
-        <w:rPr>
-          <w:rFonts w:asciiTheme="minorHAnsi" w:hAnsiTheme="minorHAnsi" w:cstheme="minorHAnsi"/>
-          <w:szCs w:val="24"/>
-        </w:rPr>
-        <w:t>.</w:t>
-      </w:r>
-      <w:r>
-        <w:rPr>
-          <w:rFonts w:asciiTheme="minorHAnsi" w:hAnsiTheme="minorHAnsi" w:cstheme="minorHAnsi"/>
-          <w:szCs w:val="24"/>
-        </w:rPr>
-        <w:t>3.</w:t>
       </w:r>
       <w:r>
         <w:rPr>
@@ -7752,14 +7136,7 @@
           <w:rFonts w:asciiTheme="minorHAnsi" w:hAnsiTheme="minorHAnsi" w:cstheme="minorHAnsi"/>
           <w:szCs w:val="24"/>
         </w:rPr>
-        <w:t>1</w:t>
-      </w:r>
-      <w:r>
-        <w:rPr>
-          <w:rFonts w:asciiTheme="minorHAnsi" w:hAnsiTheme="minorHAnsi" w:cstheme="minorHAnsi"/>
-          <w:szCs w:val="24"/>
-        </w:rPr>
-        <w:t>.3</w:t>
+        <w:t>1.3.9.1</w:t>
       </w:r>
       <w:r>
         <w:rPr>
@@ -7767,27 +7144,6 @@
           <w:szCs w:val="24"/>
         </w:rPr>
         <w:t>.</w:t>
-      </w:r>
-      <w:r>
-        <w:rPr>
-          <w:rFonts w:asciiTheme="minorHAnsi" w:hAnsiTheme="minorHAnsi" w:cstheme="minorHAnsi"/>
-          <w:szCs w:val="24"/>
-        </w:rPr>
-        <w:t>9</w:t>
-      </w:r>
-      <w:r>
-        <w:rPr>
-          <w:rFonts w:asciiTheme="minorHAnsi" w:hAnsiTheme="minorHAnsi" w:cstheme="minorHAnsi"/>
-          <w:szCs w:val="24"/>
-        </w:rPr>
-        <w:t>.</w:t>
-      </w:r>
-      <w:r>
-        <w:rPr>
-          <w:rFonts w:asciiTheme="minorHAnsi" w:hAnsiTheme="minorHAnsi" w:cstheme="minorHAnsi"/>
-          <w:szCs w:val="24"/>
-        </w:rPr>
-        <w:t>3.</w:t>
       </w:r>
       <w:r>
         <w:rPr>
@@ -8019,7 +7375,7 @@
           <w:rFonts w:asciiTheme="minorHAnsi" w:hAnsiTheme="minorHAnsi" w:cstheme="minorHAnsi"/>
           <w:szCs w:val="24"/>
         </w:rPr>
-        <w:t>4</w:t>
+        <w:t>2</w:t>
       </w:r>
       <w:r>
         <w:rPr>
@@ -8092,7 +7448,21 @@
           <w:rFonts w:asciiTheme="minorHAnsi" w:hAnsiTheme="minorHAnsi" w:cstheme="minorHAnsi"/>
           <w:szCs w:val="24"/>
         </w:rPr>
-        <w:t>] software. Biomass indices will be estimated as total biomass and by length groups (for the species with suffient length data). Prior to the survey EAF Nansen</w:t>
+        <w:t xml:space="preserve">] software. Biomass indices will be estimated as total biomass and by length groups (for the species with suffient length data). Prior to the survey </w:t>
+      </w:r>
+      <w:r>
+        <w:rPr>
+          <w:rFonts w:asciiTheme="minorHAnsi" w:hAnsiTheme="minorHAnsi" w:cstheme="minorHAnsi"/>
+          <w:szCs w:val="24"/>
+        </w:rPr>
+        <w:t xml:space="preserve">the </w:t>
+      </w:r>
+      <w:r>
+        <w:rPr>
+          <w:rFonts w:asciiTheme="minorHAnsi" w:hAnsiTheme="minorHAnsi" w:cstheme="minorHAnsi"/>
+          <w:szCs w:val="24"/>
+        </w:rPr>
+        <w:t>EAF Nansen</w:t>
       </w:r>
       <w:r>
         <w:rPr>
@@ -8106,7 +7476,21 @@
           <w:rFonts w:asciiTheme="minorHAnsi" w:hAnsiTheme="minorHAnsi" w:cstheme="minorHAnsi"/>
           <w:szCs w:val="24"/>
         </w:rPr>
-        <w:t xml:space="preserve">rogramme carried out a demersal biomass estimation course specifically aimed at this region, and the survey participants who took part in the course will be given the chance to apply their newly aquired skills in biomass estimation using StoX. </w:t>
+        <w:t xml:space="preserve">rogramme </w:t>
+      </w:r>
+      <w:r>
+        <w:rPr>
+          <w:rFonts w:asciiTheme="minorHAnsi" w:hAnsiTheme="minorHAnsi" w:cstheme="minorHAnsi"/>
+          <w:szCs w:val="24"/>
+        </w:rPr>
+        <w:t>organised</w:t>
+      </w:r>
+      <w:r>
+        <w:rPr>
+          <w:rFonts w:asciiTheme="minorHAnsi" w:hAnsiTheme="minorHAnsi" w:cstheme="minorHAnsi"/>
+          <w:szCs w:val="24"/>
+        </w:rPr>
+        <w:t xml:space="preserve"> a demersal biomass estimation course specifically aimed at this region, and the survey participants who took part in the course will be given the chance to apply their newly aquired skills in biomass estimation using StoX. </w:t>
       </w:r>
     </w:p>
     <w:p>
@@ -8457,268 +7841,59 @@
     <w:p>
       <w:pPr>
         <w:rPr>
+          <w:rFonts w:asciiTheme="minorHAnsi" w:hAnsiTheme="minorHAnsi" w:cstheme="minorBidi"/>
+        </w:rPr>
+      </w:pPr>
+      <w:r>
+        <w:rPr>
           <w:rStyle w:val="normaltextrun"/>
-          <w:rFonts w:asciiTheme="minorHAnsi" w:hAnsiTheme="minorHAnsi" w:cstheme="minorHAnsi"/>
-          <w:szCs w:val="24"/>
-        </w:rPr>
-      </w:pPr>
+          <w:rFonts w:asciiTheme="minorHAnsi" w:hAnsiTheme="minorHAnsi" w:cstheme="minorBidi"/>
+        </w:rPr>
+        <w:t xml:space="preserve">In </w:t>
+      </w:r>
       <w:r>
         <w:rPr>
           <w:rStyle w:val="normaltextrun"/>
-          <w:rFonts w:asciiTheme="minorHAnsi" w:hAnsiTheme="minorHAnsi" w:cstheme="minorHAnsi"/>
-          <w:szCs w:val="24"/>
-        </w:rPr>
-        <w:t xml:space="preserve">In line with the Nansen Data Policy, the Cruise Leader is to ensure that each national institution represented in the survey receives a copy of the draft report and the basic data (e.g. catch data) pertaining to the particular survey and for their national waters before </w:t>
+          <w:rFonts w:asciiTheme="minorHAnsi" w:hAnsiTheme="minorHAnsi" w:cstheme="minorBidi"/>
+        </w:rPr>
+        <w:t xml:space="preserve">line with the Nansen Data Policy, the Cruise Leader is to ensure that each national institution represented in the survey receives a copy of the draft report and the basic data (e.g. catch data) pertaining to the particular survey and for their national waters before </w:t>
       </w:r>
       <w:r>
         <w:rPr>
           <w:rStyle w:val="normaltextrun"/>
-          <w:rFonts w:asciiTheme="minorHAnsi" w:hAnsiTheme="minorHAnsi" w:cstheme="minorHAnsi"/>
-          <w:szCs w:val="24"/>
+          <w:rFonts w:asciiTheme="minorHAnsi" w:hAnsiTheme="minorHAnsi" w:cstheme="minorBidi"/>
         </w:rPr>
         <w:lastRenderedPageBreak/>
-        <w:t>leaving the vessel</w:t>
+        <w:t xml:space="preserve">leaving the vessel. An overview of the equipment that is going to be used for the collection of the various data can be found in Table \@ref(tab:SOequipmenttab) ([ANNEX VI](ANNEX_VI)). The different types of data expected to be recorded, their storage and delivery can be found in Table \@ref(tab:SOdatahandovertab) ([ANNEX VII](ANNEX_VII)). Finally, the samples to be collected, their preservation and planned follow-up work is detailed in Table \@ref(tab:SOcollectedsamplestab) ([ANNEX VIII](ANNEX_VIII)). The Cruise Leader is expected to document what data and samples </w:t>
       </w:r>
       <w:r>
         <w:rPr>
           <w:rStyle w:val="normaltextrun"/>
-          <w:rFonts w:asciiTheme="minorHAnsi" w:hAnsiTheme="minorHAnsi" w:cstheme="minorHAnsi"/>
-          <w:szCs w:val="24"/>
-        </w:rPr>
-        <w:t xml:space="preserve">. </w:t>
+          <w:rFonts w:asciiTheme="minorHAnsi" w:hAnsiTheme="minorHAnsi" w:cstheme="minorBidi"/>
+        </w:rPr>
+        <w:t>have</w:t>
       </w:r>
       <w:r>
         <w:rPr>
           <w:rStyle w:val="normaltextrun"/>
-          <w:rFonts w:asciiTheme="minorHAnsi" w:hAnsiTheme="minorHAnsi" w:cstheme="minorHAnsi"/>
-          <w:szCs w:val="24"/>
-        </w:rPr>
-        <w:t>An overview of the equipment that is going to be use</w:t>
-      </w:r>
-      <w:r>
+          <w:rFonts w:asciiTheme="minorHAnsi" w:hAnsiTheme="minorHAnsi" w:cstheme="minorBidi"/>
+        </w:rPr>
+        <w:t xml:space="preserve"> been shared and with whom. </w:t>
+      </w:r>
+    </w:p>
+    <w:p>
+      <w:pPr>
         <w:rPr>
           <w:rStyle w:val="normaltextrun"/>
-          <w:rFonts w:asciiTheme="minorHAnsi" w:hAnsiTheme="minorHAnsi" w:cstheme="minorHAnsi"/>
-          <w:szCs w:val="24"/>
-        </w:rPr>
-        <w:t xml:space="preserve">d for the collection of the various data can be found in </w:t>
-      </w:r>
+          <w:rFonts w:asciiTheme="minorHAnsi" w:hAnsiTheme="minorHAnsi" w:cstheme="minorBidi"/>
+        </w:rPr>
+      </w:pPr>
       <w:r>
         <w:rPr>
           <w:rStyle w:val="normaltextrun"/>
-          <w:rFonts w:asciiTheme="minorHAnsi" w:hAnsiTheme="minorHAnsi" w:cstheme="minorHAnsi"/>
-          <w:szCs w:val="24"/>
-        </w:rPr>
-        <w:t>Table \@ref(tab:SOequipmenttab) ([ANNEX VI](ANNEX_VI))</w:t>
-      </w:r>
-      <w:r>
-        <w:rPr>
-          <w:rStyle w:val="normaltextrun"/>
-          <w:rFonts w:asciiTheme="minorHAnsi" w:hAnsiTheme="minorHAnsi" w:cstheme="minorHAnsi"/>
-          <w:szCs w:val="24"/>
-        </w:rPr>
-        <w:t>. The different types of data expected to be recorded, their storage and delivery</w:t>
-      </w:r>
-      <w:r>
-        <w:rPr>
-          <w:rStyle w:val="normaltextrun"/>
-          <w:rFonts w:asciiTheme="minorHAnsi" w:hAnsiTheme="minorHAnsi" w:cstheme="minorHAnsi"/>
-          <w:szCs w:val="24"/>
-        </w:rPr>
-        <w:t xml:space="preserve"> can be found in Table \@ref(tab:</w:t>
-      </w:r>
-      <w:r>
-        <w:rPr>
-          <w:rStyle w:val="normaltextrun"/>
-          <w:rFonts w:asciiTheme="minorHAnsi" w:hAnsiTheme="minorHAnsi" w:cstheme="minorHAnsi"/>
-          <w:szCs w:val="24"/>
-        </w:rPr>
-        <w:t>SOdatahandovertab</w:t>
-      </w:r>
-      <w:r>
-        <w:rPr>
-          <w:rStyle w:val="normaltextrun"/>
-          <w:rFonts w:asciiTheme="minorHAnsi" w:hAnsiTheme="minorHAnsi" w:cstheme="minorHAnsi"/>
-          <w:szCs w:val="24"/>
-        </w:rPr>
-        <w:t>)</w:t>
-      </w:r>
-      <w:r>
-        <w:rPr>
-          <w:rStyle w:val="normaltextrun"/>
-          <w:rFonts w:asciiTheme="minorHAnsi" w:hAnsiTheme="minorHAnsi" w:cstheme="minorHAnsi"/>
-          <w:szCs w:val="24"/>
-        </w:rPr>
-        <w:t xml:space="preserve"> </w:t>
-      </w:r>
-      <w:r>
-        <w:rPr>
-          <w:rStyle w:val="normaltextrun"/>
-          <w:rFonts w:asciiTheme="minorHAnsi" w:hAnsiTheme="minorHAnsi" w:cstheme="minorHAnsi"/>
-          <w:szCs w:val="24"/>
-        </w:rPr>
-        <w:t>([ANNEX VII](ANNEX_VII))</w:t>
-      </w:r>
-      <w:r>
-        <w:rPr>
-          <w:rStyle w:val="normaltextrun"/>
-          <w:rFonts w:asciiTheme="minorHAnsi" w:hAnsiTheme="minorHAnsi" w:cstheme="minorHAnsi"/>
-          <w:szCs w:val="24"/>
-        </w:rPr>
-        <w:t>. Finally, the s</w:t>
-      </w:r>
-      <w:r>
-        <w:rPr>
-          <w:rStyle w:val="normaltextrun"/>
-          <w:rFonts w:asciiTheme="minorHAnsi" w:hAnsiTheme="minorHAnsi" w:cstheme="minorHAnsi"/>
-          <w:szCs w:val="24"/>
-        </w:rPr>
-        <w:t xml:space="preserve">amples to be collected, </w:t>
-      </w:r>
-      <w:r>
-        <w:rPr>
-          <w:rStyle w:val="normaltextrun"/>
-          <w:rFonts w:asciiTheme="minorHAnsi" w:hAnsiTheme="minorHAnsi" w:cstheme="minorHAnsi"/>
-          <w:szCs w:val="24"/>
-        </w:rPr>
-        <w:t xml:space="preserve">their </w:t>
-      </w:r>
-      <w:r>
-        <w:rPr>
-          <w:rStyle w:val="normaltextrun"/>
-          <w:rFonts w:asciiTheme="minorHAnsi" w:hAnsiTheme="minorHAnsi" w:cstheme="minorHAnsi"/>
-          <w:szCs w:val="24"/>
-        </w:rPr>
-        <w:t xml:space="preserve">preservation and </w:t>
-      </w:r>
-      <w:r>
-        <w:rPr>
-          <w:rStyle w:val="normaltextrun"/>
-          <w:rFonts w:asciiTheme="minorHAnsi" w:hAnsiTheme="minorHAnsi" w:cstheme="minorHAnsi"/>
-          <w:szCs w:val="24"/>
-        </w:rPr>
-        <w:t xml:space="preserve">planned </w:t>
-      </w:r>
-      <w:r>
-        <w:rPr>
-          <w:rStyle w:val="normaltextrun"/>
-          <w:rFonts w:asciiTheme="minorHAnsi" w:hAnsiTheme="minorHAnsi" w:cstheme="minorHAnsi"/>
-          <w:szCs w:val="24"/>
-        </w:rPr>
-        <w:t>follow-up work</w:t>
-      </w:r>
-      <w:r>
-        <w:rPr>
-          <w:rStyle w:val="normaltextrun"/>
-          <w:rFonts w:asciiTheme="minorHAnsi" w:hAnsiTheme="minorHAnsi" w:cstheme="minorHAnsi"/>
-          <w:szCs w:val="24"/>
-        </w:rPr>
-        <w:t xml:space="preserve"> is detailed in </w:t>
-      </w:r>
-      <w:r>
-        <w:rPr>
-          <w:rStyle w:val="normaltextrun"/>
-          <w:rFonts w:asciiTheme="minorHAnsi" w:hAnsiTheme="minorHAnsi" w:cstheme="minorHAnsi"/>
-          <w:szCs w:val="24"/>
-        </w:rPr>
-        <w:t>Table \@ref(tab:</w:t>
-      </w:r>
-      <w:r>
-        <w:rPr>
-          <w:rStyle w:val="normaltextrun"/>
-          <w:rFonts w:asciiTheme="minorHAnsi" w:hAnsiTheme="minorHAnsi" w:cstheme="minorHAnsi"/>
-          <w:szCs w:val="24"/>
-        </w:rPr>
-        <w:t>SOcollectedsamplestab</w:t>
-      </w:r>
-      <w:r>
-        <w:rPr>
-          <w:rStyle w:val="normaltextrun"/>
-          <w:rFonts w:asciiTheme="minorHAnsi" w:hAnsiTheme="minorHAnsi" w:cstheme="minorHAnsi"/>
-          <w:szCs w:val="24"/>
-        </w:rPr>
-        <w:t>) ([ANNEX VI</w:t>
-      </w:r>
-      <w:r>
-        <w:rPr>
-          <w:rStyle w:val="normaltextrun"/>
-          <w:rFonts w:asciiTheme="minorHAnsi" w:hAnsiTheme="minorHAnsi" w:cstheme="minorHAnsi"/>
-          <w:szCs w:val="24"/>
-        </w:rPr>
-        <w:t>I</w:t>
-      </w:r>
-      <w:r>
-        <w:rPr>
-          <w:rStyle w:val="normaltextrun"/>
-          <w:rFonts w:asciiTheme="minorHAnsi" w:hAnsiTheme="minorHAnsi" w:cstheme="minorHAnsi"/>
-          <w:szCs w:val="24"/>
-        </w:rPr>
-        <w:t>I](ANNEX_VII</w:t>
-      </w:r>
-      <w:r>
-        <w:rPr>
-          <w:rStyle w:val="normaltextrun"/>
-          <w:rFonts w:asciiTheme="minorHAnsi" w:hAnsiTheme="minorHAnsi" w:cstheme="minorHAnsi"/>
-          <w:szCs w:val="24"/>
-        </w:rPr>
-        <w:t>I</w:t>
-      </w:r>
-      <w:r>
-        <w:rPr>
-          <w:rStyle w:val="normaltextrun"/>
-          <w:rFonts w:asciiTheme="minorHAnsi" w:hAnsiTheme="minorHAnsi" w:cstheme="minorHAnsi"/>
-          <w:szCs w:val="24"/>
-        </w:rPr>
-        <w:t>))</w:t>
-      </w:r>
-      <w:r>
-        <w:rPr>
-          <w:rStyle w:val="normaltextrun"/>
-          <w:rFonts w:asciiTheme="minorHAnsi" w:hAnsiTheme="minorHAnsi" w:cstheme="minorHAnsi"/>
-          <w:szCs w:val="24"/>
-        </w:rPr>
-        <w:t>.</w:t>
-      </w:r>
-      <w:r>
-        <w:rPr>
-          <w:rStyle w:val="normaltextrun"/>
-          <w:rFonts w:asciiTheme="minorHAnsi" w:hAnsiTheme="minorHAnsi" w:cstheme="minorHAnsi"/>
-          <w:szCs w:val="24"/>
-        </w:rPr>
-        <w:t xml:space="preserve"> The Cruise Leader is expected to document </w:t>
-      </w:r>
-      <w:r>
-        <w:rPr>
-          <w:rStyle w:val="normaltextrun"/>
-          <w:rFonts w:asciiTheme="minorHAnsi" w:hAnsiTheme="minorHAnsi" w:cstheme="minorHAnsi"/>
-          <w:szCs w:val="24"/>
-        </w:rPr>
-        <w:t xml:space="preserve">what data and samples has been shared and with whom. </w:t>
-      </w:r>
-    </w:p>
-    <w:p>
-      <w:pPr>
-        <w:pStyle w:val="paragraph"/>
-        <w:spacing w:before="0" w:beforeAutospacing="0" w:after="0" w:afterAutospacing="0"/>
-        <w:jc w:val="both"/>
-        <w:textAlignment w:val="baseline"/>
-        <w:rPr>
-          <w:rFonts w:asciiTheme="minorHAnsi" w:hAnsiTheme="minorHAnsi" w:cstheme="minorHAnsi"/>
-        </w:rPr>
-      </w:pPr>
-      <w:r>
-        <w:rPr>
-          <w:rStyle w:val="normaltextrun"/>
-          <w:rFonts w:asciiTheme="minorHAnsi" w:hAnsiTheme="minorHAnsi" w:cstheme="minorHAnsi"/>
-        </w:rPr>
-        <w:t>The cruise participants are expected to sign and conform the Data policy of the EAF-Nansen Programme</w:t>
-      </w:r>
-      <w:r>
-        <w:rPr>
-          <w:rStyle w:val="normaltextrun"/>
-          <w:rFonts w:asciiTheme="minorHAnsi" w:hAnsiTheme="minorHAnsi" w:cstheme="minorHAnsi"/>
-        </w:rPr>
-        <w:t>.</w:t>
+          <w:rFonts w:asciiTheme="minorHAnsi" w:hAnsiTheme="minorHAnsi" w:cstheme="minorBidi"/>
+        </w:rPr>
+        <w:t>The cruise participants are expected to sign and conform the Data policy of the EAF-Nansen Programme.</w:t>
       </w:r>
     </w:p>
     <w:p>
@@ -9114,70 +8289,62 @@
       <w:pPr>
         <w:pStyle w:val="Heading3"/>
         <w:rPr>
-          <w:rFonts w:asciiTheme="minorHAnsi" w:hAnsiTheme="minorHAnsi" w:cstheme="minorHAnsi"/>
-          <w:szCs w:val="24"/>
-          <w:lang w:val="en-US"/>
-        </w:rPr>
-      </w:pPr>
-      <w:r>
-        <w:rPr>
-          <w:rFonts w:asciiTheme="minorHAnsi" w:hAnsiTheme="minorHAnsi" w:cstheme="minorHAnsi"/>
-          <w:szCs w:val="24"/>
+          <w:rFonts w:asciiTheme="minorHAnsi" w:hAnsiTheme="minorHAnsi" w:cstheme="minorBidi"/>
+          <w:lang w:val="en-US"/>
+        </w:rPr>
+      </w:pPr>
+      <w:r>
+        <w:rPr>
+          <w:rFonts w:asciiTheme="minorHAnsi" w:hAnsiTheme="minorHAnsi" w:cstheme="minorBidi"/>
           <w:lang w:val="en-US"/>
         </w:rPr>
         <w:t>1</w:t>
       </w:r>
       <w:r>
         <w:rPr>
-          <w:rFonts w:asciiTheme="minorHAnsi" w:hAnsiTheme="minorHAnsi" w:cstheme="minorHAnsi"/>
-          <w:szCs w:val="24"/>
+          <w:rFonts w:asciiTheme="minorHAnsi" w:hAnsiTheme="minorHAnsi" w:cstheme="minorBidi"/>
           <w:lang w:val="en-US"/>
         </w:rPr>
         <w:t>.6</w:t>
       </w:r>
       <w:r>
         <w:rPr>
-          <w:rFonts w:asciiTheme="minorHAnsi" w:hAnsiTheme="minorHAnsi" w:cstheme="minorHAnsi"/>
-          <w:szCs w:val="24"/>
+          <w:rFonts w:asciiTheme="minorHAnsi" w:hAnsiTheme="minorHAnsi" w:cstheme="minorBidi"/>
           <w:lang w:val="en-US"/>
         </w:rPr>
         <w:t xml:space="preserve">.2 </w:t>
       </w:r>
       <w:r>
         <w:rPr>
-          <w:rFonts w:asciiTheme="minorHAnsi" w:hAnsiTheme="minorHAnsi" w:cstheme="minorHAnsi"/>
-          <w:szCs w:val="24"/>
+          <w:rFonts w:asciiTheme="minorHAnsi" w:hAnsiTheme="minorHAnsi" w:cstheme="minorBidi"/>
         </w:rPr>
         <w:t>ANNEX</w:t>
       </w:r>
       <w:r>
         <w:rPr>
-          <w:rFonts w:asciiTheme="minorHAnsi" w:hAnsiTheme="minorHAnsi" w:cstheme="minorHAnsi"/>
-          <w:szCs w:val="24"/>
+          <w:rFonts w:asciiTheme="minorHAnsi" w:hAnsiTheme="minorHAnsi" w:cstheme="minorBidi"/>
           <w:lang w:val="en-US"/>
         </w:rPr>
         <w:t xml:space="preserve"> II</w:t>
       </w:r>
       <w:r>
         <w:rPr>
-          <w:rFonts w:asciiTheme="minorHAnsi" w:hAnsiTheme="minorHAnsi" w:cstheme="minorHAnsi"/>
-          <w:szCs w:val="24"/>
+          <w:rFonts w:asciiTheme="minorHAnsi" w:hAnsiTheme="minorHAnsi" w:cstheme="minorBidi"/>
           <w:lang w:val="en-US"/>
         </w:rPr>
         <w:t>.</w:t>
       </w:r>
       <w:r>
         <w:rPr>
-          <w:rFonts w:asciiTheme="minorHAnsi" w:hAnsiTheme="minorHAnsi" w:cstheme="minorHAnsi"/>
-          <w:szCs w:val="24"/>
+          <w:rFonts w:asciiTheme="minorHAnsi" w:hAnsiTheme="minorHAnsi" w:cstheme="minorBidi"/>
           <w:lang w:val="en-US"/>
         </w:rPr>
         <w:t xml:space="preserve"> </w:t>
       </w:r>
       <w:r>
         <w:rPr>
-          <w:rFonts w:asciiTheme="minorHAnsi" w:hAnsiTheme="minorHAnsi" w:cstheme="minorHAnsi"/>
-          <w:szCs w:val="24"/>
+          <w:rFonts w:asciiTheme="minorHAnsi" w:hAnsiTheme="minorHAnsi" w:cstheme="minorBidi"/>
+          <w:lang w:val="en-US"/>
         </w:rPr>
         <w:t>Planned participation</w:t>
       </w:r>
@@ -9356,71 +8523,61 @@
       <w:pPr>
         <w:pStyle w:val="Heading3"/>
         <w:rPr>
-          <w:rFonts w:asciiTheme="minorHAnsi" w:hAnsiTheme="minorHAnsi" w:cstheme="minorHAnsi"/>
-          <w:szCs w:val="24"/>
-          <w:lang w:val="en-US"/>
-        </w:rPr>
-      </w:pPr>
-      <w:r>
-        <w:rPr>
-          <w:rFonts w:asciiTheme="minorHAnsi" w:hAnsiTheme="minorHAnsi" w:cstheme="minorHAnsi"/>
-          <w:szCs w:val="24"/>
+          <w:rFonts w:asciiTheme="minorHAnsi" w:hAnsiTheme="minorHAnsi" w:cstheme="minorBidi"/>
+          <w:lang w:val="en-US"/>
+        </w:rPr>
+      </w:pPr>
+      <w:r>
+        <w:rPr>
+          <w:rFonts w:asciiTheme="minorHAnsi" w:hAnsiTheme="minorHAnsi" w:cstheme="minorBidi"/>
         </w:rPr>
         <w:t>1</w:t>
       </w:r>
       <w:r>
         <w:rPr>
-          <w:rFonts w:asciiTheme="minorHAnsi" w:hAnsiTheme="minorHAnsi" w:cstheme="minorHAnsi"/>
-          <w:szCs w:val="24"/>
+          <w:rFonts w:asciiTheme="minorHAnsi" w:hAnsiTheme="minorHAnsi" w:cstheme="minorBidi"/>
         </w:rPr>
         <w:t>.6</w:t>
       </w:r>
       <w:r>
         <w:rPr>
-          <w:rFonts w:asciiTheme="minorHAnsi" w:hAnsiTheme="minorHAnsi" w:cstheme="minorHAnsi"/>
-          <w:szCs w:val="24"/>
+          <w:rFonts w:asciiTheme="minorHAnsi" w:hAnsiTheme="minorHAnsi" w:cstheme="minorBidi"/>
         </w:rPr>
         <w:t>.</w:t>
       </w:r>
       <w:r>
         <w:rPr>
-          <w:rFonts w:asciiTheme="minorHAnsi" w:hAnsiTheme="minorHAnsi" w:cstheme="minorHAnsi"/>
-          <w:szCs w:val="24"/>
+          <w:rFonts w:asciiTheme="minorHAnsi" w:hAnsiTheme="minorHAnsi" w:cstheme="minorBidi"/>
         </w:rPr>
         <w:t>5</w:t>
       </w:r>
       <w:r>
         <w:rPr>
-          <w:rFonts w:asciiTheme="minorHAnsi" w:hAnsiTheme="minorHAnsi" w:cstheme="minorHAnsi"/>
-          <w:szCs w:val="24"/>
+          <w:rFonts w:asciiTheme="minorHAnsi" w:hAnsiTheme="minorHAnsi" w:cstheme="minorBidi"/>
         </w:rPr>
         <w:t xml:space="preserve"> </w:t>
       </w:r>
       <w:r>
         <w:rPr>
-          <w:rFonts w:asciiTheme="minorHAnsi" w:hAnsiTheme="minorHAnsi" w:cstheme="minorHAnsi"/>
-          <w:szCs w:val="24"/>
+          <w:rFonts w:asciiTheme="minorHAnsi" w:hAnsiTheme="minorHAnsi" w:cstheme="minorBidi"/>
         </w:rPr>
         <w:t>ANNEX</w:t>
       </w:r>
       <w:r>
         <w:rPr>
-          <w:rFonts w:asciiTheme="minorHAnsi" w:hAnsiTheme="minorHAnsi" w:cstheme="minorHAnsi"/>
-          <w:szCs w:val="24"/>
+          <w:rFonts w:asciiTheme="minorHAnsi" w:hAnsiTheme="minorHAnsi" w:cstheme="minorBidi"/>
         </w:rPr>
         <w:t xml:space="preserve"> V</w:t>
       </w:r>
       <w:r>
         <w:rPr>
-          <w:rFonts w:asciiTheme="minorHAnsi" w:hAnsiTheme="minorHAnsi" w:cstheme="minorHAnsi"/>
-          <w:szCs w:val="24"/>
+          <w:rFonts w:asciiTheme="minorHAnsi" w:hAnsiTheme="minorHAnsi" w:cstheme="minorBidi"/>
         </w:rPr>
         <w:t xml:space="preserve">. </w:t>
       </w:r>
       <w:r>
         <w:rPr>
-          <w:rFonts w:asciiTheme="minorHAnsi" w:hAnsiTheme="minorHAnsi" w:cstheme="minorHAnsi"/>
-          <w:szCs w:val="24"/>
+          <w:rFonts w:asciiTheme="minorHAnsi" w:hAnsiTheme="minorHAnsi" w:cstheme="minorBidi"/>
           <w:lang w:val="en-US"/>
         </w:rPr>
         <w:t>Survey-specific additional sampling</w:t>
@@ -9438,7 +8595,15 @@
           <w:rFonts w:asciiTheme="minorHAnsi" w:hAnsiTheme="minorHAnsi" w:cstheme="minorHAnsi"/>
           <w:szCs w:val="24"/>
         </w:rPr>
-        <w:t>For each of the selected families (see table below) 2-3 specimens in good conditionwill be retained from the demersal trawl catches to be used for the practical sessions of the taxonomy training course and for further scientific analysis. The list is intended to provide collectors with a broad selection of taxa that might be available in the catches with the goal of having enough variety of species/families as well as sufficient specimens (</w:t>
+        <w:t xml:space="preserve">For each of the selected families (see table below) 2-3 specimens in good conditionwill be retained from the demersal trawl catches to be used for the practical sessions of the taxonomy training course and for further scientific analysis. The list is intended to provide collectors with a broad selection of taxa that might be available in the catches with the goal </w:t>
+      </w:r>
+      <w:r>
+        <w:rPr>
+          <w:rFonts w:asciiTheme="minorHAnsi" w:hAnsiTheme="minorHAnsi" w:cstheme="minorHAnsi"/>
+          <w:szCs w:val="24"/>
+        </w:rPr>
+        <w:lastRenderedPageBreak/>
+        <w:t>of having enough variety of species/families as well as sufficient specimens (</w:t>
       </w:r>
       <w:r>
         <w:rPr>
@@ -9804,7 +8969,7 @@
           <w:rFonts w:asciiTheme="minorHAnsi" w:hAnsiTheme="minorHAnsi" w:cstheme="minorHAnsi"/>
           <w:szCs w:val="24"/>
         </w:rPr>
-        <w:t xml:space="preserve">Cut off the small running number included at the bottom of the waterproof tag (it corresponds to the running number printed on the same tag) and place it inside the vial together with the fin clip taken from the specimens’ right pelvic fin. Use high concentration (95%) ethanol for fixation. Please remember to wash forceps and scissors with 95% ethanol in-between different samples. The vial containing the fixed fin clip should then be stored inside a white box, which has numbered slots corresponding to the running numbers (see </w:t>
+        <w:t xml:space="preserve">Cut off the small running number included at the bottom of the waterproof tag (it corresponds to the running number printed on the same tag) and place it inside the vial together with the fin clip taken from the specimens’ right pelvic fin. Use high concentration </w:t>
       </w:r>
       <w:r>
         <w:rPr>
@@ -9812,7 +8977,7 @@
           <w:szCs w:val="24"/>
         </w:rPr>
         <w:lastRenderedPageBreak/>
-        <w:t xml:space="preserve">example </w:t>
+        <w:t xml:space="preserve">(95%) ethanol for fixation. Please remember to wash forceps and scissors with 95% ethanol in-between different samples. The vial containing the fixed fin clip should then be stored inside a white box, which has numbered slots corresponding to the running numbers (see example </w:t>
       </w:r>
       <w:r>
         <w:rPr>
@@ -10328,6 +9493,7 @@
           <w:rFonts w:asciiTheme="minorHAnsi" w:hAnsiTheme="minorHAnsi" w:cstheme="minorHAnsi"/>
           <w:szCs w:val="24"/>
         </w:rPr>
+        <w:lastRenderedPageBreak/>
         <w:t>Station number</w:t>
       </w:r>
     </w:p>
@@ -10363,7 +9529,6 @@
           <w:rFonts w:asciiTheme="minorHAnsi" w:hAnsiTheme="minorHAnsi" w:cstheme="minorHAnsi"/>
           <w:szCs w:val="24"/>
         </w:rPr>
-        <w:lastRenderedPageBreak/>
         <w:t>The log is to be sent to peter.psomadakis@gmail.com at the end of the survey, together with trawl station information data.</w:t>
       </w:r>
     </w:p>
@@ -10432,129 +9597,99 @@
       <w:pPr>
         <w:pStyle w:val="Heading3"/>
         <w:rPr>
-          <w:rFonts w:asciiTheme="minorHAnsi" w:hAnsiTheme="minorHAnsi" w:cstheme="minorHAnsi"/>
-          <w:szCs w:val="24"/>
-          <w:lang w:val="en-US"/>
-        </w:rPr>
-      </w:pPr>
-      <w:r>
-        <w:rPr>
-          <w:rFonts w:asciiTheme="minorHAnsi" w:hAnsiTheme="minorHAnsi" w:cstheme="minorHAnsi"/>
-          <w:szCs w:val="24"/>
+          <w:rFonts w:asciiTheme="minorHAnsi" w:hAnsiTheme="minorHAnsi" w:cstheme="minorBidi"/>
+          <w:lang w:val="en-US"/>
+        </w:rPr>
+      </w:pPr>
+      <w:r>
+        <w:rPr>
+          <w:rFonts w:asciiTheme="minorHAnsi" w:hAnsiTheme="minorHAnsi" w:cstheme="minorBidi"/>
           <w:lang w:val="en-US"/>
         </w:rPr>
         <w:t>1</w:t>
       </w:r>
       <w:r>
         <w:rPr>
-          <w:rFonts w:asciiTheme="minorHAnsi" w:hAnsiTheme="minorHAnsi" w:cstheme="minorHAnsi"/>
-          <w:szCs w:val="24"/>
+          <w:rFonts w:asciiTheme="minorHAnsi" w:hAnsiTheme="minorHAnsi" w:cstheme="minorBidi"/>
           <w:lang w:val="en-US"/>
         </w:rPr>
         <w:t>.6</w:t>
       </w:r>
       <w:r>
         <w:rPr>
-          <w:rFonts w:asciiTheme="minorHAnsi" w:hAnsiTheme="minorHAnsi" w:cstheme="minorHAnsi"/>
-          <w:szCs w:val="24"/>
+          <w:rFonts w:asciiTheme="minorHAnsi" w:hAnsiTheme="minorHAnsi" w:cstheme="minorBidi"/>
           <w:lang w:val="en-US"/>
         </w:rPr>
         <w:t>.</w:t>
       </w:r>
       <w:r>
         <w:rPr>
-          <w:rFonts w:asciiTheme="minorHAnsi" w:hAnsiTheme="minorHAnsi" w:cstheme="minorHAnsi"/>
-          <w:szCs w:val="24"/>
+          <w:rFonts w:asciiTheme="minorHAnsi" w:hAnsiTheme="minorHAnsi" w:cstheme="minorBidi"/>
           <w:lang w:val="en-US"/>
         </w:rPr>
         <w:t>6</w:t>
       </w:r>
       <w:r>
         <w:rPr>
-          <w:rFonts w:asciiTheme="minorHAnsi" w:hAnsiTheme="minorHAnsi" w:cstheme="minorHAnsi"/>
-          <w:szCs w:val="24"/>
-          <w:lang w:val="en-US"/>
-        </w:rPr>
-        <w:t xml:space="preserve"> Annex VI</w:t>
-      </w:r>
-      <w:r>
-        <w:rPr>
-          <w:rFonts w:asciiTheme="minorHAnsi" w:hAnsiTheme="minorHAnsi" w:cstheme="minorHAnsi"/>
-          <w:szCs w:val="24"/>
-          <w:lang w:val="en-US"/>
-        </w:rPr>
-        <w:t xml:space="preserve">. </w:t>
-      </w:r>
-      <w:r>
-        <w:rPr>
-          <w:rFonts w:asciiTheme="minorHAnsi" w:hAnsiTheme="minorHAnsi" w:cstheme="minorHAnsi"/>
-          <w:szCs w:val="24"/>
-          <w:lang w:val="en-US"/>
-        </w:rPr>
-        <w:t>Overview of component sampled and equipment used during the survey</w:t>
+          <w:rFonts w:asciiTheme="minorHAnsi" w:hAnsiTheme="minorHAnsi" w:cstheme="minorBidi"/>
+          <w:lang w:val="en-US"/>
+        </w:rPr>
+        <w:t xml:space="preserve"> Annex VI.</w:t>
+      </w:r>
+      <w:r>
+        <w:rPr>
+          <w:rFonts w:asciiTheme="minorHAnsi" w:hAnsiTheme="minorHAnsi" w:cstheme="minorBidi"/>
+          <w:lang w:val="en-US"/>
+        </w:rPr>
+        <w:t xml:space="preserve"> Overview of component sampled and equipment used during the survey</w:t>
       </w:r>
     </w:p>
     <w:p>
       <w:pPr>
         <w:pStyle w:val="Heading3"/>
         <w:rPr>
-          <w:rFonts w:asciiTheme="minorHAnsi" w:hAnsiTheme="minorHAnsi" w:cstheme="minorHAnsi"/>
-          <w:szCs w:val="24"/>
-          <w:lang w:val="en-US"/>
-        </w:rPr>
-      </w:pPr>
-      <w:r>
-        <w:rPr>
-          <w:rFonts w:asciiTheme="minorHAnsi" w:hAnsiTheme="minorHAnsi" w:cstheme="minorHAnsi"/>
-          <w:szCs w:val="24"/>
+          <w:rFonts w:asciiTheme="minorHAnsi" w:hAnsiTheme="minorHAnsi" w:cstheme="minorBidi"/>
+          <w:lang w:val="en-US"/>
+        </w:rPr>
+      </w:pPr>
+      <w:r>
+        <w:rPr>
+          <w:rFonts w:asciiTheme="minorHAnsi" w:hAnsiTheme="minorHAnsi" w:cstheme="minorBidi"/>
           <w:lang w:val="en-US"/>
         </w:rPr>
         <w:t>1</w:t>
       </w:r>
       <w:r>
         <w:rPr>
-          <w:rFonts w:asciiTheme="minorHAnsi" w:hAnsiTheme="minorHAnsi" w:cstheme="minorHAnsi"/>
-          <w:szCs w:val="24"/>
+          <w:rFonts w:asciiTheme="minorHAnsi" w:hAnsiTheme="minorHAnsi" w:cstheme="minorBidi"/>
           <w:lang w:val="en-US"/>
         </w:rPr>
         <w:t>.6</w:t>
       </w:r>
       <w:r>
         <w:rPr>
-          <w:rFonts w:asciiTheme="minorHAnsi" w:hAnsiTheme="minorHAnsi" w:cstheme="minorHAnsi"/>
-          <w:szCs w:val="24"/>
+          <w:rFonts w:asciiTheme="minorHAnsi" w:hAnsiTheme="minorHAnsi" w:cstheme="minorBidi"/>
           <w:lang w:val="en-US"/>
         </w:rPr>
         <w:t>.</w:t>
       </w:r>
       <w:r>
         <w:rPr>
-          <w:rFonts w:asciiTheme="minorHAnsi" w:hAnsiTheme="minorHAnsi" w:cstheme="minorHAnsi"/>
-          <w:szCs w:val="24"/>
+          <w:rFonts w:asciiTheme="minorHAnsi" w:hAnsiTheme="minorHAnsi" w:cstheme="minorBidi"/>
           <w:lang w:val="en-US"/>
         </w:rPr>
         <w:t>7</w:t>
       </w:r>
       <w:r>
         <w:rPr>
-          <w:rFonts w:asciiTheme="minorHAnsi" w:hAnsiTheme="minorHAnsi" w:cstheme="minorHAnsi"/>
-          <w:szCs w:val="24"/>
-          <w:lang w:val="en-US"/>
-        </w:rPr>
-        <w:t xml:space="preserve"> Annex VII</w:t>
-      </w:r>
-      <w:r>
-        <w:rPr>
-          <w:rFonts w:asciiTheme="minorHAnsi" w:hAnsiTheme="minorHAnsi" w:cstheme="minorHAnsi"/>
-          <w:szCs w:val="24"/>
-          <w:lang w:val="en-US"/>
-        </w:rPr>
-        <w:t xml:space="preserve">. </w:t>
-      </w:r>
-      <w:r>
-        <w:rPr>
-          <w:rFonts w:asciiTheme="minorHAnsi" w:hAnsiTheme="minorHAnsi" w:cstheme="minorHAnsi"/>
-          <w:szCs w:val="24"/>
+          <w:rFonts w:asciiTheme="minorHAnsi" w:hAnsiTheme="minorHAnsi" w:cstheme="minorBidi"/>
+          <w:lang w:val="en-US"/>
+        </w:rPr>
+        <w:t xml:space="preserve"> Annex VII. </w:t>
+      </w:r>
+      <w:r>
+        <w:rPr>
+          <w:rFonts w:asciiTheme="minorHAnsi" w:hAnsiTheme="minorHAnsi" w:cstheme="minorBidi"/>
           <w:lang w:val="en-US"/>
         </w:rPr>
         <w:t>Data to be collected and handover plan</w:t>
@@ -10564,63 +9699,48 @@
       <w:pPr>
         <w:pStyle w:val="Heading3"/>
         <w:rPr>
-          <w:rFonts w:asciiTheme="minorHAnsi" w:hAnsiTheme="minorHAnsi" w:cstheme="minorHAnsi"/>
-          <w:szCs w:val="24"/>
-          <w:lang w:val="en-US"/>
-        </w:rPr>
-      </w:pPr>
-      <w:r>
-        <w:rPr>
-          <w:rFonts w:asciiTheme="minorHAnsi" w:hAnsiTheme="minorHAnsi" w:cstheme="minorHAnsi"/>
-          <w:szCs w:val="24"/>
+          <w:rFonts w:asciiTheme="minorHAnsi" w:hAnsiTheme="minorHAnsi" w:cstheme="minorBidi"/>
+          <w:lang w:val="en-US"/>
+        </w:rPr>
+      </w:pPr>
+      <w:r>
+        <w:rPr>
+          <w:rFonts w:asciiTheme="minorHAnsi" w:hAnsiTheme="minorHAnsi" w:cstheme="minorBidi"/>
           <w:lang w:val="en-US"/>
         </w:rPr>
         <w:t>1</w:t>
       </w:r>
       <w:r>
         <w:rPr>
-          <w:rFonts w:asciiTheme="minorHAnsi" w:hAnsiTheme="minorHAnsi" w:cstheme="minorHAnsi"/>
-          <w:szCs w:val="24"/>
+          <w:rFonts w:asciiTheme="minorHAnsi" w:hAnsiTheme="minorHAnsi" w:cstheme="minorBidi"/>
           <w:lang w:val="en-US"/>
         </w:rPr>
         <w:t>.6</w:t>
       </w:r>
       <w:r>
         <w:rPr>
-          <w:rFonts w:asciiTheme="minorHAnsi" w:hAnsiTheme="minorHAnsi" w:cstheme="minorHAnsi"/>
-          <w:szCs w:val="24"/>
+          <w:rFonts w:asciiTheme="minorHAnsi" w:hAnsiTheme="minorHAnsi" w:cstheme="minorBidi"/>
           <w:lang w:val="en-US"/>
         </w:rPr>
         <w:t>.</w:t>
       </w:r>
       <w:r>
         <w:rPr>
-          <w:rFonts w:asciiTheme="minorHAnsi" w:hAnsiTheme="minorHAnsi" w:cstheme="minorHAnsi"/>
-          <w:szCs w:val="24"/>
+          <w:rFonts w:asciiTheme="minorHAnsi" w:hAnsiTheme="minorHAnsi" w:cstheme="minorBidi"/>
           <w:lang w:val="en-US"/>
         </w:rPr>
         <w:t>8</w:t>
       </w:r>
       <w:r>
         <w:rPr>
-          <w:rFonts w:asciiTheme="minorHAnsi" w:hAnsiTheme="minorHAnsi" w:cstheme="minorHAnsi"/>
-          <w:szCs w:val="24"/>
-          <w:lang w:val="en-US"/>
-        </w:rPr>
-        <w:t xml:space="preserve"> Annex V</w:t>
-      </w:r>
-      <w:r>
-        <w:rPr>
-          <w:rFonts w:asciiTheme="minorHAnsi" w:hAnsiTheme="minorHAnsi" w:cstheme="minorHAnsi"/>
-          <w:szCs w:val="24"/>
-          <w:lang w:val="en-US"/>
-        </w:rPr>
-        <w:t xml:space="preserve">III. </w:t>
-      </w:r>
-      <w:r>
-        <w:rPr>
-          <w:rFonts w:asciiTheme="minorHAnsi" w:hAnsiTheme="minorHAnsi" w:cstheme="minorHAnsi"/>
-          <w:szCs w:val="24"/>
+          <w:rFonts w:asciiTheme="minorHAnsi" w:hAnsiTheme="minorHAnsi" w:cstheme="minorBidi"/>
+          <w:lang w:val="en-US"/>
+        </w:rPr>
+        <w:t xml:space="preserve"> Annex VIII. </w:t>
+      </w:r>
+      <w:r>
+        <w:rPr>
+          <w:rFonts w:asciiTheme="minorHAnsi" w:hAnsiTheme="minorHAnsi" w:cstheme="minorBidi"/>
           <w:lang w:val="en-US"/>
         </w:rPr>
         <w:t>Samples to be collected, preservation and follow-up work</w:t>
@@ -11242,6 +10362,83 @@
 <file path=word/numbering.xml><?xml version="1.0" encoding="utf-8"?>
 <w:numbering xmlns:wpc="http://schemas.microsoft.com/office/word/2010/wordprocessingCanvas" xmlns:cx="http://schemas.microsoft.com/office/drawing/2014/chartex" xmlns:cx1="http://schemas.microsoft.com/office/drawing/2015/9/8/chartex" xmlns:cx2="http://schemas.microsoft.com/office/drawing/2015/10/21/chartex" xmlns:cx3="http://schemas.microsoft.com/office/drawing/2016/5/9/chartex" xmlns:cx4="http://schemas.microsoft.com/office/drawing/2016/5/10/chartex" xmlns:cx5="http://schemas.microsoft.com/office/drawing/2016/5/11/chartex" xmlns:cx6="http://schemas.microsoft.com/office/drawing/2016/5/12/chartex" xmlns:cx7="http://schemas.microsoft.com/office/drawing/2016/5/13/chartex" xmlns:cx8="http://schemas.microsoft.com/office/drawing/2016/5/14/chartex" xmlns:mc="http://schemas.openxmlformats.org/markup-compatibility/2006" xmlns:aink="http://schemas.microsoft.com/office/drawing/2016/ink" xmlns:am3d="http://schemas.microsoft.com/office/drawing/2017/model3d" xmlns:o="urn:schemas-microsoft-com:office:office" xmlns:r="http://schemas.openxmlformats.org/officeDocument/2006/relationships" xmlns:m="http://schemas.openxmlformats.org/officeDocument/2006/math" xmlns:v="urn:schemas-microsoft-com:vml" xmlns:wp14="http://schemas.microsoft.com/office/word/2010/wordprocessingDrawing" xmlns:wp="http://schemas.openxmlformats.org/drawingml/2006/wordprocessingDrawing" xmlns:w10="urn:schemas-microsoft-com:office:word" xmlns:w="http://schemas.openxmlformats.org/wordprocessingml/2006/main" xmlns:w14="http://schemas.microsoft.com/office/word/2010/wordml" xmlns:w15="http://schemas.microsoft.com/office/word/2012/wordml" xmlns:w16cex="http://schemas.microsoft.com/office/word/2018/wordml/cex" xmlns:w16cid="http://schemas.microsoft.com/office/word/2016/wordml/cid" xmlns:w16="http://schemas.microsoft.com/office/word/2018/wordml" xmlns:w16sdtdh="http://schemas.microsoft.com/office/word/2020/wordml/sdtdatahash" xmlns:w16se="http://schemas.microsoft.com/office/word/2015/wordml/symex" xmlns:wpg="http://schemas.microsoft.com/office/word/2010/wordprocessingGroup" xmlns:wpi="http://schemas.microsoft.com/office/word/2010/wordprocessingInk" xmlns:wne="http://schemas.microsoft.com/office/word/2006/wordml" xmlns:wps="http://schemas.microsoft.com/office/word/2010/wordprocessingShape" mc:Ignorable="w14 w15 w16se w16cid w16 w16cex w16sdtdh wp14">
   <w:abstractNum w:abstractNumId="0" w15:restartNumberingAfterBreak="0">
+    <w:nsid w:val="0000A991"/>
+    <w:multiLevelType w:val="multilevel"/>
+    <w:tmpl w:val="D3C25B4C"/>
+    <w:lvl w:ilvl="0">
+      <w:numFmt w:val="bullet"/>
+      <w:lvlText w:val="•"/>
+      <w:lvlJc w:val="left"/>
+      <w:pPr>
+        <w:ind w:left="720" w:hanging="480"/>
+      </w:pPr>
+    </w:lvl>
+    <w:lvl w:ilvl="1">
+      <w:numFmt w:val="bullet"/>
+      <w:lvlText w:val="–"/>
+      <w:lvlJc w:val="left"/>
+      <w:pPr>
+        <w:ind w:left="1440" w:hanging="480"/>
+      </w:pPr>
+    </w:lvl>
+    <w:lvl w:ilvl="2">
+      <w:numFmt w:val="bullet"/>
+      <w:lvlText w:val="•"/>
+      <w:lvlJc w:val="left"/>
+      <w:pPr>
+        <w:ind w:left="2160" w:hanging="480"/>
+      </w:pPr>
+    </w:lvl>
+    <w:lvl w:ilvl="3">
+      <w:numFmt w:val="bullet"/>
+      <w:lvlText w:val="–"/>
+      <w:lvlJc w:val="left"/>
+      <w:pPr>
+        <w:ind w:left="2880" w:hanging="480"/>
+      </w:pPr>
+    </w:lvl>
+    <w:lvl w:ilvl="4">
+      <w:numFmt w:val="bullet"/>
+      <w:lvlText w:val="•"/>
+      <w:lvlJc w:val="left"/>
+      <w:pPr>
+        <w:ind w:left="3600" w:hanging="480"/>
+      </w:pPr>
+    </w:lvl>
+    <w:lvl w:ilvl="5">
+      <w:numFmt w:val="bullet"/>
+      <w:lvlText w:val="–"/>
+      <w:lvlJc w:val="left"/>
+      <w:pPr>
+        <w:ind w:left="4320" w:hanging="480"/>
+      </w:pPr>
+    </w:lvl>
+    <w:lvl w:ilvl="6">
+      <w:numFmt w:val="bullet"/>
+      <w:lvlText w:val="•"/>
+      <w:lvlJc w:val="left"/>
+      <w:pPr>
+        <w:ind w:left="5040" w:hanging="480"/>
+      </w:pPr>
+    </w:lvl>
+    <w:lvl w:ilvl="7">
+      <w:numFmt w:val="bullet"/>
+      <w:lvlText w:val="–"/>
+      <w:lvlJc w:val="left"/>
+      <w:pPr>
+        <w:ind w:left="5760" w:hanging="480"/>
+      </w:pPr>
+    </w:lvl>
+    <w:lvl w:ilvl="8">
+      <w:numFmt w:val="bullet"/>
+      <w:lvlText w:val="•"/>
+      <w:lvlJc w:val="left"/>
+      <w:pPr>
+        <w:ind w:left="6480" w:hanging="480"/>
+      </w:pPr>
+    </w:lvl>
+  </w:abstractNum>
+  <w:abstractNum w:abstractNumId="1" w15:restartNumberingAfterBreak="0">
     <w:nsid w:val="02801AAE"/>
     <w:multiLevelType w:val="multilevel"/>
     <w:tmpl w:val="BD4CB75A"/>
@@ -11467,7 +10664,7 @@
       </w:rPr>
     </w:lvl>
   </w:abstractNum>
-  <w:abstractNum w:abstractNumId="1" w15:restartNumberingAfterBreak="0">
+  <w:abstractNum w:abstractNumId="2" w15:restartNumberingAfterBreak="0">
     <w:nsid w:val="06395693"/>
     <w:multiLevelType w:val="hybridMultilevel"/>
     <w:tmpl w:val="01265FC2"/>
@@ -11580,7 +10777,7 @@
       </w:rPr>
     </w:lvl>
   </w:abstractNum>
-  <w:abstractNum w:abstractNumId="2" w15:restartNumberingAfterBreak="0">
+  <w:abstractNum w:abstractNumId="3" w15:restartNumberingAfterBreak="0">
     <w:nsid w:val="157E4875"/>
     <w:multiLevelType w:val="hybridMultilevel"/>
     <w:tmpl w:val="E1C2504A"/>
@@ -11693,7 +10890,7 @@
       </w:rPr>
     </w:lvl>
   </w:abstractNum>
-  <w:abstractNum w:abstractNumId="3" w15:restartNumberingAfterBreak="0">
+  <w:abstractNum w:abstractNumId="4" w15:restartNumberingAfterBreak="0">
     <w:nsid w:val="15D37B4E"/>
     <w:multiLevelType w:val="hybridMultilevel"/>
     <w:tmpl w:val="51C43B00"/>
@@ -11783,7 +10980,7 @@
       </w:pPr>
     </w:lvl>
   </w:abstractNum>
-  <w:abstractNum w:abstractNumId="4" w15:restartNumberingAfterBreak="0">
+  <w:abstractNum w:abstractNumId="5" w15:restartNumberingAfterBreak="0">
     <w:nsid w:val="166E317A"/>
     <w:multiLevelType w:val="multilevel"/>
     <w:tmpl w:val="C5969928"/>
@@ -11896,7 +11093,7 @@
       </w:pPr>
     </w:lvl>
   </w:abstractNum>
-  <w:abstractNum w:abstractNumId="5" w15:restartNumberingAfterBreak="0">
+  <w:abstractNum w:abstractNumId="6" w15:restartNumberingAfterBreak="0">
     <w:nsid w:val="1CA52006"/>
     <w:multiLevelType w:val="multilevel"/>
     <w:tmpl w:val="9788C08C"/>
@@ -12009,7 +11206,7 @@
       </w:pPr>
     </w:lvl>
   </w:abstractNum>
-  <w:abstractNum w:abstractNumId="6" w15:restartNumberingAfterBreak="0">
+  <w:abstractNum w:abstractNumId="7" w15:restartNumberingAfterBreak="0">
     <w:nsid w:val="29C404A7"/>
     <w:multiLevelType w:val="hybridMultilevel"/>
     <w:tmpl w:val="77C2E0EC"/>
@@ -12122,7 +11319,7 @@
       </w:rPr>
     </w:lvl>
   </w:abstractNum>
-  <w:abstractNum w:abstractNumId="7" w15:restartNumberingAfterBreak="0">
+  <w:abstractNum w:abstractNumId="8" w15:restartNumberingAfterBreak="0">
     <w:nsid w:val="2A5C407A"/>
     <w:multiLevelType w:val="multilevel"/>
     <w:tmpl w:val="6B96B260"/>
@@ -12220,7 +11417,7 @@
       </w:pPr>
     </w:lvl>
   </w:abstractNum>
-  <w:abstractNum w:abstractNumId="8" w15:restartNumberingAfterBreak="0">
+  <w:abstractNum w:abstractNumId="9" w15:restartNumberingAfterBreak="0">
     <w:nsid w:val="30461AF9"/>
     <w:multiLevelType w:val="hybridMultilevel"/>
     <w:tmpl w:val="F44E0434"/>
@@ -12333,7 +11530,7 @@
       </w:rPr>
     </w:lvl>
   </w:abstractNum>
-  <w:abstractNum w:abstractNumId="9" w15:restartNumberingAfterBreak="0">
+  <w:abstractNum w:abstractNumId="10" w15:restartNumberingAfterBreak="0">
     <w:nsid w:val="38EA21E7"/>
     <w:multiLevelType w:val="multilevel"/>
     <w:tmpl w:val="B0786BE0"/>
@@ -12446,7 +11643,7 @@
       </w:pPr>
     </w:lvl>
   </w:abstractNum>
-  <w:abstractNum w:abstractNumId="10" w15:restartNumberingAfterBreak="0">
+  <w:abstractNum w:abstractNumId="11" w15:restartNumberingAfterBreak="0">
     <w:nsid w:val="392E6089"/>
     <w:multiLevelType w:val="hybridMultilevel"/>
     <w:tmpl w:val="D1BE2038"/>
@@ -12547,7 +11744,7 @@
       </w:pPr>
     </w:lvl>
   </w:abstractNum>
-  <w:abstractNum w:abstractNumId="11" w15:restartNumberingAfterBreak="0">
+  <w:abstractNum w:abstractNumId="12" w15:restartNumberingAfterBreak="0">
     <w:nsid w:val="3B5559E2"/>
     <w:multiLevelType w:val="hybridMultilevel"/>
     <w:tmpl w:val="0FF2385C"/>
@@ -12660,7 +11857,7 @@
       </w:rPr>
     </w:lvl>
   </w:abstractNum>
-  <w:abstractNum w:abstractNumId="12" w15:restartNumberingAfterBreak="0">
+  <w:abstractNum w:abstractNumId="13" w15:restartNumberingAfterBreak="0">
     <w:nsid w:val="41510B4B"/>
     <w:multiLevelType w:val="hybridMultilevel"/>
     <w:tmpl w:val="FC3C2FB8"/>
@@ -12773,7 +11970,7 @@
       </w:rPr>
     </w:lvl>
   </w:abstractNum>
-  <w:abstractNum w:abstractNumId="13" w15:restartNumberingAfterBreak="0">
+  <w:abstractNum w:abstractNumId="14" w15:restartNumberingAfterBreak="0">
     <w:nsid w:val="4A085344"/>
     <w:multiLevelType w:val="multilevel"/>
     <w:tmpl w:val="5F84A53A"/>
@@ -12886,7 +12083,7 @@
       </w:pPr>
     </w:lvl>
   </w:abstractNum>
-  <w:abstractNum w:abstractNumId="14" w15:restartNumberingAfterBreak="0">
+  <w:abstractNum w:abstractNumId="15" w15:restartNumberingAfterBreak="0">
     <w:nsid w:val="4DBC5859"/>
     <w:multiLevelType w:val="multilevel"/>
     <w:tmpl w:val="5268E0C6"/>
@@ -12999,7 +12196,7 @@
       </w:pPr>
     </w:lvl>
   </w:abstractNum>
-  <w:abstractNum w:abstractNumId="15" w15:restartNumberingAfterBreak="0">
+  <w:abstractNum w:abstractNumId="16" w15:restartNumberingAfterBreak="0">
     <w:nsid w:val="50AB651D"/>
     <w:multiLevelType w:val="hybridMultilevel"/>
     <w:tmpl w:val="BA5C0CC8"/>
@@ -13112,7 +12309,7 @@
       </w:rPr>
     </w:lvl>
   </w:abstractNum>
-  <w:abstractNum w:abstractNumId="16" w15:restartNumberingAfterBreak="0">
+  <w:abstractNum w:abstractNumId="17" w15:restartNumberingAfterBreak="0">
     <w:nsid w:val="52B779EE"/>
     <w:multiLevelType w:val="hybridMultilevel"/>
     <w:tmpl w:val="C62AF6A4"/>
@@ -13225,7 +12422,7 @@
       </w:rPr>
     </w:lvl>
   </w:abstractNum>
-  <w:abstractNum w:abstractNumId="17" w15:restartNumberingAfterBreak="0">
+  <w:abstractNum w:abstractNumId="18" w15:restartNumberingAfterBreak="0">
     <w:nsid w:val="556C49D1"/>
     <w:multiLevelType w:val="multilevel"/>
     <w:tmpl w:val="143216D0"/>
@@ -13338,7 +12535,7 @@
       </w:pPr>
     </w:lvl>
   </w:abstractNum>
-  <w:abstractNum w:abstractNumId="18" w15:restartNumberingAfterBreak="0">
+  <w:abstractNum w:abstractNumId="19" w15:restartNumberingAfterBreak="0">
     <w:nsid w:val="5C63076D"/>
     <w:multiLevelType w:val="multilevel"/>
     <w:tmpl w:val="2E828CE4"/>
@@ -13451,7 +12648,7 @@
       </w:pPr>
     </w:lvl>
   </w:abstractNum>
-  <w:abstractNum w:abstractNumId="19" w15:restartNumberingAfterBreak="0">
+  <w:abstractNum w:abstractNumId="20" w15:restartNumberingAfterBreak="0">
     <w:nsid w:val="62E2346C"/>
     <w:multiLevelType w:val="hybridMultilevel"/>
     <w:tmpl w:val="AF3C3638"/>
@@ -13564,7 +12761,7 @@
       </w:rPr>
     </w:lvl>
   </w:abstractNum>
-  <w:abstractNum w:abstractNumId="20" w15:restartNumberingAfterBreak="0">
+  <w:abstractNum w:abstractNumId="21" w15:restartNumberingAfterBreak="0">
     <w:nsid w:val="70566F4A"/>
     <w:multiLevelType w:val="hybridMultilevel"/>
     <w:tmpl w:val="B4166390"/>
@@ -13677,7 +12874,7 @@
       </w:rPr>
     </w:lvl>
   </w:abstractNum>
-  <w:abstractNum w:abstractNumId="21" w15:restartNumberingAfterBreak="0">
+  <w:abstractNum w:abstractNumId="22" w15:restartNumberingAfterBreak="0">
     <w:nsid w:val="76126AD6"/>
     <w:multiLevelType w:val="multilevel"/>
     <w:tmpl w:val="A5F4F558"/>
@@ -13728,7 +12925,7 @@
       <w:lvlJc w:val="left"/>
     </w:lvl>
   </w:abstractNum>
-  <w:abstractNum w:abstractNumId="22" w15:restartNumberingAfterBreak="0">
+  <w:abstractNum w:abstractNumId="23" w15:restartNumberingAfterBreak="0">
     <w:nsid w:val="77E13D5A"/>
     <w:multiLevelType w:val="hybridMultilevel"/>
     <w:tmpl w:val="448AD58A"/>
@@ -13814,7 +13011,7 @@
       </w:pPr>
     </w:lvl>
   </w:abstractNum>
-  <w:abstractNum w:abstractNumId="23" w15:restartNumberingAfterBreak="0">
+  <w:abstractNum w:abstractNumId="24" w15:restartNumberingAfterBreak="0">
     <w:nsid w:val="793073AB"/>
     <w:multiLevelType w:val="hybridMultilevel"/>
     <w:tmpl w:val="ECB6A758"/>
@@ -13927,7 +13124,7 @@
       </w:rPr>
     </w:lvl>
   </w:abstractNum>
-  <w:abstractNum w:abstractNumId="24" w15:restartNumberingAfterBreak="0">
+  <w:abstractNum w:abstractNumId="25" w15:restartNumberingAfterBreak="0">
     <w:nsid w:val="7AAE4012"/>
     <w:multiLevelType w:val="hybridMultilevel"/>
     <w:tmpl w:val="448AD58A"/>
@@ -14013,7 +13210,7 @@
       </w:pPr>
     </w:lvl>
   </w:abstractNum>
-  <w:abstractNum w:abstractNumId="25" w15:restartNumberingAfterBreak="0">
+  <w:abstractNum w:abstractNumId="26" w15:restartNumberingAfterBreak="0">
     <w:nsid w:val="7D5F0172"/>
     <w:multiLevelType w:val="hybridMultilevel"/>
     <w:tmpl w:val="DBBE8A06"/>
@@ -14127,82 +13324,85 @@
     </w:lvl>
   </w:abstractNum>
   <w:num w:numId="1">
+    <w:abstractNumId w:val="22"/>
+  </w:num>
+  <w:num w:numId="2">
+    <w:abstractNumId w:val="1"/>
+  </w:num>
+  <w:num w:numId="3">
+    <w:abstractNumId w:val="12"/>
+  </w:num>
+  <w:num w:numId="4">
+    <w:abstractNumId w:val="24"/>
+  </w:num>
+  <w:num w:numId="5">
+    <w:abstractNumId w:val="20"/>
+  </w:num>
+  <w:num w:numId="6">
+    <w:abstractNumId w:val="8"/>
+  </w:num>
+  <w:num w:numId="7">
     <w:abstractNumId w:val="21"/>
   </w:num>
-  <w:num w:numId="2">
-    <w:abstractNumId w:val="0"/>
+  <w:num w:numId="8">
+    <w:abstractNumId w:val="3"/>
   </w:num>
-  <w:num w:numId="3">
+  <w:num w:numId="9">
     <w:abstractNumId w:val="11"/>
   </w:num>
-  <w:num w:numId="4">
+  <w:num w:numId="10">
+    <w:abstractNumId w:val="13"/>
+  </w:num>
+  <w:num w:numId="11">
+    <w:abstractNumId w:val="17"/>
+  </w:num>
+  <w:num w:numId="12">
+    <w:abstractNumId w:val="6"/>
+  </w:num>
+  <w:num w:numId="13">
+    <w:abstractNumId w:val="14"/>
+  </w:num>
+  <w:num w:numId="14">
+    <w:abstractNumId w:val="5"/>
+  </w:num>
+  <w:num w:numId="15">
+    <w:abstractNumId w:val="19"/>
+  </w:num>
+  <w:num w:numId="16">
+    <w:abstractNumId w:val="10"/>
+  </w:num>
+  <w:num w:numId="17">
+    <w:abstractNumId w:val="2"/>
+  </w:num>
+  <w:num w:numId="18">
+    <w:abstractNumId w:val="7"/>
+  </w:num>
+  <w:num w:numId="19">
+    <w:abstractNumId w:val="9"/>
+  </w:num>
+  <w:num w:numId="20">
+    <w:abstractNumId w:val="25"/>
+  </w:num>
+  <w:num w:numId="21">
     <w:abstractNumId w:val="23"/>
   </w:num>
-  <w:num w:numId="5">
-    <w:abstractNumId w:val="19"/>
+  <w:num w:numId="22">
+    <w:abstractNumId w:val="4"/>
   </w:num>
-  <w:num w:numId="6">
-    <w:abstractNumId w:val="7"/>
+  <w:num w:numId="23">
+    <w:abstractNumId w:val="26"/>
   </w:num>
-  <w:num w:numId="7">
-    <w:abstractNumId w:val="20"/>
-  </w:num>
-  <w:num w:numId="8">
-    <w:abstractNumId w:val="2"/>
-  </w:num>
-  <w:num w:numId="9">
-    <w:abstractNumId w:val="10"/>
-  </w:num>
-  <w:num w:numId="10">
-    <w:abstractNumId w:val="12"/>
-  </w:num>
-  <w:num w:numId="11">
+  <w:num w:numId="24">
     <w:abstractNumId w:val="16"/>
   </w:num>
-  <w:num w:numId="12">
-    <w:abstractNumId w:val="5"/>
-  </w:num>
-  <w:num w:numId="13">
-    <w:abstractNumId w:val="13"/>
-  </w:num>
-  <w:num w:numId="14">
-    <w:abstractNumId w:val="4"/>
-  </w:num>
-  <w:num w:numId="15">
+  <w:num w:numId="25">
     <w:abstractNumId w:val="18"/>
   </w:num>
-  <w:num w:numId="16">
-    <w:abstractNumId w:val="9"/>
-  </w:num>
-  <w:num w:numId="17">
-    <w:abstractNumId w:val="1"/>
-  </w:num>
-  <w:num w:numId="18">
-    <w:abstractNumId w:val="6"/>
-  </w:num>
-  <w:num w:numId="19">
-    <w:abstractNumId w:val="8"/>
-  </w:num>
-  <w:num w:numId="20">
-    <w:abstractNumId w:val="24"/>
-  </w:num>
-  <w:num w:numId="21">
-    <w:abstractNumId w:val="22"/>
-  </w:num>
-  <w:num w:numId="22">
-    <w:abstractNumId w:val="3"/>
-  </w:num>
-  <w:num w:numId="23">
-    <w:abstractNumId w:val="25"/>
-  </w:num>
-  <w:num w:numId="24">
+  <w:num w:numId="26">
     <w:abstractNumId w:val="15"/>
   </w:num>
-  <w:num w:numId="25">
-    <w:abstractNumId w:val="17"/>
-  </w:num>
-  <w:num w:numId="26">
-    <w:abstractNumId w:val="14"/>
+  <w:num w:numId="27">
+    <w:abstractNumId w:val="0"/>
   </w:num>
   <w:numIdMacAtCleanup w:val="22"/>
 </w:numbering>
@@ -17745,6 +16945,28 @@
     <w:basedOn w:val="DefaultParagraphFont"/>
     <w:rsid w:val="00116BE8"/>
   </w:style>
+  <w:style w:type="paragraph" w:customStyle="1" w:styleId="Compact">
+    <w:name w:val="Compact"/>
+    <w:basedOn w:val="BodyText"/>
+    <w:qFormat/>
+    <w:rsid w:val="00423DA2"/>
+    <w:pPr>
+      <w:tabs>
+        <w:tab w:val="clear" w:pos="-720"/>
+      </w:tabs>
+      <w:suppressAutoHyphens w:val="0"/>
+      <w:spacing w:before="36" w:after="36" w:line="240" w:lineRule="auto"/>
+      <w:jc w:val="left"/>
+    </w:pPr>
+    <w:rPr>
+      <w:rFonts w:asciiTheme="minorHAnsi" w:eastAsiaTheme="minorHAnsi" w:hAnsiTheme="minorHAnsi" w:cstheme="minorBidi"/>
+      <w:i w:val="0"/>
+      <w:noProof w:val="0"/>
+      <w:spacing w:val="0"/>
+      <w:szCs w:val="24"/>
+      <w:lang w:val="en-US"/>
+    </w:rPr>
+  </w:style>
 </w:styles>
 </file>
 
@@ -18044,12 +17266,25 @@
 </file>
 
 <file path=customXml/item1.xml><?xml version="1.0" encoding="utf-8"?>
+<b:Sources xmlns:b="http://schemas.openxmlformats.org/officeDocument/2006/bibliography" xmlns="http://schemas.openxmlformats.org/officeDocument/2006/bibliography" SelectedStyle="\APA.XSL" StyleName="APA Fifth Edition"/>
+</file>
+
+<file path=customXml/item2.xml><?xml version="1.0" encoding="utf-8"?>
+<?mso-contentType ?>
+<FormTemplates xmlns="http://schemas.microsoft.com/sharepoint/v3/contenttype/forms">
+  <Display>DocumentLibraryForm</Display>
+  <Edit>DocumentLibraryForm</Edit>
+  <New>DocumentLibraryForm</New>
+</FormTemplates>
+</file>
+
+<file path=customXml/item3.xml><?xml version="1.0" encoding="utf-8"?>
 <p:properties xmlns:p="http://schemas.microsoft.com/office/2006/metadata/properties" xmlns:xsi="http://www.w3.org/2001/XMLSchema-instance" xmlns:pc="http://schemas.microsoft.com/office/infopath/2007/PartnerControls">
   <documentManagement/>
 </p:properties>
 </file>
 
-<file path=customXml/item2.xml><?xml version="1.0" encoding="utf-8"?>
+<file path=customXml/item4.xml><?xml version="1.0" encoding="utf-8"?>
 <ct:contentTypeSchema xmlns:ct="http://schemas.microsoft.com/office/2006/metadata/contentType" xmlns:ma="http://schemas.microsoft.com/office/2006/metadata/properties/metaAttributes" ct:_="" ma:_="" ma:contentTypeName="Document" ma:contentTypeID="0x010100B79A833CF10F444BBAB252802BF889FD" ma:contentTypeVersion="13" ma:contentTypeDescription="Create a new document." ma:contentTypeScope="" ma:versionID="64f677fd2253f5247049a9cf21871e2a">
   <xsd:schema xmlns:xsd="http://www.w3.org/2001/XMLSchema" xmlns:xs="http://www.w3.org/2001/XMLSchema" xmlns:p="http://schemas.microsoft.com/office/2006/metadata/properties" xmlns:ns2="c01e712b-8f9b-4625-8219-31b20605feb3" xmlns:ns3="2b166a80-dccc-42cc-be33-87bca7e0d87c" targetNamespace="http://schemas.microsoft.com/office/2006/metadata/properties" ma:root="true" ma:fieldsID="2fddc4c226a27c0868f3cab2348c32e7" ns2:_="" ns3:_="">
     <xsd:import namespace="c01e712b-8f9b-4625-8219-31b20605feb3"/>
@@ -18272,20 +17507,23 @@
 </ct:contentTypeSchema>
 </file>
 
-<file path=customXml/item3.xml><?xml version="1.0" encoding="utf-8"?>
-<b:Sources xmlns:b="http://schemas.openxmlformats.org/officeDocument/2006/bibliography" xmlns="http://schemas.openxmlformats.org/officeDocument/2006/bibliography" SelectedStyle="\APA.XSL" StyleName="APA Fifth Edition"/>
+<file path=customXml/itemProps1.xml><?xml version="1.0" encoding="utf-8"?>
+<ds:datastoreItem xmlns:ds="http://schemas.openxmlformats.org/officeDocument/2006/customXml" ds:itemID="{AA00162B-AAF6-4E5D-B2D5-D918EFED2F71}">
+  <ds:schemaRefs>
+    <ds:schemaRef ds:uri="http://schemas.openxmlformats.org/officeDocument/2006/bibliography"/>
+  </ds:schemaRefs>
+</ds:datastoreItem>
 </file>
 
-<file path=customXml/item4.xml><?xml version="1.0" encoding="utf-8"?>
-<?mso-contentType ?>
-<FormTemplates xmlns="http://schemas.microsoft.com/sharepoint/v3/contenttype/forms">
-  <Display>DocumentLibraryForm</Display>
-  <Edit>DocumentLibraryForm</Edit>
-  <New>DocumentLibraryForm</New>
-</FormTemplates>
+<file path=customXml/itemProps2.xml><?xml version="1.0" encoding="utf-8"?>
+<ds:datastoreItem xmlns:ds="http://schemas.openxmlformats.org/officeDocument/2006/customXml" ds:itemID="{69595501-9542-49DE-8795-703C0188D075}">
+  <ds:schemaRefs>
+    <ds:schemaRef ds:uri="http://schemas.microsoft.com/sharepoint/v3/contenttype/forms"/>
+  </ds:schemaRefs>
+</ds:datastoreItem>
 </file>
 
-<file path=customXml/itemProps1.xml><?xml version="1.0" encoding="utf-8"?>
+<file path=customXml/itemProps3.xml><?xml version="1.0" encoding="utf-8"?>
 <ds:datastoreItem xmlns:ds="http://schemas.openxmlformats.org/officeDocument/2006/customXml" ds:itemID="{F8D6F061-B7CA-4BC4-8B5B-692C2D9970D9}">
   <ds:schemaRefs>
     <ds:schemaRef ds:uri="http://schemas.microsoft.com/office/2006/metadata/properties"/>
@@ -18294,7 +17532,7 @@
 </ds:datastoreItem>
 </file>
 
-<file path=customXml/itemProps2.xml><?xml version="1.0" encoding="utf-8"?>
+<file path=customXml/itemProps4.xml><?xml version="1.0" encoding="utf-8"?>
 <ds:datastoreItem xmlns:ds="http://schemas.openxmlformats.org/officeDocument/2006/customXml" ds:itemID="{512DDFFD-0BCE-4451-979E-05B4028F04A3}">
   <ds:schemaRefs>
     <ds:schemaRef ds:uri="http://schemas.microsoft.com/office/2006/metadata/contentType"/>
@@ -18311,20 +17549,4 @@
     <ds:schemaRef ds:uri="http://schemas.microsoft.com/internal/obd"/>
   </ds:schemaRefs>
 </ds:datastoreItem>
-</file>
-
-<file path=customXml/itemProps3.xml><?xml version="1.0" encoding="utf-8"?>
-<ds:datastoreItem xmlns:ds="http://schemas.openxmlformats.org/officeDocument/2006/customXml" ds:itemID="{AA00162B-AAF6-4E5D-B2D5-D918EFED2F71}">
-  <ds:schemaRefs>
-    <ds:schemaRef ds:uri="http://schemas.openxmlformats.org/officeDocument/2006/bibliography"/>
-  </ds:schemaRefs>
-</ds:datastoreItem>
-</file>
-
-<file path=customXml/itemProps4.xml><?xml version="1.0" encoding="utf-8"?>
-<ds:datastoreItem xmlns:ds="http://schemas.openxmlformats.org/officeDocument/2006/customXml" ds:itemID="{69595501-9542-49DE-8795-703C0188D075}">
-  <ds:schemaRefs>
-    <ds:schemaRef ds:uri="http://schemas.microsoft.com/sharepoint/v3/contenttype/forms"/>
-  </ds:schemaRefs>
-</ds:datastoreItem>
 </file>
</xml_diff>